<commit_message>
Fixed library error in LakeMeadInflow.Rmd file, updated .docx file with new inflow figure.
</commit_message>
<xml_diff>
--- a/LakeMeadWaterConservationProgramAnalysis/LakeMeadWaterConservationProgramSuccessChallengesSuggestions_v3.docx
+++ b/LakeMeadWaterConservationProgramAnalysis/LakeMeadWaterConservationProgramSuccessChallengesSuggestions_v3.docx
@@ -10851,7 +10851,7 @@
         </w:rPr>
         <w:lastRenderedPageBreak/>
         <w:drawing>
-          <wp:inline distT="0" distB="0" distL="0" distR="0" wp14:anchorId="4E4DC790" wp14:editId="1F821860">
+          <wp:inline distT="0" distB="0" distL="0" distR="0" wp14:anchorId="4E4DC790" wp14:editId="1FAA486A">
             <wp:extent cx="5929566" cy="3377110"/>
             <wp:effectExtent l="0" t="0" r="0" b="0"/>
             <wp:docPr id="496325522" name="Picture 3"/>
@@ -12050,10 +12050,10 @@
         </w:rPr>
         <w:lastRenderedPageBreak/>
         <w:drawing>
-          <wp:inline distT="0" distB="0" distL="0" distR="0" wp14:anchorId="1E68F710" wp14:editId="3BDAD3EA">
-            <wp:extent cx="4636116" cy="3054350"/>
-            <wp:effectExtent l="0" t="0" r="0" b="0"/>
-            <wp:docPr id="1887471880" name="Picture 1"/>
+          <wp:inline distT="0" distB="0" distL="0" distR="0" wp14:anchorId="3B21795B" wp14:editId="355BD940">
+            <wp:extent cx="4755895" cy="3140110"/>
+            <wp:effectExtent l="0" t="0" r="6985" b="3175"/>
+            <wp:docPr id="1990438581" name="Picture 1"/>
             <wp:cNvGraphicFramePr>
               <a:graphicFrameLocks xmlns:a="http://schemas.openxmlformats.org/drawingml/2006/main" noChangeAspect="1"/>
             </wp:cNvGraphicFramePr>
@@ -12061,7 +12061,7 @@
               <a:graphicData uri="http://schemas.openxmlformats.org/drawingml/2006/picture">
                 <pic:pic xmlns:pic="http://schemas.openxmlformats.org/drawingml/2006/picture">
                   <pic:nvPicPr>
-                    <pic:cNvPr id="1887471880" name=""/>
+                    <pic:cNvPr id="1990438581" name=""/>
                     <pic:cNvPicPr/>
                   </pic:nvPicPr>
                   <pic:blipFill>
@@ -12073,7 +12073,7 @@
                   <pic:spPr>
                     <a:xfrm>
                       <a:off x="0" y="0"/>
-                      <a:ext cx="4659694" cy="3069884"/>
+                      <a:ext cx="4764110" cy="3145534"/>
                     </a:xfrm>
                     <a:prstGeom prst="rect">
                       <a:avLst/>
@@ -15749,7 +15749,31 @@
           <w:sz w:val="24"/>
           <w:szCs w:val="24"/>
         </w:rPr>
-        <w:t>Lower Basin and Mexico</w:t>
+        <w:t>Lower Basin</w:t>
+      </w:r>
+      <w:r>
+        <w:rPr>
+          <w:rFonts w:asciiTheme="majorBidi" w:hAnsiTheme="majorBidi" w:cstheme="majorBidi"/>
+          <w:sz w:val="24"/>
+          <w:szCs w:val="24"/>
+        </w:rPr>
+        <w:t xml:space="preserve">, </w:t>
+      </w:r>
+      <w:r>
+        <w:rPr>
+          <w:rFonts w:asciiTheme="majorBidi" w:hAnsiTheme="majorBidi" w:cstheme="majorBidi"/>
+          <w:sz w:val="24"/>
+          <w:szCs w:val="24"/>
+        </w:rPr>
+        <w:t>Mexico</w:t>
+      </w:r>
+      <w:r>
+        <w:rPr>
+          <w:rFonts w:asciiTheme="majorBidi" w:hAnsiTheme="majorBidi" w:cstheme="majorBidi"/>
+          <w:sz w:val="24"/>
+          <w:szCs w:val="24"/>
+        </w:rPr>
+        <w:t>, and Tribal</w:t>
       </w:r>
       <w:r>
         <w:rPr>

</xml_diff>

<commit_message>
In the middle of update to AutoRead to print current reservoir elevations
</commit_message>
<xml_diff>
--- a/LakeMeadWaterConservationProgramAnalysis/LakeMeadWaterConservationProgramSuccessChallengesSuggestions_v3.docx
+++ b/LakeMeadWaterConservationProgramAnalysis/LakeMeadWaterConservationProgramSuccessChallengesSuggestions_v3.docx
@@ -61,7 +61,7 @@
           <w:sz w:val="28"/>
           <w:szCs w:val="28"/>
         </w:rPr>
-        <w:t>Managing</w:t>
+        <w:t xml:space="preserve">Reducing </w:t>
       </w:r>
       <w:r>
         <w:rPr>
@@ -71,7 +71,7 @@
           <w:sz w:val="28"/>
           <w:szCs w:val="28"/>
         </w:rPr>
-        <w:t xml:space="preserve"> Risk</w:t>
+        <w:t>Risk</w:t>
       </w:r>
       <w:r>
         <w:rPr>
@@ -275,7 +275,15 @@
           <w:sz w:val="24"/>
           <w:szCs w:val="24"/>
         </w:rPr>
-        <w:t xml:space="preserve">The Lake Mead water conservation program </w:t>
+        <w:t xml:space="preserve">The </w:t>
+      </w:r>
+      <w:r>
+        <w:rPr>
+          <w:rFonts w:asciiTheme="majorBidi" w:hAnsiTheme="majorBidi" w:cstheme="majorBidi"/>
+          <w:sz w:val="24"/>
+          <w:szCs w:val="24"/>
+        </w:rPr>
+        <w:t xml:space="preserve">Lake Mead water conservation program </w:t>
       </w:r>
       <w:r>
         <w:rPr>
@@ -431,70 +439,38 @@
         </w:rPr>
         <w:t xml:space="preserve"> </w:t>
       </w:r>
-      <w:ins w:id="0" w:author="Erik Christian Porse" w:date="2026-05-26T16:58:00Z" w16du:dateUtc="2026-05-26T23:58:00Z">
-        <w:r>
-          <w:rPr>
-            <w:rFonts w:asciiTheme="majorBidi" w:hAnsiTheme="majorBidi" w:cstheme="majorBidi"/>
-            <w:sz w:val="24"/>
-            <w:szCs w:val="24"/>
-          </w:rPr>
-          <w:t>B</w:t>
-        </w:r>
-      </w:ins>
-      <w:r>
-        <w:rPr>
-          <w:rFonts w:asciiTheme="majorBidi" w:hAnsiTheme="majorBidi" w:cstheme="majorBidi"/>
-          <w:sz w:val="24"/>
-          <w:szCs w:val="24"/>
-        </w:rPr>
-        <w:t xml:space="preserve">oth suggestions switch </w:t>
-      </w:r>
-      <w:del w:id="1" w:author="Erik Christian Porse" w:date="2026-05-26T16:58:00Z" w16du:dateUtc="2026-05-26T23:58:00Z">
-        <w:r>
-          <w:rPr>
-            <w:rFonts w:asciiTheme="majorBidi" w:hAnsiTheme="majorBidi" w:cstheme="majorBidi"/>
-            <w:sz w:val="24"/>
-            <w:szCs w:val="24"/>
-          </w:rPr>
-          <w:delText xml:space="preserve">the </w:delText>
-        </w:r>
-      </w:del>
-      <w:r>
-        <w:rPr>
-          <w:rFonts w:asciiTheme="majorBidi" w:hAnsiTheme="majorBidi" w:cstheme="majorBidi"/>
-          <w:sz w:val="24"/>
-          <w:szCs w:val="24"/>
-        </w:rPr>
-        <w:t xml:space="preserve">accounting from reductions </w:t>
-      </w:r>
-      <w:del w:id="2" w:author="Erik Christian Porse" w:date="2026-05-26T16:58:00Z" w16du:dateUtc="2026-05-26T23:58:00Z">
-        <w:r>
-          <w:rPr>
-            <w:rFonts w:asciiTheme="majorBidi" w:hAnsiTheme="majorBidi" w:cstheme="majorBidi"/>
-            <w:sz w:val="24"/>
-            <w:szCs w:val="24"/>
-          </w:rPr>
-          <w:delText xml:space="preserve">from </w:delText>
-        </w:r>
-      </w:del>
-      <w:ins w:id="3" w:author="Erik Christian Porse" w:date="2026-05-26T16:58:00Z" w16du:dateUtc="2026-05-26T23:58:00Z">
-        <w:r>
-          <w:rPr>
-            <w:rFonts w:asciiTheme="majorBidi" w:hAnsiTheme="majorBidi" w:cstheme="majorBidi"/>
-            <w:sz w:val="24"/>
-            <w:szCs w:val="24"/>
-          </w:rPr>
-          <w:t>of</w:t>
-        </w:r>
-        <w:r>
-          <w:rPr>
-            <w:rFonts w:asciiTheme="majorBidi" w:hAnsiTheme="majorBidi" w:cstheme="majorBidi"/>
-            <w:sz w:val="24"/>
-            <w:szCs w:val="24"/>
-          </w:rPr>
-          <w:t xml:space="preserve"> </w:t>
-        </w:r>
-      </w:ins>
+      <w:r>
+        <w:rPr>
+          <w:rFonts w:asciiTheme="majorBidi" w:hAnsiTheme="majorBidi" w:cstheme="majorBidi"/>
+          <w:sz w:val="24"/>
+          <w:szCs w:val="24"/>
+        </w:rPr>
+        <w:t>B</w:t>
+      </w:r>
+      <w:r>
+        <w:rPr>
+          <w:rFonts w:asciiTheme="majorBidi" w:hAnsiTheme="majorBidi" w:cstheme="majorBidi"/>
+          <w:sz w:val="24"/>
+          <w:szCs w:val="24"/>
+        </w:rPr>
+        <w:t xml:space="preserve">oth suggestions switch accounting from reductions </w:t>
+      </w:r>
+      <w:r>
+        <w:rPr>
+          <w:rFonts w:asciiTheme="majorBidi" w:hAnsiTheme="majorBidi" w:cstheme="majorBidi"/>
+          <w:sz w:val="24"/>
+          <w:szCs w:val="24"/>
+        </w:rPr>
+        <w:t>of</w:t>
+      </w:r>
+      <w:r>
+        <w:rPr>
+          <w:rFonts w:asciiTheme="majorBidi" w:hAnsiTheme="majorBidi" w:cstheme="majorBidi"/>
+          <w:sz w:val="24"/>
+          <w:szCs w:val="24"/>
+        </w:rPr>
+        <w:t xml:space="preserve"> </w:t>
+      </w:r>
       <w:r>
         <w:rPr>
           <w:rFonts w:asciiTheme="majorBidi" w:hAnsiTheme="majorBidi" w:cstheme="majorBidi"/>
@@ -503,36 +479,22 @@
         </w:rPr>
         <w:t xml:space="preserve">historical entitlements to </w:t>
       </w:r>
-      <w:del w:id="4" w:author="Erik Christian Porse" w:date="2026-05-26T16:58:00Z" w16du:dateUtc="2026-05-26T23:58:00Z">
-        <w:r>
-          <w:rPr>
-            <w:rFonts w:asciiTheme="majorBidi" w:hAnsiTheme="majorBidi" w:cstheme="majorBidi"/>
-            <w:sz w:val="24"/>
-            <w:szCs w:val="24"/>
-          </w:rPr>
-          <w:delText>reductions from the</w:delText>
-        </w:r>
-      </w:del>
-      <w:ins w:id="5" w:author="Erik Christian Porse" w:date="2026-05-27T13:58:00Z" w16du:dateUtc="2026-05-27T20:58:00Z">
-        <w:r>
-          <w:rPr>
-            <w:rFonts w:asciiTheme="majorBidi" w:hAnsiTheme="majorBidi" w:cstheme="majorBidi"/>
-            <w:sz w:val="24"/>
-            <w:szCs w:val="24"/>
-          </w:rPr>
-          <w:t>allocations</w:t>
-        </w:r>
-      </w:ins>
-      <w:ins w:id="6" w:author="Erik Christian Porse" w:date="2026-05-26T16:58:00Z" w16du:dateUtc="2026-05-26T23:58:00Z">
-        <w:r>
-          <w:rPr>
-            <w:rFonts w:asciiTheme="majorBidi" w:hAnsiTheme="majorBidi" w:cstheme="majorBidi"/>
-            <w:sz w:val="24"/>
-            <w:szCs w:val="24"/>
-          </w:rPr>
-          <w:t xml:space="preserve"> aligned with</w:t>
-        </w:r>
-      </w:ins>
+      <w:r>
+        <w:rPr>
+          <w:rFonts w:asciiTheme="majorBidi" w:hAnsiTheme="majorBidi" w:cstheme="majorBidi"/>
+          <w:sz w:val="24"/>
+          <w:szCs w:val="24"/>
+        </w:rPr>
+        <w:t>allocations</w:t>
+      </w:r>
+      <w:r>
+        <w:rPr>
+          <w:rFonts w:asciiTheme="majorBidi" w:hAnsiTheme="majorBidi" w:cstheme="majorBidi"/>
+          <w:sz w:val="24"/>
+          <w:szCs w:val="24"/>
+        </w:rPr>
+        <w:t xml:space="preserve"> aligned with</w:t>
+      </w:r>
       <w:r>
         <w:rPr>
           <w:rFonts w:asciiTheme="majorBidi" w:hAnsiTheme="majorBidi" w:cstheme="majorBidi"/>
@@ -541,34 +503,22 @@
         </w:rPr>
         <w:t xml:space="preserve"> annual available water. </w:t>
       </w:r>
-      <w:del w:id="7" w:author="Erik Christian Porse" w:date="2026-05-27T12:45:00Z" w16du:dateUtc="2026-05-27T19:45:00Z">
-        <w:r>
-          <w:rPr>
-            <w:rFonts w:asciiTheme="majorBidi" w:hAnsiTheme="majorBidi" w:cstheme="majorBidi"/>
-            <w:sz w:val="24"/>
-            <w:szCs w:val="24"/>
-          </w:rPr>
-          <w:delText xml:space="preserve">These </w:delText>
-        </w:r>
-      </w:del>
-      <w:ins w:id="8" w:author="Erik Christian Porse" w:date="2026-05-27T12:45:00Z" w16du:dateUtc="2026-05-27T19:45:00Z">
-        <w:r>
-          <w:rPr>
-            <w:rFonts w:asciiTheme="majorBidi" w:hAnsiTheme="majorBidi" w:cstheme="majorBidi"/>
-            <w:sz w:val="24"/>
-            <w:szCs w:val="24"/>
-          </w:rPr>
-          <w:t>Our analysis shows that such</w:t>
-        </w:r>
-        <w:r>
-          <w:rPr>
-            <w:rFonts w:asciiTheme="majorBidi" w:hAnsiTheme="majorBidi" w:cstheme="majorBidi"/>
-            <w:sz w:val="24"/>
-            <w:szCs w:val="24"/>
-          </w:rPr>
-          <w:t xml:space="preserve"> </w:t>
-        </w:r>
-      </w:ins>
+      <w:r>
+        <w:rPr>
+          <w:rFonts w:asciiTheme="majorBidi" w:hAnsiTheme="majorBidi" w:cstheme="majorBidi"/>
+          <w:sz w:val="24"/>
+          <w:szCs w:val="24"/>
+        </w:rPr>
+        <w:t>Our analysis shows that such</w:t>
+      </w:r>
+      <w:r>
+        <w:rPr>
+          <w:rFonts w:asciiTheme="majorBidi" w:hAnsiTheme="majorBidi" w:cstheme="majorBidi"/>
+          <w:sz w:val="24"/>
+          <w:szCs w:val="24"/>
+        </w:rPr>
+        <w:t xml:space="preserve"> </w:t>
+      </w:r>
       <w:r>
         <w:rPr>
           <w:rFonts w:asciiTheme="majorBidi" w:hAnsiTheme="majorBidi" w:cstheme="majorBidi"/>
@@ -577,34 +527,22 @@
         </w:rPr>
         <w:t xml:space="preserve">changes </w:t>
       </w:r>
-      <w:del w:id="9" w:author="Erik Christian Porse" w:date="2026-05-27T12:45:00Z" w16du:dateUtc="2026-05-27T19:45:00Z">
-        <w:r>
-          <w:rPr>
-            <w:rFonts w:asciiTheme="majorBidi" w:hAnsiTheme="majorBidi" w:cstheme="majorBidi"/>
-            <w:sz w:val="24"/>
-            <w:szCs w:val="24"/>
-          </w:rPr>
-          <w:delText xml:space="preserve">can </w:delText>
-        </w:r>
-      </w:del>
-      <w:ins w:id="10" w:author="Erik Christian Porse" w:date="2026-05-27T12:45:00Z" w16du:dateUtc="2026-05-27T19:45:00Z">
-        <w:r>
-          <w:rPr>
-            <w:rFonts w:asciiTheme="majorBidi" w:hAnsiTheme="majorBidi" w:cstheme="majorBidi"/>
-            <w:sz w:val="24"/>
-            <w:szCs w:val="24"/>
-          </w:rPr>
-          <w:t>could</w:t>
-        </w:r>
-        <w:r>
-          <w:rPr>
-            <w:rFonts w:asciiTheme="majorBidi" w:hAnsiTheme="majorBidi" w:cstheme="majorBidi"/>
-            <w:sz w:val="24"/>
-            <w:szCs w:val="24"/>
-          </w:rPr>
-          <w:t xml:space="preserve"> </w:t>
-        </w:r>
-      </w:ins>
+      <w:r>
+        <w:rPr>
+          <w:rFonts w:asciiTheme="majorBidi" w:hAnsiTheme="majorBidi" w:cstheme="majorBidi"/>
+          <w:sz w:val="24"/>
+          <w:szCs w:val="24"/>
+        </w:rPr>
+        <w:t>could</w:t>
+      </w:r>
+      <w:r>
+        <w:rPr>
+          <w:rFonts w:asciiTheme="majorBidi" w:hAnsiTheme="majorBidi" w:cstheme="majorBidi"/>
+          <w:sz w:val="24"/>
+          <w:szCs w:val="24"/>
+        </w:rPr>
+        <w:t xml:space="preserve"> </w:t>
+      </w:r>
       <w:r>
         <w:rPr>
           <w:rFonts w:asciiTheme="majorBidi" w:hAnsiTheme="majorBidi" w:cstheme="majorBidi"/>
@@ -613,16 +551,14 @@
         </w:rPr>
         <w:t>stabilize and potentially recover Lake Mead storage under conditions of low storage and low inflow</w:t>
       </w:r>
-      <w:ins w:id="11" w:author="Erik Christian Porse" w:date="2026-05-27T12:45:00Z" w16du:dateUtc="2026-05-27T19:45:00Z">
-        <w:r>
-          <w:rPr>
-            <w:rFonts w:asciiTheme="majorBidi" w:hAnsiTheme="majorBidi" w:cstheme="majorBidi"/>
-            <w:sz w:val="24"/>
-            <w:szCs w:val="24"/>
-          </w:rPr>
-          <w:t>,</w:t>
-        </w:r>
-      </w:ins>
+      <w:r>
+        <w:rPr>
+          <w:rFonts w:asciiTheme="majorBidi" w:hAnsiTheme="majorBidi" w:cstheme="majorBidi"/>
+          <w:sz w:val="24"/>
+          <w:szCs w:val="24"/>
+        </w:rPr>
+        <w:t>,</w:t>
+      </w:r>
       <w:r>
         <w:rPr>
           <w:rFonts w:asciiTheme="majorBidi" w:hAnsiTheme="majorBidi" w:cstheme="majorBidi"/>
@@ -631,16 +567,14 @@
         </w:rPr>
         <w:t xml:space="preserve"> while</w:t>
       </w:r>
-      <w:ins w:id="12" w:author="Erik Christian Porse" w:date="2026-05-27T12:45:00Z" w16du:dateUtc="2026-05-27T19:45:00Z">
-        <w:r>
-          <w:rPr>
-            <w:rFonts w:asciiTheme="majorBidi" w:hAnsiTheme="majorBidi" w:cstheme="majorBidi"/>
-            <w:sz w:val="24"/>
-            <w:szCs w:val="24"/>
-          </w:rPr>
-          <w:t xml:space="preserve"> also</w:t>
-        </w:r>
-      </w:ins>
+      <w:r>
+        <w:rPr>
+          <w:rFonts w:asciiTheme="majorBidi" w:hAnsiTheme="majorBidi" w:cstheme="majorBidi"/>
+          <w:sz w:val="24"/>
+          <w:szCs w:val="24"/>
+        </w:rPr>
+        <w:t xml:space="preserve"> also</w:t>
+      </w:r>
       <w:r>
         <w:rPr>
           <w:rFonts w:asciiTheme="majorBidi" w:hAnsiTheme="majorBidi" w:cstheme="majorBidi"/>
@@ -649,26 +583,14 @@
         </w:rPr>
         <w:t xml:space="preserve"> increasing </w:t>
       </w:r>
-      <w:ins w:id="13" w:author="Erik Christian Porse" w:date="2026-05-27T12:44:00Z" w16du:dateUtc="2026-05-27T19:44:00Z">
-        <w:r>
-          <w:rPr>
-            <w:rFonts w:asciiTheme="majorBidi" w:hAnsiTheme="majorBidi" w:cstheme="majorBidi"/>
-            <w:sz w:val="24"/>
-            <w:szCs w:val="24"/>
-          </w:rPr>
-          <w:t xml:space="preserve">the </w:t>
-        </w:r>
-      </w:ins>
-      <w:del w:id="14" w:author="Erik Christian Porse" w:date="2026-05-27T12:44:00Z" w16du:dateUtc="2026-05-27T19:44:00Z">
-        <w:r>
-          <w:rPr>
-            <w:rFonts w:asciiTheme="majorBidi" w:hAnsiTheme="majorBidi" w:cstheme="majorBidi"/>
-            <w:sz w:val="24"/>
-            <w:szCs w:val="24"/>
-          </w:rPr>
-          <w:delText xml:space="preserve">users </w:delText>
-        </w:r>
-      </w:del>
+      <w:r>
+        <w:rPr>
+          <w:rFonts w:asciiTheme="majorBidi" w:hAnsiTheme="majorBidi" w:cstheme="majorBidi"/>
+          <w:sz w:val="24"/>
+          <w:szCs w:val="24"/>
+        </w:rPr>
+        <w:t xml:space="preserve">the </w:t>
+      </w:r>
       <w:r>
         <w:rPr>
           <w:rFonts w:asciiTheme="majorBidi" w:hAnsiTheme="majorBidi" w:cstheme="majorBidi"/>
@@ -677,51 +599,29 @@
         </w:rPr>
         <w:t xml:space="preserve">autonomy </w:t>
       </w:r>
-      <w:ins w:id="15" w:author="Erik Christian Porse" w:date="2026-05-27T12:44:00Z" w16du:dateUtc="2026-05-27T19:44:00Z">
-        <w:r>
-          <w:rPr>
-            <w:rFonts w:asciiTheme="majorBidi" w:hAnsiTheme="majorBidi" w:cstheme="majorBidi"/>
-            <w:sz w:val="24"/>
-            <w:szCs w:val="24"/>
-          </w:rPr>
-          <w:t xml:space="preserve">of </w:t>
-        </w:r>
-      </w:ins>
-      <w:ins w:id="16" w:author="Erik Christian Porse" w:date="2026-05-27T12:45:00Z" w16du:dateUtc="2026-05-27T19:45:00Z">
-        <w:r>
-          <w:rPr>
-            <w:rFonts w:asciiTheme="majorBidi" w:hAnsiTheme="majorBidi" w:cstheme="majorBidi"/>
-            <w:sz w:val="24"/>
-            <w:szCs w:val="24"/>
-          </w:rPr>
-          <w:t xml:space="preserve">water users </w:t>
-        </w:r>
-      </w:ins>
-      <w:r>
-        <w:rPr>
-          <w:rFonts w:asciiTheme="majorBidi" w:hAnsiTheme="majorBidi" w:cstheme="majorBidi"/>
-          <w:sz w:val="24"/>
-          <w:szCs w:val="24"/>
-        </w:rPr>
-        <w:t xml:space="preserve">to manage </w:t>
-      </w:r>
-      <w:del w:id="17" w:author="Erik Christian Porse" w:date="2026-05-27T12:45:00Z" w16du:dateUtc="2026-05-27T19:45:00Z">
-        <w:r>
-          <w:rPr>
-            <w:rFonts w:asciiTheme="majorBidi" w:hAnsiTheme="majorBidi" w:cstheme="majorBidi"/>
-            <w:sz w:val="24"/>
-            <w:szCs w:val="24"/>
-          </w:rPr>
-          <w:delText xml:space="preserve">their </w:delText>
-        </w:r>
-      </w:del>
-      <w:r>
-        <w:rPr>
-          <w:rFonts w:asciiTheme="majorBidi" w:hAnsiTheme="majorBidi" w:cstheme="majorBidi"/>
-          <w:sz w:val="24"/>
-          <w:szCs w:val="24"/>
-        </w:rPr>
-        <w:t>risks of water shortages.</w:t>
+      <w:r>
+        <w:rPr>
+          <w:rFonts w:asciiTheme="majorBidi" w:hAnsiTheme="majorBidi" w:cstheme="majorBidi"/>
+          <w:sz w:val="24"/>
+          <w:szCs w:val="24"/>
+        </w:rPr>
+        <w:t xml:space="preserve">of </w:t>
+      </w:r>
+      <w:r>
+        <w:rPr>
+          <w:rFonts w:asciiTheme="majorBidi" w:hAnsiTheme="majorBidi" w:cstheme="majorBidi"/>
+          <w:sz w:val="24"/>
+          <w:szCs w:val="24"/>
+        </w:rPr>
+        <w:t xml:space="preserve">water users </w:t>
+      </w:r>
+      <w:r>
+        <w:rPr>
+          <w:rFonts w:asciiTheme="majorBidi" w:hAnsiTheme="majorBidi" w:cstheme="majorBidi"/>
+          <w:sz w:val="24"/>
+          <w:szCs w:val="24"/>
+        </w:rPr>
+        <w:t>to manage risks of water shortages.</w:t>
       </w:r>
     </w:p>
     <w:p>
@@ -781,7 +681,7 @@
         </w:rPr>
         <w:t xml:space="preserve">and uncertainty in future water supply put agricultural users, urban users, Tribal Nations, and ecosystems at risk of water shortages </w:t>
       </w:r>
-      <w:commentRangeStart w:id="18"/>
+      <w:commentRangeStart w:id="0"/>
       <w:r>
         <w:rPr>
           <w:rFonts w:ascii="Times New Roman" w:eastAsia="Times New Roman" w:hAnsi="Times New Roman" w:cs="Times New Roman"/>
@@ -823,7 +723,7 @@
         </w:rPr>
         <w:fldChar w:fldCharType="end"/>
       </w:r>
-      <w:commentRangeEnd w:id="18"/>
+      <w:commentRangeEnd w:id="0"/>
       <w:r>
         <w:rPr>
           <w:rStyle w:val="CommentReference"/>
@@ -831,7 +731,7 @@
           <w:sz w:val="24"/>
           <w:szCs w:val="24"/>
         </w:rPr>
-        <w:commentReference w:id="18"/>
+        <w:commentReference w:id="0"/>
       </w:r>
       <w:r>
         <w:rPr>
@@ -1682,10 +1582,7 @@
         <w:t xml:space="preserve">from their </w:t>
       </w:r>
       <w:r>
-        <w:t>le</w:t>
-      </w:r>
-      <w:r>
-        <w:t>gal entitlements</w:t>
+        <w:t>legal entitlements</w:t>
       </w:r>
       <w:r>
         <w:t>, keep the conserved water in Lake Mead, and withdraw conserved water at a future point in time subject to some constraints. The program was created as part of the 2007 Interim Guidelines</w:t>
@@ -2820,10 +2717,7 @@
         <w:t xml:space="preserve">voluntary Lake Mead </w:t>
       </w:r>
       <w:r>
-        <w:t xml:space="preserve">water </w:t>
-      </w:r>
-      <w:r>
-        <w:t xml:space="preserve">conservation </w:t>
+        <w:t xml:space="preserve">water conservation </w:t>
       </w:r>
       <w:r>
         <w:t>program op</w:t>
@@ -2832,10 +2726,7 @@
         <w:t>e</w:t>
       </w:r>
       <w:r>
-        <w:t xml:space="preserve">rates </w:t>
-      </w:r>
-      <w:r>
-        <w:t xml:space="preserve">with the assumption that </w:t>
+        <w:t xml:space="preserve">rates with the assumption that </w:t>
       </w:r>
       <w:r>
         <w:t xml:space="preserve">the </w:t>
@@ -2880,10 +2771,7 @@
         <w:t xml:space="preserve"> </w:t>
       </w:r>
       <w:r>
-        <w:t xml:space="preserve">legal </w:t>
-      </w:r>
-      <w:r>
-        <w:t>entitlements</w:t>
+        <w:t>legal entitlements</w:t>
       </w:r>
       <w:r>
         <w:t xml:space="preserve">. </w:t>
@@ -3110,20 +2998,13 @@
         <w:t xml:space="preserve">how much </w:t>
       </w:r>
       <w:r>
-        <w:t xml:space="preserve">of that water has </w:t>
-      </w:r>
-      <w:commentRangeStart w:id="19"/>
-      <w:r>
-        <w:t xml:space="preserve">remained </w:t>
-      </w:r>
-      <w:commentRangeEnd w:id="19"/>
-      <w:r>
-        <w:rPr>
-          <w:rStyle w:val="CommentReference"/>
-          <w:sz w:val="24"/>
-          <w:szCs w:val="24"/>
-        </w:rPr>
-        <w:commentReference w:id="19"/>
+        <w:t xml:space="preserve">of that water </w:t>
+      </w:r>
+      <w:r>
+        <w:t>remains</w:t>
+      </w:r>
+      <w:r>
+        <w:t xml:space="preserve"> </w:t>
       </w:r>
       <w:r>
         <w:t>in Lake Mead</w:t>
@@ -5135,15 +5016,7 @@
           <w:sz w:val="24"/>
           <w:szCs w:val="24"/>
         </w:rPr>
-        <w:t xml:space="preserve"> </w:t>
-      </w:r>
-      <w:r>
-        <w:rPr>
-          <w:rFonts w:asciiTheme="majorBidi" w:hAnsiTheme="majorBidi" w:cstheme="majorBidi"/>
-          <w:sz w:val="24"/>
-          <w:szCs w:val="24"/>
-        </w:rPr>
-        <w:t xml:space="preserve">than its </w:t>
+        <w:t xml:space="preserve"> than its </w:t>
       </w:r>
       <w:r>
         <w:rPr>
@@ -5207,15 +5080,7 @@
           <w:sz w:val="24"/>
           <w:szCs w:val="24"/>
         </w:rPr>
-        <w:t xml:space="preserve">Arizona's </w:t>
-      </w:r>
-      <w:r>
-        <w:rPr>
-          <w:rFonts w:asciiTheme="majorBidi" w:hAnsiTheme="majorBidi" w:cstheme="majorBidi"/>
-          <w:sz w:val="24"/>
-          <w:szCs w:val="24"/>
-        </w:rPr>
-        <w:t>water conservation account was credited 2</w:t>
+        <w:t>Arizona's water conservation account was credited 2</w:t>
       </w:r>
       <w:r>
         <w:rPr>
@@ -5691,30 +5556,16 @@
         </w:rPr>
         <w:t xml:space="preserve">rogram </w:t>
       </w:r>
-      <w:del w:id="20" w:author="Erik Christian Porse" w:date="2026-05-27T14:52:00Z" w16du:dateUtc="2026-05-27T21:52:00Z">
-        <w:r>
-          <w:rPr>
-            <w:rFonts w:asciiTheme="majorBidi" w:hAnsiTheme="majorBidi" w:cstheme="majorBidi"/>
-            <w:b/>
-            <w:bCs/>
-            <w:sz w:val="24"/>
-            <w:szCs w:val="24"/>
-          </w:rPr>
-          <w:delText>constraints</w:delText>
-        </w:r>
-      </w:del>
-      <w:ins w:id="21" w:author="Erik Christian Porse" w:date="2026-05-27T14:52:00Z" w16du:dateUtc="2026-05-27T21:52:00Z">
-        <w:r>
-          <w:rPr>
-            <w:rFonts w:asciiTheme="majorBidi" w:hAnsiTheme="majorBidi" w:cstheme="majorBidi"/>
-            <w:b/>
-            <w:bCs/>
-            <w:sz w:val="24"/>
-            <w:szCs w:val="24"/>
-          </w:rPr>
-          <w:t>structure</w:t>
-        </w:r>
-      </w:ins>
+      <w:r>
+        <w:rPr>
+          <w:rFonts w:asciiTheme="majorBidi" w:hAnsiTheme="majorBidi" w:cstheme="majorBidi"/>
+          <w:b/>
+          <w:bCs/>
+          <w:sz w:val="24"/>
+          <w:szCs w:val="24"/>
+        </w:rPr>
+        <w:t>structure</w:t>
+      </w:r>
       <w:r>
         <w:rPr>
           <w:rFonts w:asciiTheme="majorBidi" w:hAnsiTheme="majorBidi" w:cstheme="majorBidi"/>
@@ -5809,24 +5660,15 @@
           <w:sz w:val="24"/>
           <w:szCs w:val="24"/>
         </w:rPr>
-        <w:t xml:space="preserve"> conservation account balances for the three Lower Basin states. The program also prohibits debits</w:t>
-      </w:r>
-      <w:r>
-        <w:rPr>
-          <w:rFonts w:asciiTheme="majorBidi" w:hAnsiTheme="majorBidi" w:cstheme="majorBidi"/>
-          <w:sz w:val="24"/>
-          <w:szCs w:val="24"/>
-        </w:rPr>
-        <w:t>—</w:t>
-      </w:r>
-      <w:commentRangeStart w:id="22"/>
-      <w:r>
-        <w:rPr>
-          <w:rFonts w:asciiTheme="majorBidi" w:hAnsiTheme="majorBidi" w:cstheme="majorBidi"/>
-          <w:sz w:val="24"/>
-          <w:szCs w:val="24"/>
-        </w:rPr>
-        <w:t>withdraw</w:t>
+        <w:t xml:space="preserve"> conservation account balances for the three Lower Basin states. The program also prohibits withdraw</w:t>
+      </w:r>
+      <w:r>
+        <w:rPr>
+          <w:rFonts w:asciiTheme="majorBidi" w:hAnsiTheme="majorBidi" w:cstheme="majorBidi"/>
+          <w:sz w:val="24"/>
+          <w:szCs w:val="24"/>
+        </w:rPr>
+        <w:t>s</w:t>
       </w:r>
       <w:r>
         <w:rPr>
@@ -5836,16 +5678,6 @@
         </w:rPr>
         <w:t xml:space="preserve"> </w:t>
       </w:r>
-      <w:commentRangeEnd w:id="22"/>
-      <w:r>
-        <w:rPr>
-          <w:rStyle w:val="CommentReference"/>
-          <w:rFonts w:asciiTheme="majorBidi" w:hAnsiTheme="majorBidi" w:cstheme="majorBidi"/>
-          <w:sz w:val="24"/>
-          <w:szCs w:val="24"/>
-        </w:rPr>
-        <w:commentReference w:id="22"/>
-      </w:r>
       <w:r>
         <w:rPr>
           <w:rFonts w:asciiTheme="majorBidi" w:hAnsiTheme="majorBidi" w:cstheme="majorBidi"/>
@@ -5868,7 +5700,7 @@
           <w:sz w:val="24"/>
           <w:szCs w:val="24"/>
         </w:rPr>
-        <w:t>—</w:t>
+        <w:t xml:space="preserve"> </w:t>
       </w:r>
       <w:r>
         <w:rPr>
@@ -5892,18 +5724,24 @@
           <w:sz w:val="24"/>
           <w:szCs w:val="24"/>
         </w:rPr>
-        <w:t xml:space="preserve"> (</w:t>
-      </w:r>
-      <w:ins w:id="23" w:author="Erik Christian Porse" w:date="2026-05-27T15:06:00Z" w16du:dateUtc="2026-05-27T22:06:00Z">
-        <w:r>
-          <w:rPr>
-            <w:rFonts w:asciiTheme="majorBidi" w:hAnsiTheme="majorBidi" w:cstheme="majorBidi"/>
-            <w:sz w:val="24"/>
-            <w:szCs w:val="24"/>
-          </w:rPr>
-          <w:t xml:space="preserve">reservoir </w:t>
-        </w:r>
-      </w:ins>
+        <w:t xml:space="preserve"> </w:t>
+      </w:r>
+      <w:r>
+        <w:rPr>
+          <w:rFonts w:asciiTheme="majorBidi" w:hAnsiTheme="majorBidi" w:cstheme="majorBidi"/>
+          <w:sz w:val="24"/>
+          <w:szCs w:val="24"/>
+        </w:rPr>
+        <w:t>(</w:t>
+      </w:r>
+      <w:r>
+        <w:rPr>
+          <w:rFonts w:asciiTheme="majorBidi" w:hAnsiTheme="majorBidi" w:cstheme="majorBidi"/>
+          <w:sz w:val="24"/>
+          <w:szCs w:val="24"/>
+        </w:rPr>
+        <w:t xml:space="preserve">reservoir </w:t>
+      </w:r>
       <w:r>
         <w:rPr>
           <w:rFonts w:asciiTheme="majorBidi" w:hAnsiTheme="majorBidi" w:cstheme="majorBidi"/>
@@ -5912,26 +5750,14 @@
         </w:rPr>
         <w:t>elevation</w:t>
       </w:r>
-      <w:ins w:id="24" w:author="Erik Christian Porse" w:date="2026-05-27T15:06:00Z" w16du:dateUtc="2026-05-27T22:06:00Z">
-        <w:r>
-          <w:rPr>
-            <w:rFonts w:asciiTheme="majorBidi" w:hAnsiTheme="majorBidi" w:cstheme="majorBidi"/>
-            <w:sz w:val="24"/>
-            <w:szCs w:val="24"/>
-          </w:rPr>
-          <w:t xml:space="preserve"> o</w:t>
-        </w:r>
-      </w:ins>
-      <w:ins w:id="25" w:author="Erik Christian Porse" w:date="2026-05-27T15:07:00Z" w16du:dateUtc="2026-05-27T22:07:00Z">
-        <w:r>
-          <w:rPr>
-            <w:rFonts w:asciiTheme="majorBidi" w:hAnsiTheme="majorBidi" w:cstheme="majorBidi"/>
-            <w:sz w:val="24"/>
-            <w:szCs w:val="24"/>
-          </w:rPr>
-          <w:t>f</w:t>
-        </w:r>
-      </w:ins>
+      <w:r>
+        <w:rPr>
+          <w:rFonts w:asciiTheme="majorBidi" w:hAnsiTheme="majorBidi" w:cstheme="majorBidi"/>
+          <w:sz w:val="24"/>
+          <w:szCs w:val="24"/>
+        </w:rPr>
+        <w:t xml:space="preserve"> of</w:t>
+      </w:r>
       <w:r>
         <w:rPr>
           <w:rFonts w:asciiTheme="majorBidi" w:hAnsiTheme="majorBidi" w:cstheme="majorBidi"/>
@@ -5940,16 +5766,14 @@
         </w:rPr>
         <w:t xml:space="preserve"> 1</w:t>
       </w:r>
-      <w:ins w:id="26" w:author="Erik Christian Porse" w:date="2026-05-27T15:07:00Z" w16du:dateUtc="2026-05-27T22:07:00Z">
-        <w:r>
-          <w:rPr>
-            <w:rFonts w:asciiTheme="majorBidi" w:hAnsiTheme="majorBidi" w:cstheme="majorBidi"/>
-            <w:sz w:val="24"/>
-            <w:szCs w:val="24"/>
-          </w:rPr>
-          <w:t>,</w:t>
-        </w:r>
-      </w:ins>
+      <w:r>
+        <w:rPr>
+          <w:rFonts w:asciiTheme="majorBidi" w:hAnsiTheme="majorBidi" w:cstheme="majorBidi"/>
+          <w:sz w:val="24"/>
+          <w:szCs w:val="24"/>
+        </w:rPr>
+        <w:t>,</w:t>
+      </w:r>
       <w:r>
         <w:rPr>
           <w:rFonts w:asciiTheme="majorBidi" w:hAnsiTheme="majorBidi" w:cstheme="majorBidi"/>
@@ -6113,16 +5937,6 @@
         </w:rPr>
         <w:t xml:space="preserve"> program</w:t>
       </w:r>
-      <w:del w:id="27" w:author="Erik Christian Porse" w:date="2026-05-27T15:07:00Z" w16du:dateUtc="2026-05-27T22:07:00Z">
-        <w:r>
-          <w:rPr>
-            <w:rFonts w:asciiTheme="majorBidi" w:hAnsiTheme="majorBidi" w:cstheme="majorBidi"/>
-            <w:sz w:val="24"/>
-            <w:szCs w:val="24"/>
-          </w:rPr>
-          <w:delText xml:space="preserve"> are complex</w:delText>
-        </w:r>
-      </w:del>
       <w:r>
         <w:rPr>
           <w:rFonts w:asciiTheme="majorBidi" w:hAnsiTheme="majorBidi" w:cstheme="majorBidi"/>
@@ -6163,16 +5977,14 @@
         </w:rPr>
         <w:t>andatory water shortages increase as Lake Mead’s level declines from</w:t>
       </w:r>
-      <w:ins w:id="28" w:author="Erik Christian Porse" w:date="2026-05-27T15:08:00Z" w16du:dateUtc="2026-05-27T22:08:00Z">
-        <w:r>
-          <w:rPr>
-            <w:rFonts w:asciiTheme="majorBidi" w:hAnsiTheme="majorBidi" w:cstheme="majorBidi"/>
-            <w:sz w:val="24"/>
-            <w:szCs w:val="24"/>
-          </w:rPr>
-          <w:t xml:space="preserve"> an</w:t>
-        </w:r>
-      </w:ins>
+      <w:r>
+        <w:rPr>
+          <w:rFonts w:asciiTheme="majorBidi" w:hAnsiTheme="majorBidi" w:cstheme="majorBidi"/>
+          <w:sz w:val="24"/>
+          <w:szCs w:val="24"/>
+        </w:rPr>
+        <w:t xml:space="preserve"> an</w:t>
+      </w:r>
       <w:r>
         <w:rPr>
           <w:rFonts w:asciiTheme="majorBidi" w:hAnsiTheme="majorBidi" w:cstheme="majorBidi"/>
@@ -6181,16 +5993,14 @@
         </w:rPr>
         <w:t xml:space="preserve"> elevation </w:t>
       </w:r>
-      <w:ins w:id="29" w:author="Erik Christian Porse" w:date="2026-05-27T15:08:00Z" w16du:dateUtc="2026-05-27T22:08:00Z">
-        <w:r>
-          <w:rPr>
-            <w:rFonts w:asciiTheme="majorBidi" w:hAnsiTheme="majorBidi" w:cstheme="majorBidi"/>
-            <w:sz w:val="24"/>
-            <w:szCs w:val="24"/>
-          </w:rPr>
-          <w:t xml:space="preserve">of </w:t>
-        </w:r>
-      </w:ins>
+      <w:r>
+        <w:rPr>
+          <w:rFonts w:asciiTheme="majorBidi" w:hAnsiTheme="majorBidi" w:cstheme="majorBidi"/>
+          <w:sz w:val="24"/>
+          <w:szCs w:val="24"/>
+        </w:rPr>
+        <w:t xml:space="preserve">of </w:t>
+      </w:r>
       <w:r>
         <w:rPr>
           <w:rFonts w:asciiTheme="majorBidi" w:hAnsiTheme="majorBidi" w:cstheme="majorBidi"/>
@@ -6420,23 +6230,29 @@
         </w:rPr>
         <w:t>water conservation account balance</w:t>
       </w:r>
-      <w:ins w:id="30" w:author="Erik Christian Porse" w:date="2026-05-27T15:08:00Z" w16du:dateUtc="2026-05-27T22:08:00Z">
-        <w:r>
-          <w:rPr>
-            <w:rFonts w:asciiTheme="majorBidi" w:hAnsiTheme="majorBidi" w:cstheme="majorBidi"/>
-            <w:sz w:val="24"/>
-            <w:szCs w:val="24"/>
-          </w:rPr>
-          <w:t>s</w:t>
-        </w:r>
-      </w:ins>
-      <w:r>
-        <w:rPr>
-          <w:rFonts w:asciiTheme="majorBidi" w:hAnsiTheme="majorBidi" w:cstheme="majorBidi"/>
-          <w:sz w:val="24"/>
-          <w:szCs w:val="24"/>
-        </w:rPr>
-        <w:t xml:space="preserve"> to meet their mandatory reductions in water use. This transfer is an administrative action and does not change Lake Mead level. </w:t>
+      <w:r>
+        <w:rPr>
+          <w:rFonts w:asciiTheme="majorBidi" w:hAnsiTheme="majorBidi" w:cstheme="majorBidi"/>
+          <w:sz w:val="24"/>
+          <w:szCs w:val="24"/>
+        </w:rPr>
+        <w:t>s</w:t>
+      </w:r>
+      <w:r>
+        <w:rPr>
+          <w:rFonts w:asciiTheme="majorBidi" w:hAnsiTheme="majorBidi" w:cstheme="majorBidi"/>
+          <w:sz w:val="24"/>
+          <w:szCs w:val="24"/>
+        </w:rPr>
+        <w:t xml:space="preserve"> to meet their mandatory reductions in water use. This transfer is an administrative action and </w:t>
+      </w:r>
+      <w:r>
+        <w:rPr>
+          <w:rFonts w:asciiTheme="majorBidi" w:hAnsiTheme="majorBidi" w:cstheme="majorBidi"/>
+          <w:sz w:val="24"/>
+          <w:szCs w:val="24"/>
+        </w:rPr>
+        <w:t xml:space="preserve">does not change Lake Mead level. </w:t>
       </w:r>
       <w:r>
         <w:rPr>
@@ -6820,11 +6636,9 @@
       <w:r>
         <w:t>. The data span the period 2007 to 2025</w:t>
       </w:r>
-      <w:ins w:id="31" w:author="David Rosenberg" w:date="2026-05-29T12:20:00Z" w16du:dateUtc="2026-05-29T18:20:00Z">
-        <w:r>
-          <w:t>.</w:t>
-        </w:r>
-      </w:ins>
+      <w:r>
+        <w:t>.</w:t>
+      </w:r>
     </w:p>
     <w:p>
       <w:pPr>
@@ -7875,6 +7689,13 @@
           <w:sz w:val="24"/>
           <w:szCs w:val="24"/>
         </w:rPr>
+      </w:r>
+      <w:r>
+        <w:rPr>
+          <w:rFonts w:asciiTheme="majorBidi" w:hAnsiTheme="majorBidi" w:cstheme="majorBidi"/>
+          <w:sz w:val="24"/>
+          <w:szCs w:val="24"/>
+        </w:rPr>
         <w:fldChar w:fldCharType="separate"/>
       </w:r>
       <w:r>
@@ -8243,16 +8064,6 @@
     </w:p>
     <w:p>
       <w:pPr>
-        <w:pStyle w:val="ListParagraph"/>
-        <w:rPr>
-          <w:rFonts w:asciiTheme="majorBidi" w:hAnsiTheme="majorBidi" w:cstheme="majorBidi"/>
-          <w:sz w:val="24"/>
-          <w:szCs w:val="24"/>
-        </w:rPr>
-      </w:pPr>
-    </w:p>
-    <w:p>
-      <w:pPr>
         <w:rPr>
           <w:rFonts w:asciiTheme="majorBidi" w:hAnsiTheme="majorBidi" w:cstheme="majorBidi"/>
           <w:sz w:val="24"/>
@@ -8586,6 +8397,97 @@
     </w:p>
     <w:p>
       <w:pPr>
+        <w:pStyle w:val="Heading1"/>
+      </w:pPr>
+      <w:r>
+        <w:t xml:space="preserve">Program </w:t>
+      </w:r>
+      <w:r>
+        <w:t>Challenges</w:t>
+      </w:r>
+    </w:p>
+    <w:p>
+      <w:pPr>
+        <w:rPr>
+          <w:rFonts w:asciiTheme="majorBidi" w:hAnsiTheme="majorBidi" w:cstheme="majorBidi"/>
+          <w:sz w:val="24"/>
+          <w:szCs w:val="24"/>
+        </w:rPr>
+      </w:pPr>
+      <w:r>
+        <w:rPr>
+          <w:rFonts w:asciiTheme="majorBidi" w:hAnsiTheme="majorBidi" w:cstheme="majorBidi"/>
+          <w:sz w:val="24"/>
+          <w:szCs w:val="24"/>
+        </w:rPr>
+        <w:t>Despite successes, there are challenges to motivating</w:t>
+      </w:r>
+      <w:r>
+        <w:rPr>
+          <w:rFonts w:asciiTheme="majorBidi" w:hAnsiTheme="majorBidi" w:cstheme="majorBidi"/>
+          <w:sz w:val="24"/>
+          <w:szCs w:val="24"/>
+        </w:rPr>
+        <w:t xml:space="preserve"> users to continue to conserve water</w:t>
+      </w:r>
+      <w:r>
+        <w:rPr>
+          <w:rFonts w:asciiTheme="majorBidi" w:hAnsiTheme="majorBidi" w:cstheme="majorBidi"/>
+          <w:sz w:val="24"/>
+          <w:szCs w:val="24"/>
+        </w:rPr>
+        <w:t xml:space="preserve"> and</w:t>
+      </w:r>
+      <w:r>
+        <w:rPr>
+          <w:rFonts w:asciiTheme="majorBidi" w:hAnsiTheme="majorBidi" w:cstheme="majorBidi"/>
+          <w:sz w:val="24"/>
+          <w:szCs w:val="24"/>
+        </w:rPr>
+        <w:t xml:space="preserve"> leave that water in Lake Mead</w:t>
+      </w:r>
+      <w:r>
+        <w:rPr>
+          <w:rFonts w:asciiTheme="majorBidi" w:hAnsiTheme="majorBidi" w:cstheme="majorBidi"/>
+          <w:sz w:val="24"/>
+          <w:szCs w:val="24"/>
+        </w:rPr>
+        <w:t xml:space="preserve">. There are also challenges to </w:t>
+      </w:r>
+      <w:r>
+        <w:rPr>
+          <w:rFonts w:asciiTheme="majorBidi" w:hAnsiTheme="majorBidi" w:cstheme="majorBidi"/>
+          <w:sz w:val="24"/>
+          <w:szCs w:val="24"/>
+        </w:rPr>
+        <w:t xml:space="preserve">access conserved water </w:t>
+      </w:r>
+      <w:r>
+        <w:rPr>
+          <w:rFonts w:asciiTheme="majorBidi" w:hAnsiTheme="majorBidi" w:cstheme="majorBidi"/>
+          <w:sz w:val="24"/>
+          <w:szCs w:val="24"/>
+        </w:rPr>
+        <w:t>as inflow and reservoir storage decline</w:t>
+      </w:r>
+      <w:r>
+        <w:rPr>
+          <w:rFonts w:asciiTheme="majorBidi" w:hAnsiTheme="majorBidi" w:cstheme="majorBidi"/>
+          <w:sz w:val="24"/>
+          <w:szCs w:val="24"/>
+        </w:rPr>
+        <w:t>.</w:t>
+      </w:r>
+    </w:p>
+    <w:p>
+      <w:pPr>
+        <w:rPr>
+          <w:rFonts w:asciiTheme="majorBidi" w:hAnsiTheme="majorBidi" w:cstheme="majorBidi"/>
+          <w:sz w:val="24"/>
+          <w:szCs w:val="24"/>
+        </w:rPr>
+      </w:pPr>
+      <w:r>
         <w:rPr>
           <w:rFonts w:asciiTheme="majorBidi" w:hAnsiTheme="majorBidi" w:cstheme="majorBidi"/>
           <w:b/>
@@ -8593,164 +8495,6 @@
           <w:sz w:val="24"/>
           <w:szCs w:val="24"/>
         </w:rPr>
-      </w:pPr>
-    </w:p>
-    <w:p>
-      <w:pPr>
-        <w:pStyle w:val="Heading1"/>
-      </w:pPr>
-      <w:r>
-        <w:t xml:space="preserve">Program </w:t>
-      </w:r>
-      <w:r>
-        <w:t>Challenges</w:t>
-      </w:r>
-    </w:p>
-    <w:p>
-      <w:pPr>
-        <w:rPr>
-          <w:rFonts w:asciiTheme="majorBidi" w:hAnsiTheme="majorBidi" w:cstheme="majorBidi"/>
-          <w:sz w:val="24"/>
-          <w:szCs w:val="24"/>
-        </w:rPr>
-      </w:pPr>
-      <w:del w:id="32" w:author="Erik Christian Porse" w:date="2026-05-27T15:43:00Z" w16du:dateUtc="2026-05-27T22:43:00Z">
-        <w:r>
-          <w:rPr>
-            <w:rFonts w:asciiTheme="majorBidi" w:hAnsiTheme="majorBidi" w:cstheme="majorBidi"/>
-            <w:sz w:val="24"/>
-            <w:szCs w:val="24"/>
-          </w:rPr>
-          <w:delText xml:space="preserve">Here we describe </w:delText>
-        </w:r>
-        <w:r>
-          <w:rPr>
-            <w:rFonts w:asciiTheme="majorBidi" w:hAnsiTheme="majorBidi" w:cstheme="majorBidi"/>
-            <w:sz w:val="24"/>
-            <w:szCs w:val="24"/>
-          </w:rPr>
-          <w:delText>4</w:delText>
-        </w:r>
-        <w:r>
-          <w:rPr>
-            <w:rFonts w:asciiTheme="majorBidi" w:hAnsiTheme="majorBidi" w:cstheme="majorBidi"/>
-            <w:sz w:val="24"/>
-            <w:szCs w:val="24"/>
-          </w:rPr>
-          <w:delText xml:space="preserve"> </w:delText>
-        </w:r>
-        <w:r>
-          <w:rPr>
-            <w:rFonts w:asciiTheme="majorBidi" w:hAnsiTheme="majorBidi" w:cstheme="majorBidi"/>
-            <w:sz w:val="24"/>
-            <w:szCs w:val="24"/>
-          </w:rPr>
-          <w:delText xml:space="preserve">challenges </w:delText>
-        </w:r>
-        <w:r>
-          <w:rPr>
-            <w:rFonts w:asciiTheme="majorBidi" w:hAnsiTheme="majorBidi" w:cstheme="majorBidi"/>
-            <w:sz w:val="24"/>
-            <w:szCs w:val="24"/>
-          </w:rPr>
-          <w:delText>to motive</w:delText>
-        </w:r>
-      </w:del>
-      <w:ins w:id="33" w:author="Erik Christian Porse" w:date="2026-05-27T15:43:00Z" w16du:dateUtc="2026-05-27T22:43:00Z">
-        <w:r>
-          <w:rPr>
-            <w:rFonts w:asciiTheme="majorBidi" w:hAnsiTheme="majorBidi" w:cstheme="majorBidi"/>
-            <w:sz w:val="24"/>
-            <w:szCs w:val="24"/>
-          </w:rPr>
-          <w:t>Despite successes, there are challenges to motivating</w:t>
-        </w:r>
-      </w:ins>
-      <w:r>
-        <w:rPr>
-          <w:rFonts w:asciiTheme="majorBidi" w:hAnsiTheme="majorBidi" w:cstheme="majorBidi"/>
-          <w:sz w:val="24"/>
-          <w:szCs w:val="24"/>
-        </w:rPr>
-        <w:t xml:space="preserve"> users to continue to conserve water</w:t>
-      </w:r>
-      <w:ins w:id="34" w:author="Erik Christian Porse" w:date="2026-05-27T15:44:00Z" w16du:dateUtc="2026-05-27T22:44:00Z">
-        <w:r>
-          <w:rPr>
-            <w:rFonts w:asciiTheme="majorBidi" w:hAnsiTheme="majorBidi" w:cstheme="majorBidi"/>
-            <w:sz w:val="24"/>
-            <w:szCs w:val="24"/>
-          </w:rPr>
-          <w:t xml:space="preserve"> and</w:t>
-        </w:r>
-      </w:ins>
-      <w:del w:id="35" w:author="Erik Christian Porse" w:date="2026-05-27T15:44:00Z" w16du:dateUtc="2026-05-27T22:44:00Z">
-        <w:r>
-          <w:rPr>
-            <w:rFonts w:asciiTheme="majorBidi" w:hAnsiTheme="majorBidi" w:cstheme="majorBidi"/>
-            <w:sz w:val="24"/>
-            <w:szCs w:val="24"/>
-          </w:rPr>
-          <w:delText>,</w:delText>
-        </w:r>
-      </w:del>
-      <w:r>
-        <w:rPr>
-          <w:rFonts w:asciiTheme="majorBidi" w:hAnsiTheme="majorBidi" w:cstheme="majorBidi"/>
-          <w:sz w:val="24"/>
-          <w:szCs w:val="24"/>
-        </w:rPr>
-        <w:t xml:space="preserve"> leave that water in Lake Mead</w:t>
-      </w:r>
-      <w:r>
-        <w:rPr>
-          <w:rFonts w:asciiTheme="majorBidi" w:hAnsiTheme="majorBidi" w:cstheme="majorBidi"/>
-          <w:sz w:val="24"/>
-          <w:szCs w:val="24"/>
-        </w:rPr>
-        <w:t xml:space="preserve">. There are also challenges to </w:t>
-      </w:r>
-      <w:r>
-        <w:rPr>
-          <w:rFonts w:asciiTheme="majorBidi" w:hAnsiTheme="majorBidi" w:cstheme="majorBidi"/>
-          <w:sz w:val="24"/>
-          <w:szCs w:val="24"/>
-        </w:rPr>
-        <w:t xml:space="preserve">access conserved water </w:t>
-      </w:r>
-      <w:r>
-        <w:rPr>
-          <w:rFonts w:asciiTheme="majorBidi" w:hAnsiTheme="majorBidi" w:cstheme="majorBidi"/>
-          <w:sz w:val="24"/>
-          <w:szCs w:val="24"/>
-        </w:rPr>
-        <w:t>as inflow and reservoir storage decline</w:t>
-      </w:r>
-      <w:r>
-        <w:rPr>
-          <w:rFonts w:asciiTheme="majorBidi" w:hAnsiTheme="majorBidi" w:cstheme="majorBidi"/>
-          <w:sz w:val="24"/>
-          <w:szCs w:val="24"/>
-        </w:rPr>
-        <w:t>.</w:t>
-      </w:r>
-    </w:p>
-    <w:p>
-      <w:pPr>
-        <w:rPr>
-          <w:rFonts w:asciiTheme="majorBidi" w:hAnsiTheme="majorBidi" w:cstheme="majorBidi"/>
-          <w:sz w:val="24"/>
-          <w:szCs w:val="24"/>
-        </w:rPr>
-      </w:pPr>
-      <w:r>
-        <w:rPr>
-          <w:rFonts w:asciiTheme="majorBidi" w:hAnsiTheme="majorBidi" w:cstheme="majorBidi"/>
-          <w:b/>
-          <w:bCs/>
-          <w:sz w:val="24"/>
-          <w:szCs w:val="24"/>
-        </w:rPr>
         <w:t>Reservoirs can draw down quickly</w:t>
       </w:r>
       <w:r>
@@ -8783,16 +8527,7 @@
           <w:sz w:val="24"/>
           <w:szCs w:val="24"/>
         </w:rPr>
-        <w:t xml:space="preserve"> for </w:t>
-      </w:r>
-      <w:commentRangeStart w:id="36"/>
-      <w:r>
-        <w:rPr>
-          <w:rFonts w:asciiTheme="majorBidi" w:hAnsiTheme="majorBidi" w:cstheme="majorBidi"/>
-          <w:sz w:val="24"/>
-          <w:szCs w:val="24"/>
-        </w:rPr>
-        <w:t>withdrawal</w:t>
+        <w:t xml:space="preserve"> for withdraw</w:t>
       </w:r>
       <w:r>
         <w:rPr>
@@ -8802,7 +8537,64 @@
         </w:rPr>
         <w:t xml:space="preserve"> </w:t>
       </w:r>
-      <w:commentRangeEnd w:id="36"/>
+      <w:r>
+        <w:rPr>
+          <w:rFonts w:asciiTheme="majorBidi" w:hAnsiTheme="majorBidi" w:cstheme="majorBidi"/>
+          <w:sz w:val="24"/>
+          <w:szCs w:val="24"/>
+        </w:rPr>
+        <w:t>in the future</w:t>
+      </w:r>
+      <w:r>
+        <w:rPr>
+          <w:rFonts w:asciiTheme="majorBidi" w:hAnsiTheme="majorBidi" w:cstheme="majorBidi"/>
+          <w:sz w:val="24"/>
+          <w:szCs w:val="24"/>
+        </w:rPr>
+        <w:t xml:space="preserve">. With </w:t>
+      </w:r>
+      <w:r>
+        <w:rPr>
+          <w:rFonts w:asciiTheme="majorBidi" w:hAnsiTheme="majorBidi" w:cstheme="majorBidi"/>
+          <w:sz w:val="24"/>
+          <w:szCs w:val="24"/>
+        </w:rPr>
+        <w:t xml:space="preserve">current elevation of </w:t>
+      </w:r>
+      <w:r>
+        <w:rPr>
+          <w:rFonts w:asciiTheme="majorBidi" w:hAnsiTheme="majorBidi" w:cstheme="majorBidi"/>
+          <w:sz w:val="24"/>
+          <w:szCs w:val="24"/>
+        </w:rPr>
+        <w:t>multiple years of debits</w:t>
+      </w:r>
+      <w:r>
+        <w:rPr>
+          <w:rFonts w:asciiTheme="majorBidi" w:hAnsiTheme="majorBidi" w:cstheme="majorBidi"/>
+          <w:sz w:val="24"/>
+          <w:szCs w:val="24"/>
+        </w:rPr>
+        <w:t xml:space="preserve"> and current </w:t>
+      </w:r>
+      <w:r>
+        <w:rPr>
+          <w:rFonts w:asciiTheme="majorBidi" w:hAnsiTheme="majorBidi" w:cstheme="majorBidi"/>
+          <w:sz w:val="24"/>
+          <w:szCs w:val="24"/>
+        </w:rPr>
+        <w:t xml:space="preserve">, Lake Mead can drawdown close to the protection elevation in a few </w:t>
+      </w:r>
+      <w:commentRangeStart w:id="1"/>
+      <w:r>
+        <w:rPr>
+          <w:rFonts w:asciiTheme="majorBidi" w:hAnsiTheme="majorBidi" w:cstheme="majorBidi"/>
+          <w:sz w:val="24"/>
+          <w:szCs w:val="24"/>
+        </w:rPr>
+        <w:t>years</w:t>
+      </w:r>
+      <w:commentRangeEnd w:id="1"/>
       <w:r>
         <w:rPr>
           <w:rStyle w:val="CommentReference"/>
@@ -8810,23 +8602,71 @@
           <w:sz w:val="24"/>
           <w:szCs w:val="24"/>
         </w:rPr>
-        <w:commentReference w:id="36"/>
-      </w:r>
-      <w:r>
-        <w:rPr>
-          <w:rFonts w:asciiTheme="majorBidi" w:hAnsiTheme="majorBidi" w:cstheme="majorBidi"/>
-          <w:sz w:val="24"/>
-          <w:szCs w:val="24"/>
-        </w:rPr>
-        <w:t>in the future</w:t>
-      </w:r>
-      <w:r>
-        <w:rPr>
-          <w:rFonts w:asciiTheme="majorBidi" w:hAnsiTheme="majorBidi" w:cstheme="majorBidi"/>
-          <w:sz w:val="24"/>
-          <w:szCs w:val="24"/>
-        </w:rPr>
-        <w:t xml:space="preserve">. With multiple </w:t>
+        <w:commentReference w:id="1"/>
+      </w:r>
+      <w:r>
+        <w:rPr>
+          <w:rFonts w:asciiTheme="majorBidi" w:hAnsiTheme="majorBidi" w:cstheme="majorBidi"/>
+          <w:sz w:val="24"/>
+          <w:szCs w:val="24"/>
+        </w:rPr>
+        <w:t xml:space="preserve">. </w:t>
+      </w:r>
+      <w:r>
+        <w:rPr>
+          <w:rFonts w:asciiTheme="majorBidi" w:hAnsiTheme="majorBidi" w:cstheme="majorBidi"/>
+          <w:sz w:val="24"/>
+          <w:szCs w:val="24"/>
+        </w:rPr>
+        <w:t>Within the current conservation framework,</w:t>
+      </w:r>
+      <w:r>
+        <w:rPr>
+          <w:rFonts w:asciiTheme="majorBidi" w:hAnsiTheme="majorBidi" w:cstheme="majorBidi"/>
+          <w:sz w:val="24"/>
+          <w:szCs w:val="24"/>
+        </w:rPr>
+        <w:t xml:space="preserve"> Lower Basin states </w:t>
+      </w:r>
+      <w:r>
+        <w:rPr>
+          <w:rFonts w:asciiTheme="majorBidi" w:hAnsiTheme="majorBidi" w:cstheme="majorBidi"/>
+          <w:sz w:val="24"/>
+          <w:szCs w:val="24"/>
+        </w:rPr>
+        <w:t xml:space="preserve">and Mexico </w:t>
+      </w:r>
+      <w:r>
+        <w:rPr>
+          <w:rFonts w:asciiTheme="majorBidi" w:hAnsiTheme="majorBidi" w:cstheme="majorBidi"/>
+          <w:sz w:val="24"/>
+          <w:szCs w:val="24"/>
+        </w:rPr>
+        <w:t>loaned the Colorado River system 3.</w:t>
+      </w:r>
+      <w:r>
+        <w:rPr>
+          <w:rFonts w:asciiTheme="majorBidi" w:hAnsiTheme="majorBidi" w:cstheme="majorBidi"/>
+          <w:sz w:val="24"/>
+          <w:szCs w:val="24"/>
+        </w:rPr>
+        <w:t>6</w:t>
+      </w:r>
+      <w:r>
+        <w:rPr>
+          <w:rFonts w:asciiTheme="majorBidi" w:hAnsiTheme="majorBidi" w:cstheme="majorBidi"/>
+          <w:sz w:val="24"/>
+          <w:szCs w:val="24"/>
+        </w:rPr>
+        <w:t xml:space="preserve"> million acre-feet of water</w:t>
+      </w:r>
+      <w:r>
+        <w:rPr>
+          <w:rFonts w:asciiTheme="majorBidi" w:hAnsiTheme="majorBidi" w:cstheme="majorBidi"/>
+          <w:sz w:val="24"/>
+          <w:szCs w:val="24"/>
+        </w:rPr>
+        <w:t xml:space="preserve">, which some </w:t>
       </w:r>
       <w:r>
         <w:rPr>
@@ -8835,90 +8675,7 @@
           <w:szCs w:val="24"/>
         </w:rPr>
         <w:lastRenderedPageBreak/>
-        <w:t xml:space="preserve">years of debits, Lake Mead can drawdown close to the protection elevation in a few </w:t>
-      </w:r>
-      <w:commentRangeStart w:id="37"/>
-      <w:r>
-        <w:rPr>
-          <w:rFonts w:asciiTheme="majorBidi" w:hAnsiTheme="majorBidi" w:cstheme="majorBidi"/>
-          <w:sz w:val="24"/>
-          <w:szCs w:val="24"/>
-        </w:rPr>
-        <w:t>years</w:t>
-      </w:r>
-      <w:commentRangeEnd w:id="37"/>
-      <w:r>
-        <w:rPr>
-          <w:rStyle w:val="CommentReference"/>
-          <w:rFonts w:asciiTheme="majorBidi" w:hAnsiTheme="majorBidi" w:cstheme="majorBidi"/>
-          <w:sz w:val="24"/>
-          <w:szCs w:val="24"/>
-        </w:rPr>
-        <w:commentReference w:id="37"/>
-      </w:r>
-      <w:r>
-        <w:rPr>
-          <w:rFonts w:asciiTheme="majorBidi" w:hAnsiTheme="majorBidi" w:cstheme="majorBidi"/>
-          <w:sz w:val="24"/>
-          <w:szCs w:val="24"/>
-        </w:rPr>
-        <w:t xml:space="preserve">. </w:t>
-      </w:r>
-      <w:r>
-        <w:rPr>
-          <w:rFonts w:asciiTheme="majorBidi" w:hAnsiTheme="majorBidi" w:cstheme="majorBidi"/>
-          <w:sz w:val="24"/>
-          <w:szCs w:val="24"/>
-        </w:rPr>
-        <w:t>Within the current conservation framework,</w:t>
-      </w:r>
-      <w:r>
-        <w:rPr>
-          <w:rFonts w:asciiTheme="majorBidi" w:hAnsiTheme="majorBidi" w:cstheme="majorBidi"/>
-          <w:sz w:val="24"/>
-          <w:szCs w:val="24"/>
-        </w:rPr>
-        <w:t xml:space="preserve"> Lower Basin states </w:t>
-      </w:r>
-      <w:r>
-        <w:rPr>
-          <w:rFonts w:asciiTheme="majorBidi" w:hAnsiTheme="majorBidi" w:cstheme="majorBidi"/>
-          <w:sz w:val="24"/>
-          <w:szCs w:val="24"/>
-        </w:rPr>
-        <w:t xml:space="preserve">and Mexico </w:t>
-      </w:r>
-      <w:r>
-        <w:rPr>
-          <w:rFonts w:asciiTheme="majorBidi" w:hAnsiTheme="majorBidi" w:cstheme="majorBidi"/>
-          <w:sz w:val="24"/>
-          <w:szCs w:val="24"/>
-        </w:rPr>
-        <w:t>loaned the Colorado River system 3.</w:t>
-      </w:r>
-      <w:r>
-        <w:rPr>
-          <w:rFonts w:asciiTheme="majorBidi" w:hAnsiTheme="majorBidi" w:cstheme="majorBidi"/>
-          <w:sz w:val="24"/>
-          <w:szCs w:val="24"/>
-        </w:rPr>
-        <w:t>6</w:t>
-      </w:r>
-      <w:r>
-        <w:rPr>
-          <w:rFonts w:asciiTheme="majorBidi" w:hAnsiTheme="majorBidi" w:cstheme="majorBidi"/>
-          <w:sz w:val="24"/>
-          <w:szCs w:val="24"/>
-        </w:rPr>
-        <w:t xml:space="preserve"> million acre-feet of water</w:t>
-      </w:r>
-      <w:r>
-        <w:rPr>
-          <w:rFonts w:asciiTheme="majorBidi" w:hAnsiTheme="majorBidi" w:cstheme="majorBidi"/>
-          <w:sz w:val="24"/>
-          <w:szCs w:val="24"/>
-        </w:rPr>
-        <w:t xml:space="preserve">, which some or all </w:t>
+        <w:t xml:space="preserve">or all </w:t>
       </w:r>
       <w:r>
         <w:rPr>
@@ -9236,7 +8993,7 @@
         </w:rPr>
         <w:t xml:space="preserve"> </w:t>
       </w:r>
-      <w:commentRangeStart w:id="38"/>
+      <w:commentRangeStart w:id="2"/>
       <w:r>
         <w:rPr>
           <w:rFonts w:asciiTheme="majorBidi" w:hAnsiTheme="majorBidi" w:cstheme="majorBidi"/>
@@ -9245,7 +9002,7 @@
         </w:rPr>
         <w:t xml:space="preserve">lower debits </w:t>
       </w:r>
-      <w:commentRangeEnd w:id="38"/>
+      <w:commentRangeEnd w:id="2"/>
       <w:r>
         <w:rPr>
           <w:rStyle w:val="CommentReference"/>
@@ -9253,7 +9010,7 @@
           <w:sz w:val="24"/>
           <w:szCs w:val="24"/>
         </w:rPr>
-        <w:commentReference w:id="38"/>
+        <w:commentReference w:id="2"/>
       </w:r>
       <w:r>
         <w:rPr>
@@ -9294,7 +9051,7 @@
           <w:szCs w:val="24"/>
         </w:rPr>
       </w:pPr>
-      <w:commentRangeStart w:id="39"/>
+      <w:commentRangeStart w:id="3"/>
       <w:r>
         <w:rPr>
           <w:rFonts w:asciiTheme="majorBidi" w:hAnsiTheme="majorBidi" w:cstheme="majorBidi"/>
@@ -9417,7 +9174,7 @@
         </w:rPr>
         <w:t xml:space="preserve"> their accounts.</w:t>
       </w:r>
-      <w:commentRangeEnd w:id="39"/>
+      <w:commentRangeEnd w:id="3"/>
       <w:r>
         <w:rPr>
           <w:rStyle w:val="CommentReference"/>
@@ -9425,7 +9182,7 @@
           <w:sz w:val="24"/>
           <w:szCs w:val="24"/>
         </w:rPr>
-        <w:commentReference w:id="39"/>
+        <w:commentReference w:id="3"/>
       </w:r>
     </w:p>
     <w:p>
@@ -9727,7 +9484,7 @@
         </w:rPr>
         <w:t>Lake Mead storage above</w:t>
       </w:r>
-      <w:ins w:id="40" w:author="Erik Christian Porse" w:date="2026-05-27T15:50:00Z" w16du:dateUtc="2026-05-27T22:50:00Z">
+      <w:ins w:id="4" w:author="Erik Christian Porse" w:date="2026-05-27T15:50:00Z" w16du:dateUtc="2026-05-27T22:50:00Z">
         <w:r>
           <w:rPr>
             <w:rFonts w:asciiTheme="majorBidi" w:hAnsiTheme="majorBidi" w:cstheme="majorBidi"/>
@@ -9745,7 +9502,7 @@
         </w:rPr>
         <w:t xml:space="preserve"> elevation</w:t>
       </w:r>
-      <w:ins w:id="41" w:author="Erik Christian Porse" w:date="2026-05-27T15:50:00Z" w16du:dateUtc="2026-05-27T22:50:00Z">
+      <w:ins w:id="5" w:author="Erik Christian Porse" w:date="2026-05-27T15:50:00Z" w16du:dateUtc="2026-05-27T22:50:00Z">
         <w:r>
           <w:rPr>
             <w:rFonts w:asciiTheme="majorBidi" w:hAnsiTheme="majorBidi" w:cstheme="majorBidi"/>
@@ -9870,7 +9627,7 @@
         </w:rPr>
         <w:t>exceed</w:t>
       </w:r>
-      <w:ins w:id="42" w:author="Erik Christian Porse" w:date="2026-05-27T15:51:00Z" w16du:dateUtc="2026-05-27T22:51:00Z">
+      <w:ins w:id="6" w:author="Erik Christian Porse" w:date="2026-05-27T15:51:00Z" w16du:dateUtc="2026-05-27T22:51:00Z">
         <w:r>
           <w:rPr>
             <w:rFonts w:asciiTheme="majorBidi" w:hAnsiTheme="majorBidi" w:cstheme="majorBidi"/>
@@ -9896,7 +9653,7 @@
         </w:rPr>
         <w:t xml:space="preserve">the sum of </w:t>
       </w:r>
-      <w:del w:id="43" w:author="Erik Christian Porse" w:date="2026-05-27T15:51:00Z" w16du:dateUtc="2026-05-27T22:51:00Z">
+      <w:del w:id="7" w:author="Erik Christian Porse" w:date="2026-05-27T15:51:00Z" w16du:dateUtc="2026-05-27T22:51:00Z">
         <w:r>
           <w:rPr>
             <w:rFonts w:asciiTheme="majorBidi" w:hAnsiTheme="majorBidi" w:cstheme="majorBidi"/>
@@ -9914,7 +9671,7 @@
         </w:rPr>
         <w:t xml:space="preserve">legal entitlements of 9.0 million acre-feet per </w:t>
       </w:r>
-      <w:commentRangeStart w:id="44"/>
+      <w:commentRangeStart w:id="8"/>
       <w:r>
         <w:rPr>
           <w:rFonts w:asciiTheme="majorBidi" w:hAnsiTheme="majorBidi" w:cstheme="majorBidi"/>
@@ -9923,7 +9680,7 @@
         </w:rPr>
         <w:t>year</w:t>
       </w:r>
-      <w:commentRangeEnd w:id="44"/>
+      <w:commentRangeEnd w:id="8"/>
       <w:r>
         <w:rPr>
           <w:rStyle w:val="CommentReference"/>
@@ -9931,7 +9688,7 @@
           <w:sz w:val="24"/>
           <w:szCs w:val="24"/>
         </w:rPr>
-        <w:commentReference w:id="44"/>
+        <w:commentReference w:id="8"/>
       </w:r>
       <w:r>
         <w:rPr>
@@ -10036,7 +9793,7 @@
         </w:rPr>
         <w:lastRenderedPageBreak/>
         <w:drawing>
-          <wp:inline distT="0" distB="0" distL="0" distR="0" wp14:anchorId="4E4DC790" wp14:editId="27AF331E">
+          <wp:inline distT="0" distB="0" distL="0" distR="0" wp14:anchorId="4E4DC790" wp14:editId="359181E2">
             <wp:extent cx="5929566" cy="3377110"/>
             <wp:effectExtent l="0" t="0" r="0" b="0"/>
             <wp:docPr id="496325522" name="Picture 3"/>
@@ -10453,7 +10210,7 @@
         <w:t>Summing Eq. 2 over all users gives:</w:t>
       </w:r>
     </w:p>
-    <w:commentRangeStart w:id="45"/>
+    <w:commentRangeStart w:id="9"/>
     <w:p>
       <w:pPr>
         <w:jc w:val="center"/>
@@ -10639,7 +10396,7 @@
           </m:e>
         </m:d>
       </m:oMath>
-      <w:commentRangeEnd w:id="45"/>
+      <w:commentRangeEnd w:id="9"/>
       <w:r>
         <w:rPr>
           <w:rStyle w:val="CommentReference"/>
@@ -10647,7 +10404,7 @@
           <w:sz w:val="24"/>
           <w:szCs w:val="24"/>
         </w:rPr>
-        <w:commentReference w:id="45"/>
+        <w:commentReference w:id="9"/>
       </w:r>
       <w:r>
         <w:rPr>
@@ -10672,7 +10429,7 @@
       <w:r>
         <w:t>In case 1</w:t>
       </w:r>
-      <w:ins w:id="46" w:author="Erik Christian Porse" w:date="2026-05-27T15:52:00Z" w16du:dateUtc="2026-05-27T22:52:00Z">
+      <w:ins w:id="10" w:author="Erik Christian Porse" w:date="2026-05-27T15:52:00Z" w16du:dateUtc="2026-05-27T22:52:00Z">
         <w:r>
           <w:t>,</w:t>
         </w:r>
@@ -10710,12 +10467,12 @@
       <w:r>
         <w:t>)</w:t>
       </w:r>
-      <w:ins w:id="47" w:author="Erik Christian Porse" w:date="2026-05-27T15:52:00Z" w16du:dateUtc="2026-05-27T22:52:00Z">
+      <w:ins w:id="11" w:author="Erik Christian Porse" w:date="2026-05-27T15:52:00Z" w16du:dateUtc="2026-05-27T22:52:00Z">
         <w:r>
           <w:t xml:space="preserve"> </w:t>
         </w:r>
       </w:ins>
-      <w:del w:id="48" w:author="Erik Christian Porse" w:date="2026-05-27T15:52:00Z" w16du:dateUtc="2026-05-27T22:52:00Z">
+      <w:del w:id="12" w:author="Erik Christian Porse" w:date="2026-05-27T15:52:00Z" w16du:dateUtc="2026-05-27T22:52:00Z">
         <w:r>
           <w:delText>—</w:delText>
         </w:r>
@@ -10925,18 +10682,18 @@
       <w:r>
         <w:t xml:space="preserve">correctly </w:t>
       </w:r>
-      <w:commentRangeStart w:id="49"/>
+      <w:commentRangeStart w:id="13"/>
       <w:r>
         <w:t xml:space="preserve">awarded </w:t>
       </w:r>
-      <w:commentRangeEnd w:id="49"/>
+      <w:commentRangeEnd w:id="13"/>
       <w:r>
         <w:rPr>
           <w:rStyle w:val="CommentReference"/>
           <w:sz w:val="24"/>
           <w:szCs w:val="24"/>
         </w:rPr>
-        <w:commentReference w:id="49"/>
+        <w:commentReference w:id="13"/>
       </w:r>
       <w:r>
         <w:t>(</w:t>
@@ -11128,7 +10885,7 @@
         </w:rPr>
         <w:t>We estimate</w:t>
       </w:r>
-      <w:del w:id="50" w:author="Erik Christian Porse" w:date="2026-05-27T17:57:00Z" w16du:dateUtc="2026-05-28T00:57:00Z">
+      <w:del w:id="14" w:author="Erik Christian Porse" w:date="2026-05-27T17:57:00Z" w16du:dateUtc="2026-05-28T00:57:00Z">
         <w:r>
           <w:rPr>
             <w:rFonts w:asciiTheme="majorBidi" w:hAnsiTheme="majorBidi" w:cstheme="majorBidi"/>
@@ -11411,7 +11168,7 @@
       <w:r>
         <w:t xml:space="preserve">Conditions where the physically available water is less that total legal entitlements will increasingly occur as future Colorado River flows </w:t>
       </w:r>
-      <w:del w:id="51" w:author="Erik Christian Porse" w:date="2026-05-27T17:57:00Z" w16du:dateUtc="2026-05-28T00:57:00Z">
+      <w:del w:id="15" w:author="Erik Christian Porse" w:date="2026-05-27T17:57:00Z" w16du:dateUtc="2026-05-28T00:57:00Z">
         <w:r>
           <w:delText xml:space="preserve">decline and/or </w:delText>
         </w:r>
@@ -11419,12 +11176,12 @@
       <w:r>
         <w:t>become more volatile</w:t>
       </w:r>
-      <w:ins w:id="52" w:author="Erik Christian Porse" w:date="2026-05-27T17:57:00Z" w16du:dateUtc="2026-05-28T00:57:00Z">
+      <w:ins w:id="16" w:author="Erik Christian Porse" w:date="2026-05-27T17:57:00Z" w16du:dateUtc="2026-05-28T00:57:00Z">
         <w:r>
           <w:t xml:space="preserve"> and risk o</w:t>
         </w:r>
       </w:ins>
-      <w:ins w:id="53" w:author="Erik Christian Porse" w:date="2026-05-27T17:58:00Z" w16du:dateUtc="2026-05-28T00:58:00Z">
+      <w:ins w:id="17" w:author="Erik Christian Porse" w:date="2026-05-27T17:58:00Z" w16du:dateUtc="2026-05-28T00:58:00Z">
         <w:r>
           <w:t>f reservoir level declines increase</w:t>
         </w:r>
@@ -11441,18 +11198,18 @@
       <w:r>
         <w:t xml:space="preserve">r, mandatory shortages must exceed 1.5 maf per year for there to be sufficient physically available water to award all requested </w:t>
       </w:r>
-      <w:commentRangeStart w:id="54"/>
+      <w:commentRangeStart w:id="18"/>
       <w:r>
         <w:t>credits</w:t>
       </w:r>
-      <w:commentRangeEnd w:id="54"/>
+      <w:commentRangeEnd w:id="18"/>
       <w:r>
         <w:rPr>
           <w:rStyle w:val="CommentReference"/>
           <w:sz w:val="24"/>
           <w:szCs w:val="24"/>
         </w:rPr>
-        <w:commentReference w:id="54"/>
+        <w:commentReference w:id="18"/>
       </w:r>
       <w:r>
         <w:t>. When the Lake Powell release is 6 million acre-feet as in Water Year 2025-2026, mandatory shortages must exceed 2.6 maf per year.</w:t>
@@ -11583,12 +11340,12 @@
       <w:r>
         <w:t xml:space="preserve"> Conservation and </w:t>
       </w:r>
-      <w:del w:id="55" w:author="Erik Christian Porse" w:date="2026-05-27T14:26:00Z" w16du:dateUtc="2026-05-27T21:26:00Z">
+      <w:del w:id="19" w:author="Erik Christian Porse" w:date="2026-05-27T14:26:00Z" w16du:dateUtc="2026-05-27T21:26:00Z">
         <w:r>
           <w:delText>Give Users more</w:delText>
         </w:r>
       </w:del>
-      <w:ins w:id="56" w:author="Erik Christian Porse" w:date="2026-05-27T14:26:00Z" w16du:dateUtc="2026-05-27T21:26:00Z">
+      <w:ins w:id="20" w:author="Erik Christian Porse" w:date="2026-05-27T14:26:00Z" w16du:dateUtc="2026-05-27T21:26:00Z">
         <w:r>
           <w:t>Increase</w:t>
         </w:r>
@@ -11596,7 +11353,7 @@
       <w:r>
         <w:t xml:space="preserve"> Autonomy</w:t>
       </w:r>
-      <w:ins w:id="57" w:author="Erik Christian Porse" w:date="2026-05-27T17:59:00Z" w16du:dateUtc="2026-05-28T00:59:00Z">
+      <w:ins w:id="21" w:author="Erik Christian Porse" w:date="2026-05-27T17:59:00Z" w16du:dateUtc="2026-05-28T00:59:00Z">
         <w:r>
           <w:t xml:space="preserve"> of Users</w:t>
         </w:r>
@@ -11604,7 +11361,7 @@
       <w:r>
         <w:t xml:space="preserve"> </w:t>
       </w:r>
-      <w:del w:id="58" w:author="Erik Christian Porse" w:date="2026-05-27T14:26:00Z" w16du:dateUtc="2026-05-27T21:26:00Z">
+      <w:del w:id="22" w:author="Erik Christian Porse" w:date="2026-05-27T14:26:00Z" w16du:dateUtc="2026-05-27T21:26:00Z">
         <w:r>
           <w:delText>in the Face of Aridity</w:delText>
         </w:r>
@@ -11642,7 +11399,7 @@
         </w:rPr>
         <w:t xml:space="preserve"> </w:t>
       </w:r>
-      <w:del w:id="59" w:author="Erik Christian Porse" w:date="2026-05-27T17:59:00Z" w16du:dateUtc="2026-05-28T00:59:00Z">
+      <w:del w:id="23" w:author="Erik Christian Porse" w:date="2026-05-27T17:59:00Z" w16du:dateUtc="2026-05-28T00:59:00Z">
         <w:r>
           <w:rPr>
             <w:rFonts w:asciiTheme="majorBidi" w:hAnsiTheme="majorBidi" w:cstheme="majorBidi"/>
@@ -11660,7 +11417,7 @@
         </w:rPr>
         <w:t xml:space="preserve">factors </w:t>
       </w:r>
-      <w:del w:id="60" w:author="Erik Christian Porse" w:date="2026-05-27T17:59:00Z" w16du:dateUtc="2026-05-28T00:59:00Z">
+      <w:del w:id="24" w:author="Erik Christian Porse" w:date="2026-05-27T17:59:00Z" w16du:dateUtc="2026-05-28T00:59:00Z">
         <w:r>
           <w:rPr>
             <w:rFonts w:asciiTheme="majorBidi" w:hAnsiTheme="majorBidi" w:cstheme="majorBidi"/>
@@ -11670,7 +11427,7 @@
           <w:delText>in a hydrologic balance</w:delText>
         </w:r>
       </w:del>
-      <w:ins w:id="61" w:author="Erik Christian Porse" w:date="2026-05-27T17:59:00Z" w16du:dateUtc="2026-05-28T00:59:00Z">
+      <w:ins w:id="25" w:author="Erik Christian Porse" w:date="2026-05-27T17:59:00Z" w16du:dateUtc="2026-05-28T00:59:00Z">
         <w:r>
           <w:rPr>
             <w:rFonts w:asciiTheme="majorBidi" w:hAnsiTheme="majorBidi" w:cstheme="majorBidi"/>
@@ -11680,7 +11437,7 @@
           <w:t>that drive long-term stable reservoir levels and hydrologic balance</w:t>
         </w:r>
       </w:ins>
-      <w:ins w:id="62" w:author="Erik Christian Porse" w:date="2026-05-27T18:00:00Z" w16du:dateUtc="2026-05-28T01:00:00Z">
+      <w:ins w:id="26" w:author="Erik Christian Porse" w:date="2026-05-27T18:00:00Z" w16du:dateUtc="2026-05-28T01:00:00Z">
         <w:r>
           <w:rPr>
             <w:rFonts w:asciiTheme="majorBidi" w:hAnsiTheme="majorBidi" w:cstheme="majorBidi"/>
@@ -11690,7 +11447,7 @@
           <w:t xml:space="preserve">s within a water allocation program to promote conservation. </w:t>
         </w:r>
       </w:ins>
-      <w:del w:id="63" w:author="Erik Christian Porse" w:date="2026-05-27T18:00:00Z" w16du:dateUtc="2026-05-28T01:00:00Z">
+      <w:del w:id="27" w:author="Erik Christian Porse" w:date="2026-05-27T18:00:00Z" w16du:dateUtc="2026-05-28T01:00:00Z">
         <w:r>
           <w:rPr>
             <w:rFonts w:asciiTheme="majorBidi" w:hAnsiTheme="majorBidi" w:cstheme="majorBidi"/>
@@ -11708,7 +11465,7 @@
           <w:delText xml:space="preserve">reservoir </w:delText>
         </w:r>
       </w:del>
-      <w:ins w:id="64" w:author="Erik Christian Porse" w:date="2026-05-27T18:00:00Z" w16du:dateUtc="2026-05-28T01:00:00Z">
+      <w:ins w:id="28" w:author="Erik Christian Porse" w:date="2026-05-27T18:00:00Z" w16du:dateUtc="2026-05-28T01:00:00Z">
         <w:r>
           <w:rPr>
             <w:rFonts w:asciiTheme="majorBidi" w:hAnsiTheme="majorBidi" w:cstheme="majorBidi"/>
@@ -11790,7 +11547,7 @@
         </w:rPr>
         <w:t>volume</w:t>
       </w:r>
-      <w:ins w:id="65" w:author="Erik Christian Porse" w:date="2026-05-27T18:01:00Z" w16du:dateUtc="2026-05-28T01:01:00Z">
+      <w:ins w:id="29" w:author="Erik Christian Porse" w:date="2026-05-27T18:01:00Z" w16du:dateUtc="2026-05-28T01:01:00Z">
         <w:r>
           <w:rPr>
             <w:rFonts w:asciiTheme="majorBidi" w:hAnsiTheme="majorBidi" w:cstheme="majorBidi"/>
@@ -11800,7 +11557,7 @@
           <w:t xml:space="preserve"> is critical to managing future risks</w:t>
         </w:r>
       </w:ins>
-      <w:del w:id="66" w:author="Erik Christian Porse" w:date="2026-05-27T18:00:00Z" w16du:dateUtc="2026-05-28T01:00:00Z">
+      <w:del w:id="30" w:author="Erik Christian Porse" w:date="2026-05-27T18:00:00Z" w16du:dateUtc="2026-05-28T01:00:00Z">
         <w:r>
           <w:rPr>
             <w:rFonts w:asciiTheme="majorBidi" w:hAnsiTheme="majorBidi" w:cstheme="majorBidi"/>
@@ -11850,7 +11607,7 @@
         </w:rPr>
         <w:t xml:space="preserve">. </w:t>
       </w:r>
-      <w:del w:id="67" w:author="Erik Christian Porse" w:date="2026-05-27T18:02:00Z" w16du:dateUtc="2026-05-28T01:02:00Z">
+      <w:del w:id="31" w:author="Erik Christian Porse" w:date="2026-05-27T18:02:00Z" w16du:dateUtc="2026-05-28T01:02:00Z">
         <w:r>
           <w:rPr>
             <w:rFonts w:asciiTheme="majorBidi" w:hAnsiTheme="majorBidi" w:cstheme="majorBidi"/>
@@ -11868,7 +11625,7 @@
           <w:delText xml:space="preserve"> there</w:delText>
         </w:r>
       </w:del>
-      <w:ins w:id="68" w:author="Erik Christian Porse" w:date="2026-05-27T18:02:00Z" w16du:dateUtc="2026-05-28T01:02:00Z">
+      <w:ins w:id="32" w:author="Erik Christian Porse" w:date="2026-05-27T18:02:00Z" w16du:dateUtc="2026-05-28T01:02:00Z">
         <w:r>
           <w:rPr>
             <w:rFonts w:asciiTheme="majorBidi" w:hAnsiTheme="majorBidi" w:cstheme="majorBidi"/>
@@ -11926,7 +11683,7 @@
         </w:rPr>
         <w:t xml:space="preserve"> water conservation</w:t>
       </w:r>
-      <w:del w:id="69" w:author="Erik Christian Porse" w:date="2026-05-27T18:03:00Z" w16du:dateUtc="2026-05-28T01:03:00Z">
+      <w:del w:id="33" w:author="Erik Christian Porse" w:date="2026-05-27T18:03:00Z" w16du:dateUtc="2026-05-28T01:03:00Z">
         <w:r>
           <w:rPr>
             <w:rFonts w:asciiTheme="majorBidi" w:hAnsiTheme="majorBidi" w:cstheme="majorBidi"/>
@@ -11952,7 +11709,7 @@
         </w:rPr>
         <w:t xml:space="preserve">. </w:t>
       </w:r>
-      <w:del w:id="70" w:author="Erik Christian Porse" w:date="2026-05-27T18:03:00Z" w16du:dateUtc="2026-05-28T01:03:00Z">
+      <w:del w:id="34" w:author="Erik Christian Porse" w:date="2026-05-27T18:03:00Z" w16du:dateUtc="2026-05-28T01:03:00Z">
         <w:r>
           <w:rPr>
             <w:rFonts w:asciiTheme="majorBidi" w:hAnsiTheme="majorBidi" w:cstheme="majorBidi"/>
@@ -11978,7 +11735,7 @@
           <w:delText xml:space="preserve"> is to</w:delText>
         </w:r>
       </w:del>
-      <w:ins w:id="71" w:author="Erik Christian Porse" w:date="2026-05-27T18:03:00Z" w16du:dateUtc="2026-05-28T01:03:00Z">
+      <w:ins w:id="35" w:author="Erik Christian Porse" w:date="2026-05-27T18:03:00Z" w16du:dateUtc="2026-05-28T01:03:00Z">
         <w:r>
           <w:rPr>
             <w:rFonts w:asciiTheme="majorBidi" w:hAnsiTheme="majorBidi" w:cstheme="majorBidi"/>
@@ -11996,7 +11753,7 @@
         </w:rPr>
         <w:t xml:space="preserve"> raise the elevation trigger that prohibits debits on water conservation accounts. </w:t>
       </w:r>
-      <w:ins w:id="72" w:author="Erik Christian Porse" w:date="2026-05-27T18:03:00Z" w16du:dateUtc="2026-05-28T01:03:00Z">
+      <w:ins w:id="36" w:author="Erik Christian Porse" w:date="2026-05-27T18:03:00Z" w16du:dateUtc="2026-05-28T01:03:00Z">
         <w:r>
           <w:rPr>
             <w:rFonts w:asciiTheme="majorBidi" w:hAnsiTheme="majorBidi" w:cstheme="majorBidi"/>
@@ -12006,7 +11763,7 @@
           <w:t xml:space="preserve">This would preserve more water in storage by preventing deliveries of unavailable water. </w:t>
         </w:r>
       </w:ins>
-      <w:del w:id="73" w:author="Erik Christian Porse" w:date="2026-05-27T18:03:00Z" w16du:dateUtc="2026-05-28T01:03:00Z">
+      <w:del w:id="37" w:author="Erik Christian Porse" w:date="2026-05-27T18:03:00Z" w16du:dateUtc="2026-05-28T01:03:00Z">
         <w:r>
           <w:rPr>
             <w:rFonts w:asciiTheme="majorBidi" w:hAnsiTheme="majorBidi" w:cstheme="majorBidi"/>
@@ -12040,7 +11797,7 @@
           <w:delText>et</w:delText>
         </w:r>
       </w:del>
-      <w:ins w:id="74" w:author="Erik Christian Porse" w:date="2026-05-27T18:03:00Z" w16du:dateUtc="2026-05-28T01:03:00Z">
+      <w:ins w:id="38" w:author="Erik Christian Porse" w:date="2026-05-27T18:03:00Z" w16du:dateUtc="2026-05-28T01:03:00Z">
         <w:r>
           <w:rPr>
             <w:rFonts w:asciiTheme="majorBidi" w:hAnsiTheme="majorBidi" w:cstheme="majorBidi"/>
@@ -12050,7 +11807,7 @@
           <w:t xml:space="preserve">Second, USBR </w:t>
         </w:r>
       </w:ins>
-      <w:ins w:id="75" w:author="Erik Christian Porse" w:date="2026-05-27T18:04:00Z" w16du:dateUtc="2026-05-28T01:04:00Z">
+      <w:ins w:id="39" w:author="Erik Christian Porse" w:date="2026-05-27T18:04:00Z" w16du:dateUtc="2026-05-28T01:04:00Z">
         <w:r>
           <w:rPr>
             <w:rFonts w:asciiTheme="majorBidi" w:hAnsiTheme="majorBidi" w:cstheme="majorBidi"/>
@@ -12068,7 +11825,7 @@
         </w:rPr>
         <w:t xml:space="preserve"> </w:t>
       </w:r>
-      <w:del w:id="76" w:author="Erik Christian Porse" w:date="2026-05-27T18:04:00Z" w16du:dateUtc="2026-05-28T01:04:00Z">
+      <w:del w:id="40" w:author="Erik Christian Porse" w:date="2026-05-27T18:04:00Z" w16du:dateUtc="2026-05-28T01:04:00Z">
         <w:r>
           <w:rPr>
             <w:rFonts w:asciiTheme="majorBidi" w:hAnsiTheme="majorBidi" w:cstheme="majorBidi"/>
@@ -12078,7 +11835,7 @@
           <w:delText xml:space="preserve">the </w:delText>
         </w:r>
       </w:del>
-      <w:ins w:id="77" w:author="Erik Christian Porse" w:date="2026-05-27T18:04:00Z" w16du:dateUtc="2026-05-28T01:04:00Z">
+      <w:ins w:id="41" w:author="Erik Christian Porse" w:date="2026-05-27T18:04:00Z" w16du:dateUtc="2026-05-28T01:04:00Z">
         <w:r>
           <w:rPr>
             <w:rFonts w:asciiTheme="majorBidi" w:hAnsiTheme="majorBidi" w:cstheme="majorBidi"/>
@@ -12315,6 +12072,13 @@
           <w:sz w:val="24"/>
           <w:szCs w:val="24"/>
         </w:rPr>
+      </w:r>
+      <w:r>
+        <w:rPr>
+          <w:rFonts w:asciiTheme="majorBidi" w:hAnsiTheme="majorBidi" w:cstheme="majorBidi"/>
+          <w:sz w:val="24"/>
+          <w:szCs w:val="24"/>
+        </w:rPr>
         <w:fldChar w:fldCharType="separate"/>
       </w:r>
       <w:r>
@@ -12350,7 +12114,7 @@
         </w:rPr>
         <w:t xml:space="preserve"> </w:t>
       </w:r>
-      <w:del w:id="78" w:author="Erik Christian Porse" w:date="2026-05-27T18:04:00Z" w16du:dateUtc="2026-05-28T01:04:00Z">
+      <w:del w:id="42" w:author="Erik Christian Porse" w:date="2026-05-27T18:04:00Z" w16du:dateUtc="2026-05-28T01:04:00Z">
         <w:r>
           <w:rPr>
             <w:rFonts w:asciiTheme="majorBidi" w:hAnsiTheme="majorBidi" w:cstheme="majorBidi"/>
@@ -12360,7 +12124,7 @@
           <w:delText>Other improvements allow</w:delText>
         </w:r>
       </w:del>
-      <w:ins w:id="79" w:author="Erik Christian Porse" w:date="2026-05-27T18:04:00Z" w16du:dateUtc="2026-05-28T01:04:00Z">
+      <w:ins w:id="43" w:author="Erik Christian Porse" w:date="2026-05-27T18:04:00Z" w16du:dateUtc="2026-05-28T01:04:00Z">
         <w:r>
           <w:rPr>
             <w:rFonts w:asciiTheme="majorBidi" w:hAnsiTheme="majorBidi" w:cstheme="majorBidi"/>
@@ -12378,7 +12142,7 @@
         </w:rPr>
         <w:t xml:space="preserve"> Tribal users to participate</w:t>
       </w:r>
-      <w:ins w:id="80" w:author="Erik Christian Porse" w:date="2026-05-27T18:05:00Z" w16du:dateUtc="2026-05-28T01:05:00Z">
+      <w:ins w:id="44" w:author="Erik Christian Porse" w:date="2026-05-27T18:05:00Z" w16du:dateUtc="2026-05-28T01:05:00Z">
         <w:r>
           <w:rPr>
             <w:rFonts w:asciiTheme="majorBidi" w:hAnsiTheme="majorBidi" w:cstheme="majorBidi"/>
@@ -12388,7 +12152,7 @@
           <w:t>. Finally, new operational policies that</w:t>
         </w:r>
       </w:ins>
-      <w:del w:id="81" w:author="Erik Christian Porse" w:date="2026-05-27T18:05:00Z" w16du:dateUtc="2026-05-28T01:05:00Z">
+      <w:del w:id="45" w:author="Erik Christian Porse" w:date="2026-05-27T18:05:00Z" w16du:dateUtc="2026-05-28T01:05:00Z">
         <w:r>
           <w:rPr>
             <w:rFonts w:asciiTheme="majorBidi" w:hAnsiTheme="majorBidi" w:cstheme="majorBidi"/>
@@ -12406,7 +12170,7 @@
         </w:rPr>
         <w:t xml:space="preserve"> split conserved water between Lake Powell and Lake Mead </w:t>
       </w:r>
-      <w:del w:id="82" w:author="Erik Christian Porse" w:date="2026-05-27T18:05:00Z" w16du:dateUtc="2026-05-28T01:05:00Z">
+      <w:del w:id="46" w:author="Erik Christian Porse" w:date="2026-05-27T18:05:00Z" w16du:dateUtc="2026-05-28T01:05:00Z">
         <w:r>
           <w:rPr>
             <w:rFonts w:asciiTheme="majorBidi" w:hAnsiTheme="majorBidi" w:cstheme="majorBidi"/>
@@ -12416,7 +12180,7 @@
           <w:delText xml:space="preserve">to </w:delText>
         </w:r>
       </w:del>
-      <w:ins w:id="83" w:author="Erik Christian Porse" w:date="2026-05-27T18:05:00Z" w16du:dateUtc="2026-05-28T01:05:00Z">
+      <w:ins w:id="47" w:author="Erik Christian Porse" w:date="2026-05-27T18:05:00Z" w16du:dateUtc="2026-05-28T01:05:00Z">
         <w:r>
           <w:rPr>
             <w:rFonts w:asciiTheme="majorBidi" w:hAnsiTheme="majorBidi" w:cstheme="majorBidi"/>
@@ -12585,6 +12349,13 @@
           <w:sz w:val="24"/>
           <w:szCs w:val="24"/>
         </w:rPr>
+      </w:r>
+      <w:r>
+        <w:rPr>
+          <w:rFonts w:asciiTheme="majorBidi" w:hAnsiTheme="majorBidi" w:cstheme="majorBidi"/>
+          <w:sz w:val="24"/>
+          <w:szCs w:val="24"/>
+        </w:rPr>
         <w:fldChar w:fldCharType="separate"/>
       </w:r>
       <w:r>
@@ -12790,12 +12561,12 @@
       <w:r>
         <w:t xml:space="preserve">Never allow </w:t>
       </w:r>
-      <w:ins w:id="84" w:author="Erik Christian Porse" w:date="2026-05-27T18:05:00Z" w16du:dateUtc="2026-05-28T01:05:00Z">
+      <w:ins w:id="48" w:author="Erik Christian Porse" w:date="2026-05-27T18:05:00Z" w16du:dateUtc="2026-05-28T01:05:00Z">
         <w:r>
           <w:t>t</w:t>
         </w:r>
       </w:ins>
-      <w:del w:id="85" w:author="Erik Christian Porse" w:date="2026-05-27T18:05:00Z" w16du:dateUtc="2026-05-28T01:05:00Z">
+      <w:del w:id="49" w:author="Erik Christian Porse" w:date="2026-05-27T18:05:00Z" w16du:dateUtc="2026-05-28T01:05:00Z">
         <w:r>
           <w:delText>T</w:delText>
         </w:r>
@@ -12809,7 +12580,7 @@
       <w:r>
         <w:t>assigned credits</w:t>
       </w:r>
-      <w:ins w:id="86" w:author="Erik Christian Porse" w:date="2026-05-27T18:05:00Z" w16du:dateUtc="2026-05-28T01:05:00Z">
+      <w:ins w:id="50" w:author="Erik Christian Porse" w:date="2026-05-27T18:05:00Z" w16du:dateUtc="2026-05-28T01:05:00Z">
         <w:r>
           <w:t xml:space="preserve"> (Atotal)</w:t>
         </w:r>
@@ -12835,12 +12606,12 @@
       <w:r>
         <w:t>)</w:t>
       </w:r>
-      <w:ins w:id="87" w:author="Erik Christian Porse" w:date="2026-05-27T18:05:00Z" w16du:dateUtc="2026-05-28T01:05:00Z">
+      <w:ins w:id="51" w:author="Erik Christian Porse" w:date="2026-05-27T18:05:00Z" w16du:dateUtc="2026-05-28T01:05:00Z">
         <w:r>
           <w:t>:</w:t>
         </w:r>
       </w:ins>
-      <w:del w:id="88" w:author="Erik Christian Porse" w:date="2026-05-27T18:05:00Z" w16du:dateUtc="2026-05-28T01:05:00Z">
+      <w:del w:id="52" w:author="Erik Christian Porse" w:date="2026-05-27T18:05:00Z" w16du:dateUtc="2026-05-28T01:05:00Z">
         <w:r>
           <w:delText>.</w:delText>
         </w:r>
@@ -13187,7 +12958,7 @@
         </w:rPr>
         <w:t xml:space="preserve">This strategy </w:t>
       </w:r>
-      <w:del w:id="89" w:author="Erik Christian Porse" w:date="2026-05-27T18:06:00Z" w16du:dateUtc="2026-05-28T01:06:00Z">
+      <w:del w:id="53" w:author="Erik Christian Porse" w:date="2026-05-27T18:06:00Z" w16du:dateUtc="2026-05-28T01:06:00Z">
         <w:r>
           <w:rPr>
             <w:rFonts w:asciiTheme="majorBidi" w:hAnsiTheme="majorBidi" w:cstheme="majorBidi"/>
@@ -13804,7 +13575,7 @@
         </w:rPr>
         <w:t xml:space="preserve"> </w:t>
       </w:r>
-      <w:ins w:id="90" w:author="Erik Christian Porse" w:date="2026-05-27T18:06:00Z" w16du:dateUtc="2026-05-28T01:06:00Z">
+      <w:ins w:id="54" w:author="Erik Christian Porse" w:date="2026-05-27T18:06:00Z" w16du:dateUtc="2026-05-28T01:06:00Z">
         <w:r>
           <w:rPr>
             <w:rFonts w:asciiTheme="majorBidi" w:hAnsiTheme="majorBidi" w:cstheme="majorBidi"/>
@@ -13835,7 +13606,7 @@
         </w:rPr>
         <w:t>i</w:t>
       </w:r>
-      <w:del w:id="91" w:author="Erik Christian Porse" w:date="2026-05-27T18:06:00Z" w16du:dateUtc="2026-05-28T01:06:00Z">
+      <w:del w:id="55" w:author="Erik Christian Porse" w:date="2026-05-27T18:06:00Z" w16du:dateUtc="2026-05-28T01:06:00Z">
         <w:r>
           <w:rPr>
             <w:rFonts w:asciiTheme="majorBidi" w:hAnsiTheme="majorBidi" w:cstheme="majorBidi"/>
@@ -13845,7 +13616,7 @@
           <w:delText>.</w:delText>
         </w:r>
       </w:del>
-      <w:ins w:id="92" w:author="Erik Christian Porse" w:date="2026-05-27T18:06:00Z" w16du:dateUtc="2026-05-28T01:06:00Z">
+      <w:ins w:id="56" w:author="Erik Christian Porse" w:date="2026-05-27T18:06:00Z" w16du:dateUtc="2026-05-28T01:06:00Z">
         <w:r>
           <w:rPr>
             <w:rFonts w:asciiTheme="majorBidi" w:hAnsiTheme="majorBidi" w:cstheme="majorBidi"/>
@@ -14033,7 +13804,7 @@
         </w:rPr>
         <w:t xml:space="preserve"> </w:t>
       </w:r>
-      <w:del w:id="93" w:author="Erik Christian Porse" w:date="2026-05-27T18:07:00Z" w16du:dateUtc="2026-05-28T01:07:00Z">
+      <w:del w:id="57" w:author="Erik Christian Porse" w:date="2026-05-27T18:07:00Z" w16du:dateUtc="2026-05-28T01:07:00Z">
         <w:r>
           <w:rPr>
             <w:rFonts w:asciiTheme="majorBidi" w:hAnsiTheme="majorBidi" w:cstheme="majorBidi"/>
@@ -14043,7 +13814,7 @@
           <w:delText xml:space="preserve">proportionally </w:delText>
         </w:r>
       </w:del>
-      <w:ins w:id="94" w:author="Erik Christian Porse" w:date="2026-05-27T18:07:00Z" w16du:dateUtc="2026-05-28T01:07:00Z">
+      <w:ins w:id="58" w:author="Erik Christian Porse" w:date="2026-05-27T18:07:00Z" w16du:dateUtc="2026-05-28T01:07:00Z">
         <w:r>
           <w:rPr>
             <w:rFonts w:asciiTheme="majorBidi" w:hAnsiTheme="majorBidi" w:cstheme="majorBidi"/>
@@ -14061,7 +13832,7 @@
           <w:t xml:space="preserve"> </w:t>
         </w:r>
       </w:ins>
-      <w:del w:id="95" w:author="Erik Christian Porse" w:date="2026-05-27T18:07:00Z" w16du:dateUtc="2026-05-28T01:07:00Z">
+      <w:del w:id="59" w:author="Erik Christian Porse" w:date="2026-05-27T18:07:00Z" w16du:dateUtc="2026-05-28T01:07:00Z">
         <w:r>
           <w:rPr>
             <w:rFonts w:asciiTheme="majorBidi" w:hAnsiTheme="majorBidi" w:cstheme="majorBidi"/>
@@ -14079,7 +13850,7 @@
           <w:delText xml:space="preserve"> </w:delText>
         </w:r>
       </w:del>
-      <w:ins w:id="96" w:author="Erik Christian Porse" w:date="2026-05-27T18:07:00Z" w16du:dateUtc="2026-05-28T01:07:00Z">
+      <w:ins w:id="60" w:author="Erik Christian Porse" w:date="2026-05-27T18:07:00Z" w16du:dateUtc="2026-05-28T01:07:00Z">
         <w:r>
           <w:rPr>
             <w:rFonts w:asciiTheme="majorBidi" w:hAnsiTheme="majorBidi" w:cstheme="majorBidi"/>
@@ -14121,7 +13892,7 @@
         </w:rPr>
         <w:t>credits</w:t>
       </w:r>
-      <w:ins w:id="97" w:author="Erik Christian Porse" w:date="2026-05-27T18:07:00Z" w16du:dateUtc="2026-05-28T01:07:00Z">
+      <w:ins w:id="61" w:author="Erik Christian Porse" w:date="2026-05-27T18:07:00Z" w16du:dateUtc="2026-05-28T01:07:00Z">
         <w:r>
           <w:rPr>
             <w:rFonts w:asciiTheme="majorBidi" w:hAnsiTheme="majorBidi" w:cstheme="majorBidi"/>
@@ -14147,7 +13918,7 @@
         </w:rPr>
         <w:t xml:space="preserve"> </w:t>
       </w:r>
-      <w:del w:id="98" w:author="Erik Christian Porse" w:date="2026-05-27T18:07:00Z" w16du:dateUtc="2026-05-28T01:07:00Z">
+      <w:del w:id="62" w:author="Erik Christian Porse" w:date="2026-05-27T18:07:00Z" w16du:dateUtc="2026-05-28T01:07:00Z">
         <w:r>
           <w:rPr>
             <w:rFonts w:asciiTheme="majorBidi" w:hAnsiTheme="majorBidi" w:cstheme="majorBidi"/>
@@ -14197,7 +13968,7 @@
           <w:delText>reducing</w:delText>
         </w:r>
       </w:del>
-      <w:ins w:id="99" w:author="Erik Christian Porse" w:date="2026-05-27T18:07:00Z" w16du:dateUtc="2026-05-28T01:07:00Z">
+      <w:ins w:id="63" w:author="Erik Christian Porse" w:date="2026-05-27T18:07:00Z" w16du:dateUtc="2026-05-28T01:07:00Z">
         <w:r>
           <w:rPr>
             <w:rFonts w:asciiTheme="majorBidi" w:hAnsiTheme="majorBidi" w:cstheme="majorBidi"/>
@@ -14215,7 +13986,7 @@
         </w:rPr>
         <w:t xml:space="preserve"> credits </w:t>
       </w:r>
-      <w:ins w:id="100" w:author="Erik Christian Porse" w:date="2026-05-27T18:07:00Z" w16du:dateUtc="2026-05-28T01:07:00Z">
+      <w:ins w:id="64" w:author="Erik Christian Porse" w:date="2026-05-27T18:07:00Z" w16du:dateUtc="2026-05-28T01:07:00Z">
         <w:r>
           <w:rPr>
             <w:rFonts w:asciiTheme="majorBidi" w:hAnsiTheme="majorBidi" w:cstheme="majorBidi"/>
@@ -14225,7 +13996,7 @@
           <w:t xml:space="preserve">in this way </w:t>
         </w:r>
       </w:ins>
-      <w:del w:id="101" w:author="Erik Christian Porse" w:date="2026-05-27T18:07:00Z" w16du:dateUtc="2026-05-28T01:07:00Z">
+      <w:del w:id="65" w:author="Erik Christian Porse" w:date="2026-05-27T18:07:00Z" w16du:dateUtc="2026-05-28T01:07:00Z">
         <w:r>
           <w:rPr>
             <w:rFonts w:asciiTheme="majorBidi" w:hAnsiTheme="majorBidi" w:cstheme="majorBidi"/>
@@ -14235,7 +14006,7 @@
           <w:delText xml:space="preserve">will </w:delText>
         </w:r>
       </w:del>
-      <w:ins w:id="102" w:author="Erik Christian Porse" w:date="2026-05-27T18:07:00Z" w16du:dateUtc="2026-05-28T01:07:00Z">
+      <w:ins w:id="66" w:author="Erik Christian Porse" w:date="2026-05-27T18:07:00Z" w16du:dateUtc="2026-05-28T01:07:00Z">
         <w:r>
           <w:rPr>
             <w:rFonts w:asciiTheme="majorBidi" w:hAnsiTheme="majorBidi" w:cstheme="majorBidi"/>
@@ -14253,7 +14024,7 @@
         </w:rPr>
         <w:t>encourage water conservation at larger Lake Powell releases and higher Lake Mead storage (lower storages)</w:t>
       </w:r>
-      <w:ins w:id="103" w:author="Erik Christian Porse" w:date="2026-05-27T18:07:00Z" w16du:dateUtc="2026-05-28T01:07:00Z">
+      <w:ins w:id="67" w:author="Erik Christian Porse" w:date="2026-05-27T18:07:00Z" w16du:dateUtc="2026-05-28T01:07:00Z">
         <w:r>
           <w:rPr>
             <w:rFonts w:asciiTheme="majorBidi" w:hAnsiTheme="majorBidi" w:cstheme="majorBidi"/>
@@ -14263,7 +14034,7 @@
           <w:t>.</w:t>
         </w:r>
       </w:ins>
-      <w:del w:id="104" w:author="Erik Christian Porse" w:date="2026-05-27T18:07:00Z" w16du:dateUtc="2026-05-28T01:07:00Z">
+      <w:del w:id="68" w:author="Erik Christian Porse" w:date="2026-05-27T18:07:00Z" w16du:dateUtc="2026-05-28T01:07:00Z">
         <w:r>
           <w:rPr>
             <w:rFonts w:asciiTheme="majorBidi" w:hAnsiTheme="majorBidi" w:cstheme="majorBidi"/>
@@ -14322,13 +14093,13 @@
         </w:rPr>
         <w:t xml:space="preserve"> </w:t>
       </w:r>
-      <w:ins w:id="105" w:author="Erik Christian Porse" w:date="2026-05-27T18:08:00Z" w16du:dateUtc="2026-05-28T01:08:00Z">
+      <w:ins w:id="69" w:author="Erik Christian Porse" w:date="2026-05-27T18:08:00Z" w16du:dateUtc="2026-05-28T01:08:00Z">
         <w:r>
           <w:rPr>
             <w:rFonts w:asciiTheme="majorBidi" w:hAnsiTheme="majorBidi" w:cstheme="majorBidi"/>
             <w:sz w:val="24"/>
             <w:szCs w:val="24"/>
-            <w:rPrChange w:id="106" w:author="Erik Christian Porse" w:date="2026-05-27T18:08:00Z" w16du:dateUtc="2026-05-28T01:08:00Z">
+            <w:rPrChange w:id="70" w:author="Erik Christian Porse" w:date="2026-05-27T18:08:00Z" w16du:dateUtc="2026-05-28T01:08:00Z">
               <w:rPr>
                 <w:rFonts w:asciiTheme="majorBidi" w:hAnsiTheme="majorBidi" w:cstheme="majorBidi"/>
                 <w:b/>
@@ -14359,7 +14130,7 @@
         </w:rPr>
         <w:t xml:space="preserve">In this framework, </w:t>
       </w:r>
-      <w:del w:id="107" w:author="Erik Christian Porse" w:date="2026-05-27T18:08:00Z" w16du:dateUtc="2026-05-28T01:08:00Z">
+      <w:del w:id="71" w:author="Erik Christian Porse" w:date="2026-05-27T18:08:00Z" w16du:dateUtc="2026-05-28T01:08:00Z">
         <w:r>
           <w:rPr>
             <w:rFonts w:asciiTheme="majorBidi" w:hAnsiTheme="majorBidi" w:cstheme="majorBidi"/>
@@ -14385,7 +14156,7 @@
           <w:delText>sets</w:delText>
         </w:r>
       </w:del>
-      <w:ins w:id="108" w:author="Erik Christian Porse" w:date="2026-05-27T18:08:00Z" w16du:dateUtc="2026-05-28T01:08:00Z">
+      <w:ins w:id="72" w:author="Erik Christian Porse" w:date="2026-05-27T18:08:00Z" w16du:dateUtc="2026-05-28T01:08:00Z">
         <w:r>
           <w:rPr>
             <w:rFonts w:asciiTheme="majorBidi" w:hAnsiTheme="majorBidi" w:cstheme="majorBidi"/>
@@ -14403,7 +14174,7 @@
         </w:rPr>
         <w:t xml:space="preserve"> the protection volume </w:t>
       </w:r>
-      <w:ins w:id="109" w:author="Erik Christian Porse" w:date="2026-05-27T18:08:00Z" w16du:dateUtc="2026-05-28T01:08:00Z">
+      <w:ins w:id="73" w:author="Erik Christian Porse" w:date="2026-05-27T18:08:00Z" w16du:dateUtc="2026-05-28T01:08:00Z">
         <w:r>
           <w:rPr>
             <w:rFonts w:asciiTheme="majorBidi" w:hAnsiTheme="majorBidi" w:cstheme="majorBidi"/>
@@ -14413,7 +14184,7 @@
           <w:t xml:space="preserve">in Lake Mead during </w:t>
         </w:r>
       </w:ins>
-      <w:del w:id="110" w:author="Erik Christian Porse" w:date="2026-05-27T18:08:00Z" w16du:dateUtc="2026-05-28T01:08:00Z">
+      <w:del w:id="74" w:author="Erik Christian Porse" w:date="2026-05-27T18:08:00Z" w16du:dateUtc="2026-05-28T01:08:00Z">
         <w:r>
           <w:rPr>
             <w:rFonts w:asciiTheme="majorBidi" w:hAnsiTheme="majorBidi" w:cstheme="majorBidi"/>
@@ -14439,7 +14210,7 @@
         </w:rPr>
         <w:t xml:space="preserve">to stabilize </w:t>
       </w:r>
-      <w:del w:id="111" w:author="Erik Christian Porse" w:date="2026-05-27T18:08:00Z" w16du:dateUtc="2026-05-28T01:08:00Z">
+      <w:del w:id="75" w:author="Erik Christian Porse" w:date="2026-05-27T18:08:00Z" w16du:dateUtc="2026-05-28T01:08:00Z">
         <w:r>
           <w:rPr>
             <w:rFonts w:asciiTheme="majorBidi" w:hAnsiTheme="majorBidi" w:cstheme="majorBidi"/>
@@ -14458,7 +14229,7 @@
           <w:delText>Mead</w:delText>
         </w:r>
       </w:del>
-      <w:ins w:id="112" w:author="Erik Christian Porse" w:date="2026-05-27T18:08:00Z" w16du:dateUtc="2026-05-28T01:08:00Z">
+      <w:ins w:id="76" w:author="Erik Christian Porse" w:date="2026-05-27T18:08:00Z" w16du:dateUtc="2026-05-28T01:08:00Z">
         <w:r>
           <w:rPr>
             <w:rFonts w:asciiTheme="majorBidi" w:hAnsiTheme="majorBidi" w:cstheme="majorBidi"/>
@@ -14513,7 +14284,7 @@
         </w:rPr>
         <w:t xml:space="preserve"> [million acre-feet)</w:t>
       </w:r>
-      <w:ins w:id="113" w:author="Erik Christian Porse" w:date="2026-05-27T18:10:00Z" w16du:dateUtc="2026-05-28T01:10:00Z">
+      <w:ins w:id="77" w:author="Erik Christian Porse" w:date="2026-05-27T18:10:00Z" w16du:dateUtc="2026-05-28T01:10:00Z">
         <w:r>
           <w:rPr>
             <w:rFonts w:asciiTheme="majorBidi" w:hAnsiTheme="majorBidi" w:cstheme="majorBidi"/>
@@ -14993,7 +14764,7 @@
         </w:rPr>
         <w:t xml:space="preserve">reservoir </w:t>
       </w:r>
-      <w:commentRangeStart w:id="114"/>
+      <w:commentRangeStart w:id="78"/>
       <w:r>
         <w:rPr>
           <w:rFonts w:asciiTheme="majorBidi" w:hAnsiTheme="majorBidi" w:cstheme="majorBidi"/>
@@ -15002,7 +14773,7 @@
         </w:rPr>
         <w:t>inflow</w:t>
       </w:r>
-      <w:commentRangeEnd w:id="114"/>
+      <w:commentRangeEnd w:id="78"/>
       <w:r>
         <w:rPr>
           <w:rStyle w:val="CommentReference"/>
@@ -15010,7 +14781,7 @@
           <w:sz w:val="24"/>
           <w:szCs w:val="24"/>
         </w:rPr>
-        <w:commentReference w:id="114"/>
+        <w:commentReference w:id="78"/>
       </w:r>
       <w:r>
         <w:rPr>
@@ -15544,7 +15315,7 @@
         </w:rPr>
         <w:t xml:space="preserve">). </w:t>
       </w:r>
-      <w:commentRangeStart w:id="115"/>
+      <w:commentRangeStart w:id="79"/>
       <w:r>
         <w:rPr>
           <w:rFonts w:asciiTheme="majorBidi" w:hAnsiTheme="majorBidi" w:cstheme="majorBidi"/>
@@ -15553,7 +15324,7 @@
         </w:rPr>
         <w:t>Users carry over any positive end-of-year account balances to the next year</w:t>
       </w:r>
-      <w:commentRangeEnd w:id="115"/>
+      <w:commentRangeEnd w:id="79"/>
       <w:r>
         <w:rPr>
           <w:rStyle w:val="CommentReference"/>
@@ -15561,7 +15332,7 @@
           <w:sz w:val="24"/>
           <w:szCs w:val="24"/>
         </w:rPr>
-        <w:commentReference w:id="115"/>
+        <w:commentReference w:id="79"/>
       </w:r>
       <w:r>
         <w:rPr>
@@ -15575,13 +15346,13 @@
     <w:p>
       <w:pPr>
         <w:rPr>
-          <w:del w:id="116" w:author="Erik Christian Porse" w:date="2026-05-27T18:10:00Z" w16du:dateUtc="2026-05-28T01:10:00Z"/>
-          <w:rFonts w:asciiTheme="majorBidi" w:hAnsiTheme="majorBidi" w:cstheme="majorBidi"/>
-          <w:sz w:val="24"/>
-          <w:szCs w:val="24"/>
-        </w:rPr>
-      </w:pPr>
-      <w:del w:id="117" w:author="Erik Christian Porse" w:date="2026-05-27T18:10:00Z" w16du:dateUtc="2026-05-28T01:10:00Z">
+          <w:del w:id="80" w:author="Erik Christian Porse" w:date="2026-05-27T18:10:00Z" w16du:dateUtc="2026-05-28T01:10:00Z"/>
+          <w:rFonts w:asciiTheme="majorBidi" w:hAnsiTheme="majorBidi" w:cstheme="majorBidi"/>
+          <w:sz w:val="24"/>
+          <w:szCs w:val="24"/>
+        </w:rPr>
+      </w:pPr>
+      <w:del w:id="81" w:author="Erik Christian Porse" w:date="2026-05-27T18:10:00Z" w16du:dateUtc="2026-05-28T01:10:00Z">
         <w:r>
           <w:rPr>
             <w:rFonts w:asciiTheme="majorBidi" w:hAnsiTheme="majorBidi" w:cstheme="majorBidi"/>
@@ -15591,7 +15362,7 @@
           <w:delText xml:space="preserve">This water accounting method </w:delText>
         </w:r>
       </w:del>
-      <w:del w:id="118" w:author="Erik Christian Porse" w:date="2026-05-27T18:07:00Z" w16du:dateUtc="2026-05-28T01:07:00Z">
+      <w:del w:id="82" w:author="Erik Christian Porse" w:date="2026-05-27T18:07:00Z" w16du:dateUtc="2026-05-28T01:07:00Z">
         <w:r>
           <w:rPr>
             <w:rFonts w:asciiTheme="majorBidi" w:hAnsiTheme="majorBidi" w:cstheme="majorBidi"/>
@@ -15601,7 +15372,7 @@
           <w:delText xml:space="preserve">is </w:delText>
         </w:r>
       </w:del>
-      <w:del w:id="119" w:author="Erik Christian Porse" w:date="2026-05-27T18:10:00Z" w16du:dateUtc="2026-05-28T01:10:00Z">
+      <w:del w:id="83" w:author="Erik Christian Porse" w:date="2026-05-27T18:10:00Z" w16du:dateUtc="2026-05-28T01:10:00Z">
         <w:r>
           <w:rPr>
             <w:rFonts w:asciiTheme="majorBidi" w:hAnsiTheme="majorBidi" w:cstheme="majorBidi"/>
@@ -15611,7 +15382,7 @@
           <w:delText xml:space="preserve">implemented numerically </w:delText>
         </w:r>
       </w:del>
-      <w:del w:id="120" w:author="Erik Christian Porse" w:date="2026-05-27T18:07:00Z" w16du:dateUtc="2026-05-28T01:07:00Z">
+      <w:del w:id="84" w:author="Erik Christian Porse" w:date="2026-05-27T18:07:00Z" w16du:dateUtc="2026-05-28T01:07:00Z">
         <w:r>
           <w:rPr>
             <w:rFonts w:asciiTheme="majorBidi" w:hAnsiTheme="majorBidi" w:cstheme="majorBidi"/>
@@ -15662,7 +15433,7 @@
           <w:fldChar w:fldCharType="end"/>
         </w:r>
       </w:del>
-      <w:del w:id="121" w:author="Erik Christian Porse" w:date="2026-05-27T18:10:00Z" w16du:dateUtc="2026-05-28T01:10:00Z">
+      <w:del w:id="85" w:author="Erik Christian Porse" w:date="2026-05-27T18:10:00Z" w16du:dateUtc="2026-05-28T01:10:00Z">
         <w:r>
           <w:rPr>
             <w:rFonts w:asciiTheme="majorBidi" w:hAnsiTheme="majorBidi" w:cstheme="majorBidi"/>
@@ -15681,8 +15452,8 @@
           <w:szCs w:val="24"/>
         </w:rPr>
       </w:pPr>
-      <w:commentRangeStart w:id="122"/>
-      <w:commentRangeStart w:id="123"/>
+      <w:commentRangeStart w:id="86"/>
+      <w:commentRangeStart w:id="87"/>
       <w:r>
         <w:rPr>
           <w:rFonts w:asciiTheme="majorBidi" w:hAnsiTheme="majorBidi" w:cstheme="majorBidi"/>
@@ -15707,7 +15478,7 @@
         </w:rPr>
         <w:t>water accounting program.</w:t>
       </w:r>
-      <w:commentRangeEnd w:id="122"/>
+      <w:commentRangeEnd w:id="86"/>
       <w:r>
         <w:rPr>
           <w:rStyle w:val="CommentReference"/>
@@ -15715,9 +15486,9 @@
           <w:sz w:val="24"/>
           <w:szCs w:val="24"/>
         </w:rPr>
-        <w:commentReference w:id="122"/>
-      </w:r>
-      <w:commentRangeEnd w:id="123"/>
+        <w:commentReference w:id="86"/>
+      </w:r>
+      <w:commentRangeEnd w:id="87"/>
       <w:r>
         <w:rPr>
           <w:rStyle w:val="CommentReference"/>
@@ -15725,7 +15496,7 @@
           <w:sz w:val="24"/>
           <w:szCs w:val="24"/>
         </w:rPr>
-        <w:commentReference w:id="123"/>
+        <w:commentReference w:id="87"/>
       </w:r>
     </w:p>
     <w:p>
@@ -15763,7 +15534,7 @@
           <w:numId w:val="30"/>
         </w:numPr>
       </w:pPr>
-      <w:del w:id="124" w:author="Erik Christian Porse" w:date="2026-05-27T18:13:00Z" w16du:dateUtc="2026-05-28T01:13:00Z">
+      <w:del w:id="88" w:author="Erik Christian Porse" w:date="2026-05-27T18:13:00Z" w16du:dateUtc="2026-05-28T01:13:00Z">
         <w:r>
           <w:rPr>
             <w:rFonts w:asciiTheme="majorBidi" w:hAnsiTheme="majorBidi" w:cstheme="majorBidi"/>
@@ -15775,7 +15546,7 @@
           <w:delText>Each user</w:delText>
         </w:r>
       </w:del>
-      <w:ins w:id="125" w:author="Erik Christian Porse" w:date="2026-05-27T18:13:00Z" w16du:dateUtc="2026-05-28T01:13:00Z">
+      <w:ins w:id="89" w:author="Erik Christian Porse" w:date="2026-05-27T18:13:00Z" w16du:dateUtc="2026-05-28T01:13:00Z">
         <w:r>
           <w:rPr>
             <w:rFonts w:asciiTheme="majorBidi" w:hAnsiTheme="majorBidi" w:cstheme="majorBidi"/>
@@ -16082,7 +15853,7 @@
       <w:r>
         <w:t xml:space="preserve"> and </w:t>
       </w:r>
-      <w:del w:id="126" w:author="Erik Christian Porse" w:date="2026-05-27T18:14:00Z" w16du:dateUtc="2026-05-28T01:14:00Z">
+      <w:del w:id="90" w:author="Erik Christian Porse" w:date="2026-05-27T18:14:00Z" w16du:dateUtc="2026-05-28T01:14:00Z">
         <w:r>
           <w:delText>the baking in o</w:delText>
         </w:r>
@@ -16093,7 +15864,7 @@
       <w:r>
         <w:t xml:space="preserve">water shortages </w:t>
       </w:r>
-      <w:del w:id="127" w:author="Erik Christian Porse" w:date="2026-05-27T18:14:00Z" w16du:dateUtc="2026-05-28T01:14:00Z">
+      <w:del w:id="91" w:author="Erik Christian Porse" w:date="2026-05-27T18:14:00Z" w16du:dateUtc="2026-05-28T01:14:00Z">
         <w:r>
           <w:delText xml:space="preserve">(mandatory reductions from historical allocations) </w:delText>
         </w:r>
@@ -16101,7 +15872,7 @@
       <w:r>
         <w:t xml:space="preserve">tied to declining Lake Mead. If all users consume and draw down </w:t>
       </w:r>
-      <w:del w:id="128" w:author="Erik Christian Porse" w:date="2026-05-27T18:14:00Z" w16du:dateUtc="2026-05-28T01:14:00Z">
+      <w:del w:id="92" w:author="Erik Christian Porse" w:date="2026-05-27T18:14:00Z" w16du:dateUtc="2026-05-28T01:14:00Z">
         <w:r>
           <w:delText xml:space="preserve">all of </w:delText>
         </w:r>
@@ -16139,7 +15910,7 @@
       <w:r>
         <w:t xml:space="preserve">also </w:t>
       </w:r>
-      <w:del w:id="129" w:author="Erik Christian Porse" w:date="2026-05-27T18:15:00Z" w16du:dateUtc="2026-05-28T01:15:00Z">
+      <w:del w:id="93" w:author="Erik Christian Porse" w:date="2026-05-27T18:15:00Z" w16du:dateUtc="2026-05-28T01:15:00Z">
         <w:r>
           <w:rPr>
             <w:b/>
@@ -16148,7 +15919,7 @@
           <w:delText xml:space="preserve">not </w:delText>
         </w:r>
       </w:del>
-      <w:ins w:id="130" w:author="Erik Christian Porse" w:date="2026-05-27T18:15:00Z" w16du:dateUtc="2026-05-28T01:15:00Z">
+      <w:ins w:id="94" w:author="Erik Christian Porse" w:date="2026-05-27T18:15:00Z" w16du:dateUtc="2026-05-28T01:15:00Z">
         <w:r>
           <w:rPr>
             <w:b/>
@@ -19721,7 +19492,7 @@
 
 <file path=word/comments.xml><?xml version="1.0" encoding="utf-8"?>
 <w:comments xmlns:wpc="http://schemas.microsoft.com/office/word/2010/wordprocessingCanvas" xmlns:cx="http://schemas.microsoft.com/office/drawing/2014/chartex" xmlns:cx1="http://schemas.microsoft.com/office/drawing/2015/9/8/chartex" xmlns:cx2="http://schemas.microsoft.com/office/drawing/2015/10/21/chartex" xmlns:cx3="http://schemas.microsoft.com/office/drawing/2016/5/9/chartex" xmlns:cx4="http://schemas.microsoft.com/office/drawing/2016/5/10/chartex" xmlns:cx5="http://schemas.microsoft.com/office/drawing/2016/5/11/chartex" xmlns:cx6="http://schemas.microsoft.com/office/drawing/2016/5/12/chartex" xmlns:cx7="http://schemas.microsoft.com/office/drawing/2016/5/13/chartex" xmlns:cx8="http://schemas.microsoft.com/office/drawing/2016/5/14/chartex" xmlns:mc="http://schemas.openxmlformats.org/markup-compatibility/2006" xmlns:aink="http://schemas.microsoft.com/office/drawing/2016/ink" xmlns:am3d="http://schemas.microsoft.com/office/drawing/2017/model3d" xmlns:o="urn:schemas-microsoft-com:office:office" xmlns:oel="http://schemas.microsoft.com/office/2019/extlst" xmlns:r="http://schemas.openxmlformats.org/officeDocument/2006/relationships" xmlns:m="http://schemas.openxmlformats.org/officeDocument/2006/math" xmlns:v="urn:schemas-microsoft-com:vml" xmlns:wp14="http://schemas.microsoft.com/office/word/2010/wordprocessingDrawing" xmlns:wp="http://schemas.openxmlformats.org/drawingml/2006/wordprocessingDrawing" xmlns:w10="urn:schemas-microsoft-com:office:word" xmlns:w="http://schemas.openxmlformats.org/wordprocessingml/2006/main" xmlns:w14="http://schemas.microsoft.com/office/word/2010/wordml" xmlns:w15="http://schemas.microsoft.com/office/word/2012/wordml" xmlns:w16cex="http://schemas.microsoft.com/office/word/2018/wordml/cex" xmlns:w16cid="http://schemas.microsoft.com/office/word/2016/wordml/cid" xmlns:w16="http://schemas.microsoft.com/office/word/2018/wordml" xmlns:w16du="http://schemas.microsoft.com/office/word/2023/wordml/word16du" xmlns:w16sdtdh="http://schemas.microsoft.com/office/word/2020/wordml/sdtdatahash" xmlns:w16sdtfl="http://schemas.microsoft.com/office/word/2024/wordml/sdtformatlock" xmlns:w16se="http://schemas.microsoft.com/office/word/2015/wordml/symex" xmlns:wpg="http://schemas.microsoft.com/office/word/2010/wordprocessingGroup" xmlns:wpi="http://schemas.microsoft.com/office/word/2010/wordprocessingInk" xmlns:wne="http://schemas.microsoft.com/office/word/2006/wordml" xmlns:wps="http://schemas.microsoft.com/office/word/2010/wordprocessingShape" mc:Ignorable="w14 w15 w16se w16cid w16 w16cex w16sdtdh w16sdtfl w16du wp14">
-  <w:comment w:id="18" w:author="Erik Christian Porse" w:date="2026-05-27T12:47:00Z" w:initials="EP">
+  <w:comment w:id="0" w:author="Erik Christian Porse" w:date="2026-05-27T12:47:00Z" w:initials="EP">
     <w:p>
       <w:r>
         <w:rPr>
@@ -19738,7 +19509,7 @@
       </w:r>
     </w:p>
   </w:comment>
-  <w:comment w:id="19" w:author="Erik Christian Porse" w:date="2026-05-27T13:08:00Z" w:initials="EP">
+  <w:comment w:id="1" w:author="Erik Christian Porse" w:date="2026-05-27T15:45:00Z" w:initials="EP">
     <w:p>
       <w:r>
         <w:rPr>
@@ -19751,11 +19522,11 @@
           <w:sz w:val="20"/>
           <w:szCs w:val="20"/>
         </w:rPr>
-        <w:t>vs. losses from evaporation</w:t>
+        <w:t>is more clarity needed for this statement? What about initial conditions? How much drawdown?</w:t>
       </w:r>
     </w:p>
   </w:comment>
-  <w:comment w:id="22" w:author="Erik Christian Porse" w:date="2026-05-27T15:06:00Z" w:initials="EP">
+  <w:comment w:id="2" w:author="Erik Christian Porse" w:date="2026-05-27T15:49:00Z" w:initials="EP">
     <w:p>
       <w:r>
         <w:rPr>
@@ -19768,11 +19539,11 @@
           <w:sz w:val="20"/>
           <w:szCs w:val="20"/>
         </w:rPr>
-        <w:t>this should be plural but the grammar is odd</w:t>
+        <w:t xml:space="preserve">in some cases can we swap with the term deliveries? The language sounds a lot like a checking account and I am always hesitant about overly commodifying natural resources. </w:t>
       </w:r>
     </w:p>
   </w:comment>
-  <w:comment w:id="36" w:author="Erik Christian Porse" w:date="2026-05-27T15:44:00Z" w:initials="EP">
+  <w:comment w:id="3" w:author="Erik Christian Porse" w:date="2026-05-27T15:50:00Z" w:initials="EP">
     <w:p>
       <w:r>
         <w:rPr>
@@ -19785,11 +19556,11 @@
           <w:sz w:val="20"/>
           <w:szCs w:val="20"/>
         </w:rPr>
-        <w:t>are we consistent between withdraw and withdrawal throughout?</w:t>
+        <w:t>Is this additional voluntary water conservation, or an issue of timing of deliveries?</w:t>
       </w:r>
     </w:p>
   </w:comment>
-  <w:comment w:id="37" w:author="Erik Christian Porse" w:date="2026-05-27T15:45:00Z" w:initials="EP">
+  <w:comment w:id="8" w:author="Erik Christian Porse" w:date="2026-05-27T15:52:00Z" w:initials="EP">
     <w:p>
       <w:r>
         <w:rPr>
@@ -19802,11 +19573,11 @@
           <w:sz w:val="20"/>
           <w:szCs w:val="20"/>
         </w:rPr>
-        <w:t>is more clarity needed for this statement? What about initial conditions? How much drawdown?</w:t>
+        <w:t>what are these entitlements? Lower Basin States + Mexico?</w:t>
       </w:r>
     </w:p>
   </w:comment>
-  <w:comment w:id="38" w:author="Erik Christian Porse" w:date="2026-05-27T15:49:00Z" w:initials="EP">
+  <w:comment w:id="9" w:author="Erik Christian Porse" w:date="2026-05-27T17:53:00Z" w:initials="EP">
     <w:p>
       <w:r>
         <w:rPr>
@@ -19819,11 +19590,11 @@
           <w:sz w:val="20"/>
           <w:szCs w:val="20"/>
         </w:rPr>
-        <w:t xml:space="preserve">in some cases can we swap with the term deliveries? The language sounds a lot like a checking account and I am always hesitant about overly commodifying natural resources. </w:t>
+        <w:t>why is this maximized and what does that mean in a non-optimization formulation?</w:t>
       </w:r>
     </w:p>
   </w:comment>
-  <w:comment w:id="39" w:author="Erik Christian Porse" w:date="2026-05-27T15:50:00Z" w:initials="EP">
+  <w:comment w:id="13" w:author="Erik Christian Porse" w:date="2026-05-27T15:54:00Z" w:initials="EP">
     <w:p>
       <w:r>
         <w:rPr>
@@ -19836,11 +19607,11 @@
           <w:sz w:val="20"/>
           <w:szCs w:val="20"/>
         </w:rPr>
-        <w:t>Is this additional voluntary water conservation, or an issue of timing of deliveries?</w:t>
+        <w:t>hard to follow as several of the terms are not in the equation for case #1 but they are in the diagram</w:t>
       </w:r>
     </w:p>
   </w:comment>
-  <w:comment w:id="44" w:author="Erik Christian Porse" w:date="2026-05-27T15:52:00Z" w:initials="EP">
+  <w:comment w:id="18" w:author="Erik Christian Porse" w:date="2026-05-27T17:58:00Z" w:initials="EP">
     <w:p>
       <w:r>
         <w:rPr>
@@ -19853,62 +19624,11 @@
           <w:sz w:val="20"/>
           <w:szCs w:val="20"/>
         </w:rPr>
-        <w:t>what are these entitlements? Lower Basin States + Mexico?</w:t>
+        <w:t>suggest to complete this thought by indicating that the Lower Basin legal entitlements are 9 MAF</w:t>
       </w:r>
     </w:p>
   </w:comment>
-  <w:comment w:id="45" w:author="Erik Christian Porse" w:date="2026-05-27T17:53:00Z" w:initials="EP">
-    <w:p>
-      <w:r>
-        <w:rPr>
-          <w:rStyle w:val="CommentReference"/>
-        </w:rPr>
-        <w:annotationRef/>
-      </w:r>
-      <w:r>
-        <w:rPr>
-          <w:sz w:val="20"/>
-          <w:szCs w:val="20"/>
-        </w:rPr>
-        <w:t>why is this maximized and what does that mean in a non-optimization formulation?</w:t>
-      </w:r>
-    </w:p>
-  </w:comment>
-  <w:comment w:id="49" w:author="Erik Christian Porse" w:date="2026-05-27T15:54:00Z" w:initials="EP">
-    <w:p>
-      <w:r>
-        <w:rPr>
-          <w:rStyle w:val="CommentReference"/>
-        </w:rPr>
-        <w:annotationRef/>
-      </w:r>
-      <w:r>
-        <w:rPr>
-          <w:sz w:val="20"/>
-          <w:szCs w:val="20"/>
-        </w:rPr>
-        <w:t>hard to follow as several of the terms are not in the equation for case #1 but they are in the diagram</w:t>
-      </w:r>
-    </w:p>
-  </w:comment>
-  <w:comment w:id="54" w:author="Erik Christian Porse" w:date="2026-05-27T17:58:00Z" w:initials="EP">
-    <w:p>
-      <w:r>
-        <w:rPr>
-          <w:rStyle w:val="CommentReference"/>
-        </w:rPr>
-        <w:annotationRef/>
-      </w:r>
-      <w:r>
-        <w:rPr>
-          <w:sz w:val="20"/>
-          <w:szCs w:val="20"/>
-        </w:rPr>
-        <w:t>suggest to complete this thought by indicating that the Lower Basin legal entitlements are 9 MAF</w:t>
-      </w:r>
-    </w:p>
-  </w:comment>
-  <w:comment w:id="114" w:author="Erik Christian Porse" w:date="2025-02-03T20:21:00Z" w:initials="EP">
+  <w:comment w:id="78" w:author="Erik Christian Porse" w:date="2025-02-03T20:21:00Z" w:initials="EP">
     <w:p>
       <w:r>
         <w:rPr>
@@ -19926,7 +19646,7 @@
       </w:r>
     </w:p>
   </w:comment>
-  <w:comment w:id="115" w:author="Erik Christian Porse" w:date="2025-02-03T20:22:00Z" w:initials="EP">
+  <w:comment w:id="79" w:author="Erik Christian Porse" w:date="2025-02-03T20:22:00Z" w:initials="EP">
     <w:p>
       <w:r>
         <w:rPr>
@@ -19944,7 +19664,7 @@
       </w:r>
     </w:p>
   </w:comment>
-  <w:comment w:id="122" w:author="Erik Christian Porse" w:date="2026-05-27T18:13:00Z" w:initials="EP">
+  <w:comment w:id="86" w:author="Erik Christian Porse" w:date="2026-05-27T18:13:00Z" w:initials="EP">
     <w:p>
       <w:r>
         <w:rPr>
@@ -19961,7 +19681,7 @@
       </w:r>
     </w:p>
   </w:comment>
-  <w:comment w:id="123" w:author="Erik Christian Porse" w:date="2026-05-27T18:15:00Z" w:initials="EP">
+  <w:comment w:id="87" w:author="Erik Christian Porse" w:date="2026-05-27T18:15:00Z" w:initials="EP">
     <w:p>
       <w:r>
         <w:rPr>
@@ -19984,9 +19704,6 @@
 <file path=word/commentsExtended.xml><?xml version="1.0" encoding="utf-8"?>
 <w15:commentsEx xmlns:wpc="http://schemas.microsoft.com/office/word/2010/wordprocessingCanvas" xmlns:cx="http://schemas.microsoft.com/office/drawing/2014/chartex" xmlns:cx1="http://schemas.microsoft.com/office/drawing/2015/9/8/chartex" xmlns:cx2="http://schemas.microsoft.com/office/drawing/2015/10/21/chartex" xmlns:cx3="http://schemas.microsoft.com/office/drawing/2016/5/9/chartex" xmlns:cx4="http://schemas.microsoft.com/office/drawing/2016/5/10/chartex" xmlns:cx5="http://schemas.microsoft.com/office/drawing/2016/5/11/chartex" xmlns:cx6="http://schemas.microsoft.com/office/drawing/2016/5/12/chartex" xmlns:cx7="http://schemas.microsoft.com/office/drawing/2016/5/13/chartex" xmlns:cx8="http://schemas.microsoft.com/office/drawing/2016/5/14/chartex" xmlns:mc="http://schemas.openxmlformats.org/markup-compatibility/2006" xmlns:aink="http://schemas.microsoft.com/office/drawing/2016/ink" xmlns:am3d="http://schemas.microsoft.com/office/drawing/2017/model3d" xmlns:o="urn:schemas-microsoft-com:office:office" xmlns:oel="http://schemas.microsoft.com/office/2019/extlst" xmlns:r="http://schemas.openxmlformats.org/officeDocument/2006/relationships" xmlns:m="http://schemas.openxmlformats.org/officeDocument/2006/math" xmlns:v="urn:schemas-microsoft-com:vml" xmlns:wp14="http://schemas.microsoft.com/office/word/2010/wordprocessingDrawing" xmlns:wp="http://schemas.openxmlformats.org/drawingml/2006/wordprocessingDrawing" xmlns:w10="urn:schemas-microsoft-com:office:word" xmlns:w="http://schemas.openxmlformats.org/wordprocessingml/2006/main" xmlns:w14="http://schemas.microsoft.com/office/word/2010/wordml" xmlns:w15="http://schemas.microsoft.com/office/word/2012/wordml" xmlns:w16cex="http://schemas.microsoft.com/office/word/2018/wordml/cex" xmlns:w16cid="http://schemas.microsoft.com/office/word/2016/wordml/cid" xmlns:w16="http://schemas.microsoft.com/office/word/2018/wordml" xmlns:w16du="http://schemas.microsoft.com/office/word/2023/wordml/word16du" xmlns:w16sdtdh="http://schemas.microsoft.com/office/word/2020/wordml/sdtdatahash" xmlns:w16sdtfl="http://schemas.microsoft.com/office/word/2024/wordml/sdtformatlock" xmlns:w16se="http://schemas.microsoft.com/office/word/2015/wordml/symex" xmlns:wpg="http://schemas.microsoft.com/office/word/2010/wordprocessingGroup" xmlns:wpi="http://schemas.microsoft.com/office/word/2010/wordprocessingInk" xmlns:wne="http://schemas.microsoft.com/office/word/2006/wordml" xmlns:wps="http://schemas.microsoft.com/office/word/2010/wordprocessingShape" mc:Ignorable="w14 w15 w16se w16cid w16 w16cex w16sdtdh w16sdtfl w16du wp14">
   <w15:commentEx w15:paraId="5028B586" w15:done="0"/>
-  <w15:commentEx w15:paraId="79C85185" w15:done="0"/>
-  <w15:commentEx w15:paraId="6F2DACBB" w15:done="0"/>
-  <w15:commentEx w15:paraId="7A90E55F" w15:done="0"/>
   <w15:commentEx w15:paraId="2D008202" w15:done="0"/>
   <w15:commentEx w15:paraId="2B93612E" w15:done="0"/>
   <w15:commentEx w15:paraId="140C500F" w15:done="0"/>
@@ -20004,9 +19721,6 @@
 <file path=word/commentsExtensible.xml><?xml version="1.0" encoding="utf-8"?>
 <w16cex:commentsExtensible xmlns:wpc="http://schemas.microsoft.com/office/word/2010/wordprocessingCanvas" xmlns:cx="http://schemas.microsoft.com/office/drawing/2014/chartex" xmlns:cx1="http://schemas.microsoft.com/office/drawing/2015/9/8/chartex" xmlns:cx2="http://schemas.microsoft.com/office/drawing/2015/10/21/chartex" xmlns:cx3="http://schemas.microsoft.com/office/drawing/2016/5/9/chartex" xmlns:cx4="http://schemas.microsoft.com/office/drawing/2016/5/10/chartex" xmlns:cx5="http://schemas.microsoft.com/office/drawing/2016/5/11/chartex" xmlns:cx6="http://schemas.microsoft.com/office/drawing/2016/5/12/chartex" xmlns:cx7="http://schemas.microsoft.com/office/drawing/2016/5/13/chartex" xmlns:cx8="http://schemas.microsoft.com/office/drawing/2016/5/14/chartex" xmlns:cr="http://schemas.microsoft.com/office/comments/2020/reactions" xmlns:mc="http://schemas.openxmlformats.org/markup-compatibility/2006" xmlns:aink="http://schemas.microsoft.com/office/drawing/2016/ink" xmlns:am3d="http://schemas.microsoft.com/office/drawing/2017/model3d" xmlns:o="urn:schemas-microsoft-com:office:office" xmlns:oel="http://schemas.microsoft.com/office/2019/extlst" xmlns:r="http://schemas.openxmlformats.org/officeDocument/2006/relationships" xmlns:m="http://schemas.openxmlformats.org/officeDocument/2006/math" xmlns:v="urn:schemas-microsoft-com:vml" xmlns:wp14="http://schemas.microsoft.com/office/word/2010/wordprocessingDrawing" xmlns:wp="http://schemas.openxmlformats.org/drawingml/2006/wordprocessingDrawing" xmlns:w10="urn:schemas-microsoft-com:office:word" xmlns:w="http://schemas.openxmlformats.org/wordprocessingml/2006/main" xmlns:w14="http://schemas.microsoft.com/office/word/2010/wordml" xmlns:w15="http://schemas.microsoft.com/office/word/2012/wordml" xmlns:w16cex="http://schemas.microsoft.com/office/word/2018/wordml/cex" xmlns:w16cid="http://schemas.microsoft.com/office/word/2016/wordml/cid" xmlns:w16="http://schemas.microsoft.com/office/word/2018/wordml" xmlns:w16du="http://schemas.microsoft.com/office/word/2023/wordml/word16du" xmlns:w16sdtdh="http://schemas.microsoft.com/office/word/2020/wordml/sdtdatahash" xmlns:w16sdtfl="http://schemas.microsoft.com/office/word/2024/wordml/sdtformatlock" xmlns:w16se="http://schemas.microsoft.com/office/word/2015/wordml/symex" xmlns:wpg="http://schemas.microsoft.com/office/word/2010/wordprocessingGroup" xmlns:wpi="http://schemas.microsoft.com/office/word/2010/wordprocessingInk" xmlns:wne="http://schemas.microsoft.com/office/word/2006/wordml" xmlns:wps="http://schemas.microsoft.com/office/word/2010/wordprocessingShape" mc:Ignorable="w14 w15 w16se w16cid w16 w16cex w16sdtdh w16sdtfl cr w16du wp14">
   <w16cex:commentExtensible w16cex:durableId="29F1A260" w16cex:dateUtc="2026-05-27T19:47:00Z"/>
-  <w16cex:commentExtensible w16cex:durableId="2E96353D" w16cex:dateUtc="2026-05-27T20:08:00Z"/>
-  <w16cex:commentExtensible w16cex:durableId="5BEFE056" w16cex:dateUtc="2026-05-27T22:06:00Z"/>
-  <w16cex:commentExtensible w16cex:durableId="48A985C2" w16cex:dateUtc="2026-05-27T22:44:00Z"/>
   <w16cex:commentExtensible w16cex:durableId="771B7970" w16cex:dateUtc="2026-05-27T22:45:00Z"/>
   <w16cex:commentExtensible w16cex:durableId="3A2CAA42" w16cex:dateUtc="2026-05-27T22:49:00Z"/>
   <w16cex:commentExtensible w16cex:durableId="72798785" w16cex:dateUtc="2026-05-27T22:50:00Z"/>
@@ -20024,9 +19738,6 @@
 <file path=word/commentsIds.xml><?xml version="1.0" encoding="utf-8"?>
 <w16cid:commentsIds xmlns:wpc="http://schemas.microsoft.com/office/word/2010/wordprocessingCanvas" xmlns:cx="http://schemas.microsoft.com/office/drawing/2014/chartex" xmlns:cx1="http://schemas.microsoft.com/office/drawing/2015/9/8/chartex" xmlns:cx2="http://schemas.microsoft.com/office/drawing/2015/10/21/chartex" xmlns:cx3="http://schemas.microsoft.com/office/drawing/2016/5/9/chartex" xmlns:cx4="http://schemas.microsoft.com/office/drawing/2016/5/10/chartex" xmlns:cx5="http://schemas.microsoft.com/office/drawing/2016/5/11/chartex" xmlns:cx6="http://schemas.microsoft.com/office/drawing/2016/5/12/chartex" xmlns:cx7="http://schemas.microsoft.com/office/drawing/2016/5/13/chartex" xmlns:cx8="http://schemas.microsoft.com/office/drawing/2016/5/14/chartex" xmlns:mc="http://schemas.openxmlformats.org/markup-compatibility/2006" xmlns:aink="http://schemas.microsoft.com/office/drawing/2016/ink" xmlns:am3d="http://schemas.microsoft.com/office/drawing/2017/model3d" xmlns:o="urn:schemas-microsoft-com:office:office" xmlns:oel="http://schemas.microsoft.com/office/2019/extlst" xmlns:r="http://schemas.openxmlformats.org/officeDocument/2006/relationships" xmlns:m="http://schemas.openxmlformats.org/officeDocument/2006/math" xmlns:v="urn:schemas-microsoft-com:vml" xmlns:wp14="http://schemas.microsoft.com/office/word/2010/wordprocessingDrawing" xmlns:wp="http://schemas.openxmlformats.org/drawingml/2006/wordprocessingDrawing" xmlns:w10="urn:schemas-microsoft-com:office:word" xmlns:w="http://schemas.openxmlformats.org/wordprocessingml/2006/main" xmlns:w14="http://schemas.microsoft.com/office/word/2010/wordml" xmlns:w15="http://schemas.microsoft.com/office/word/2012/wordml" xmlns:w16cex="http://schemas.microsoft.com/office/word/2018/wordml/cex" xmlns:w16cid="http://schemas.microsoft.com/office/word/2016/wordml/cid" xmlns:w16="http://schemas.microsoft.com/office/word/2018/wordml" xmlns:w16du="http://schemas.microsoft.com/office/word/2023/wordml/word16du" xmlns:w16sdtdh="http://schemas.microsoft.com/office/word/2020/wordml/sdtdatahash" xmlns:w16sdtfl="http://schemas.microsoft.com/office/word/2024/wordml/sdtformatlock" xmlns:w16se="http://schemas.microsoft.com/office/word/2015/wordml/symex" xmlns:wpg="http://schemas.microsoft.com/office/word/2010/wordprocessingGroup" xmlns:wpi="http://schemas.microsoft.com/office/word/2010/wordprocessingInk" xmlns:wne="http://schemas.microsoft.com/office/word/2006/wordml" xmlns:wps="http://schemas.microsoft.com/office/word/2010/wordprocessingShape" mc:Ignorable="w14 w15 w16se w16cid w16 w16cex w16sdtdh w16sdtfl w16du wp14">
   <w16cid:commentId w16cid:paraId="5028B586" w16cid:durableId="29F1A260"/>
-  <w16cid:commentId w16cid:paraId="79C85185" w16cid:durableId="2E96353D"/>
-  <w16cid:commentId w16cid:paraId="6F2DACBB" w16cid:durableId="5BEFE056"/>
-  <w16cid:commentId w16cid:paraId="7A90E55F" w16cid:durableId="48A985C2"/>
   <w16cid:commentId w16cid:paraId="2D008202" w16cid:durableId="771B7970"/>
   <w16cid:commentId w16cid:paraId="2B93612E" w16cid:durableId="3A2CAA42"/>
   <w16cid:commentId w16cid:paraId="140C500F" w16cid:durableId="72798785"/>
@@ -23183,9 +22894,6 @@
 <w15:people xmlns:wpc="http://schemas.microsoft.com/office/word/2010/wordprocessingCanvas" xmlns:cx="http://schemas.microsoft.com/office/drawing/2014/chartex" xmlns:cx1="http://schemas.microsoft.com/office/drawing/2015/9/8/chartex" xmlns:cx2="http://schemas.microsoft.com/office/drawing/2015/10/21/chartex" xmlns:cx3="http://schemas.microsoft.com/office/drawing/2016/5/9/chartex" xmlns:cx4="http://schemas.microsoft.com/office/drawing/2016/5/10/chartex" xmlns:cx5="http://schemas.microsoft.com/office/drawing/2016/5/11/chartex" xmlns:cx6="http://schemas.microsoft.com/office/drawing/2016/5/12/chartex" xmlns:cx7="http://schemas.microsoft.com/office/drawing/2016/5/13/chartex" xmlns:cx8="http://schemas.microsoft.com/office/drawing/2016/5/14/chartex" xmlns:mc="http://schemas.openxmlformats.org/markup-compatibility/2006" xmlns:aink="http://schemas.microsoft.com/office/drawing/2016/ink" xmlns:am3d="http://schemas.microsoft.com/office/drawing/2017/model3d" xmlns:o="urn:schemas-microsoft-com:office:office" xmlns:oel="http://schemas.microsoft.com/office/2019/extlst" xmlns:r="http://schemas.openxmlformats.org/officeDocument/2006/relationships" xmlns:m="http://schemas.openxmlformats.org/officeDocument/2006/math" xmlns:v="urn:schemas-microsoft-com:vml" xmlns:wp14="http://schemas.microsoft.com/office/word/2010/wordprocessingDrawing" xmlns:wp="http://schemas.openxmlformats.org/drawingml/2006/wordprocessingDrawing" xmlns:w10="urn:schemas-microsoft-com:office:word" xmlns:w="http://schemas.openxmlformats.org/wordprocessingml/2006/main" xmlns:w14="http://schemas.microsoft.com/office/word/2010/wordml" xmlns:w15="http://schemas.microsoft.com/office/word/2012/wordml" xmlns:w16cex="http://schemas.microsoft.com/office/word/2018/wordml/cex" xmlns:w16cid="http://schemas.microsoft.com/office/word/2016/wordml/cid" xmlns:w16="http://schemas.microsoft.com/office/word/2018/wordml" xmlns:w16du="http://schemas.microsoft.com/office/word/2023/wordml/word16du" xmlns:w16sdtdh="http://schemas.microsoft.com/office/word/2020/wordml/sdtdatahash" xmlns:w16sdtfl="http://schemas.microsoft.com/office/word/2024/wordml/sdtformatlock" xmlns:w16se="http://schemas.microsoft.com/office/word/2015/wordml/symex" xmlns:wpg="http://schemas.microsoft.com/office/word/2010/wordprocessingGroup" xmlns:wpi="http://schemas.microsoft.com/office/word/2010/wordprocessingInk" xmlns:wne="http://schemas.microsoft.com/office/word/2006/wordml" xmlns:wps="http://schemas.microsoft.com/office/word/2010/wordprocessingShape" mc:Ignorable="w14 w15 w16se w16cid w16 w16cex w16sdtdh w16sdtfl w16du wp14">
   <w15:person w15:author="Erik Christian Porse">
     <w15:presenceInfo w15:providerId="AD" w15:userId="S::eporse@ucdavis.edu::e6b50e3b-0b40-4d96-8b53-4f3def8ebfff"/>
-  </w15:person>
-  <w15:person w15:author="David Rosenberg">
-    <w15:presenceInfo w15:providerId="AD" w15:userId="S::A01192427@aggies.usu.edu::c209a15a-8d29-49b1-b0b3-d96d249aedaa"/>
   </w15:person>
 </w15:people>
 </file>
@@ -23616,6 +23324,7 @@
   <w:style w:type="character" w:default="1" w:styleId="DefaultParagraphFont">
     <w:name w:val="Default Paragraph Font"/>
     <w:uiPriority w:val="1"/>
+    <w:semiHidden/>
     <w:unhideWhenUsed/>
   </w:style>
   <w:style w:type="table" w:default="1" w:styleId="TableNormal">

</xml_diff>

<commit_message>
Add to Minimum Drawdown elevations function to print reservoir storages
</commit_message>
<xml_diff>
--- a/LakeMeadWaterConservationProgramAnalysis/LakeMeadWaterConservationProgramSuccessChallengesSuggestions_v3.docx
+++ b/LakeMeadWaterConservationProgramAnalysis/LakeMeadWaterConservationProgramSuccessChallengesSuggestions_v3.docx
@@ -2296,7 +2296,23 @@
           <w:sz w:val="24"/>
           <w:szCs w:val="24"/>
         </w:rPr>
-        <w:t>Even with these activities, Lake Mead continues to draw down.</w:t>
+        <w:t>Even with these activities, Lake Mead continue</w:t>
+      </w:r>
+      <w:r>
+        <w:rPr>
+          <w:rFonts w:asciiTheme="majorBidi" w:hAnsiTheme="majorBidi" w:cstheme="majorBidi"/>
+          <w:sz w:val="24"/>
+          <w:szCs w:val="24"/>
+        </w:rPr>
+        <w:t>d</w:t>
+      </w:r>
+      <w:r>
+        <w:rPr>
+          <w:rFonts w:asciiTheme="majorBidi" w:hAnsiTheme="majorBidi" w:cstheme="majorBidi"/>
+          <w:sz w:val="24"/>
+          <w:szCs w:val="24"/>
+        </w:rPr>
+        <w:t xml:space="preserve"> to draw down.</w:t>
       </w:r>
     </w:p>
     <w:p>
@@ -7153,7 +7169,7 @@
                     <pic:cNvPicPr/>
                   </pic:nvPicPr>
                   <pic:blipFill>
-                    <a:blip r:embed="rId11"/>
+                    <a:blip r:embed="rId12"/>
                     <a:stretch>
                       <a:fillRect/>
                     </a:stretch>
@@ -7237,7 +7253,7 @@
                     <pic:cNvPicPr/>
                   </pic:nvPicPr>
                   <pic:blipFill>
-                    <a:blip r:embed="rId12"/>
+                    <a:blip r:embed="rId13"/>
                     <a:stretch>
                       <a:fillRect/>
                     </a:stretch>
@@ -7819,7 +7835,7 @@
                     </pic:cNvPicPr>
                   </pic:nvPicPr>
                   <pic:blipFill>
-                    <a:blip r:embed="rId13">
+                    <a:blip r:embed="rId14">
                       <a:extLst>
                         <a:ext uri="{28A0092B-C50C-407E-A947-70E740481C1C}">
                           <a14:useLocalDpi xmlns:a14="http://schemas.microsoft.com/office/drawing/2010/main" val="0"/>
@@ -8117,7 +8133,7 @@
                     <pic:cNvPicPr/>
                   </pic:nvPicPr>
                   <pic:blipFill>
-                    <a:blip r:embed="rId14"/>
+                    <a:blip r:embed="rId15"/>
                     <a:stretch>
                       <a:fillRect/>
                     </a:stretch>
@@ -9515,15 +9531,7 @@
           <w:sz w:val="24"/>
           <w:szCs w:val="24"/>
         </w:rPr>
-        <w:t xml:space="preserve">Lake Mead storage </w:t>
-      </w:r>
-      <w:r>
-        <w:rPr>
-          <w:rFonts w:asciiTheme="majorBidi" w:hAnsiTheme="majorBidi" w:cstheme="majorBidi"/>
-          <w:sz w:val="24"/>
-          <w:szCs w:val="24"/>
-        </w:rPr>
-        <w:t>above</w:t>
+        <w:t>Lake Mead storage above</w:t>
       </w:r>
       <w:r>
         <w:rPr>
@@ -9579,15 +9587,7 @@
           <w:sz w:val="24"/>
           <w:szCs w:val="24"/>
         </w:rPr>
-        <w:t xml:space="preserve"> allow invasive </w:t>
-      </w:r>
-      <w:r>
-        <w:rPr>
-          <w:rFonts w:asciiTheme="majorBidi" w:hAnsiTheme="majorBidi" w:cstheme="majorBidi"/>
-          <w:sz w:val="24"/>
-          <w:szCs w:val="24"/>
-        </w:rPr>
-        <w:t xml:space="preserve">fish in the reservoir to swim upstream to the detriment of native fish in Grand Canyon. </w:t>
+        <w:t xml:space="preserve"> allow invasive fish in the reservoir to swim upstream to the detriment of native fish in Grand Canyon. </w:t>
       </w:r>
       <w:r>
         <w:rPr>
@@ -9710,15 +9710,7 @@
           <w:sz w:val="24"/>
           <w:szCs w:val="24"/>
         </w:rPr>
-        <w:t xml:space="preserve">the sum of legal </w:t>
-      </w:r>
-      <w:r>
-        <w:rPr>
-          <w:rFonts w:asciiTheme="majorBidi" w:hAnsiTheme="majorBidi" w:cstheme="majorBidi"/>
-          <w:sz w:val="24"/>
-          <w:szCs w:val="24"/>
-        </w:rPr>
-        <w:t xml:space="preserve">entitlements of 9.0 million acre-feet per </w:t>
+        <w:t xml:space="preserve">the sum of legal entitlements of 9.0 million acre-feet per </w:t>
       </w:r>
       <w:commentRangeStart w:id="1"/>
       <w:r>
@@ -9866,7 +9858,7 @@
         </w:rPr>
         <w:lastRenderedPageBreak/>
         <w:drawing>
-          <wp:inline distT="0" distB="0" distL="0" distR="0" wp14:anchorId="4E4DC790" wp14:editId="12307EA7">
+          <wp:inline distT="0" distB="0" distL="0" distR="0" wp14:anchorId="4E4DC790" wp14:editId="54C7C552">
             <wp:extent cx="5929566" cy="3377110"/>
             <wp:effectExtent l="0" t="0" r="0" b="0"/>
             <wp:docPr id="496325522" name="Picture 3"/>
@@ -9883,7 +9875,7 @@
                     </pic:cNvPicPr>
                   </pic:nvPicPr>
                   <pic:blipFill>
-                    <a:blip r:embed="rId15" cstate="print">
+                    <a:blip r:embed="rId16" cstate="print">
                       <a:extLst>
                         <a:ext uri="{28A0092B-C50C-407E-A947-70E740481C1C}">
                           <a14:useLocalDpi xmlns:a14="http://schemas.microsoft.com/office/drawing/2010/main" val="0"/>
@@ -10512,10 +10504,7 @@
         <w:t xml:space="preserve"> </w:t>
       </w:r>
       <w:r>
-        <w:t xml:space="preserve">Physically Available </w:t>
-      </w:r>
-      <w:r>
-        <w:t>Water (</w:t>
+        <w:t>Physically Available Water (</w:t>
       </w:r>
       <w:r>
         <w:rPr>
@@ -11066,7 +11055,7 @@
                     <pic:cNvPicPr/>
                   </pic:nvPicPr>
                   <pic:blipFill>
-                    <a:blip r:embed="rId16"/>
+                    <a:blip r:embed="rId17"/>
                     <a:stretch>
                       <a:fillRect/>
                     </a:stretch>
@@ -11334,10 +11323,7 @@
         <w:commentReference w:id="7"/>
       </w:r>
       <w:r>
-        <w:t xml:space="preserve">. When the Lake Powell release is 6 million acre-feet as in Water Year 2025-2026, mandatory </w:t>
-      </w:r>
-      <w:r>
-        <w:t>shortages must exceed 2.6 maf per year.</w:t>
+        <w:t>. When the Lake Powell release is 6 million acre-feet as in Water Year 2025-2026, mandatory shortages must exceed 2.6 maf per year.</w:t>
       </w:r>
     </w:p>
     <w:p>
@@ -11411,7 +11397,7 @@
                     </pic:cNvPicPr>
                   </pic:nvPicPr>
                   <pic:blipFill>
-                    <a:blip r:embed="rId17">
+                    <a:blip r:embed="rId18">
                       <a:extLst>
                         <a:ext uri="{28A0092B-C50C-407E-A947-70E740481C1C}">
                           <a14:useLocalDpi xmlns:a14="http://schemas.microsoft.com/office/drawing/2010/main" val="0"/>
@@ -12625,15 +12611,7 @@
             <w:sz w:val="24"/>
             <w:szCs w:val="24"/>
           </w:rPr>
-          <m:t>≤</m:t>
-        </m:r>
-        <m:r>
-          <w:rPr>
-            <w:rFonts w:ascii="Cambria Math" w:hAnsi="Cambria Math" w:cstheme="majorBidi"/>
-            <w:sz w:val="24"/>
-            <w:szCs w:val="24"/>
-          </w:rPr>
-          <m:t>max</m:t>
+          <m:t>≤max</m:t>
         </m:r>
         <m:d>
           <m:dPr>
@@ -12802,15 +12780,7 @@
           <w:sz w:val="24"/>
           <w:szCs w:val="24"/>
         </w:rPr>
-        <w:t xml:space="preserve"> (Eq</w:t>
-      </w:r>
-      <w:r>
-        <w:rPr>
-          <w:rFonts w:asciiTheme="majorBidi" w:hAnsiTheme="majorBidi" w:cstheme="majorBidi"/>
-          <w:sz w:val="24"/>
-          <w:szCs w:val="24"/>
-        </w:rPr>
-        <w:t>. 5)</w:t>
+        <w:t xml:space="preserve"> (Eq. 5)</w:t>
       </w:r>
       <w:r>
         <w:rPr>
@@ -13406,15 +13376,7 @@
           <w:sz w:val="24"/>
           <w:szCs w:val="24"/>
         </w:rPr>
-        <w:t xml:space="preserve"> </w:t>
-      </w:r>
-      <w:r>
-        <w:rPr>
-          <w:rFonts w:asciiTheme="majorBidi" w:hAnsiTheme="majorBidi" w:cstheme="majorBidi"/>
-          <w:sz w:val="24"/>
-          <w:szCs w:val="24"/>
-        </w:rPr>
-        <w:t xml:space="preserve">If total claims exceed </w:t>
+        <w:t xml:space="preserve"> If total claims exceed </w:t>
       </w:r>
       <w:r>
         <w:rPr>
@@ -13576,15 +13538,7 @@
           <w:sz w:val="24"/>
           <w:szCs w:val="24"/>
         </w:rPr>
-        <w:t xml:space="preserve"> &lt; 1</w:t>
-      </w:r>
-      <w:r>
-        <w:rPr>
-          <w:rFonts w:asciiTheme="majorBidi" w:hAnsiTheme="majorBidi" w:cstheme="majorBidi"/>
-          <w:sz w:val="24"/>
-          <w:szCs w:val="24"/>
-        </w:rPr>
-        <w:t>,</w:t>
+        <w:t xml:space="preserve"> &lt; 1,</w:t>
       </w:r>
       <w:r>
         <w:rPr>
@@ -14031,15 +13985,7 @@
           <w:sz w:val="24"/>
           <w:szCs w:val="24"/>
         </w:rPr>
-        <w:t xml:space="preserve"> equal to </w:t>
-      </w:r>
-      <w:r>
-        <w:rPr>
-          <w:rFonts w:asciiTheme="majorBidi" w:hAnsiTheme="majorBidi" w:cstheme="majorBidi"/>
-          <w:sz w:val="24"/>
-          <w:szCs w:val="24"/>
-        </w:rPr>
-        <w:t>the annual reservoir evaporation</w:t>
+        <w:t xml:space="preserve"> equal to the annual reservoir evaporation</w:t>
       </w:r>
       <w:r>
         <w:rPr>
@@ -14222,23 +14168,7 @@
                 <w:sz w:val="24"/>
                 <w:szCs w:val="24"/>
               </w:rPr>
-              <m:t xml:space="preserve"> + </m:t>
-            </m:r>
-            <m:r>
-              <w:rPr>
-                <w:rFonts w:ascii="Cambria Math" w:hAnsi="Cambria Math" w:cstheme="majorBidi"/>
-                <w:sz w:val="24"/>
-                <w:szCs w:val="24"/>
-              </w:rPr>
-              <m:t>USBR S</m:t>
-            </m:r>
-            <m:r>
-              <w:rPr>
-                <w:rFonts w:ascii="Cambria Math" w:hAnsi="Cambria Math" w:cstheme="majorBidi"/>
-                <w:sz w:val="24"/>
-                <w:szCs w:val="24"/>
-              </w:rPr>
-              <m:t>hare of Inflow</m:t>
+              <m:t xml:space="preserve"> + USBR Share of Inflow</m:t>
             </m:r>
           </m:e>
           <m:sub>
@@ -14332,15 +14262,7 @@
           <w:sz w:val="24"/>
           <w:szCs w:val="24"/>
         </w:rPr>
-        <w:t>The annual Lake Mead inflow is typically known at the beginning of the year because the annual Lake Powell release—that is set in Fall of each year</w:t>
-      </w:r>
-      <w:r>
-        <w:rPr>
-          <w:rFonts w:asciiTheme="majorBidi" w:hAnsiTheme="majorBidi" w:cstheme="majorBidi"/>
-          <w:sz w:val="24"/>
-          <w:szCs w:val="24"/>
-        </w:rPr>
-        <w:t>—</w:t>
+        <w:t>The annual Lake Mead inflow is typically known at the beginning of the year because the annual Lake Powell release—that is set in Fall of each year—</w:t>
       </w:r>
       <w:r>
         <w:rPr>
@@ -15214,15 +15136,7 @@
             <w:sz w:val="24"/>
             <w:szCs w:val="24"/>
           </w:rPr>
-          <m:t>,   ∀</m:t>
-        </m:r>
-        <m:r>
-          <w:rPr>
-            <w:rFonts w:ascii="Cambria Math" w:hAnsi="Cambria Math" w:cstheme="majorBidi"/>
-            <w:sz w:val="24"/>
-            <w:szCs w:val="24"/>
-          </w:rPr>
-          <m:t>t</m:t>
+          <m:t>,   ∀t</m:t>
         </m:r>
       </m:oMath>
       <w:r>
@@ -15231,23 +15145,7 @@
           <w:sz w:val="24"/>
           <w:szCs w:val="24"/>
         </w:rPr>
-        <w:t xml:space="preserve">  [Eq. </w:t>
-      </w:r>
-      <w:r>
-        <w:rPr>
-          <w:rFonts w:asciiTheme="majorBidi" w:eastAsiaTheme="minorEastAsia" w:hAnsiTheme="majorBidi" w:cstheme="majorBidi"/>
-          <w:sz w:val="24"/>
-          <w:szCs w:val="24"/>
-        </w:rPr>
-        <w:t>8</w:t>
-      </w:r>
-      <w:r>
-        <w:rPr>
-          <w:rFonts w:asciiTheme="majorBidi" w:eastAsiaTheme="minorEastAsia" w:hAnsiTheme="majorBidi" w:cstheme="majorBidi"/>
-          <w:sz w:val="24"/>
-          <w:szCs w:val="24"/>
-        </w:rPr>
-        <w:t>]</w:t>
+        <w:t xml:space="preserve">  [Eq. 8]</w:t>
       </w:r>
     </w:p>
     <w:p>
@@ -15366,23 +15264,7 @@
           <w:sz w:val="24"/>
           <w:szCs w:val="24"/>
         </w:rPr>
-        <w:t xml:space="preserve">Presently, some </w:t>
-      </w:r>
-      <w:r>
-        <w:rPr>
-          <w:rFonts w:asciiTheme="majorBidi" w:hAnsiTheme="majorBidi" w:cstheme="majorBidi"/>
-          <w:sz w:val="24"/>
-          <w:szCs w:val="24"/>
-        </w:rPr>
-        <w:t>now 3.6 million acre-feet</w:t>
-      </w:r>
-      <w:r>
-        <w:rPr>
-          <w:rFonts w:asciiTheme="majorBidi" w:hAnsiTheme="majorBidi" w:cstheme="majorBidi"/>
-          <w:sz w:val="24"/>
-          <w:szCs w:val="24"/>
-        </w:rPr>
-        <w:t xml:space="preserve"> of c</w:t>
+        <w:t>Presently, some now 3.6 million acre-feet of c</w:t>
       </w:r>
       <w:r>
         <w:rPr>
@@ -15406,15 +15288,7 @@
           <w:sz w:val="24"/>
           <w:szCs w:val="24"/>
         </w:rPr>
-        <w:t xml:space="preserve"> in Lake Mead—quadruple the modest volume of ~ 700,000 acre-feet reported through 2015</w:t>
-      </w:r>
-      <w:r>
-        <w:rPr>
-          <w:rFonts w:asciiTheme="majorBidi" w:hAnsiTheme="majorBidi" w:cstheme="majorBidi"/>
-          <w:sz w:val="24"/>
-          <w:szCs w:val="24"/>
-        </w:rPr>
-        <w:t xml:space="preserve"> </w:t>
+        <w:t xml:space="preserve"> in Lake Mead—quadruple the volume of ~ 700,000 acre-feet reported through 2015 </w:t>
       </w:r>
       <w:r>
         <w:rPr>
@@ -15471,7 +15345,23 @@
           <w:sz w:val="24"/>
           <w:szCs w:val="24"/>
         </w:rPr>
-        <w:t xml:space="preserve"> Since 2022, conservation efforts by California, Arizona, Nevada, and Mexico have kept Lake Mead above the protection elevation of 1,020 feet set in the 2019 Lower Drought Contingency Plan.</w:t>
+        <w:t xml:space="preserve"> Since 2022, conservation efforts by California, Arizona, Nevada, and Mexico have kept Lake Mead above </w:t>
+      </w:r>
+      <w:r>
+        <w:rPr>
+          <w:rFonts w:asciiTheme="majorBidi" w:hAnsiTheme="majorBidi" w:cstheme="majorBidi"/>
+          <w:sz w:val="24"/>
+          <w:szCs w:val="24"/>
+        </w:rPr>
+        <w:t>its</w:t>
+      </w:r>
+      <w:r>
+        <w:rPr>
+          <w:rFonts w:asciiTheme="majorBidi" w:hAnsiTheme="majorBidi" w:cstheme="majorBidi"/>
+          <w:sz w:val="24"/>
+          <w:szCs w:val="24"/>
+        </w:rPr>
+        <w:t xml:space="preserve"> protection elevation of 1,020 feet set in the 2019 Lower Drought Contingency Plan.</w:t>
       </w:r>
     </w:p>
     <w:p>
@@ -15488,7 +15378,236 @@
           <w:sz w:val="24"/>
           <w:szCs w:val="24"/>
         </w:rPr>
-        <w:t>Prior researchers have suggested</w:t>
+        <w:t>To expand program participation and increase operational flexibility, p</w:t>
+      </w:r>
+      <w:r>
+        <w:rPr>
+          <w:rFonts w:asciiTheme="majorBidi" w:hAnsiTheme="majorBidi" w:cstheme="majorBidi"/>
+          <w:sz w:val="24"/>
+          <w:szCs w:val="24"/>
+        </w:rPr>
+        <w:t xml:space="preserve">rior researchers </w:t>
+      </w:r>
+      <w:r>
+        <w:rPr>
+          <w:rFonts w:asciiTheme="majorBidi" w:hAnsiTheme="majorBidi" w:cstheme="majorBidi"/>
+          <w:sz w:val="24"/>
+          <w:szCs w:val="24"/>
+        </w:rPr>
+        <w:t xml:space="preserve">suggested to raise caps on water conservation account balances </w:t>
+      </w:r>
+      <w:r>
+        <w:rPr>
+          <w:rFonts w:asciiTheme="majorBidi" w:hAnsiTheme="majorBidi" w:cstheme="majorBidi"/>
+          <w:sz w:val="24"/>
+          <w:szCs w:val="24"/>
+        </w:rPr>
+        <w:fldChar w:fldCharType="begin"/>
+      </w:r>
+      <w:r>
+        <w:rPr>
+          <w:rFonts w:asciiTheme="majorBidi" w:hAnsiTheme="majorBidi" w:cstheme="majorBidi"/>
+          <w:sz w:val="24"/>
+          <w:szCs w:val="24"/>
+        </w:rPr>
+        <w:instrText xml:space="preserve"> ADDIN EN.CITE &lt;EndNote&gt;&lt;Cite&gt;&lt;Author&gt;Robison&lt;/Author&gt;&lt;Year&gt;2017&lt;/Year&gt;&lt;RecNum&gt;3108&lt;/RecNum&gt;&lt;DisplayText&gt;(Fleck and Udall, 2021; Robison, 2017)&lt;/DisplayText&gt;&lt;record&gt;&lt;rec-number&gt;3108&lt;/rec-number&gt;&lt;foreign-keys&gt;&lt;key app="EN" db-id="xxt5ta9pd995dwesap0pdzzp2weaz0w9werf" timestamp="1776460861"&gt;3108&lt;/key&gt;&lt;/foreign-keys&gt;&lt;ref-type name="Journal Article"&gt;17&lt;/ref-type&gt;&lt;contributors&gt;&lt;authors&gt;&lt;author&gt;Jason Anthony Robison&lt;/author&gt;&lt;/authors&gt;&lt;/contributors&gt;&lt;titles&gt;&lt;title&gt;The Colorado River Revisited&lt;/title&gt;&lt;secondary-title&gt;University of Colorado Law Review&lt;/secondary-title&gt;&lt;/titles&gt;&lt;periodical&gt;&lt;full-title&gt;University of Colorado Law Review&lt;/full-title&gt;&lt;/periodical&gt;&lt;volume&gt;88&lt;/volume&gt;&lt;number&gt;3&lt;/number&gt;&lt;dates&gt;&lt;year&gt;2017&lt;/year&gt;&lt;/dates&gt;&lt;urls&gt;&lt;related-urls&gt;&lt;url&gt;https://heinonline.org/HOL/Page?handle=hein.journals/ucollr88&amp;amp;id=511&amp;amp;collection=journals&amp;amp;index=&lt;/url&gt;&lt;/related-urls&gt;&lt;/urls&gt;&lt;/record&gt;&lt;/Cite&gt;&lt;Cite&gt;&lt;Author&gt;Fleck&lt;/Author&gt;&lt;Year&gt;2021&lt;/Year&gt;&lt;RecNum&gt;2801&lt;/RecNum&gt;&lt;record&gt;&lt;rec-number&gt;2801&lt;/rec-number&gt;&lt;foreign-keys&gt;&lt;key app="EN" db-id="xxt5ta9pd995dwesap0pdzzp2weaz0w9werf" timestamp="1624662415"&gt;2801&lt;/key&gt;&lt;/foreign-keys&gt;&lt;ref-type name="Journal Article"&gt;17&lt;/ref-type&gt;&lt;contributors&gt;&lt;authors&gt;&lt;author&gt;Fleck, John&lt;/author&gt;&lt;author&gt;Udall, Brad&lt;/author&gt;&lt;/authors&gt;&lt;/contributors&gt;&lt;titles&gt;&lt;title&gt;Managing Colorado River risk&lt;/title&gt;&lt;secondary-title&gt;Science&lt;/secondary-title&gt;&lt;/titles&gt;&lt;periodical&gt;&lt;full-title&gt;Science&lt;/full-title&gt;&lt;/periodical&gt;&lt;pages&gt;885-885&lt;/pages&gt;&lt;volume&gt;372&lt;/volume&gt;&lt;number&gt;6545&lt;/number&gt;&lt;dates&gt;&lt;year&gt;2021&lt;/year&gt;&lt;/dates&gt;&lt;urls&gt;&lt;related-urls&gt;&lt;url&gt;https://science.sciencemag.org/content/sci/372/6545/885.full.pdf&lt;/url&gt;&lt;/related-urls&gt;&lt;/urls&gt;&lt;electronic-resource-num&gt;https://doi.org/10.1126/science.abj5498&lt;/electronic-resource-num&gt;&lt;/record&gt;&lt;/Cite&gt;&lt;/EndNote&gt;</w:instrText>
+      </w:r>
+      <w:r>
+        <w:rPr>
+          <w:rFonts w:asciiTheme="majorBidi" w:hAnsiTheme="majorBidi" w:cstheme="majorBidi"/>
+          <w:sz w:val="24"/>
+          <w:szCs w:val="24"/>
+        </w:rPr>
+        <w:fldChar w:fldCharType="separate"/>
+      </w:r>
+      <w:r>
+        <w:rPr>
+          <w:rFonts w:asciiTheme="majorBidi" w:hAnsiTheme="majorBidi" w:cstheme="majorBidi"/>
+          <w:noProof/>
+          <w:sz w:val="24"/>
+          <w:szCs w:val="24"/>
+        </w:rPr>
+        <w:t>(Fleck and Udall, 2021; Robison, 2017)</w:t>
+      </w:r>
+      <w:r>
+        <w:rPr>
+          <w:rFonts w:asciiTheme="majorBidi" w:hAnsiTheme="majorBidi" w:cstheme="majorBidi"/>
+          <w:sz w:val="24"/>
+          <w:szCs w:val="24"/>
+        </w:rPr>
+        <w:fldChar w:fldCharType="end"/>
+      </w:r>
+      <w:r>
+        <w:rPr>
+          <w:rFonts w:asciiTheme="majorBidi" w:hAnsiTheme="majorBidi" w:cstheme="majorBidi"/>
+          <w:sz w:val="24"/>
+          <w:szCs w:val="24"/>
+        </w:rPr>
+        <w:t xml:space="preserve">. These suggestions </w:t>
+      </w:r>
+      <w:r>
+        <w:rPr>
+          <w:rFonts w:asciiTheme="majorBidi" w:hAnsiTheme="majorBidi" w:cstheme="majorBidi"/>
+          <w:sz w:val="24"/>
+          <w:szCs w:val="24"/>
+        </w:rPr>
+        <w:t xml:space="preserve">became obsolete in </w:t>
+      </w:r>
+      <w:r>
+        <w:rPr>
+          <w:rFonts w:asciiTheme="majorBidi" w:hAnsiTheme="majorBidi" w:cstheme="majorBidi"/>
+          <w:sz w:val="24"/>
+          <w:szCs w:val="24"/>
+        </w:rPr>
+        <w:t xml:space="preserve">2020 </w:t>
+      </w:r>
+      <w:r>
+        <w:rPr>
+          <w:rFonts w:asciiTheme="majorBidi" w:hAnsiTheme="majorBidi" w:cstheme="majorBidi"/>
+          <w:sz w:val="24"/>
+          <w:szCs w:val="24"/>
+        </w:rPr>
+        <w:t xml:space="preserve">when </w:t>
+      </w:r>
+      <w:r>
+        <w:rPr>
+          <w:rFonts w:asciiTheme="majorBidi" w:hAnsiTheme="majorBidi" w:cstheme="majorBidi"/>
+          <w:sz w:val="24"/>
+          <w:szCs w:val="24"/>
+        </w:rPr>
+        <w:t>total account</w:t>
+      </w:r>
+      <w:r>
+        <w:rPr>
+          <w:rFonts w:asciiTheme="majorBidi" w:hAnsiTheme="majorBidi" w:cstheme="majorBidi"/>
+          <w:sz w:val="24"/>
+          <w:szCs w:val="24"/>
+        </w:rPr>
+        <w:t xml:space="preserve"> balances exceeded the 2.7 million acre-feet maximum balance defined in the 2019 Drought Contingency Plan</w:t>
+      </w:r>
+      <w:r>
+        <w:rPr>
+          <w:rFonts w:asciiTheme="majorBidi" w:hAnsiTheme="majorBidi" w:cstheme="majorBidi"/>
+          <w:sz w:val="24"/>
+          <w:szCs w:val="24"/>
+        </w:rPr>
+        <w:t xml:space="preserve"> </w:t>
+      </w:r>
+      <w:r>
+        <w:rPr>
+          <w:rFonts w:asciiTheme="majorBidi" w:hAnsiTheme="majorBidi" w:cstheme="majorBidi"/>
+          <w:sz w:val="24"/>
+          <w:szCs w:val="24"/>
+        </w:rPr>
+        <w:fldChar w:fldCharType="begin"/>
+      </w:r>
+      <w:r>
+        <w:rPr>
+          <w:rFonts w:asciiTheme="majorBidi" w:hAnsiTheme="majorBidi" w:cstheme="majorBidi"/>
+          <w:sz w:val="24"/>
+          <w:szCs w:val="24"/>
+        </w:rPr>
+        <w:instrText xml:space="preserve"> ADDIN EN.CITE &lt;EndNote&gt;&lt;Cite&gt;&lt;Author&gt;USBR&lt;/Author&gt;&lt;Year&gt;2019&lt;/Year&gt;&lt;RecNum&gt;2578&lt;/RecNum&gt;&lt;DisplayText&gt;(USBR, 2019)&lt;/DisplayText&gt;&lt;record&gt;&lt;rec-number&gt;2578&lt;/rec-number&gt;&lt;foreign-keys&gt;&lt;key app="EN" db-id="xxt5ta9pd995dwesap0pdzzp2weaz0w9werf" timestamp="1554700022"&gt;2578&lt;/key&gt;&lt;/foreign-keys&gt;&lt;ref-type name="Report"&gt;27&lt;/ref-type&gt;&lt;contributors&gt;&lt;authors&gt;&lt;author&gt;USBR&lt;/author&gt;&lt;/authors&gt;&lt;/contributors&gt;&lt;titles&gt;&lt;title&gt;Agreement Concerning Colorado River Drought Contingency Management and Operations&lt;/title&gt;&lt;/titles&gt;&lt;pages&gt;56&lt;/pages&gt;&lt;dates&gt;&lt;year&gt;2019&lt;/year&gt;&lt;pub-dates&gt;&lt;date&gt;May 20&lt;/date&gt;&lt;/pub-dates&gt;&lt;/dates&gt;&lt;pub-location&gt;Washington, DC&lt;/pub-location&gt;&lt;publisher&gt;U.S. Bureau of Reclamation&lt;/publisher&gt;&lt;urls&gt;&lt;related-urls&gt;&lt;url&gt;https://www.usbr.gov/ColoradoRiverBasin/dcp/index.html&lt;/url&gt;&lt;/related-urls&gt;&lt;/urls&gt;&lt;/record&gt;&lt;/Cite&gt;&lt;/EndNote&gt;</w:instrText>
+      </w:r>
+      <w:r>
+        <w:rPr>
+          <w:rFonts w:asciiTheme="majorBidi" w:hAnsiTheme="majorBidi" w:cstheme="majorBidi"/>
+          <w:sz w:val="24"/>
+          <w:szCs w:val="24"/>
+        </w:rPr>
+        <w:fldChar w:fldCharType="separate"/>
+      </w:r>
+      <w:r>
+        <w:rPr>
+          <w:rFonts w:asciiTheme="majorBidi" w:hAnsiTheme="majorBidi" w:cstheme="majorBidi"/>
+          <w:noProof/>
+          <w:sz w:val="24"/>
+          <w:szCs w:val="24"/>
+        </w:rPr>
+        <w:t xml:space="preserve">(USBR, </w:t>
+      </w:r>
+      <w:r>
+        <w:rPr>
+          <w:rFonts w:asciiTheme="majorBidi" w:hAnsiTheme="majorBidi" w:cstheme="majorBidi"/>
+          <w:noProof/>
+          <w:sz w:val="24"/>
+          <w:szCs w:val="24"/>
+        </w:rPr>
+        <w:lastRenderedPageBreak/>
+        <w:t>2019)</w:t>
+      </w:r>
+      <w:r>
+        <w:rPr>
+          <w:rFonts w:asciiTheme="majorBidi" w:hAnsiTheme="majorBidi" w:cstheme="majorBidi"/>
+          <w:sz w:val="24"/>
+          <w:szCs w:val="24"/>
+        </w:rPr>
+        <w:fldChar w:fldCharType="end"/>
+      </w:r>
+      <w:r>
+        <w:rPr>
+          <w:rFonts w:asciiTheme="majorBidi" w:hAnsiTheme="majorBidi" w:cstheme="majorBidi"/>
+          <w:sz w:val="24"/>
+          <w:szCs w:val="24"/>
+        </w:rPr>
+        <w:t>.</w:t>
+      </w:r>
+      <w:r>
+        <w:rPr>
+          <w:rFonts w:asciiTheme="majorBidi" w:hAnsiTheme="majorBidi" w:cstheme="majorBidi"/>
+          <w:sz w:val="24"/>
+          <w:szCs w:val="24"/>
+        </w:rPr>
+        <w:t xml:space="preserve"> A second suggestion would allow movement of voluntarily conserved water from Lake Mead upstream to Lake Powell </w:t>
+      </w:r>
+      <w:r>
+        <w:rPr>
+          <w:rFonts w:asciiTheme="majorBidi" w:hAnsiTheme="majorBidi" w:cstheme="majorBidi"/>
+          <w:sz w:val="24"/>
+          <w:szCs w:val="24"/>
+        </w:rPr>
+        <w:fldChar w:fldCharType="begin"/>
+      </w:r>
+      <w:r>
+        <w:rPr>
+          <w:rFonts w:asciiTheme="majorBidi" w:hAnsiTheme="majorBidi" w:cstheme="majorBidi"/>
+          <w:sz w:val="24"/>
+          <w:szCs w:val="24"/>
+        </w:rPr>
+        <w:instrText xml:space="preserve"> ADDIN EN.CITE &lt;EndNote&gt;&lt;Cite&gt;&lt;Author&gt;USBR&lt;/Author&gt;&lt;Year&gt;2026&lt;/Year&gt;&lt;RecNum&gt;3107&lt;/RecNum&gt;&lt;DisplayText&gt;(USBR, 2026b)&lt;/DisplayText&gt;&lt;record&gt;&lt;rec-number&gt;3107&lt;/rec-number&gt;&lt;foreign-keys&gt;&lt;key app="EN" db-id="xxt5ta9pd995dwesap0pdzzp2weaz0w9werf" timestamp="1772056442"&gt;3107&lt;/key&gt;&lt;/foreign-keys&gt;&lt;ref-type name="Report"&gt;27&lt;/ref-type&gt;&lt;contributors&gt;&lt;authors&gt;&lt;author&gt;USBR&lt;/author&gt;&lt;/authors&gt;&lt;/contributors&gt;&lt;titles&gt;&lt;title&gt;Post-2026 Operational Guidelines and Strategies for Lake Powell and Lake Mead – Draft Environmental Impact Statement&lt;/title&gt;&lt;/titles&gt;&lt;dates&gt;&lt;year&gt;2026&lt;/year&gt;&lt;/dates&gt;&lt;publisher&gt;U.S. Bureau of Reclamation&lt;/publisher&gt;&lt;urls&gt;&lt;related-urls&gt;&lt;url&gt;https://www.usbr.gov/ColoradoRiverBasin/post2026/draft-eis/&lt;/url&gt;&lt;/related-urls&gt;&lt;/urls&gt;&lt;/record&gt;&lt;/Cite&gt;&lt;/EndNote&gt;</w:instrText>
+      </w:r>
+      <w:r>
+        <w:rPr>
+          <w:rFonts w:asciiTheme="majorBidi" w:hAnsiTheme="majorBidi" w:cstheme="majorBidi"/>
+          <w:sz w:val="24"/>
+          <w:szCs w:val="24"/>
+        </w:rPr>
+        <w:fldChar w:fldCharType="separate"/>
+      </w:r>
+      <w:r>
+        <w:rPr>
+          <w:rFonts w:asciiTheme="majorBidi" w:hAnsiTheme="majorBidi" w:cstheme="majorBidi"/>
+          <w:noProof/>
+          <w:sz w:val="24"/>
+          <w:szCs w:val="24"/>
+        </w:rPr>
+        <w:t>(USBR, 2026b)</w:t>
+      </w:r>
+      <w:r>
+        <w:rPr>
+          <w:rFonts w:asciiTheme="majorBidi" w:hAnsiTheme="majorBidi" w:cstheme="majorBidi"/>
+          <w:sz w:val="24"/>
+          <w:szCs w:val="24"/>
+        </w:rPr>
+        <w:fldChar w:fldCharType="end"/>
+      </w:r>
+      <w:r>
+        <w:rPr>
+          <w:rFonts w:asciiTheme="majorBidi" w:hAnsiTheme="majorBidi" w:cstheme="majorBidi"/>
+          <w:sz w:val="24"/>
+          <w:szCs w:val="24"/>
+        </w:rPr>
+        <w:t>.</w:t>
       </w:r>
     </w:p>
     <w:p>
@@ -15505,7 +15624,47 @@
           <w:sz w:val="24"/>
           <w:szCs w:val="24"/>
         </w:rPr>
-        <w:t xml:space="preserve">To promote higher engagement, new proposals suggest to raise caps on allowed credits and debits </w:t>
+        <w:t xml:space="preserve">Other proposals placed additional constraints on the program </w:t>
+      </w:r>
+      <w:r>
+        <w:rPr>
+          <w:rFonts w:asciiTheme="majorBidi" w:hAnsiTheme="majorBidi" w:cstheme="majorBidi"/>
+          <w:sz w:val="24"/>
+          <w:szCs w:val="24"/>
+        </w:rPr>
+        <w:t>that we believe will</w:t>
+      </w:r>
+      <w:r>
+        <w:rPr>
+          <w:rFonts w:asciiTheme="majorBidi" w:hAnsiTheme="majorBidi" w:cstheme="majorBidi"/>
+          <w:sz w:val="24"/>
+          <w:szCs w:val="24"/>
+        </w:rPr>
+        <w:t xml:space="preserve"> limit </w:t>
+      </w:r>
+      <w:r>
+        <w:rPr>
+          <w:rFonts w:asciiTheme="majorBidi" w:hAnsiTheme="majorBidi" w:cstheme="majorBidi"/>
+          <w:sz w:val="24"/>
+          <w:szCs w:val="24"/>
+        </w:rPr>
+        <w:t>participation and user autonomy.</w:t>
+      </w:r>
+      <w:r>
+        <w:rPr>
+          <w:rFonts w:asciiTheme="majorBidi" w:hAnsiTheme="majorBidi" w:cstheme="majorBidi"/>
+          <w:sz w:val="24"/>
+          <w:szCs w:val="24"/>
+        </w:rPr>
+        <w:t xml:space="preserve"> </w:t>
+      </w:r>
+      <w:r>
+        <w:rPr>
+          <w:rFonts w:asciiTheme="majorBidi" w:hAnsiTheme="majorBidi" w:cstheme="majorBidi"/>
+          <w:sz w:val="24"/>
+          <w:szCs w:val="24"/>
+        </w:rPr>
+        <w:t xml:space="preserve">For example, </w:t>
       </w:r>
       <w:r>
         <w:rPr>
@@ -15521,7 +15680,7 @@
           <w:sz w:val="24"/>
           <w:szCs w:val="24"/>
         </w:rPr>
-        <w:instrText xml:space="preserve"> ADDIN EN.CITE &lt;EndNote&gt;&lt;Cite&gt;&lt;Author&gt;Robison&lt;/Author&gt;&lt;Year&gt;2017&lt;/Year&gt;&lt;RecNum&gt;3108&lt;/RecNum&gt;&lt;DisplayText&gt;(Fleck and Udall, 2021; Robison, 2017)&lt;/DisplayText&gt;&lt;record&gt;&lt;rec-number&gt;3108&lt;/rec-number&gt;&lt;foreign-keys&gt;&lt;key app="EN" db-id="xxt5ta9pd995dwesap0pdzzp2weaz0w9werf" timestamp="1776460861"&gt;3108&lt;/key&gt;&lt;/foreign-keys&gt;&lt;ref-type name="Journal Article"&gt;17&lt;/ref-type&gt;&lt;contributors&gt;&lt;authors&gt;&lt;author&gt;Jason Anthony Robison&lt;/author&gt;&lt;/authors&gt;&lt;/contributors&gt;&lt;titles&gt;&lt;title&gt;The Colorado River Revisited&lt;/title&gt;&lt;secondary-title&gt;University of Colorado Law Review&lt;/secondary-title&gt;&lt;/titles&gt;&lt;periodical&gt;&lt;full-title&gt;University of Colorado Law Review&lt;/full-title&gt;&lt;/periodical&gt;&lt;volume&gt;88&lt;/volume&gt;&lt;number&gt;3&lt;/number&gt;&lt;dates&gt;&lt;year&gt;2017&lt;/year&gt;&lt;/dates&gt;&lt;urls&gt;&lt;related-urls&gt;&lt;url&gt;https://heinonline.org/HOL/Page?handle=hein.journals/ucollr88&amp;amp;id=511&amp;amp;collection=journals&amp;amp;index=&lt;/url&gt;&lt;/related-urls&gt;&lt;/urls&gt;&lt;/record&gt;&lt;/Cite&gt;&lt;Cite&gt;&lt;Author&gt;Fleck&lt;/Author&gt;&lt;Year&gt;2021&lt;/Year&gt;&lt;RecNum&gt;2801&lt;/RecNum&gt;&lt;record&gt;&lt;rec-number&gt;2801&lt;/rec-number&gt;&lt;foreign-keys&gt;&lt;key app="EN" db-id="xxt5ta9pd995dwesap0pdzzp2weaz0w9werf" timestamp="1624662415"&gt;2801&lt;/key&gt;&lt;/foreign-keys&gt;&lt;ref-type name="Journal Article"&gt;17&lt;/ref-type&gt;&lt;contributors&gt;&lt;authors&gt;&lt;author&gt;Fleck, John&lt;/author&gt;&lt;author&gt;Udall, Brad&lt;/author&gt;&lt;/authors&gt;&lt;/contributors&gt;&lt;titles&gt;&lt;title&gt;Managing Colorado River risk&lt;/title&gt;&lt;secondary-title&gt;Science&lt;/secondary-title&gt;&lt;/titles&gt;&lt;periodical&gt;&lt;full-title&gt;Science&lt;/full-title&gt;&lt;/periodical&gt;&lt;pages&gt;885-885&lt;/pages&gt;&lt;volume&gt;372&lt;/volume&gt;&lt;number&gt;6545&lt;/number&gt;&lt;dates&gt;&lt;year&gt;2021&lt;/year&gt;&lt;/dates&gt;&lt;urls&gt;&lt;related-urls&gt;&lt;url&gt;https://science.sciencemag.org/content/sci/372/6545/885.full.pdf&lt;/url&gt;&lt;/related-urls&gt;&lt;/urls&gt;&lt;electronic-resource-num&gt;https://doi.org/10.1126/science.abj5498&lt;/electronic-resource-num&gt;&lt;/record&gt;&lt;/Cite&gt;&lt;/EndNote&gt;</w:instrText>
+        <w:instrText xml:space="preserve"> ADDIN EN.CITE &lt;EndNote&gt;&lt;Cite AuthorYear="1"&gt;&lt;Author&gt;Colby&lt;/Author&gt;&lt;Year&gt;2025&lt;/Year&gt;&lt;RecNum&gt;3109&lt;/RecNum&gt;&lt;DisplayText&gt;Colby et al. (2025)&lt;/DisplayText&gt;&lt;record&gt;&lt;rec-number&gt;3109&lt;/rec-number&gt;&lt;foreign-keys&gt;&lt;key app="EN" db-id="xxt5ta9pd995dwesap0pdzzp2weaz0w9werf" timestamp="1776466532"&gt;3109&lt;/key&gt;&lt;/foreign-keys&gt;&lt;ref-type name="Journal Article"&gt;17&lt;/ref-type&gt;&lt;contributors&gt;&lt;authors&gt;&lt;author&gt;Colby, Bonnie&lt;/author&gt;&lt;author&gt;Hansen, Kristiana&lt;/author&gt;&lt;author&gt;Sorensen, Kathryn&lt;/author&gt;&lt;/authors&gt;&lt;/contributors&gt;&lt;titles&gt;&lt;title&gt;Policy Nook — Policy Note: Tough Tradeoffs in the Colorado River Basin&lt;/title&gt;&lt;secondary-title&gt;Water Economics and Policy&lt;/secondary-title&gt;&lt;/titles&gt;&lt;periodical&gt;&lt;full-title&gt;Water Economics and Policy&lt;/full-title&gt;&lt;/periodical&gt;&lt;pages&gt;2471002&lt;/pages&gt;&lt;volume&gt;11&lt;/volume&gt;&lt;number&gt;04&lt;/number&gt;&lt;keywords&gt;&lt;keyword&gt;Colorado River Basin,water shortage,water conservation,water equity,tribal water&lt;/keyword&gt;&lt;/keywords&gt;&lt;dates&gt;&lt;year&gt;2025&lt;/year&gt;&lt;/dates&gt;&lt;urls&gt;&lt;related-urls&gt;&lt;url&gt;https://www.worldscientific.com/doi/abs/10.1142/S2382624X24710024&lt;/url&gt;&lt;/related-urls&gt;&lt;/urls&gt;&lt;electronic-resource-num&gt;10.1142/s2382624x24710024&lt;/electronic-resource-num&gt;&lt;/record&gt;&lt;/Cite&gt;&lt;/EndNote&gt;</w:instrText>
       </w:r>
       <w:r>
         <w:rPr>
@@ -15538,7 +15697,7 @@
           <w:sz w:val="24"/>
           <w:szCs w:val="24"/>
         </w:rPr>
-        <w:t>(Fleck and Udall, 2021; Robison, 2017)</w:t>
+        <w:t>Colby et al. (2025)</w:t>
       </w:r>
       <w:r>
         <w:rPr>
@@ -15554,6 +15713,191 @@
           <w:sz w:val="24"/>
           <w:szCs w:val="24"/>
         </w:rPr>
+        <w:t xml:space="preserve"> suggested to assign up to 50% of conserved water to remain in Lake Mead as system water. </w:t>
+      </w:r>
+      <w:r>
+        <w:rPr>
+          <w:rFonts w:asciiTheme="majorBidi" w:hAnsiTheme="majorBidi" w:cstheme="majorBidi"/>
+          <w:sz w:val="24"/>
+          <w:szCs w:val="24"/>
+        </w:rPr>
+        <w:t>This suggestion mean</w:t>
+      </w:r>
+      <w:r>
+        <w:rPr>
+          <w:rFonts w:asciiTheme="majorBidi" w:hAnsiTheme="majorBidi" w:cstheme="majorBidi"/>
+          <w:sz w:val="24"/>
+          <w:szCs w:val="24"/>
+        </w:rPr>
+        <w:t>s</w:t>
+      </w:r>
+      <w:r>
+        <w:rPr>
+          <w:rFonts w:asciiTheme="majorBidi" w:hAnsiTheme="majorBidi" w:cstheme="majorBidi"/>
+          <w:sz w:val="24"/>
+          <w:szCs w:val="24"/>
+        </w:rPr>
+        <w:t xml:space="preserve"> that for every 1 million acre-feet </w:t>
+      </w:r>
+      <w:r>
+        <w:rPr>
+          <w:rFonts w:asciiTheme="majorBidi" w:hAnsiTheme="majorBidi" w:cstheme="majorBidi"/>
+          <w:sz w:val="24"/>
+          <w:szCs w:val="24"/>
+        </w:rPr>
+        <w:t xml:space="preserve">of </w:t>
+      </w:r>
+      <w:r>
+        <w:rPr>
+          <w:rFonts w:asciiTheme="majorBidi" w:hAnsiTheme="majorBidi" w:cstheme="majorBidi"/>
+          <w:sz w:val="24"/>
+          <w:szCs w:val="24"/>
+        </w:rPr>
+        <w:t xml:space="preserve">conserved </w:t>
+      </w:r>
+      <w:r>
+        <w:rPr>
+          <w:rFonts w:asciiTheme="majorBidi" w:hAnsiTheme="majorBidi" w:cstheme="majorBidi"/>
+          <w:sz w:val="24"/>
+          <w:szCs w:val="24"/>
+        </w:rPr>
+        <w:t xml:space="preserve">water </w:t>
+      </w:r>
+      <w:r>
+        <w:rPr>
+          <w:rFonts w:asciiTheme="majorBidi" w:hAnsiTheme="majorBidi" w:cstheme="majorBidi"/>
+          <w:sz w:val="24"/>
+          <w:szCs w:val="24"/>
+        </w:rPr>
+        <w:t>left in Lake Mead, users c</w:t>
+      </w:r>
+      <w:r>
+        <w:rPr>
+          <w:rFonts w:asciiTheme="majorBidi" w:hAnsiTheme="majorBidi" w:cstheme="majorBidi"/>
+          <w:sz w:val="24"/>
+          <w:szCs w:val="24"/>
+        </w:rPr>
+        <w:t>an</w:t>
+      </w:r>
+      <w:r>
+        <w:rPr>
+          <w:rFonts w:asciiTheme="majorBidi" w:hAnsiTheme="majorBidi" w:cstheme="majorBidi"/>
+          <w:sz w:val="24"/>
+          <w:szCs w:val="24"/>
+        </w:rPr>
+        <w:t xml:space="preserve"> only withdraw 500,000 acre-feet. </w:t>
+      </w:r>
+      <w:r>
+        <w:rPr>
+          <w:rFonts w:asciiTheme="majorBidi" w:hAnsiTheme="majorBidi" w:cstheme="majorBidi"/>
+          <w:sz w:val="24"/>
+          <w:szCs w:val="24"/>
+        </w:rPr>
+        <w:t xml:space="preserve">Other proposals would </w:t>
+      </w:r>
+      <w:r>
+        <w:rPr>
+          <w:rFonts w:asciiTheme="majorBidi" w:hAnsiTheme="majorBidi" w:cstheme="majorBidi"/>
+          <w:sz w:val="24"/>
+          <w:szCs w:val="24"/>
+        </w:rPr>
+        <w:t>shift focus to</w:t>
+      </w:r>
+      <w:r>
+        <w:rPr>
+          <w:rFonts w:asciiTheme="majorBidi" w:hAnsiTheme="majorBidi" w:cstheme="majorBidi"/>
+          <w:sz w:val="24"/>
+          <w:szCs w:val="24"/>
+        </w:rPr>
+        <w:t xml:space="preserve"> mandatory water shortages. Reclamation proposed to </w:t>
+      </w:r>
+      <w:r>
+        <w:rPr>
+          <w:rFonts w:asciiTheme="majorBidi" w:hAnsiTheme="majorBidi" w:cstheme="majorBidi"/>
+          <w:sz w:val="24"/>
+          <w:szCs w:val="24"/>
+        </w:rPr>
+        <w:t>tie</w:t>
+      </w:r>
+      <w:r>
+        <w:rPr>
+          <w:rFonts w:asciiTheme="majorBidi" w:hAnsiTheme="majorBidi" w:cstheme="majorBidi"/>
+          <w:sz w:val="24"/>
+          <w:szCs w:val="24"/>
+        </w:rPr>
+        <w:t xml:space="preserve"> mandatory shortages to the anticipated Lake Mead level if there was no voluntary</w:t>
+      </w:r>
+      <w:r>
+        <w:rPr>
+          <w:rFonts w:asciiTheme="majorBidi" w:hAnsiTheme="majorBidi" w:cstheme="majorBidi"/>
+          <w:sz w:val="24"/>
+          <w:szCs w:val="24"/>
+        </w:rPr>
+        <w:t xml:space="preserve"> water conservation</w:t>
+      </w:r>
+      <w:r>
+        <w:rPr>
+          <w:rFonts w:asciiTheme="majorBidi" w:hAnsiTheme="majorBidi" w:cstheme="majorBidi"/>
+          <w:sz w:val="24"/>
+          <w:szCs w:val="24"/>
+        </w:rPr>
+        <w:t xml:space="preserve"> activity</w:t>
+      </w:r>
+      <w:r>
+        <w:rPr>
+          <w:rFonts w:asciiTheme="majorBidi" w:hAnsiTheme="majorBidi" w:cstheme="majorBidi"/>
+          <w:sz w:val="24"/>
+          <w:szCs w:val="24"/>
+        </w:rPr>
+        <w:t xml:space="preserve"> </w:t>
+      </w:r>
+      <w:r>
+        <w:rPr>
+          <w:rFonts w:asciiTheme="majorBidi" w:hAnsiTheme="majorBidi" w:cstheme="majorBidi"/>
+          <w:sz w:val="24"/>
+          <w:szCs w:val="24"/>
+        </w:rPr>
+        <w:fldChar w:fldCharType="begin"/>
+      </w:r>
+      <w:r>
+        <w:rPr>
+          <w:rFonts w:asciiTheme="majorBidi" w:hAnsiTheme="majorBidi" w:cstheme="majorBidi"/>
+          <w:sz w:val="24"/>
+          <w:szCs w:val="24"/>
+        </w:rPr>
+        <w:instrText xml:space="preserve"> ADDIN EN.CITE &lt;EndNote&gt;&lt;Cite&gt;&lt;Author&gt;USBR&lt;/Author&gt;&lt;Year&gt;2026&lt;/Year&gt;&lt;RecNum&gt;3107&lt;/RecNum&gt;&lt;DisplayText&gt;(USBR, 2026b)&lt;/DisplayText&gt;&lt;record&gt;&lt;rec-number&gt;3107&lt;/rec-number&gt;&lt;foreign-keys&gt;&lt;key app="EN" db-id="xxt5ta9pd995dwesap0pdzzp2weaz0w9werf" timestamp="1772056442"&gt;3107&lt;/key&gt;&lt;/foreign-keys&gt;&lt;ref-type name="Report"&gt;27&lt;/ref-type&gt;&lt;contributors&gt;&lt;authors&gt;&lt;author&gt;USBR&lt;/author&gt;&lt;/authors&gt;&lt;/contributors&gt;&lt;titles&gt;&lt;title&gt;Post-2026 Operational Guidelines and Strategies for Lake Powell and Lake Mead – Draft Environmental Impact Statement&lt;/title&gt;&lt;/titles&gt;&lt;dates&gt;&lt;year&gt;2026&lt;/year&gt;&lt;/dates&gt;&lt;publisher&gt;U.S. Bureau of Reclamation&lt;/publisher&gt;&lt;urls&gt;&lt;related-urls&gt;&lt;url&gt;https://www.usbr.gov/ColoradoRiverBasin/post2026/draft-eis/&lt;/url&gt;&lt;/related-urls&gt;&lt;/urls&gt;&lt;/record&gt;&lt;/Cite&gt;&lt;/EndNote&gt;</w:instrText>
+      </w:r>
+      <w:r>
+        <w:rPr>
+          <w:rFonts w:asciiTheme="majorBidi" w:hAnsiTheme="majorBidi" w:cstheme="majorBidi"/>
+          <w:sz w:val="24"/>
+          <w:szCs w:val="24"/>
+        </w:rPr>
+        <w:fldChar w:fldCharType="separate"/>
+      </w:r>
+      <w:r>
+        <w:rPr>
+          <w:rFonts w:asciiTheme="majorBidi" w:hAnsiTheme="majorBidi" w:cstheme="majorBidi"/>
+          <w:noProof/>
+          <w:sz w:val="24"/>
+          <w:szCs w:val="24"/>
+        </w:rPr>
+        <w:t>(USBR, 2026b)</w:t>
+      </w:r>
+      <w:r>
+        <w:rPr>
+          <w:rFonts w:asciiTheme="majorBidi" w:hAnsiTheme="majorBidi" w:cstheme="majorBidi"/>
+          <w:sz w:val="24"/>
+          <w:szCs w:val="24"/>
+        </w:rPr>
+        <w:fldChar w:fldCharType="end"/>
+      </w:r>
+      <w:r>
+        <w:rPr>
+          <w:rFonts w:asciiTheme="majorBidi" w:hAnsiTheme="majorBidi" w:cstheme="majorBidi"/>
+          <w:sz w:val="24"/>
+          <w:szCs w:val="24"/>
+        </w:rPr>
         <w:t xml:space="preserve">. </w:t>
       </w:r>
       <w:r>
@@ -15562,285 +15906,79 @@
           <w:sz w:val="24"/>
           <w:szCs w:val="24"/>
         </w:rPr>
-        <w:fldChar w:fldCharType="begin"/>
-      </w:r>
-      <w:r>
-        <w:rPr>
-          <w:rFonts w:asciiTheme="majorBidi" w:hAnsiTheme="majorBidi" w:cstheme="majorBidi"/>
-          <w:sz w:val="24"/>
-          <w:szCs w:val="24"/>
-        </w:rPr>
-        <w:instrText xml:space="preserve"> ADDIN EN.CITE &lt;EndNote&gt;&lt;Cite AuthorYear="1"&gt;&lt;Author&gt;Stelter&lt;/Author&gt;&lt;Year&gt;2022&lt;/Year&gt;&lt;RecNum&gt;3013&lt;/RecNum&gt;&lt;DisplayText&gt;Stelter (2022)&lt;/DisplayText&gt;&lt;record&gt;&lt;rec-number&gt;3013&lt;/rec-number&gt;&lt;foreign-keys&gt;&lt;key app="EN" db-id="xxt5ta9pd995dwesap0pdzzp2weaz0w9werf" timestamp="1722973781"&gt;3013&lt;/key&gt;&lt;/foreign-keys&gt;&lt;ref-type name="Journal Article"&gt;17&lt;/ref-type&gt;&lt;contributors&gt;&lt;authors&gt;&lt;author&gt;Devin Stelter&lt;/author&gt;&lt;/authors&gt;&lt;/contributors&gt;&lt;titles&gt;&lt;title&gt;Towards a Utah Intentionally Created Surplus Program&lt;/title&gt;&lt;secondary-title&gt;Sustainable Development Law and Policy&lt;/secondary-title&gt;&lt;/titles&gt;&lt;periodical&gt;&lt;full-title&gt;Sustainable Development Law and Policy&lt;/full-title&gt;&lt;/periodical&gt;&lt;pages&gt;4-21&lt;/pages&gt;&lt;volume&gt;22&lt;/volume&gt;&lt;number&gt;2&lt;/number&gt;&lt;dates&gt;&lt;year&gt;2022&lt;/year&gt;&lt;/dates&gt;&lt;urls&gt;&lt;related-urls&gt;&lt;url&gt;https://heinonline.org/HOL/Page?collection=journals&amp;amp;handle=hein.journals/sdlp22&amp;amp;id=44&amp;amp;men_tab=srchresults&lt;/url&gt;&lt;/related-urls&gt;&lt;/urls&gt;&lt;/record&gt;&lt;/Cite&gt;&lt;/EndNote&gt;</w:instrText>
-      </w:r>
-      <w:r>
-        <w:rPr>
-          <w:rFonts w:asciiTheme="majorBidi" w:hAnsiTheme="majorBidi" w:cstheme="majorBidi"/>
-          <w:sz w:val="24"/>
-          <w:szCs w:val="24"/>
-        </w:rPr>
-        <w:fldChar w:fldCharType="separate"/>
-      </w:r>
-      <w:r>
-        <w:rPr>
-          <w:rFonts w:asciiTheme="majorBidi" w:hAnsiTheme="majorBidi" w:cstheme="majorBidi"/>
-          <w:noProof/>
-          <w:sz w:val="24"/>
-          <w:szCs w:val="24"/>
-        </w:rPr>
-        <w:t>Stelter (2022)</w:t>
-      </w:r>
-      <w:r>
-        <w:rPr>
-          <w:rFonts w:asciiTheme="majorBidi" w:hAnsiTheme="majorBidi" w:cstheme="majorBidi"/>
-          <w:sz w:val="24"/>
-          <w:szCs w:val="24"/>
-        </w:rPr>
-        <w:fldChar w:fldCharType="end"/>
-      </w:r>
-      <w:r>
-        <w:rPr>
-          <w:rFonts w:asciiTheme="majorBidi" w:hAnsiTheme="majorBidi" w:cstheme="majorBidi"/>
-          <w:sz w:val="24"/>
-          <w:szCs w:val="24"/>
-        </w:rPr>
-        <w:t xml:space="preserve"> suggested Utah adopt the same voluntary water conservation program using Flaming Gorge as the reservoir. </w:t>
-      </w:r>
-      <w:r>
-        <w:rPr>
-          <w:rFonts w:asciiTheme="majorBidi" w:hAnsiTheme="majorBidi" w:cstheme="majorBidi"/>
-          <w:sz w:val="24"/>
-          <w:szCs w:val="24"/>
-        </w:rPr>
-        <w:fldChar w:fldCharType="begin"/>
-      </w:r>
-      <w:r>
-        <w:rPr>
-          <w:rFonts w:asciiTheme="majorBidi" w:hAnsiTheme="majorBidi" w:cstheme="majorBidi"/>
-          <w:sz w:val="24"/>
-          <w:szCs w:val="24"/>
-        </w:rPr>
-        <w:instrText xml:space="preserve"> ADDIN EN.CITE &lt;EndNote&gt;&lt;Cite AuthorYear="1"&gt;&lt;Author&gt;Colby&lt;/Author&gt;&lt;Year&gt;2025&lt;/Year&gt;&lt;RecNum&gt;3109&lt;/RecNum&gt;&lt;DisplayText&gt;Colby et al. (2025)&lt;/DisplayText&gt;&lt;record&gt;&lt;rec-number&gt;3109&lt;/rec-number&gt;&lt;foreign-keys&gt;&lt;key app="EN" db-id="xxt5ta9pd995dwesap0pdzzp2weaz0w9werf" timestamp="1776466532"&gt;3109&lt;/key&gt;&lt;/foreign-keys&gt;&lt;ref-type name="Journal Article"&gt;17&lt;/ref-type&gt;&lt;contributors&gt;&lt;authors&gt;&lt;author&gt;Colby, Bonnie&lt;/author&gt;&lt;author&gt;Hansen, Kristiana&lt;/author&gt;&lt;author&gt;Sorensen, Kathryn&lt;/author&gt;&lt;/authors&gt;&lt;/contributors&gt;&lt;titles&gt;&lt;title&gt;Policy Nook — Policy Note: Tough Tradeoffs in the Colorado River Basin&lt;/title&gt;&lt;secondary-title&gt;Water Economics and Policy&lt;/secondary-title&gt;&lt;/titles&gt;&lt;periodical&gt;&lt;full-title&gt;Water Economics and Policy&lt;/full-title&gt;&lt;/periodical&gt;&lt;pages&gt;2471002&lt;/pages&gt;&lt;volume&gt;11&lt;/volume&gt;&lt;number&gt;04&lt;/number&gt;&lt;keywords&gt;&lt;keyword&gt;Colorado River Basin,water shortage,water conservation,water equity,tribal water&lt;/keyword&gt;&lt;/keywords&gt;&lt;dates&gt;&lt;year&gt;2025&lt;/year&gt;&lt;/dates&gt;&lt;urls&gt;&lt;related-urls&gt;&lt;url&gt;https://www.worldscientific.com/doi/abs/10.1142/S2382624X24710024&lt;/url&gt;&lt;/related-urls&gt;&lt;/urls&gt;&lt;electronic-resource-num&gt;10.1142/s2382624x24710024&lt;/electronic-resource-num&gt;&lt;/record&gt;&lt;/Cite&gt;&lt;/EndNote&gt;</w:instrText>
-      </w:r>
-      <w:r>
-        <w:rPr>
-          <w:rFonts w:asciiTheme="majorBidi" w:hAnsiTheme="majorBidi" w:cstheme="majorBidi"/>
-          <w:sz w:val="24"/>
-          <w:szCs w:val="24"/>
-        </w:rPr>
-        <w:fldChar w:fldCharType="separate"/>
-      </w:r>
-      <w:r>
-        <w:rPr>
-          <w:rFonts w:asciiTheme="majorBidi" w:hAnsiTheme="majorBidi" w:cstheme="majorBidi"/>
-          <w:noProof/>
-          <w:sz w:val="24"/>
-          <w:szCs w:val="24"/>
-        </w:rPr>
-        <w:t>Colby et al. (2025)</w:t>
-      </w:r>
-      <w:r>
-        <w:rPr>
-          <w:rFonts w:asciiTheme="majorBidi" w:hAnsiTheme="majorBidi" w:cstheme="majorBidi"/>
-          <w:sz w:val="24"/>
-          <w:szCs w:val="24"/>
-        </w:rPr>
-        <w:fldChar w:fldCharType="end"/>
-      </w:r>
-      <w:r>
-        <w:rPr>
-          <w:rFonts w:asciiTheme="majorBidi" w:hAnsiTheme="majorBidi" w:cstheme="majorBidi"/>
-          <w:sz w:val="24"/>
-          <w:szCs w:val="24"/>
-        </w:rPr>
-        <w:t xml:space="preserve"> </w:t>
-      </w:r>
-      <w:r>
-        <w:rPr>
-          <w:rFonts w:asciiTheme="majorBidi" w:hAnsiTheme="majorBidi" w:cstheme="majorBidi"/>
-          <w:sz w:val="24"/>
-          <w:szCs w:val="24"/>
-        </w:rPr>
-        <w:lastRenderedPageBreak/>
-        <w:t xml:space="preserve">suggested to assign up to 50% of conserved water to remain in Lake Mead as system water to create a balance of individual and collective resiliency. </w:t>
-      </w:r>
-      <w:r>
-        <w:rPr>
-          <w:rFonts w:asciiTheme="majorBidi" w:hAnsiTheme="majorBidi" w:cstheme="majorBidi"/>
-          <w:sz w:val="24"/>
-          <w:szCs w:val="24"/>
-        </w:rPr>
-        <w:fldChar w:fldCharType="begin"/>
-      </w:r>
-      <w:r>
-        <w:rPr>
-          <w:rFonts w:asciiTheme="majorBidi" w:hAnsiTheme="majorBidi" w:cstheme="majorBidi"/>
-          <w:sz w:val="24"/>
-          <w:szCs w:val="24"/>
-        </w:rPr>
-        <w:instrText xml:space="preserve"> ADDIN EN.CITE &lt;EndNote&gt;&lt;Cite AuthorYear="1"&gt;&lt;Author&gt;Huizar&lt;/Author&gt;&lt;Year&gt;2023&lt;/Year&gt;&lt;RecNum&gt;3110&lt;/RecNum&gt;&lt;DisplayText&gt;Huizar et al. (2023)&lt;/DisplayText&gt;&lt;record&gt;&lt;rec-number&gt;3110&lt;/rec-number&gt;&lt;foreign-keys&gt;&lt;key app="EN" db-id="xxt5ta9pd995dwesap0pdzzp2weaz0w9werf" timestamp="1776715189"&gt;3110&lt;/key&gt;&lt;/foreign-keys&gt;&lt;ref-type name="Journal Article"&gt;17&lt;/ref-type&gt;&lt;contributors&gt;&lt;authors&gt;&lt;author&gt;Luis Huizar&lt;/author&gt;&lt;author&gt;Sarai Díaz&lt;/author&gt;&lt;author&gt;Kevin Lansey&lt;/author&gt;&lt;author&gt;Robert Arnold&lt;/author&gt;&lt;/authors&gt;&lt;/contributors&gt;&lt;titles&gt;&lt;title&gt;Water Supply in the Lower Colorado River Basin: Effectiveness of the 2019 Drought Contingency Plan&lt;/title&gt;&lt;secondary-title&gt;Journal of Environmental Engineering&lt;/secondary-title&gt;&lt;/titles&gt;&lt;periodical&gt;&lt;full-title&gt;Journal of Environmental Engineering&lt;/full-title&gt;&lt;/periodical&gt;&lt;pages&gt;04023058&lt;/pages&gt;&lt;volume&gt;149&lt;/volume&gt;&lt;number&gt;10&lt;/number&gt;&lt;dates&gt;&lt;year&gt;2023&lt;/year&gt;&lt;/dates&gt;&lt;urls&gt;&lt;related-urls&gt;&lt;url&gt;https://ascelibrary.org/doi/abs/10.1061/JOEEDU.EEENG-7324&lt;/url&gt;&lt;/related-urls&gt;&lt;/urls&gt;&lt;electronic-resource-num&gt;doi:10.1061/JOEEDU.EEENG-7324&lt;/electronic-resource-num&gt;&lt;/record&gt;&lt;/Cite&gt;&lt;/EndNote&gt;</w:instrText>
-      </w:r>
-      <w:r>
-        <w:rPr>
-          <w:rFonts w:asciiTheme="majorBidi" w:hAnsiTheme="majorBidi" w:cstheme="majorBidi"/>
-          <w:sz w:val="24"/>
-          <w:szCs w:val="24"/>
-        </w:rPr>
-        <w:fldChar w:fldCharType="separate"/>
-      </w:r>
-      <w:r>
-        <w:rPr>
-          <w:rFonts w:asciiTheme="majorBidi" w:hAnsiTheme="majorBidi" w:cstheme="majorBidi"/>
-          <w:noProof/>
-          <w:sz w:val="24"/>
-          <w:szCs w:val="24"/>
-        </w:rPr>
-        <w:t>Huizar et al. (2023)</w:t>
-      </w:r>
-      <w:r>
-        <w:rPr>
-          <w:rFonts w:asciiTheme="majorBidi" w:hAnsiTheme="majorBidi" w:cstheme="majorBidi"/>
-          <w:sz w:val="24"/>
-          <w:szCs w:val="24"/>
-        </w:rPr>
-        <w:fldChar w:fldCharType="end"/>
-      </w:r>
-      <w:r>
-        <w:rPr>
-          <w:rFonts w:asciiTheme="majorBidi" w:hAnsiTheme="majorBidi" w:cstheme="majorBidi"/>
-          <w:sz w:val="24"/>
-          <w:szCs w:val="24"/>
-        </w:rPr>
-        <w:t xml:space="preserve"> reported difficulty to predict and model state’s water conservation choices. </w:t>
-      </w:r>
-      <w:r>
-        <w:rPr>
-          <w:rFonts w:asciiTheme="majorBidi" w:hAnsiTheme="majorBidi" w:cstheme="majorBidi"/>
-          <w:sz w:val="24"/>
-          <w:szCs w:val="24"/>
-        </w:rPr>
-        <w:fldChar w:fldCharType="begin"/>
-      </w:r>
-      <w:r>
-        <w:rPr>
-          <w:rFonts w:asciiTheme="majorBidi" w:hAnsiTheme="majorBidi" w:cstheme="majorBidi"/>
-          <w:sz w:val="24"/>
-          <w:szCs w:val="24"/>
-        </w:rPr>
-        <w:instrText xml:space="preserve"> ADDIN EN.CITE &lt;EndNote&gt;&lt;Cite AuthorYear="1"&gt;&lt;Author&gt;Rosenberg&lt;/Author&gt;&lt;Year&gt;2024&lt;/Year&gt;&lt;RecNum&gt;2847&lt;/RecNum&gt;&lt;DisplayText&gt;Rosenberg (2024)&lt;/DisplayText&gt;&lt;record&gt;&lt;rec-number&gt;2847&lt;/rec-number&gt;&lt;foreign-keys&gt;&lt;key app="EN" db-id="xxt5ta9pd995dwesap0pdzzp2weaz0w9werf" timestamp="1642471467"&gt;2847&lt;/key&gt;&lt;/foreign-keys&gt;&lt;ref-type name="Journal Article"&gt;17&lt;/ref-type&gt;&lt;contributors&gt;&lt;authors&gt;&lt;author&gt;David E. Rosenberg&lt;/author&gt;&lt;/authors&gt;&lt;/contributors&gt;&lt;titles&gt;&lt;title&gt;Lessons from immersive online collaborative modeling to discuss more adaptive reservoir operations&lt;/title&gt;&lt;secondary-title&gt;Journal of Water Resources Planning and Management&lt;/secondary-title&gt;&lt;/titles&gt;&lt;periodical&gt;&lt;full-title&gt;Journal of Water Resources Planning and Management&lt;/full-title&gt;&lt;/periodical&gt;&lt;volume&gt;150&lt;/volume&gt;&lt;number&gt;7&lt;/number&gt;&lt;dates&gt;&lt;year&gt;2024&lt;/year&gt;&lt;/dates&gt;&lt;publisher&gt;American Society of Civil Engineers&lt;/publisher&gt;&lt;urls&gt;&lt;related-urls&gt;&lt;url&gt;https://doi.org/10.4211/hs.e0cbe52ad4524c07bb5b7ff8c373a343&lt;/url&gt;&lt;/related-urls&gt;&lt;/urls&gt;&lt;electronic-resource-num&gt;https://doi.org/10.1061/JWRMD5.WRENG-5893&lt;/electronic-resource-num&gt;&lt;/record&gt;&lt;/Cite&gt;&lt;/EndNote&gt;</w:instrText>
-      </w:r>
-      <w:r>
-        <w:rPr>
-          <w:rFonts w:asciiTheme="majorBidi" w:hAnsiTheme="majorBidi" w:cstheme="majorBidi"/>
-          <w:sz w:val="24"/>
-          <w:szCs w:val="24"/>
-        </w:rPr>
-        <w:fldChar w:fldCharType="separate"/>
-      </w:r>
-      <w:r>
-        <w:rPr>
-          <w:rFonts w:asciiTheme="majorBidi" w:hAnsiTheme="majorBidi" w:cstheme="majorBidi"/>
-          <w:noProof/>
-          <w:sz w:val="24"/>
-          <w:szCs w:val="24"/>
-        </w:rPr>
-        <w:t>Rosenberg (2024)</w:t>
-      </w:r>
-      <w:r>
-        <w:rPr>
-          <w:rFonts w:asciiTheme="majorBidi" w:hAnsiTheme="majorBidi" w:cstheme="majorBidi"/>
-          <w:sz w:val="24"/>
-          <w:szCs w:val="24"/>
-        </w:rPr>
-        <w:fldChar w:fldCharType="end"/>
-      </w:r>
-      <w:r>
-        <w:rPr>
-          <w:rFonts w:asciiTheme="majorBidi" w:hAnsiTheme="majorBidi" w:cstheme="majorBidi"/>
-          <w:sz w:val="24"/>
-          <w:szCs w:val="24"/>
-        </w:rPr>
-        <w:t xml:space="preserve"> proposed and tested water accounts in a combined Lake Powell-Lake Mead system. </w:t>
-      </w:r>
-      <w:r>
-        <w:rPr>
-          <w:rFonts w:asciiTheme="majorBidi" w:hAnsiTheme="majorBidi" w:cstheme="majorBidi"/>
-          <w:sz w:val="24"/>
-          <w:szCs w:val="24"/>
-        </w:rPr>
-        <w:t>Recently, the U.S. Bureau of Reclamation (</w:t>
-      </w:r>
-      <w:r>
-        <w:rPr>
-          <w:rFonts w:asciiTheme="majorBidi" w:hAnsiTheme="majorBidi" w:cstheme="majorBidi"/>
-          <w:sz w:val="24"/>
-          <w:szCs w:val="24"/>
-        </w:rPr>
-        <w:t>USBR</w:t>
-      </w:r>
-      <w:r>
-        <w:rPr>
-          <w:rFonts w:asciiTheme="majorBidi" w:hAnsiTheme="majorBidi" w:cstheme="majorBidi"/>
-          <w:sz w:val="24"/>
-          <w:szCs w:val="24"/>
-        </w:rPr>
-        <w:t xml:space="preserve">) proposed several ways to improve the program (now called Storage and Delivery) beginning in 2027 </w:t>
-      </w:r>
-      <w:r>
-        <w:rPr>
-          <w:rFonts w:asciiTheme="majorBidi" w:hAnsiTheme="majorBidi" w:cstheme="majorBidi"/>
-          <w:sz w:val="24"/>
-          <w:szCs w:val="24"/>
-        </w:rPr>
-        <w:fldChar w:fldCharType="begin"/>
-      </w:r>
-      <w:r>
-        <w:rPr>
-          <w:rFonts w:asciiTheme="majorBidi" w:hAnsiTheme="majorBidi" w:cstheme="majorBidi"/>
-          <w:sz w:val="24"/>
-          <w:szCs w:val="24"/>
-        </w:rPr>
-        <w:instrText xml:space="preserve"> ADDIN EN.CITE &lt;EndNote&gt;&lt;Cite&gt;&lt;Author&gt;USBR&lt;/Author&gt;&lt;Year&gt;2026&lt;/Year&gt;&lt;RecNum&gt;3107&lt;/RecNum&gt;&lt;DisplayText&gt;(USBR, 2026b)&lt;/DisplayText&gt;&lt;record&gt;&lt;rec-number&gt;3107&lt;/rec-number&gt;&lt;foreign-keys&gt;&lt;key app="EN" db-id="xxt5ta9pd995dwesap0pdzzp2weaz0w9werf" timestamp="1772056442"&gt;3107&lt;/key&gt;&lt;/foreign-keys&gt;&lt;ref-type name="Report"&gt;27&lt;/ref-type&gt;&lt;contributors&gt;&lt;authors&gt;&lt;author&gt;USBR&lt;/author&gt;&lt;/authors&gt;&lt;/contributors&gt;&lt;titles&gt;&lt;title&gt;Post-2026 Operational Guidelines and Strategies for Lake Powell and Lake Mead – Draft Environmental Impact Statement&lt;/title&gt;&lt;/titles&gt;&lt;dates&gt;&lt;year&gt;2026&lt;/year&gt;&lt;/dates&gt;&lt;publisher&gt;U.S. Bureau of Reclamation&lt;/publisher&gt;&lt;urls&gt;&lt;related-urls&gt;&lt;url&gt;https://www.usbr.gov/ColoradoRiverBasin/post2026/draft-eis/&lt;/url&gt;&lt;/related-urls&gt;&lt;/urls&gt;&lt;/record&gt;&lt;/Cite&gt;&lt;/EndNote&gt;</w:instrText>
-      </w:r>
-      <w:r>
-        <w:rPr>
-          <w:rFonts w:asciiTheme="majorBidi" w:hAnsiTheme="majorBidi" w:cstheme="majorBidi"/>
-          <w:sz w:val="24"/>
-          <w:szCs w:val="24"/>
-        </w:rPr>
-        <w:fldChar w:fldCharType="separate"/>
-      </w:r>
-      <w:r>
-        <w:rPr>
-          <w:rFonts w:asciiTheme="majorBidi" w:hAnsiTheme="majorBidi" w:cstheme="majorBidi"/>
-          <w:noProof/>
-          <w:sz w:val="24"/>
-          <w:szCs w:val="24"/>
-        </w:rPr>
-        <w:t>(USBR, 2026b)</w:t>
-      </w:r>
-      <w:r>
-        <w:rPr>
-          <w:rFonts w:asciiTheme="majorBidi" w:hAnsiTheme="majorBidi" w:cstheme="majorBidi"/>
-          <w:sz w:val="24"/>
-          <w:szCs w:val="24"/>
-        </w:rPr>
-        <w:fldChar w:fldCharType="end"/>
-      </w:r>
-      <w:r>
-        <w:rPr>
-          <w:rFonts w:asciiTheme="majorBidi" w:hAnsiTheme="majorBidi" w:cstheme="majorBidi"/>
-          <w:sz w:val="24"/>
-          <w:szCs w:val="24"/>
-        </w:rPr>
-        <w:t>.</w:t>
-      </w:r>
-      <w:r>
-        <w:rPr>
-          <w:rFonts w:asciiTheme="majorBidi" w:hAnsiTheme="majorBidi" w:cstheme="majorBidi"/>
-          <w:sz w:val="24"/>
-          <w:szCs w:val="24"/>
-        </w:rPr>
-        <w:t xml:space="preserve"> One option is to remove gaming between the voluntary water conservation and mandatory water shortage programs by tying mandatory shortages to the anticipated Lake Mead level if there was no voluntary activity (colloquially called “operational neutrality”). A second suggestion can move voluntarily conserved water upstream to Lake Powell to increase operational flexibility.</w:t>
+        <w:t xml:space="preserve">They also proposed to exclude mandatory reductions from the calculation of voluntary credits. </w:t>
+      </w:r>
+      <w:r>
+        <w:rPr>
+          <w:rFonts w:asciiTheme="majorBidi" w:hAnsiTheme="majorBidi" w:cstheme="majorBidi"/>
+          <w:sz w:val="24"/>
+          <w:szCs w:val="24"/>
+        </w:rPr>
+        <w:t>Larger shortages that trigger at higher reservoir levels will help Lake Mead. But there is also a downside. S</w:t>
+      </w:r>
+      <w:r>
+        <w:rPr>
+          <w:rFonts w:asciiTheme="majorBidi" w:hAnsiTheme="majorBidi" w:cstheme="majorBidi"/>
+          <w:sz w:val="24"/>
+          <w:szCs w:val="24"/>
+        </w:rPr>
+        <w:t xml:space="preserve">hortages </w:t>
+      </w:r>
+      <w:r>
+        <w:rPr>
+          <w:rFonts w:asciiTheme="majorBidi" w:hAnsiTheme="majorBidi" w:cstheme="majorBidi"/>
+          <w:sz w:val="24"/>
+          <w:szCs w:val="24"/>
+        </w:rPr>
+        <w:t>will</w:t>
+      </w:r>
+      <w:r>
+        <w:rPr>
+          <w:rFonts w:asciiTheme="majorBidi" w:hAnsiTheme="majorBidi" w:cstheme="majorBidi"/>
+          <w:sz w:val="24"/>
+          <w:szCs w:val="24"/>
+        </w:rPr>
+        <w:t xml:space="preserve"> vary </w:t>
+      </w:r>
+      <w:r>
+        <w:rPr>
+          <w:rFonts w:asciiTheme="majorBidi" w:hAnsiTheme="majorBidi" w:cstheme="majorBidi"/>
+          <w:sz w:val="24"/>
+          <w:szCs w:val="24"/>
+        </w:rPr>
+        <w:t xml:space="preserve">year-to-year </w:t>
+      </w:r>
+      <w:r>
+        <w:rPr>
+          <w:rFonts w:asciiTheme="majorBidi" w:hAnsiTheme="majorBidi" w:cstheme="majorBidi"/>
+          <w:sz w:val="24"/>
+          <w:szCs w:val="24"/>
+        </w:rPr>
+        <w:t xml:space="preserve">as Lake Mead and/or system storage </w:t>
+      </w:r>
+      <w:r>
+        <w:rPr>
+          <w:rFonts w:asciiTheme="majorBidi" w:hAnsiTheme="majorBidi" w:cstheme="majorBidi"/>
+          <w:sz w:val="24"/>
+          <w:szCs w:val="24"/>
+        </w:rPr>
+        <w:t>varies</w:t>
+      </w:r>
+      <w:r>
+        <w:rPr>
+          <w:rFonts w:asciiTheme="majorBidi" w:hAnsiTheme="majorBidi" w:cstheme="majorBidi"/>
+          <w:sz w:val="24"/>
+          <w:szCs w:val="24"/>
+        </w:rPr>
+        <w:t xml:space="preserve"> in response to volatile Colorado River flows.</w:t>
+      </w:r>
+      <w:r>
+        <w:rPr>
+          <w:rFonts w:asciiTheme="majorBidi" w:hAnsiTheme="majorBidi" w:cstheme="majorBidi"/>
+          <w:sz w:val="24"/>
+          <w:szCs w:val="24"/>
+        </w:rPr>
+        <w:t xml:space="preserve"> There is agreement among all of Reclamation’s ensembles that river flow can decrease by 6 million acre-feet a year. Swings in shortage make it difficult for user’s to plan their water use. </w:t>
       </w:r>
     </w:p>
     <w:p>
@@ -15851,161 +15989,280 @@
           <w:szCs w:val="24"/>
         </w:rPr>
       </w:pPr>
+      <w:r>
+        <w:rPr>
+          <w:rFonts w:asciiTheme="majorBidi" w:hAnsiTheme="majorBidi" w:cstheme="majorBidi"/>
+          <w:sz w:val="24"/>
+          <w:szCs w:val="24"/>
+        </w:rPr>
+        <w:t>All of the proposals fail to address two challenges of the existing voluntary water conservation program. First</w:t>
+      </w:r>
+      <w:r>
+        <w:rPr>
+          <w:rFonts w:asciiTheme="majorBidi" w:hAnsiTheme="majorBidi" w:cstheme="majorBidi"/>
+          <w:sz w:val="24"/>
+          <w:szCs w:val="24"/>
+        </w:rPr>
+        <w:t>,</w:t>
+      </w:r>
+      <w:r>
+        <w:rPr>
+          <w:rFonts w:asciiTheme="majorBidi" w:hAnsiTheme="majorBidi" w:cstheme="majorBidi"/>
+          <w:sz w:val="24"/>
+          <w:szCs w:val="24"/>
+        </w:rPr>
+        <w:t xml:space="preserve"> as Lake Mead draws down, it becomes more difficult for users to </w:t>
+      </w:r>
+      <w:r>
+        <w:rPr>
+          <w:rFonts w:asciiTheme="majorBidi" w:hAnsiTheme="majorBidi" w:cstheme="majorBidi"/>
+          <w:sz w:val="24"/>
+          <w:szCs w:val="24"/>
+        </w:rPr>
+        <w:t xml:space="preserve">withdraw </w:t>
+      </w:r>
+      <w:r>
+        <w:rPr>
+          <w:rFonts w:asciiTheme="majorBidi" w:hAnsiTheme="majorBidi" w:cstheme="majorBidi"/>
+          <w:sz w:val="24"/>
+          <w:szCs w:val="24"/>
+        </w:rPr>
+        <w:t>their conserved water. Second, credits are awarded as reductions from legal entitlements rather than reductions from the physically available reservoir inflow. This later challenge means Lake Mead can continue to drawdown even as users voluntarily conserve some water. All of these challenges are exacerbated as reservoir inflow declines, a situation that will occur more frequently as the basin becomes more arid</w:t>
+      </w:r>
+      <w:r>
+        <w:rPr>
+          <w:rFonts w:asciiTheme="majorBidi" w:hAnsiTheme="majorBidi" w:cstheme="majorBidi"/>
+          <w:sz w:val="24"/>
+          <w:szCs w:val="24"/>
+        </w:rPr>
+        <w:t xml:space="preserve"> </w:t>
+      </w:r>
+      <w:r>
+        <w:rPr>
+          <w:rFonts w:asciiTheme="majorBidi" w:hAnsiTheme="majorBidi" w:cstheme="majorBidi"/>
+          <w:sz w:val="24"/>
+          <w:szCs w:val="24"/>
+        </w:rPr>
+        <w:fldChar w:fldCharType="begin">
+          <w:fldData xml:space="preserve">PEVuZE5vdGU+PENpdGU+PEF1dGhvcj5TYWxlaGFiYWRpPC9BdXRob3I+PFllYXI+MjAyNDwvWWVh
+cj48UmVjTnVtPjMwMjM8L1JlY051bT48RGlzcGxheVRleHQ+KFNhbGVoYWJhZGkgZXQgYWwuLCAy
+MDI0OyBVZGFsbCBhbmQgT3ZlcnBlY2ssIDIwMTcpPC9EaXNwbGF5VGV4dD48cmVjb3JkPjxyZWMt
+bnVtYmVyPjMwMjM8L3JlYy1udW1iZXI+PGZvcmVpZ24ta2V5cz48a2V5IGFwcD0iRU4iIGRiLWlk
+PSJ4eHQ1dGE5cGQ5OTVkd2VzYXAwcGR6enAyd2VhejB3OXdlcmYiIHRpbWVzdGFtcD0iMTcyODA3
+NDM1NSI+MzAyMzwva2V5PjwvZm9yZWlnbi1rZXlzPjxyZWYtdHlwZSBuYW1lPSJKb3VybmFsIEFy
+dGljbGUiPjE3PC9yZWYtdHlwZT48Y29udHJpYnV0b3JzPjxhdXRob3JzPjxhdXRob3I+U2FsZWhh
+YmFkaSwgSG9tYTwvYXV0aG9yPjxhdXRob3I+VGFyYm90b24sIERhdmlkIEcuPC9hdXRob3I+PGF1
+dGhvcj5XaGVlbGVyLCBLZXZpbiBHLjwvYXV0aG9yPjxhdXRob3I+U21pdGgsIFJlYmVjY2E8L2F1
+dGhvcj48YXV0aG9yPkJha2VyLCBTYXJhaDwvYXV0aG9yPjwvYXV0aG9ycz48L2NvbnRyaWJ1dG9y
+cz48dGl0bGVzPjx0aXRsZT5RdWFudGlmeWluZyBhbmQgQ2xhc3NpZnlpbmcgU3RyZWFtZmxvdyBF
+bnNlbWJsZXMgVXNpbmcgYSBCcm9hZCBSYW5nZSBvZiBNZXRyaWNzIGZvciBhbiBFdmlkZW5jZS1C
+YXNlZCBBbmFseXNpczogQ29sb3JhZG8gUml2ZXIgQ2FzZSBTdHVkeTwvdGl0bGU+PHNlY29uZGFy
+eS10aXRsZT5XYXRlciBSZXNvdXJjZXMgUmVzZWFyY2g8L3NlY29uZGFyeS10aXRsZT48L3RpdGxl
+cz48cGVyaW9kaWNhbD48ZnVsbC10aXRsZT5XYXRlciBSZXNvdXJjZXMgUmVzZWFyY2g8L2Z1bGwt
+dGl0bGU+PC9wZXJpb2RpY2FsPjxwYWdlcz5lMjAyNFdSMDM3MjI1PC9wYWdlcz48dm9sdW1lPjYw
+PC92b2x1bWU+PG51bWJlcj43PC9udW1iZXI+PGRhdGVzPjx5ZWFyPjIwMjQ8L3llYXI+PC9kYXRl
+cz48aXNibj4wMDQzLTEzOTc8L2lzYm4+PHVybHM+PHJlbGF0ZWQtdXJscz48dXJsPmh0dHBzOi8v
+YWd1cHVicy5vbmxpbmVsaWJyYXJ5LndpbGV5LmNvbS9kb2kvYWJzLzEwLjEwMjkvMjAyNFdSMDM3
+MjI1PC91cmw+PC9yZWxhdGVkLXVybHM+PC91cmxzPjxlbGVjdHJvbmljLXJlc291cmNlLW51bT5o
+dHRwczovL2RvaS5vcmcvMTAuMTAyOS8yMDI0V1IwMzcyMjU8L2VsZWN0cm9uaWMtcmVzb3VyY2Ut
+bnVtPjwvcmVjb3JkPjwvQ2l0ZT48Q2l0ZT48QXV0aG9yPlVkYWxsPC9BdXRob3I+PFllYXI+MjAx
+NzwvWWVhcj48UmVjTnVtPjIyOTA8L1JlY051bT48cmVjb3JkPjxyZWMtbnVtYmVyPjIyOTA8L3Jl
+Yy1udW1iZXI+PGZvcmVpZ24ta2V5cz48a2V5IGFwcD0iRU4iIGRiLWlkPSJ4eHQ1dGE5cGQ5OTVk
+d2VzYXAwcGR6enAyd2VhejB3OXdlcmYiIHRpbWVzdGFtcD0iMTUyMzU1MDg2OCI+MjI5MDwva2V5
+PjwvZm9yZWlnbi1rZXlzPjxyZWYtdHlwZSBuYW1lPSJKb3VybmFsIEFydGljbGUiPjE3PC9yZWYt
+dHlwZT48Y29udHJpYnV0b3JzPjxhdXRob3JzPjxhdXRob3I+QnJhZGxleSBVZGFsbDwvYXV0aG9y
+PjxhdXRob3I+Sm9uYXRoYW4gT3ZlcnBlY2s8L2F1dGhvcj48L2F1dGhvcnM+PC9jb250cmlidXRv
+cnM+PHRpdGxlcz48dGl0bGU+VGhlIHR3ZW50eeKAkGZpcnN0IGNlbnR1cnkgQ29sb3JhZG8gUml2
+ZXIgaG90IGRyb3VnaHQgYW5kIGltcGxpY2F0aW9ucyBmb3IgdGhlIGZ1dHVyZTwvdGl0bGU+PHNl
+Y29uZGFyeS10aXRsZT5XYXRlciBSZXNvdXJjZXMgUmVzZWFyY2g8L3NlY29uZGFyeS10aXRsZT48
+L3RpdGxlcz48cGVyaW9kaWNhbD48ZnVsbC10aXRsZT5XYXRlciBSZXNvdXJjZXMgUmVzZWFyY2g8
+L2Z1bGwtdGl0bGU+PC9wZXJpb2RpY2FsPjxwYWdlcz4yNDA0LTI0MTg8L3BhZ2VzPjx2b2x1bWU+
+NTM8L3ZvbHVtZT48bnVtYmVyPjM8L251bWJlcj48a2V5d29yZHM+PGtleXdvcmQ+Q29sb3JhZG8g
+Uml2ZXI8L2tleXdvcmQ+PC9rZXl3b3Jkcz48ZGF0ZXM+PHllYXI+MjAxNzwveWVhcj48L2RhdGVz
+Pjx1cmxzPjxyZWxhdGVkLXVybHM+PHVybD4gaHR0cHM6Ly9kb2kub3JnLzEwLjEwMDIvMjAxNldS
+MDE5NjM4PC91cmw+PC9yZWxhdGVkLXVybHM+PC91cmxzPjxlbGVjdHJvbmljLXJlc291cmNlLW51
+bT4gaHR0cHM6Ly9kb2kub3JnLzEwLjEwMDIvMjAxNldSMDE5NjM4PC9lbGVjdHJvbmljLXJlc291
+cmNlLW51bT48L3JlY29yZD48L0NpdGU+PC9FbmROb3RlPn==
+</w:fldData>
+        </w:fldChar>
+      </w:r>
+      <w:r>
+        <w:rPr>
+          <w:rFonts w:asciiTheme="majorBidi" w:hAnsiTheme="majorBidi" w:cstheme="majorBidi"/>
+          <w:sz w:val="24"/>
+          <w:szCs w:val="24"/>
+        </w:rPr>
+        <w:instrText xml:space="preserve"> ADDIN EN.CITE </w:instrText>
+      </w:r>
+      <w:r>
+        <w:rPr>
+          <w:rFonts w:asciiTheme="majorBidi" w:hAnsiTheme="majorBidi" w:cstheme="majorBidi"/>
+          <w:sz w:val="24"/>
+          <w:szCs w:val="24"/>
+        </w:rPr>
+        <w:fldChar w:fldCharType="begin">
+          <w:fldData xml:space="preserve">PEVuZE5vdGU+PENpdGU+PEF1dGhvcj5TYWxlaGFiYWRpPC9BdXRob3I+PFllYXI+MjAyNDwvWWVh
+cj48UmVjTnVtPjMwMjM8L1JlY051bT48RGlzcGxheVRleHQ+KFNhbGVoYWJhZGkgZXQgYWwuLCAy
+MDI0OyBVZGFsbCBhbmQgT3ZlcnBlY2ssIDIwMTcpPC9EaXNwbGF5VGV4dD48cmVjb3JkPjxyZWMt
+bnVtYmVyPjMwMjM8L3JlYy1udW1iZXI+PGZvcmVpZ24ta2V5cz48a2V5IGFwcD0iRU4iIGRiLWlk
+PSJ4eHQ1dGE5cGQ5OTVkd2VzYXAwcGR6enAyd2VhejB3OXdlcmYiIHRpbWVzdGFtcD0iMTcyODA3
+NDM1NSI+MzAyMzwva2V5PjwvZm9yZWlnbi1rZXlzPjxyZWYtdHlwZSBuYW1lPSJKb3VybmFsIEFy
+dGljbGUiPjE3PC9yZWYtdHlwZT48Y29udHJpYnV0b3JzPjxhdXRob3JzPjxhdXRob3I+U2FsZWhh
+YmFkaSwgSG9tYTwvYXV0aG9yPjxhdXRob3I+VGFyYm90b24sIERhdmlkIEcuPC9hdXRob3I+PGF1
+dGhvcj5XaGVlbGVyLCBLZXZpbiBHLjwvYXV0aG9yPjxhdXRob3I+U21pdGgsIFJlYmVjY2E8L2F1
+dGhvcj48YXV0aG9yPkJha2VyLCBTYXJhaDwvYXV0aG9yPjwvYXV0aG9ycz48L2NvbnRyaWJ1dG9y
+cz48dGl0bGVzPjx0aXRsZT5RdWFudGlmeWluZyBhbmQgQ2xhc3NpZnlpbmcgU3RyZWFtZmxvdyBF
+bnNlbWJsZXMgVXNpbmcgYSBCcm9hZCBSYW5nZSBvZiBNZXRyaWNzIGZvciBhbiBFdmlkZW5jZS1C
+YXNlZCBBbmFseXNpczogQ29sb3JhZG8gUml2ZXIgQ2FzZSBTdHVkeTwvdGl0bGU+PHNlY29uZGFy
+eS10aXRsZT5XYXRlciBSZXNvdXJjZXMgUmVzZWFyY2g8L3NlY29uZGFyeS10aXRsZT48L3RpdGxl
+cz48cGVyaW9kaWNhbD48ZnVsbC10aXRsZT5XYXRlciBSZXNvdXJjZXMgUmVzZWFyY2g8L2Z1bGwt
+dGl0bGU+PC9wZXJpb2RpY2FsPjxwYWdlcz5lMjAyNFdSMDM3MjI1PC9wYWdlcz48dm9sdW1lPjYw
+PC92b2x1bWU+PG51bWJlcj43PC9udW1iZXI+PGRhdGVzPjx5ZWFyPjIwMjQ8L3llYXI+PC9kYXRl
+cz48aXNibj4wMDQzLTEzOTc8L2lzYm4+PHVybHM+PHJlbGF0ZWQtdXJscz48dXJsPmh0dHBzOi8v
+YWd1cHVicy5vbmxpbmVsaWJyYXJ5LndpbGV5LmNvbS9kb2kvYWJzLzEwLjEwMjkvMjAyNFdSMDM3
+MjI1PC91cmw+PC9yZWxhdGVkLXVybHM+PC91cmxzPjxlbGVjdHJvbmljLXJlc291cmNlLW51bT5o
+dHRwczovL2RvaS5vcmcvMTAuMTAyOS8yMDI0V1IwMzcyMjU8L2VsZWN0cm9uaWMtcmVzb3VyY2Ut
+bnVtPjwvcmVjb3JkPjwvQ2l0ZT48Q2l0ZT48QXV0aG9yPlVkYWxsPC9BdXRob3I+PFllYXI+MjAx
+NzwvWWVhcj48UmVjTnVtPjIyOTA8L1JlY051bT48cmVjb3JkPjxyZWMtbnVtYmVyPjIyOTA8L3Jl
+Yy1udW1iZXI+PGZvcmVpZ24ta2V5cz48a2V5IGFwcD0iRU4iIGRiLWlkPSJ4eHQ1dGE5cGQ5OTVk
+d2VzYXAwcGR6enAyd2VhejB3OXdlcmYiIHRpbWVzdGFtcD0iMTUyMzU1MDg2OCI+MjI5MDwva2V5
+PjwvZm9yZWlnbi1rZXlzPjxyZWYtdHlwZSBuYW1lPSJKb3VybmFsIEFydGljbGUiPjE3PC9yZWYt
+dHlwZT48Y29udHJpYnV0b3JzPjxhdXRob3JzPjxhdXRob3I+QnJhZGxleSBVZGFsbDwvYXV0aG9y
+PjxhdXRob3I+Sm9uYXRoYW4gT3ZlcnBlY2s8L2F1dGhvcj48L2F1dGhvcnM+PC9jb250cmlidXRv
+cnM+PHRpdGxlcz48dGl0bGU+VGhlIHR3ZW50eeKAkGZpcnN0IGNlbnR1cnkgQ29sb3JhZG8gUml2
+ZXIgaG90IGRyb3VnaHQgYW5kIGltcGxpY2F0aW9ucyBmb3IgdGhlIGZ1dHVyZTwvdGl0bGU+PHNl
+Y29uZGFyeS10aXRsZT5XYXRlciBSZXNvdXJjZXMgUmVzZWFyY2g8L3NlY29uZGFyeS10aXRsZT48
+L3RpdGxlcz48cGVyaW9kaWNhbD48ZnVsbC10aXRsZT5XYXRlciBSZXNvdXJjZXMgUmVzZWFyY2g8
+L2Z1bGwtdGl0bGU+PC9wZXJpb2RpY2FsPjxwYWdlcz4yNDA0LTI0MTg8L3BhZ2VzPjx2b2x1bWU+
+NTM8L3ZvbHVtZT48bnVtYmVyPjM8L251bWJlcj48a2V5d29yZHM+PGtleXdvcmQ+Q29sb3JhZG8g
+Uml2ZXI8L2tleXdvcmQ+PC9rZXl3b3Jkcz48ZGF0ZXM+PHllYXI+MjAxNzwveWVhcj48L2RhdGVz
+Pjx1cmxzPjxyZWxhdGVkLXVybHM+PHVybD4gaHR0cHM6Ly9kb2kub3JnLzEwLjEwMDIvMjAxNldS
+MDE5NjM4PC91cmw+PC9yZWxhdGVkLXVybHM+PC91cmxzPjxlbGVjdHJvbmljLXJlc291cmNlLW51
+bT4gaHR0cHM6Ly9kb2kub3JnLzEwLjEwMDIvMjAxNldSMDE5NjM4PC9lbGVjdHJvbmljLXJlc291
+cmNlLW51bT48L3JlY29yZD48L0NpdGU+PC9FbmROb3RlPn==
+</w:fldData>
+        </w:fldChar>
+      </w:r>
+      <w:r>
+        <w:rPr>
+          <w:rFonts w:asciiTheme="majorBidi" w:hAnsiTheme="majorBidi" w:cstheme="majorBidi"/>
+          <w:sz w:val="24"/>
+          <w:szCs w:val="24"/>
+        </w:rPr>
+        <w:instrText xml:space="preserve"> ADDIN EN.CITE.DATA </w:instrText>
+      </w:r>
+      <w:r>
+        <w:rPr>
+          <w:rFonts w:asciiTheme="majorBidi" w:hAnsiTheme="majorBidi" w:cstheme="majorBidi"/>
+          <w:sz w:val="24"/>
+          <w:szCs w:val="24"/>
+        </w:rPr>
+      </w:r>
+      <w:r>
+        <w:rPr>
+          <w:rFonts w:asciiTheme="majorBidi" w:hAnsiTheme="majorBidi" w:cstheme="majorBidi"/>
+          <w:sz w:val="24"/>
+          <w:szCs w:val="24"/>
+        </w:rPr>
+        <w:fldChar w:fldCharType="end"/>
+      </w:r>
+      <w:r>
+        <w:rPr>
+          <w:rFonts w:asciiTheme="majorBidi" w:hAnsiTheme="majorBidi" w:cstheme="majorBidi"/>
+          <w:sz w:val="24"/>
+          <w:szCs w:val="24"/>
+        </w:rPr>
+        <w:fldChar w:fldCharType="separate"/>
+      </w:r>
+      <w:r>
+        <w:rPr>
+          <w:rFonts w:asciiTheme="majorBidi" w:hAnsiTheme="majorBidi" w:cstheme="majorBidi"/>
+          <w:noProof/>
+          <w:sz w:val="24"/>
+          <w:szCs w:val="24"/>
+        </w:rPr>
+        <w:t>(Salehabadi et al., 2024; Udall and Overpeck, 2017)</w:t>
+      </w:r>
+      <w:r>
+        <w:rPr>
+          <w:rFonts w:asciiTheme="majorBidi" w:hAnsiTheme="majorBidi" w:cstheme="majorBidi"/>
+          <w:sz w:val="24"/>
+          <w:szCs w:val="24"/>
+        </w:rPr>
+        <w:fldChar w:fldCharType="end"/>
+      </w:r>
+      <w:r>
+        <w:rPr>
+          <w:rFonts w:asciiTheme="majorBidi" w:hAnsiTheme="majorBidi" w:cstheme="majorBidi"/>
+          <w:sz w:val="24"/>
+          <w:szCs w:val="24"/>
+        </w:rPr>
+        <w:t xml:space="preserve"> </w:t>
+      </w:r>
+      <w:r>
+        <w:rPr>
+          <w:rFonts w:asciiTheme="majorBidi" w:hAnsiTheme="majorBidi" w:cstheme="majorBidi"/>
+          <w:sz w:val="24"/>
+          <w:szCs w:val="24"/>
+        </w:rPr>
+        <w:t xml:space="preserve">. </w:t>
+      </w:r>
     </w:p>
     <w:p>
       <w:pPr>
         <w:rPr>
-          <w:del w:id="8" w:author="Erik Christian Porse" w:date="2026-05-27T18:10:00Z" w16du:dateUtc="2026-05-28T01:10:00Z"/>
-          <w:rFonts w:asciiTheme="majorBidi" w:hAnsiTheme="majorBidi" w:cstheme="majorBidi"/>
-          <w:sz w:val="24"/>
-          <w:szCs w:val="24"/>
-        </w:rPr>
-      </w:pPr>
-      <w:del w:id="9" w:author="Erik Christian Porse" w:date="2026-05-27T18:10:00Z" w16du:dateUtc="2026-05-28T01:10:00Z">
-        <w:r>
-          <w:rPr>
-            <w:rFonts w:asciiTheme="majorBidi" w:hAnsiTheme="majorBidi" w:cstheme="majorBidi"/>
-            <w:sz w:val="24"/>
-            <w:szCs w:val="24"/>
-          </w:rPr>
-          <w:delText xml:space="preserve">This water accounting method </w:delText>
-        </w:r>
-      </w:del>
-      <w:del w:id="10" w:author="Erik Christian Porse" w:date="2026-05-27T18:07:00Z" w16du:dateUtc="2026-05-28T01:07:00Z">
-        <w:r>
-          <w:rPr>
-            <w:rFonts w:asciiTheme="majorBidi" w:hAnsiTheme="majorBidi" w:cstheme="majorBidi"/>
-            <w:sz w:val="24"/>
-            <w:szCs w:val="24"/>
-          </w:rPr>
-          <w:delText xml:space="preserve">is </w:delText>
-        </w:r>
-      </w:del>
-      <w:del w:id="11" w:author="Erik Christian Porse" w:date="2026-05-27T18:10:00Z" w16du:dateUtc="2026-05-28T01:10:00Z">
-        <w:r>
-          <w:rPr>
-            <w:rFonts w:asciiTheme="majorBidi" w:hAnsiTheme="majorBidi" w:cstheme="majorBidi"/>
-            <w:sz w:val="24"/>
-            <w:szCs w:val="24"/>
-          </w:rPr>
-          <w:delText xml:space="preserve">implemented numerically </w:delText>
-        </w:r>
-      </w:del>
-      <w:del w:id="12" w:author="Erik Christian Porse" w:date="2026-05-27T18:07:00Z" w16du:dateUtc="2026-05-28T01:07:00Z">
-        <w:r>
-          <w:rPr>
-            <w:rFonts w:asciiTheme="majorBidi" w:hAnsiTheme="majorBidi" w:cstheme="majorBidi"/>
-            <w:sz w:val="24"/>
-            <w:szCs w:val="24"/>
-          </w:rPr>
-          <w:delText xml:space="preserve">at </w:delText>
-        </w:r>
-        <w:r>
-          <w:rPr>
-            <w:rFonts w:asciiTheme="majorBidi" w:hAnsiTheme="majorBidi" w:cstheme="majorBidi"/>
-            <w:sz w:val="24"/>
-            <w:szCs w:val="24"/>
-          </w:rPr>
-          <w:fldChar w:fldCharType="begin"/>
-        </w:r>
-        <w:r>
-          <w:rPr>
-            <w:rFonts w:asciiTheme="majorBidi" w:hAnsiTheme="majorBidi" w:cstheme="majorBidi"/>
-            <w:sz w:val="24"/>
-            <w:szCs w:val="24"/>
-          </w:rPr>
-          <w:delInstrText xml:space="preserve"> ADDIN EN.CITE &lt;EndNote&gt;&lt;Cite&gt;&lt;Author&gt;Myers&lt;/Author&gt;&lt;Year&gt;2025&lt;/Year&gt;&lt;RecNum&gt;3103&lt;/RecNum&gt;&lt;DisplayText&gt;(Myers et al., 2025)&lt;/DisplayText&gt;&lt;record&gt;&lt;rec-number&gt;3103&lt;/rec-number&gt;&lt;foreign-keys&gt;&lt;key app="EN" db-id="xxt5ta9pd995dwesap0pdzzp2weaz0w9werf" timestamp="1762385688"&gt;3103&lt;/key&gt;&lt;/foreign-keys&gt;&lt;ref-type name="Journal Article"&gt;17&lt;/ref-type&gt;&lt;contributors&gt;&lt;authors&gt;&lt;author&gt;Anabelle Myers&lt;/author&gt;&lt;author&gt;David Rosenberg&lt;/author&gt;&lt;author&gt;Hadia Akbar&lt;/author&gt;&lt;author&gt;Erik Porse&lt;/author&gt;&lt;/authors&gt;&lt;/contributors&gt;&lt;titles&gt;&lt;title&gt;Immersive Model for Lake Mead Based on the Principle of Divide Reservoir Inflow&lt;/title&gt;&lt;secondary-title&gt;Hydroshare&lt;/secondary-title&gt;&lt;/titles&gt;&lt;periodical&gt;&lt;full-title&gt;Hydroshare&lt;/full-title&gt;&lt;/periodical&gt;&lt;dates&gt;&lt;year&gt;2025&lt;/year&gt;&lt;/dates&gt;&lt;urls&gt;&lt;/urls&gt;&lt;electronic-resource-num&gt;http://www.hydroshare.org/resource/23bf9eb290ce4c6a8290c214e6b04da4&lt;/electronic-resource-num&gt;&lt;/record&gt;&lt;/Cite&gt;&lt;/EndNote&gt;</w:delInstrText>
-        </w:r>
-        <w:r>
-          <w:rPr>
-            <w:rFonts w:asciiTheme="majorBidi" w:hAnsiTheme="majorBidi" w:cstheme="majorBidi"/>
-            <w:sz w:val="24"/>
-            <w:szCs w:val="24"/>
-          </w:rPr>
-          <w:fldChar w:fldCharType="separate"/>
-        </w:r>
-        <w:r>
-          <w:rPr>
-            <w:rFonts w:asciiTheme="majorBidi" w:hAnsiTheme="majorBidi" w:cstheme="majorBidi"/>
-            <w:noProof/>
-            <w:sz w:val="24"/>
-            <w:szCs w:val="24"/>
-          </w:rPr>
-          <w:delText>(Myers et al., 2025)</w:delText>
-        </w:r>
-        <w:r>
-          <w:rPr>
-            <w:rFonts w:asciiTheme="majorBidi" w:hAnsiTheme="majorBidi" w:cstheme="majorBidi"/>
-            <w:sz w:val="24"/>
-            <w:szCs w:val="24"/>
-          </w:rPr>
-          <w:fldChar w:fldCharType="end"/>
-        </w:r>
-      </w:del>
-      <w:del w:id="13" w:author="Erik Christian Porse" w:date="2026-05-27T18:10:00Z" w16du:dateUtc="2026-05-28T01:10:00Z">
-        <w:r>
-          <w:rPr>
-            <w:rFonts w:asciiTheme="majorBidi" w:hAnsiTheme="majorBidi" w:cstheme="majorBidi"/>
-            <w:sz w:val="24"/>
-            <w:szCs w:val="24"/>
-          </w:rPr>
-          <w:delText>.</w:delText>
-        </w:r>
-      </w:del>
-    </w:p>
-    <w:p>
-      <w:pPr>
-        <w:rPr>
-          <w:rFonts w:asciiTheme="majorBidi" w:hAnsiTheme="majorBidi" w:cstheme="majorBidi"/>
-          <w:sz w:val="24"/>
-          <w:szCs w:val="24"/>
-        </w:rPr>
-      </w:pPr>
-      <w:commentRangeStart w:id="14"/>
-      <w:commentRangeStart w:id="15"/>
-      <w:r>
-        <w:rPr>
-          <w:rFonts w:asciiTheme="majorBidi" w:hAnsiTheme="majorBidi" w:cstheme="majorBidi"/>
-          <w:sz w:val="24"/>
-          <w:szCs w:val="24"/>
-        </w:rPr>
-        <w:t xml:space="preserve">There are several additional benefits and motivators for a </w:t>
-      </w:r>
-      <w:r>
-        <w:rPr>
-          <w:rFonts w:asciiTheme="majorBidi" w:hAnsiTheme="majorBidi" w:cstheme="majorBidi"/>
-          <w:sz w:val="24"/>
-          <w:szCs w:val="24"/>
-        </w:rPr>
-        <w:t xml:space="preserve">Lake Mead </w:t>
-      </w:r>
-      <w:r>
-        <w:rPr>
-          <w:rFonts w:asciiTheme="majorBidi" w:hAnsiTheme="majorBidi" w:cstheme="majorBidi"/>
-          <w:sz w:val="24"/>
-          <w:szCs w:val="24"/>
-        </w:rPr>
-        <w:t>water accounting program.</w:t>
-      </w:r>
-      <w:commentRangeEnd w:id="14"/>
-      <w:r>
-        <w:rPr>
-          <w:rStyle w:val="CommentReference"/>
-          <w:rFonts w:asciiTheme="majorBidi" w:hAnsiTheme="majorBidi" w:cstheme="majorBidi"/>
-          <w:sz w:val="24"/>
-          <w:szCs w:val="24"/>
-        </w:rPr>
-        <w:commentReference w:id="14"/>
-      </w:r>
-      <w:commentRangeEnd w:id="15"/>
-      <w:r>
-        <w:rPr>
-          <w:rStyle w:val="CommentReference"/>
-          <w:rFonts w:asciiTheme="majorBidi" w:hAnsiTheme="majorBidi" w:cstheme="majorBidi"/>
-          <w:sz w:val="24"/>
-          <w:szCs w:val="24"/>
-        </w:rPr>
-        <w:commentReference w:id="15"/>
+          <w:rFonts w:asciiTheme="majorBidi" w:hAnsiTheme="majorBidi" w:cstheme="majorBidi"/>
+          <w:sz w:val="24"/>
+          <w:szCs w:val="24"/>
+        </w:rPr>
+      </w:pPr>
+      <w:r>
+        <w:rPr>
+          <w:rFonts w:asciiTheme="majorBidi" w:hAnsiTheme="majorBidi" w:cstheme="majorBidi"/>
+          <w:sz w:val="24"/>
+          <w:szCs w:val="24"/>
+        </w:rPr>
+        <w:t>Both of</w:t>
+      </w:r>
+      <w:r>
+        <w:rPr>
+          <w:rFonts w:asciiTheme="majorBidi" w:hAnsiTheme="majorBidi" w:cstheme="majorBidi"/>
+          <w:sz w:val="24"/>
+          <w:szCs w:val="24"/>
+        </w:rPr>
+        <w:t xml:space="preserve"> our proposals </w:t>
+      </w:r>
+      <w:r>
+        <w:rPr>
+          <w:rFonts w:asciiTheme="majorBidi" w:hAnsiTheme="majorBidi" w:cstheme="majorBidi"/>
+          <w:sz w:val="24"/>
+          <w:szCs w:val="24"/>
+        </w:rPr>
+        <w:t xml:space="preserve">address the challenge of sustainability head on. Our first proposal constrains total water consumption and credits to be less than the annual reservoir inflow. Our second proposal divides reservoir inflow among </w:t>
+      </w:r>
+      <w:r>
+        <w:rPr>
+          <w:rFonts w:asciiTheme="majorBidi" w:hAnsiTheme="majorBidi" w:cstheme="majorBidi"/>
+          <w:sz w:val="24"/>
+          <w:szCs w:val="24"/>
+        </w:rPr>
+        <w:t xml:space="preserve">Reclamation and </w:t>
+      </w:r>
+      <w:r>
+        <w:rPr>
+          <w:rFonts w:asciiTheme="majorBidi" w:hAnsiTheme="majorBidi" w:cstheme="majorBidi"/>
+          <w:sz w:val="24"/>
+          <w:szCs w:val="24"/>
+        </w:rPr>
+        <w:t>the users and allows users to consume, conserve, and trade within their water account balance.</w:t>
+      </w:r>
+      <w:r>
+        <w:rPr>
+          <w:rFonts w:asciiTheme="majorBidi" w:hAnsiTheme="majorBidi" w:cstheme="majorBidi"/>
+          <w:sz w:val="24"/>
+          <w:szCs w:val="24"/>
+        </w:rPr>
+        <w:t xml:space="preserve"> There are several other benefits of our proposals, all of which increase user autonomy and adaptability.</w:t>
       </w:r>
     </w:p>
     <w:p>
@@ -16043,27 +16300,6 @@
           <w:numId w:val="30"/>
         </w:numPr>
       </w:pPr>
-      <w:del w:id="16" w:author="Erik Christian Porse" w:date="2026-05-27T18:13:00Z" w16du:dateUtc="2026-05-28T01:13:00Z">
-        <w:r>
-          <w:rPr>
-            <w:rFonts w:asciiTheme="majorBidi" w:hAnsiTheme="majorBidi" w:cstheme="majorBidi"/>
-            <w:b/>
-            <w:bCs/>
-            <w:sz w:val="24"/>
-            <w:szCs w:val="24"/>
-          </w:rPr>
-          <w:delText xml:space="preserve">Each </w:delText>
-        </w:r>
-      </w:del>
-    </w:p>
-    <w:p>
-      <w:pPr>
-        <w:pStyle w:val="ListParagraph"/>
-        <w:numPr>
-          <w:ilvl w:val="0"/>
-          <w:numId w:val="30"/>
-        </w:numPr>
-      </w:pPr>
       <w:r>
         <w:rPr>
           <w:rFonts w:asciiTheme="majorBidi" w:hAnsiTheme="majorBidi" w:cstheme="majorBidi"/>
@@ -16109,10 +16345,58 @@
           <w:b/>
           <w:bCs/>
         </w:rPr>
-        <w:t>Water accounting gives Reclamation and water users more autonomy and flexibility to manage their differing interests and risks.</w:t>
-      </w:r>
-      <w:r>
-        <w:t xml:space="preserve"> For Reclamation, this is where to set the reservoir protection elevation. Reclamation does not need to consult with the other users. The other water users can more independently adapt their decisions to consume water, conserve water for future use, and trade in response to their account balances, others choices, the discussion of choices, and their perceptions—or fears—of future low flow. There can also be discussion of the (a) volumes, and (b) prices for Reclamation to purchase water from other users to raise the Lake Mead elevation—purchase volumes and prices that may change from year to year as water becomes more scarce or available.</w:t>
+        <w:t xml:space="preserve">Water accounting </w:t>
+      </w:r>
+      <w:r>
+        <w:rPr>
+          <w:b/>
+          <w:bCs/>
+        </w:rPr>
+        <w:t xml:space="preserve">allows </w:t>
+      </w:r>
+      <w:r>
+        <w:rPr>
+          <w:b/>
+          <w:bCs/>
+        </w:rPr>
+        <w:t>Reclamation and water users</w:t>
+      </w:r>
+      <w:r>
+        <w:rPr>
+          <w:b/>
+          <w:bCs/>
+        </w:rPr>
+        <w:t xml:space="preserve"> </w:t>
+      </w:r>
+      <w:r>
+        <w:rPr>
+          <w:b/>
+          <w:bCs/>
+        </w:rPr>
+        <w:t>to</w:t>
+      </w:r>
+      <w:r>
+        <w:rPr>
+          <w:b/>
+          <w:bCs/>
+        </w:rPr>
+        <w:t xml:space="preserve"> more separately</w:t>
+      </w:r>
+      <w:r>
+        <w:rPr>
+          <w:b/>
+          <w:bCs/>
+        </w:rPr>
+        <w:t xml:space="preserve"> manage their differing interests and risks.</w:t>
+      </w:r>
+      <w:r>
+        <w:t xml:space="preserve"> For Reclamation, this is where to set the reservoir protection elevation. Reclamation does not need to consult with the other users. The other water users can more independently adapt their decisions to consume water, conserve water for future use, and trade in response to their account balances, others choices, the discussion of choices, and their perceptions—or fears—of future low flow. There can also be discussion of the (a) volumes, and (b) prices for Reclamation </w:t>
+      </w:r>
+      <w:r>
+        <w:t>and users to purchase water from each other</w:t>
+      </w:r>
+      <w:r>
+        <w:t>—purchase volumes and prices that may change from year to year as water becomes more scarce or available.</w:t>
       </w:r>
     </w:p>
     <w:p>
@@ -16133,6 +16417,7 @@
           <w:b/>
           <w:bCs/>
         </w:rPr>
+        <w:lastRenderedPageBreak/>
         <w:t xml:space="preserve">Sunset </w:t>
       </w:r>
       <w:r>
@@ -16150,40 +16435,17 @@
         <w:t>existing mandatory water shortage program</w:t>
       </w:r>
       <w:r>
-        <w:t xml:space="preserve"> and </w:t>
-      </w:r>
-      <w:del w:id="17" w:author="Erik Christian Porse" w:date="2026-05-27T18:14:00Z" w16du:dateUtc="2026-05-28T01:14:00Z">
-        <w:r>
-          <w:delText>the baking in o</w:delText>
-        </w:r>
-        <w:r>
-          <w:delText xml:space="preserve">f agreements for increasing Lower Basin and Mexico </w:delText>
-        </w:r>
-      </w:del>
-      <w:r>
-        <w:t xml:space="preserve">water shortages </w:t>
-      </w:r>
-      <w:del w:id="18" w:author="Erik Christian Porse" w:date="2026-05-27T18:14:00Z" w16du:dateUtc="2026-05-28T01:14:00Z">
-        <w:r>
-          <w:delText xml:space="preserve">(mandatory reductions from historical allocations) </w:delText>
-        </w:r>
-      </w:del>
-      <w:r>
-        <w:t xml:space="preserve">tied to declining Lake Mead. If all users consume and draw down </w:t>
-      </w:r>
-      <w:del w:id="19" w:author="Erik Christian Porse" w:date="2026-05-27T18:14:00Z" w16du:dateUtc="2026-05-28T01:14:00Z">
-        <w:r>
-          <w:delText xml:space="preserve">all of </w:delText>
-        </w:r>
-      </w:del>
-      <w:r>
-        <w:t xml:space="preserve">their water account balances, the protection account prevents further draw down to critical levels. </w:t>
-      </w:r>
-      <w:r>
-        <w:t xml:space="preserve">Users who maintain positive account balances will keep Lake Mead storage </w:t>
-      </w:r>
-      <w:r>
-        <w:t>above the protection volume.</w:t>
+        <w:rPr>
+          <w:b/>
+          <w:bCs/>
+        </w:rPr>
+        <w:t xml:space="preserve">. </w:t>
+      </w:r>
+      <w:r>
+        <w:t>A Reclamation protection account prevents Lake Mead drawdown to critical levels</w:t>
+      </w:r>
+      <w:r>
+        <w:t>.</w:t>
       </w:r>
     </w:p>
     <w:p>
@@ -16208,7 +16470,7 @@
       <w:r>
         <w:t xml:space="preserve">also </w:t>
       </w:r>
-      <w:del w:id="20" w:author="Erik Christian Porse" w:date="2026-05-27T18:15:00Z" w16du:dateUtc="2026-05-28T01:15:00Z">
+      <w:del w:id="8" w:author="Erik Christian Porse" w:date="2026-05-27T18:15:00Z" w16du:dateUtc="2026-05-28T01:15:00Z">
         <w:r>
           <w:rPr>
             <w:b/>
@@ -16217,7 +16479,7 @@
           <w:delText xml:space="preserve">not </w:delText>
         </w:r>
       </w:del>
-      <w:ins w:id="21" w:author="Erik Christian Porse" w:date="2026-05-27T18:15:00Z" w16du:dateUtc="2026-05-28T01:15:00Z">
+      <w:ins w:id="9" w:author="Erik Christian Porse" w:date="2026-05-27T18:15:00Z" w16du:dateUtc="2026-05-28T01:15:00Z">
         <w:r>
           <w:rPr>
             <w:b/>
@@ -16274,7 +16536,6 @@
           <w:b/>
           <w:bCs/>
         </w:rPr>
-        <w:lastRenderedPageBreak/>
         <w:t>Prioritize reservoir evaporation as the highest consumptive use</w:t>
       </w:r>
       <w:r>
@@ -16287,7 +16548,13 @@
         <w:t>Lake Mead</w:t>
       </w:r>
       <w:r>
-        <w:t xml:space="preserve"> inflow to the reservoir protection account to offset reservoir evaporation.</w:t>
+        <w:t xml:space="preserve"> inflow to the </w:t>
+      </w:r>
+      <w:r>
+        <w:t>Reclamation</w:t>
+      </w:r>
+      <w:r>
+        <w:t xml:space="preserve"> protection account to offset reservoir evaporation.</w:t>
       </w:r>
       <w:r>
         <w:t xml:space="preserve"> This prioritization corrects a shortfall of existing Colorado River operations that ignore reservoir evaporation.</w:t>
@@ -16369,7 +16636,31 @@
           <w:sz w:val="24"/>
           <w:szCs w:val="24"/>
         </w:rPr>
-        <w:t>There are at least 2 sticky points that come with water accounting.</w:t>
+        <w:t>There are a</w:t>
+      </w:r>
+      <w:r>
+        <w:rPr>
+          <w:rFonts w:asciiTheme="majorBidi" w:hAnsiTheme="majorBidi" w:cstheme="majorBidi"/>
+          <w:sz w:val="24"/>
+          <w:szCs w:val="24"/>
+        </w:rPr>
+        <w:t xml:space="preserve">lso several limitations </w:t>
+      </w:r>
+      <w:r>
+        <w:rPr>
+          <w:rFonts w:asciiTheme="majorBidi" w:hAnsiTheme="majorBidi" w:cstheme="majorBidi"/>
+          <w:sz w:val="24"/>
+          <w:szCs w:val="24"/>
+        </w:rPr>
+        <w:t>of our proposals</w:t>
+      </w:r>
+      <w:r>
+        <w:rPr>
+          <w:rFonts w:asciiTheme="majorBidi" w:hAnsiTheme="majorBidi" w:cstheme="majorBidi"/>
+          <w:sz w:val="24"/>
+          <w:szCs w:val="24"/>
+        </w:rPr>
+        <w:t>.</w:t>
       </w:r>
     </w:p>
     <w:p>
@@ -16393,159 +16684,80 @@
           <w:sz w:val="24"/>
           <w:szCs w:val="24"/>
         </w:rPr>
-        <w:t>Tradeoffs</w:t>
-      </w:r>
-      <w:r>
-        <w:rPr>
-          <w:rFonts w:asciiTheme="majorBidi" w:hAnsiTheme="majorBidi" w:cstheme="majorBidi"/>
-          <w:sz w:val="24"/>
-          <w:szCs w:val="24"/>
-        </w:rPr>
-        <w:t xml:space="preserve">. The selection of a Lake Mead protection volume creates a tradeoff between the protection account volume managed by Reclamation and the remaining reservoir storage available to other users. When a water accounting program starts, </w:t>
-      </w:r>
-      <w:r>
-        <w:rPr>
-          <w:rFonts w:asciiTheme="majorBidi" w:hAnsiTheme="majorBidi" w:cstheme="majorBidi"/>
-          <w:sz w:val="24"/>
-          <w:szCs w:val="24"/>
-        </w:rPr>
-        <w:t>s</w:t>
-      </w:r>
-      <w:r>
-        <w:rPr>
-          <w:rFonts w:asciiTheme="majorBidi" w:hAnsiTheme="majorBidi" w:cstheme="majorBidi"/>
-          <w:sz w:val="24"/>
-          <w:szCs w:val="24"/>
-        </w:rPr>
-        <w:t xml:space="preserve">etting a lower protection volume increases the storage for other users. </w:t>
-      </w:r>
-      <w:r>
-        <w:rPr>
-          <w:rFonts w:asciiTheme="majorBidi" w:hAnsiTheme="majorBidi" w:cstheme="majorBidi"/>
-          <w:sz w:val="24"/>
-          <w:szCs w:val="24"/>
-        </w:rPr>
-        <w:t>S</w:t>
-      </w:r>
-      <w:r>
-        <w:rPr>
-          <w:rFonts w:asciiTheme="majorBidi" w:hAnsiTheme="majorBidi" w:cstheme="majorBidi"/>
-          <w:sz w:val="24"/>
-          <w:szCs w:val="24"/>
-        </w:rPr>
-        <w:t>etting a higher protection volume reduces the starting storage available to other users</w:t>
-      </w:r>
-      <w:r>
-        <w:rPr>
-          <w:rFonts w:asciiTheme="majorBidi" w:hAnsiTheme="majorBidi" w:cstheme="majorBidi"/>
-          <w:sz w:val="24"/>
-          <w:szCs w:val="24"/>
-        </w:rPr>
-        <w:t>, potentially limiting the roll over of existing water conservation account balances</w:t>
-      </w:r>
-      <w:r>
-        <w:rPr>
-          <w:rFonts w:asciiTheme="majorBidi" w:hAnsiTheme="majorBidi" w:cstheme="majorBidi"/>
-          <w:sz w:val="24"/>
-          <w:szCs w:val="24"/>
-        </w:rPr>
-        <w:t xml:space="preserve">. For example, if the accounting program started on </w:t>
-      </w:r>
-      <w:r>
-        <w:rPr>
-          <w:rFonts w:asciiTheme="majorBidi" w:hAnsiTheme="majorBidi" w:cstheme="majorBidi"/>
-          <w:sz w:val="24"/>
-          <w:szCs w:val="24"/>
-        </w:rPr>
-        <w:t>May 16, 2026</w:t>
-      </w:r>
-      <w:r>
-        <w:rPr>
-          <w:rFonts w:asciiTheme="majorBidi" w:hAnsiTheme="majorBidi" w:cstheme="majorBidi"/>
-          <w:sz w:val="24"/>
-          <w:szCs w:val="24"/>
-        </w:rPr>
-        <w:t xml:space="preserve"> (Lake Mead elevation 1,</w:t>
-      </w:r>
-      <w:r>
-        <w:rPr>
-          <w:rFonts w:asciiTheme="majorBidi" w:hAnsiTheme="majorBidi" w:cstheme="majorBidi"/>
-          <w:sz w:val="24"/>
-          <w:szCs w:val="24"/>
-        </w:rPr>
-        <w:t>052.5</w:t>
-      </w:r>
-      <w:r>
-        <w:rPr>
-          <w:rFonts w:asciiTheme="majorBidi" w:hAnsiTheme="majorBidi" w:cstheme="majorBidi"/>
-          <w:sz w:val="24"/>
-          <w:szCs w:val="24"/>
-        </w:rPr>
-        <w:t xml:space="preserve"> feet; </w:t>
-      </w:r>
-      <w:r>
-        <w:rPr>
-          <w:rFonts w:asciiTheme="majorBidi" w:hAnsiTheme="majorBidi" w:cstheme="majorBidi"/>
-          <w:sz w:val="24"/>
-          <w:szCs w:val="24"/>
-        </w:rPr>
-        <w:t>7.9</w:t>
-      </w:r>
-      <w:r>
-        <w:rPr>
-          <w:rFonts w:asciiTheme="majorBidi" w:hAnsiTheme="majorBidi" w:cstheme="majorBidi"/>
-          <w:sz w:val="24"/>
-          <w:szCs w:val="24"/>
-        </w:rPr>
-        <w:t xml:space="preserve"> million acre-feet active storage) and Reclamation selected a Lake Mead protection elevation of 1,000 feet (4.5 million acre-feet of active storage), then users could </w:t>
-      </w:r>
-      <w:r>
-        <w:rPr>
-          <w:rFonts w:asciiTheme="majorBidi" w:hAnsiTheme="majorBidi" w:cstheme="majorBidi"/>
-          <w:sz w:val="24"/>
-          <w:szCs w:val="24"/>
-        </w:rPr>
-        <w:t xml:space="preserve">only roll over 3.4 of the </w:t>
-      </w:r>
-      <w:r>
-        <w:rPr>
-          <w:rFonts w:asciiTheme="majorBidi" w:hAnsiTheme="majorBidi" w:cstheme="majorBidi"/>
-          <w:sz w:val="24"/>
-          <w:szCs w:val="24"/>
-        </w:rPr>
-        <w:t xml:space="preserve">existing </w:t>
-      </w:r>
-      <w:r>
-        <w:rPr>
-          <w:rFonts w:asciiTheme="majorBidi" w:hAnsiTheme="majorBidi" w:cstheme="majorBidi"/>
-          <w:sz w:val="24"/>
-          <w:szCs w:val="24"/>
-        </w:rPr>
-        <w:t xml:space="preserve">3.6 million acre-feet in the water conservation program. Setting a protection elevation of 975 feet (3.2 maf of active storage) would allow the complete roll over of all existing conserved water with </w:t>
-      </w:r>
-      <w:r>
-        <w:rPr>
-          <w:rFonts w:asciiTheme="majorBidi" w:hAnsiTheme="majorBidi" w:cstheme="majorBidi"/>
-          <w:sz w:val="24"/>
-          <w:szCs w:val="24"/>
-        </w:rPr>
-        <w:t>1.1 maf of unassigned storage. This storage could be assigned to users such as</w:t>
-      </w:r>
-      <w:r>
-        <w:rPr>
-          <w:rFonts w:asciiTheme="majorBidi" w:hAnsiTheme="majorBidi" w:cstheme="majorBidi"/>
-          <w:sz w:val="24"/>
-          <w:szCs w:val="24"/>
-        </w:rPr>
-        <w:t xml:space="preserve"> Tribal Nations, who were previously excluded from participation</w:t>
-      </w:r>
-      <w:r>
-        <w:rPr>
-          <w:rFonts w:asciiTheme="majorBidi" w:hAnsiTheme="majorBidi" w:cstheme="majorBidi"/>
-          <w:sz w:val="24"/>
-          <w:szCs w:val="24"/>
-        </w:rPr>
-        <w:t>.</w:t>
+        <w:t xml:space="preserve">Difficult to predict and model users’ choices. </w:t>
+      </w:r>
+      <w:r>
+        <w:rPr>
+          <w:rFonts w:asciiTheme="majorBidi" w:hAnsiTheme="majorBidi" w:cstheme="majorBidi"/>
+          <w:sz w:val="24"/>
+          <w:szCs w:val="24"/>
+        </w:rPr>
+        <w:t xml:space="preserve">Like </w:t>
+      </w:r>
+      <w:r>
+        <w:rPr>
+          <w:rFonts w:asciiTheme="majorBidi" w:hAnsiTheme="majorBidi" w:cstheme="majorBidi"/>
+          <w:sz w:val="24"/>
+          <w:szCs w:val="24"/>
+        </w:rPr>
+        <w:fldChar w:fldCharType="begin"/>
+      </w:r>
+      <w:r>
+        <w:rPr>
+          <w:rFonts w:asciiTheme="majorBidi" w:hAnsiTheme="majorBidi" w:cstheme="majorBidi"/>
+          <w:sz w:val="24"/>
+          <w:szCs w:val="24"/>
+        </w:rPr>
+        <w:instrText xml:space="preserve"> ADDIN EN.CITE &lt;EndNote&gt;&lt;Cite AuthorYear="1"&gt;&lt;Author&gt;Huizar&lt;/Author&gt;&lt;Year&gt;2023&lt;/Year&gt;&lt;RecNum&gt;3110&lt;/RecNum&gt;&lt;DisplayText&gt;Huizar et al. (2023)&lt;/DisplayText&gt;&lt;record&gt;&lt;rec-number&gt;3110&lt;/rec-number&gt;&lt;foreign-keys&gt;&lt;key app="EN" db-id="xxt5ta9pd995dwesap0pdzzp2weaz0w9werf" timestamp="1776715189"&gt;3110&lt;/key&gt;&lt;/foreign-keys&gt;&lt;ref-type name="Journal Article"&gt;17&lt;/ref-type&gt;&lt;contributors&gt;&lt;authors&gt;&lt;author&gt;Luis Huizar&lt;/author&gt;&lt;author&gt;Sarai Díaz&lt;/author&gt;&lt;author&gt;Kevin Lansey&lt;/author&gt;&lt;author&gt;Robert Arnold&lt;/author&gt;&lt;/authors&gt;&lt;/contributors&gt;&lt;titles&gt;&lt;title&gt;Water Supply in the Lower Colorado River Basin: Effectiveness of the 2019 Drought Contingency Plan&lt;/title&gt;&lt;secondary-title&gt;Journal of Environmental Engineering&lt;/secondary-title&gt;&lt;/titles&gt;&lt;periodical&gt;&lt;full-title&gt;Journal of Environmental Engineering&lt;/full-title&gt;&lt;/periodical&gt;&lt;pages&gt;04023058&lt;/pages&gt;&lt;volume&gt;149&lt;/volume&gt;&lt;number&gt;10&lt;/number&gt;&lt;dates&gt;&lt;year&gt;2023&lt;/year&gt;&lt;/dates&gt;&lt;urls&gt;&lt;related-urls&gt;&lt;url&gt;https://ascelibrary.org/doi/abs/10.1061/JOEEDU.EEENG-7324&lt;/url&gt;&lt;/related-urls&gt;&lt;/urls&gt;&lt;electronic-resource-num&gt;doi:10.1061/JOEEDU.EEENG-7324&lt;/electronic-resource-num&gt;&lt;/record&gt;&lt;/Cite&gt;&lt;/EndNote&gt;</w:instrText>
+      </w:r>
+      <w:r>
+        <w:rPr>
+          <w:rFonts w:asciiTheme="majorBidi" w:hAnsiTheme="majorBidi" w:cstheme="majorBidi"/>
+          <w:sz w:val="24"/>
+          <w:szCs w:val="24"/>
+        </w:rPr>
+        <w:fldChar w:fldCharType="separate"/>
+      </w:r>
+      <w:r>
+        <w:rPr>
+          <w:rFonts w:asciiTheme="majorBidi" w:hAnsiTheme="majorBidi" w:cstheme="majorBidi"/>
+          <w:noProof/>
+          <w:sz w:val="24"/>
+          <w:szCs w:val="24"/>
+        </w:rPr>
+        <w:t>Huizar et al. (2023)</w:t>
+      </w:r>
+      <w:r>
+        <w:rPr>
+          <w:rFonts w:asciiTheme="majorBidi" w:hAnsiTheme="majorBidi" w:cstheme="majorBidi"/>
+          <w:sz w:val="24"/>
+          <w:szCs w:val="24"/>
+        </w:rPr>
+        <w:fldChar w:fldCharType="end"/>
+      </w:r>
+      <w:r>
+        <w:rPr>
+          <w:rFonts w:asciiTheme="majorBidi" w:hAnsiTheme="majorBidi" w:cstheme="majorBidi"/>
+          <w:sz w:val="24"/>
+          <w:szCs w:val="24"/>
+        </w:rPr>
+        <w:t xml:space="preserve">, it will be difficult to predict and model state’s water consumption and conservation choices, and corresponding Lake Mead storage volume. Prediction is difficult because with more autonomy, users can adapt their choices year-to-year for a variety of reasons that are not readily coded into rules. For our proposals, the minimum Lake Mead storage volume will be </w:t>
+      </w:r>
+      <w:r>
+        <w:rPr>
+          <w:rFonts w:asciiTheme="majorBidi" w:hAnsiTheme="majorBidi" w:cstheme="majorBidi"/>
+          <w:sz w:val="24"/>
+          <w:szCs w:val="24"/>
+        </w:rPr>
+        <w:t xml:space="preserve">the </w:t>
+      </w:r>
+      <w:r>
+        <w:rPr>
+          <w:rFonts w:asciiTheme="majorBidi" w:hAnsiTheme="majorBidi" w:cstheme="majorBidi"/>
+          <w:sz w:val="24"/>
+          <w:szCs w:val="24"/>
+        </w:rPr>
+        <w:t>protection volume selected by Reclamation. In this case, all users would release and consume all of their account balances in every year. A higher Lake Mead storage volume would occur if one or more users consume only part of their water account balance. Again, it will be difficult to predict how much of their account balance users would choose to consume.</w:t>
       </w:r>
     </w:p>
     <w:p>
@@ -16555,6 +16767,11 @@
           <w:ilvl w:val="0"/>
           <w:numId w:val="31"/>
         </w:numPr>
+        <w:rPr>
+          <w:rFonts w:asciiTheme="majorBidi" w:hAnsiTheme="majorBidi" w:cstheme="majorBidi"/>
+          <w:sz w:val="24"/>
+          <w:szCs w:val="24"/>
+        </w:rPr>
       </w:pPr>
       <w:r>
         <w:rPr>
@@ -16564,623 +16781,874 @@
           <w:sz w:val="24"/>
           <w:szCs w:val="24"/>
         </w:rPr>
-        <w:t>Division of Lake Mead inflow</w:t>
-      </w:r>
-      <w:r>
-        <w:rPr>
-          <w:rFonts w:asciiTheme="majorBidi" w:hAnsiTheme="majorBidi" w:cstheme="majorBidi"/>
-          <w:sz w:val="24"/>
-          <w:szCs w:val="24"/>
-        </w:rPr>
-        <w:t xml:space="preserve">. Water accounting is neutral to if or how the Lower Basin states, Tribal Nations of the Lower Basin, and Mexico apportion the Lake Mead inflow after Reclamation takes the first share to offset reservoir evaporation. Apportionment can be done by priority, pro rata, a combination, percentage splits of shortages in the Lower Basin Alternative </w:t>
-      </w:r>
-      <w:r>
-        <w:rPr>
-          <w:rFonts w:asciiTheme="majorBidi" w:hAnsiTheme="majorBidi" w:cstheme="majorBidi"/>
-          <w:sz w:val="24"/>
-          <w:szCs w:val="24"/>
-        </w:rPr>
-        <w:fldChar w:fldCharType="begin"/>
-      </w:r>
-      <w:r>
-        <w:rPr>
-          <w:rFonts w:asciiTheme="majorBidi" w:hAnsiTheme="majorBidi" w:cstheme="majorBidi"/>
-          <w:sz w:val="24"/>
-          <w:szCs w:val="24"/>
-        </w:rPr>
-        <w:instrText xml:space="preserve"> ADDIN EN.CITE &lt;EndNote&gt;&lt;Cite&gt;&lt;Author&gt;Buschatzke&lt;/Author&gt;&lt;Year&gt;2024&lt;/Year&gt;&lt;RecNum&gt;3016&lt;/RecNum&gt;&lt;DisplayText&gt;(Buschatzke et al., 2024)&lt;/DisplayText&gt;&lt;record&gt;&lt;rec-number&gt;3016&lt;/rec-number&gt;&lt;foreign-keys&gt;&lt;key app="EN" db-id="xxt5ta9pd995dwesap0pdzzp2weaz0w9werf" timestamp="1723671806"&gt;3016&lt;/key&gt;&lt;/foreign-keys&gt;&lt;ref-type name="Web Page"&gt;12&lt;/ref-type&gt;&lt;contributors&gt;&lt;authors&gt;&lt;author&gt;Thomas Buschatzke&lt;/author&gt;&lt;author&gt;J.B. Hamby&lt;/author&gt;&lt;author&gt;John Entsminger&lt;/author&gt;&lt;/authors&gt;&lt;/contributors&gt;&lt;titles&gt;&lt;title&gt;Lower Basin Alternative for the Post-2026 Coordinated Operation of the Colorado River Basin&lt;/title&gt;&lt;/titles&gt;&lt;volume&gt;2024&lt;/volume&gt;&lt;number&gt;August 14&lt;/number&gt;&lt;dates&gt;&lt;year&gt;2024&lt;/year&gt;&lt;/dates&gt;&lt;urls&gt;&lt;related-urls&gt;&lt;url&gt;https://www.snwa.com/assets/pdf/lower-basin-alternative-letter-march2024.pdf&lt;/url&gt;&lt;/related-urls&gt;&lt;/urls&gt;&lt;/record&gt;&lt;/Cite&gt;&lt;/EndNote&gt;</w:instrText>
-      </w:r>
-      <w:r>
-        <w:rPr>
-          <w:rFonts w:asciiTheme="majorBidi" w:hAnsiTheme="majorBidi" w:cstheme="majorBidi"/>
-          <w:sz w:val="24"/>
-          <w:szCs w:val="24"/>
-        </w:rPr>
-        <w:fldChar w:fldCharType="separate"/>
-      </w:r>
-      <w:r>
-        <w:rPr>
-          <w:rFonts w:asciiTheme="majorBidi" w:hAnsiTheme="majorBidi" w:cstheme="majorBidi"/>
-          <w:noProof/>
-          <w:sz w:val="24"/>
-          <w:szCs w:val="24"/>
-        </w:rPr>
-        <w:t>(Buschatzke et al., 2024)</w:t>
-      </w:r>
-      <w:r>
-        <w:rPr>
-          <w:rFonts w:asciiTheme="majorBidi" w:hAnsiTheme="majorBidi" w:cstheme="majorBidi"/>
-          <w:sz w:val="24"/>
-          <w:szCs w:val="24"/>
-        </w:rPr>
-        <w:fldChar w:fldCharType="end"/>
-      </w:r>
-      <w:r>
-        <w:rPr>
-          <w:rFonts w:asciiTheme="majorBidi" w:hAnsiTheme="majorBidi" w:cstheme="majorBidi"/>
-          <w:sz w:val="24"/>
-          <w:szCs w:val="24"/>
-        </w:rPr>
-        <w:t>, or another method. In the 4</w:t>
-      </w:r>
-      <w:r>
-        <w:rPr>
-          <w:rFonts w:asciiTheme="majorBidi" w:hAnsiTheme="majorBidi" w:cstheme="majorBidi"/>
-          <w:sz w:val="24"/>
-          <w:szCs w:val="24"/>
-          <w:vertAlign w:val="superscript"/>
-        </w:rPr>
-        <w:t>th</w:t>
-      </w:r>
-      <w:r>
-        <w:rPr>
-          <w:rFonts w:asciiTheme="majorBidi" w:hAnsiTheme="majorBidi" w:cstheme="majorBidi"/>
-          <w:sz w:val="24"/>
-          <w:szCs w:val="24"/>
-        </w:rPr>
-        <w:t xml:space="preserve"> method, a user’s share of the reservoir inflow is their historical allocation minus the agreed-on shortage volume (Appendix A). </w:t>
-      </w:r>
-      <w:r>
-        <w:rPr>
-          <w:rFonts w:asciiTheme="majorBidi" w:hAnsiTheme="majorBidi" w:cstheme="majorBidi"/>
-          <w:sz w:val="24"/>
-          <w:szCs w:val="24"/>
-        </w:rPr>
-        <w:t>D</w:t>
-      </w:r>
-      <w:r>
-        <w:rPr>
-          <w:rFonts w:asciiTheme="majorBidi" w:hAnsiTheme="majorBidi" w:cstheme="majorBidi"/>
-          <w:sz w:val="24"/>
-          <w:szCs w:val="24"/>
-        </w:rPr>
-        <w:t>ifficult decisions</w:t>
-      </w:r>
-      <w:r>
-        <w:rPr>
-          <w:rFonts w:asciiTheme="majorBidi" w:hAnsiTheme="majorBidi" w:cstheme="majorBidi"/>
-          <w:sz w:val="24"/>
-          <w:szCs w:val="24"/>
-        </w:rPr>
-        <w:t xml:space="preserve"> about apportionment of reservoir inflow</w:t>
-      </w:r>
-      <w:r>
-        <w:rPr>
-          <w:rFonts w:asciiTheme="majorBidi" w:hAnsiTheme="majorBidi" w:cstheme="majorBidi"/>
-          <w:sz w:val="24"/>
-          <w:szCs w:val="24"/>
-        </w:rPr>
-        <w:t xml:space="preserve"> are best for negotiations as they are ultimately political choices for where, when, how much, and for which purposes to consumptively use Colorado River water. Until users reach agreement, we suggest to allocate more reservoir inflow to increase </w:t>
-      </w:r>
-      <w:r>
-        <w:rPr>
-          <w:rFonts w:asciiTheme="majorBidi" w:hAnsiTheme="majorBidi" w:cstheme="majorBidi"/>
-          <w:sz w:val="24"/>
-          <w:szCs w:val="24"/>
-        </w:rPr>
-        <w:t xml:space="preserve">the </w:t>
-      </w:r>
-      <w:r>
-        <w:rPr>
-          <w:rFonts w:asciiTheme="majorBidi" w:hAnsiTheme="majorBidi" w:cstheme="majorBidi"/>
-          <w:sz w:val="24"/>
-          <w:szCs w:val="24"/>
-        </w:rPr>
-        <w:t xml:space="preserve">Lake Mead protection account balance. This set up may encourage users to reach agreement so they can access water. </w:t>
+        <w:t>Tradeoffs</w:t>
+      </w:r>
+      <w:r>
+        <w:rPr>
+          <w:rFonts w:asciiTheme="majorBidi" w:hAnsiTheme="majorBidi" w:cstheme="majorBidi"/>
+          <w:sz w:val="24"/>
+          <w:szCs w:val="24"/>
+        </w:rPr>
+        <w:t xml:space="preserve">. The selection of a Lake Mead protection volume creates a tradeoff between the protection account volume managed by Reclamation and the remaining reservoir storage available to other users. </w:t>
+      </w:r>
+      <w:r>
+        <w:rPr>
+          <w:rFonts w:asciiTheme="majorBidi" w:hAnsiTheme="majorBidi" w:cstheme="majorBidi"/>
+          <w:sz w:val="24"/>
+          <w:szCs w:val="24"/>
+        </w:rPr>
+        <w:t>S</w:t>
+      </w:r>
+      <w:r>
+        <w:rPr>
+          <w:rFonts w:asciiTheme="majorBidi" w:hAnsiTheme="majorBidi" w:cstheme="majorBidi"/>
+          <w:sz w:val="24"/>
+          <w:szCs w:val="24"/>
+        </w:rPr>
+        <w:t xml:space="preserve">etting a lower protection volume increases the storage for other users. </w:t>
+      </w:r>
+      <w:r>
+        <w:rPr>
+          <w:rFonts w:asciiTheme="majorBidi" w:hAnsiTheme="majorBidi" w:cstheme="majorBidi"/>
+          <w:sz w:val="24"/>
+          <w:szCs w:val="24"/>
+        </w:rPr>
+        <w:t>S</w:t>
+      </w:r>
+      <w:r>
+        <w:rPr>
+          <w:rFonts w:asciiTheme="majorBidi" w:hAnsiTheme="majorBidi" w:cstheme="majorBidi"/>
+          <w:sz w:val="24"/>
+          <w:szCs w:val="24"/>
+        </w:rPr>
+        <w:t>etting a higher protection volume reduces the storage available to other users</w:t>
+      </w:r>
+      <w:r>
+        <w:rPr>
+          <w:rFonts w:asciiTheme="majorBidi" w:hAnsiTheme="majorBidi" w:cstheme="majorBidi"/>
+          <w:sz w:val="24"/>
+          <w:szCs w:val="24"/>
+        </w:rPr>
+        <w:t>, potentially limiting the roll over of existing water conservation account balances</w:t>
+      </w:r>
+      <w:r>
+        <w:rPr>
+          <w:rFonts w:asciiTheme="majorBidi" w:hAnsiTheme="majorBidi" w:cstheme="majorBidi"/>
+          <w:sz w:val="24"/>
+          <w:szCs w:val="24"/>
+        </w:rPr>
+        <w:t xml:space="preserve">. For example, if the accounting program started on </w:t>
+      </w:r>
+      <w:r>
+        <w:rPr>
+          <w:rFonts w:asciiTheme="majorBidi" w:hAnsiTheme="majorBidi" w:cstheme="majorBidi"/>
+          <w:sz w:val="24"/>
+          <w:szCs w:val="24"/>
+        </w:rPr>
+        <w:t>June 23</w:t>
+      </w:r>
+      <w:r>
+        <w:rPr>
+          <w:rFonts w:asciiTheme="majorBidi" w:hAnsiTheme="majorBidi" w:cstheme="majorBidi"/>
+          <w:sz w:val="24"/>
+          <w:szCs w:val="24"/>
+        </w:rPr>
+        <w:t>, 2026</w:t>
+      </w:r>
+      <w:r>
+        <w:rPr>
+          <w:rFonts w:asciiTheme="majorBidi" w:hAnsiTheme="majorBidi" w:cstheme="majorBidi"/>
+          <w:sz w:val="24"/>
+          <w:szCs w:val="24"/>
+        </w:rPr>
+        <w:t xml:space="preserve"> (Lake Mead elevation 1,</w:t>
+      </w:r>
+      <w:r>
+        <w:rPr>
+          <w:rFonts w:asciiTheme="majorBidi" w:hAnsiTheme="majorBidi" w:cstheme="majorBidi"/>
+          <w:sz w:val="24"/>
+          <w:szCs w:val="24"/>
+        </w:rPr>
+        <w:t>0</w:t>
+      </w:r>
+      <w:r>
+        <w:rPr>
+          <w:rFonts w:asciiTheme="majorBidi" w:hAnsiTheme="majorBidi" w:cstheme="majorBidi"/>
+          <w:sz w:val="24"/>
+          <w:szCs w:val="24"/>
+        </w:rPr>
+        <w:t>45</w:t>
+      </w:r>
+      <w:r>
+        <w:rPr>
+          <w:rFonts w:asciiTheme="majorBidi" w:hAnsiTheme="majorBidi" w:cstheme="majorBidi"/>
+          <w:sz w:val="24"/>
+          <w:szCs w:val="24"/>
+        </w:rPr>
+        <w:t>.</w:t>
+      </w:r>
+      <w:r>
+        <w:rPr>
+          <w:rFonts w:asciiTheme="majorBidi" w:hAnsiTheme="majorBidi" w:cstheme="majorBidi"/>
+          <w:sz w:val="24"/>
+          <w:szCs w:val="24"/>
+        </w:rPr>
+        <w:t>6</w:t>
+      </w:r>
+      <w:r>
+        <w:rPr>
+          <w:rFonts w:asciiTheme="majorBidi" w:hAnsiTheme="majorBidi" w:cstheme="majorBidi"/>
+          <w:sz w:val="24"/>
+          <w:szCs w:val="24"/>
+        </w:rPr>
+        <w:t xml:space="preserve"> feet; </w:t>
+      </w:r>
+      <w:r>
+        <w:rPr>
+          <w:rFonts w:asciiTheme="majorBidi" w:hAnsiTheme="majorBidi" w:cstheme="majorBidi"/>
+          <w:sz w:val="24"/>
+          <w:szCs w:val="24"/>
+        </w:rPr>
+        <w:t>7.</w:t>
+      </w:r>
+      <w:r>
+        <w:rPr>
+          <w:rFonts w:asciiTheme="majorBidi" w:hAnsiTheme="majorBidi" w:cstheme="majorBidi"/>
+          <w:sz w:val="24"/>
+          <w:szCs w:val="24"/>
+        </w:rPr>
+        <w:t>4</w:t>
+      </w:r>
+      <w:r>
+        <w:rPr>
+          <w:rFonts w:asciiTheme="majorBidi" w:hAnsiTheme="majorBidi" w:cstheme="majorBidi"/>
+          <w:sz w:val="24"/>
+          <w:szCs w:val="24"/>
+        </w:rPr>
+        <w:t xml:space="preserve"> million acre-feet active storage) and Reclamation selected a Lake Mead protection elevation of 1,000 feet (4.5 million acre-feet of active storage), then users could </w:t>
+      </w:r>
+      <w:r>
+        <w:rPr>
+          <w:rFonts w:asciiTheme="majorBidi" w:hAnsiTheme="majorBidi" w:cstheme="majorBidi"/>
+          <w:sz w:val="24"/>
+          <w:szCs w:val="24"/>
+        </w:rPr>
+        <w:t xml:space="preserve">only roll over </w:t>
+      </w:r>
+      <w:r>
+        <w:rPr>
+          <w:rFonts w:asciiTheme="majorBidi" w:hAnsiTheme="majorBidi" w:cstheme="majorBidi"/>
+          <w:sz w:val="24"/>
+          <w:szCs w:val="24"/>
+        </w:rPr>
+        <w:t>2</w:t>
+      </w:r>
+      <w:r>
+        <w:rPr>
+          <w:rFonts w:asciiTheme="majorBidi" w:hAnsiTheme="majorBidi" w:cstheme="majorBidi"/>
+          <w:sz w:val="24"/>
+          <w:szCs w:val="24"/>
+        </w:rPr>
+        <w:t>.</w:t>
+      </w:r>
+      <w:r>
+        <w:rPr>
+          <w:rFonts w:asciiTheme="majorBidi" w:hAnsiTheme="majorBidi" w:cstheme="majorBidi"/>
+          <w:sz w:val="24"/>
+          <w:szCs w:val="24"/>
+        </w:rPr>
+        <w:t>9</w:t>
+      </w:r>
+      <w:r>
+        <w:rPr>
+          <w:rFonts w:asciiTheme="majorBidi" w:hAnsiTheme="majorBidi" w:cstheme="majorBidi"/>
+          <w:sz w:val="24"/>
+          <w:szCs w:val="24"/>
+        </w:rPr>
+        <w:t xml:space="preserve"> of the </w:t>
+      </w:r>
+      <w:r>
+        <w:rPr>
+          <w:rFonts w:asciiTheme="majorBidi" w:hAnsiTheme="majorBidi" w:cstheme="majorBidi"/>
+          <w:sz w:val="24"/>
+          <w:szCs w:val="24"/>
+        </w:rPr>
+        <w:t xml:space="preserve">existing </w:t>
+      </w:r>
+      <w:r>
+        <w:rPr>
+          <w:rFonts w:asciiTheme="majorBidi" w:hAnsiTheme="majorBidi" w:cstheme="majorBidi"/>
+          <w:sz w:val="24"/>
+          <w:szCs w:val="24"/>
+        </w:rPr>
+        <w:t xml:space="preserve">3.6 million acre-feet in the water conservation program. Setting a protection elevation of 975 feet (3.2 maf of active storage) would allow the complete roll over of all existing conserved water with </w:t>
+      </w:r>
+      <w:r>
+        <w:rPr>
+          <w:rFonts w:asciiTheme="majorBidi" w:hAnsiTheme="majorBidi" w:cstheme="majorBidi"/>
+          <w:sz w:val="24"/>
+          <w:szCs w:val="24"/>
+        </w:rPr>
+        <w:t>0.6</w:t>
+      </w:r>
+      <w:r>
+        <w:rPr>
+          <w:rFonts w:asciiTheme="majorBidi" w:hAnsiTheme="majorBidi" w:cstheme="majorBidi"/>
+          <w:sz w:val="24"/>
+          <w:szCs w:val="24"/>
+        </w:rPr>
+        <w:t xml:space="preserve"> maf of unassigned storage. This storage could be assigned to users such as</w:t>
+      </w:r>
+      <w:r>
+        <w:rPr>
+          <w:rFonts w:asciiTheme="majorBidi" w:hAnsiTheme="majorBidi" w:cstheme="majorBidi"/>
+          <w:sz w:val="24"/>
+          <w:szCs w:val="24"/>
+        </w:rPr>
+        <w:t xml:space="preserve"> Tribal Nations, who were previously excluded from participation</w:t>
+      </w:r>
+      <w:r>
+        <w:rPr>
+          <w:rFonts w:asciiTheme="majorBidi" w:hAnsiTheme="majorBidi" w:cstheme="majorBidi"/>
+          <w:sz w:val="24"/>
+          <w:szCs w:val="24"/>
+        </w:rPr>
+        <w:t>.</w:t>
       </w:r>
     </w:p>
     <w:p>
       <w:pPr>
-        <w:pStyle w:val="Heading1"/>
-      </w:pPr>
-      <w:r>
-        <w:t>Conclusions</w:t>
+        <w:pStyle w:val="ListParagraph"/>
+        <w:numPr>
+          <w:ilvl w:val="0"/>
+          <w:numId w:val="31"/>
+        </w:numPr>
+      </w:pPr>
+      <w:r>
+        <w:rPr>
+          <w:rFonts w:asciiTheme="majorBidi" w:hAnsiTheme="majorBidi" w:cstheme="majorBidi"/>
+          <w:b/>
+          <w:bCs/>
+          <w:sz w:val="24"/>
+          <w:szCs w:val="24"/>
+        </w:rPr>
+        <w:t>Division of Lake Mead inflow</w:t>
+      </w:r>
+      <w:r>
+        <w:rPr>
+          <w:rFonts w:asciiTheme="majorBidi" w:hAnsiTheme="majorBidi" w:cstheme="majorBidi"/>
+          <w:sz w:val="24"/>
+          <w:szCs w:val="24"/>
+        </w:rPr>
+        <w:t xml:space="preserve">. Water accounting is neutral to if or how the Lower Basin states, Tribal Nations of the Lower Basin, and Mexico apportion the Lake Mead inflow </w:t>
+      </w:r>
+      <w:r>
+        <w:rPr>
+          <w:rFonts w:asciiTheme="majorBidi" w:hAnsiTheme="majorBidi" w:cstheme="majorBidi"/>
+          <w:sz w:val="24"/>
+          <w:szCs w:val="24"/>
+        </w:rPr>
+        <w:lastRenderedPageBreak/>
+        <w:t xml:space="preserve">after Reclamation takes the first share to offset reservoir evaporation. Apportionment can be done by priority, pro rata, a combination, percentage splits of shortages in the Lower Basin Alternative </w:t>
+      </w:r>
+      <w:r>
+        <w:rPr>
+          <w:rFonts w:asciiTheme="majorBidi" w:hAnsiTheme="majorBidi" w:cstheme="majorBidi"/>
+          <w:sz w:val="24"/>
+          <w:szCs w:val="24"/>
+        </w:rPr>
+        <w:fldChar w:fldCharType="begin"/>
+      </w:r>
+      <w:r>
+        <w:rPr>
+          <w:rFonts w:asciiTheme="majorBidi" w:hAnsiTheme="majorBidi" w:cstheme="majorBidi"/>
+          <w:sz w:val="24"/>
+          <w:szCs w:val="24"/>
+        </w:rPr>
+        <w:instrText xml:space="preserve"> ADDIN EN.CITE &lt;EndNote&gt;&lt;Cite&gt;&lt;Author&gt;Buschatzke&lt;/Author&gt;&lt;Year&gt;2024&lt;/Year&gt;&lt;RecNum&gt;3016&lt;/RecNum&gt;&lt;DisplayText&gt;(Buschatzke et al., 2024)&lt;/DisplayText&gt;&lt;record&gt;&lt;rec-number&gt;3016&lt;/rec-number&gt;&lt;foreign-keys&gt;&lt;key app="EN" db-id="xxt5ta9pd995dwesap0pdzzp2weaz0w9werf" timestamp="1723671806"&gt;3016&lt;/key&gt;&lt;/foreign-keys&gt;&lt;ref-type name="Web Page"&gt;12&lt;/ref-type&gt;&lt;contributors&gt;&lt;authors&gt;&lt;author&gt;Thomas Buschatzke&lt;/author&gt;&lt;author&gt;J.B. Hamby&lt;/author&gt;&lt;author&gt;John Entsminger&lt;/author&gt;&lt;/authors&gt;&lt;/contributors&gt;&lt;titles&gt;&lt;title&gt;Lower Basin Alternative for the Post-2026 Coordinated Operation of the Colorado River Basin&lt;/title&gt;&lt;/titles&gt;&lt;volume&gt;2024&lt;/volume&gt;&lt;number&gt;August 14&lt;/number&gt;&lt;dates&gt;&lt;year&gt;2024&lt;/year&gt;&lt;/dates&gt;&lt;urls&gt;&lt;related-urls&gt;&lt;url&gt;https://www.snwa.com/assets/pdf/lower-basin-alternative-letter-march2024.pdf&lt;/url&gt;&lt;/related-urls&gt;&lt;/urls&gt;&lt;/record&gt;&lt;/Cite&gt;&lt;/EndNote&gt;</w:instrText>
+      </w:r>
+      <w:r>
+        <w:rPr>
+          <w:rFonts w:asciiTheme="majorBidi" w:hAnsiTheme="majorBidi" w:cstheme="majorBidi"/>
+          <w:sz w:val="24"/>
+          <w:szCs w:val="24"/>
+        </w:rPr>
+        <w:fldChar w:fldCharType="separate"/>
+      </w:r>
+      <w:r>
+        <w:rPr>
+          <w:rFonts w:asciiTheme="majorBidi" w:hAnsiTheme="majorBidi" w:cstheme="majorBidi"/>
+          <w:noProof/>
+          <w:sz w:val="24"/>
+          <w:szCs w:val="24"/>
+        </w:rPr>
+        <w:t>(Buschatzke et al., 2024)</w:t>
+      </w:r>
+      <w:r>
+        <w:rPr>
+          <w:rFonts w:asciiTheme="majorBidi" w:hAnsiTheme="majorBidi" w:cstheme="majorBidi"/>
+          <w:sz w:val="24"/>
+          <w:szCs w:val="24"/>
+        </w:rPr>
+        <w:fldChar w:fldCharType="end"/>
+      </w:r>
+      <w:r>
+        <w:rPr>
+          <w:rFonts w:asciiTheme="majorBidi" w:hAnsiTheme="majorBidi" w:cstheme="majorBidi"/>
+          <w:sz w:val="24"/>
+          <w:szCs w:val="24"/>
+        </w:rPr>
+        <w:t>, or another method. In the 4</w:t>
+      </w:r>
+      <w:r>
+        <w:rPr>
+          <w:rFonts w:asciiTheme="majorBidi" w:hAnsiTheme="majorBidi" w:cstheme="majorBidi"/>
+          <w:sz w:val="24"/>
+          <w:szCs w:val="24"/>
+          <w:vertAlign w:val="superscript"/>
+        </w:rPr>
+        <w:t>th</w:t>
+      </w:r>
+      <w:r>
+        <w:rPr>
+          <w:rFonts w:asciiTheme="majorBidi" w:hAnsiTheme="majorBidi" w:cstheme="majorBidi"/>
+          <w:sz w:val="24"/>
+          <w:szCs w:val="24"/>
+        </w:rPr>
+        <w:t xml:space="preserve"> method, a user’s share of the reservoir inflow is their historical allocation minus the agreed-on shortage volume (Appendix A). </w:t>
+      </w:r>
+      <w:r>
+        <w:rPr>
+          <w:rFonts w:asciiTheme="majorBidi" w:hAnsiTheme="majorBidi" w:cstheme="majorBidi"/>
+          <w:sz w:val="24"/>
+          <w:szCs w:val="24"/>
+        </w:rPr>
+        <w:t>D</w:t>
+      </w:r>
+      <w:r>
+        <w:rPr>
+          <w:rFonts w:asciiTheme="majorBidi" w:hAnsiTheme="majorBidi" w:cstheme="majorBidi"/>
+          <w:sz w:val="24"/>
+          <w:szCs w:val="24"/>
+        </w:rPr>
+        <w:t>ifficult decisions</w:t>
+      </w:r>
+      <w:r>
+        <w:rPr>
+          <w:rFonts w:asciiTheme="majorBidi" w:hAnsiTheme="majorBidi" w:cstheme="majorBidi"/>
+          <w:sz w:val="24"/>
+          <w:szCs w:val="24"/>
+        </w:rPr>
+        <w:t xml:space="preserve"> about apportionment of reservoir inflow</w:t>
+      </w:r>
+      <w:r>
+        <w:rPr>
+          <w:rFonts w:asciiTheme="majorBidi" w:hAnsiTheme="majorBidi" w:cstheme="majorBidi"/>
+          <w:sz w:val="24"/>
+          <w:szCs w:val="24"/>
+        </w:rPr>
+        <w:t xml:space="preserve"> are best for negotiations as they are ultimately political choices for where, when, how much, and for which purposes to consumptively use Colorado River water. Until users reach agreement, we suggest to allocate more reservoir inflow to increase </w:t>
+      </w:r>
+      <w:r>
+        <w:rPr>
+          <w:rFonts w:asciiTheme="majorBidi" w:hAnsiTheme="majorBidi" w:cstheme="majorBidi"/>
+          <w:sz w:val="24"/>
+          <w:szCs w:val="24"/>
+        </w:rPr>
+        <w:t xml:space="preserve">the </w:t>
+      </w:r>
+      <w:r>
+        <w:rPr>
+          <w:rFonts w:asciiTheme="majorBidi" w:hAnsiTheme="majorBidi" w:cstheme="majorBidi"/>
+          <w:sz w:val="24"/>
+          <w:szCs w:val="24"/>
+        </w:rPr>
+        <w:t xml:space="preserve">Lake Mead protection account balance. This set up may encourage users to reach agreement so they can access water. </w:t>
       </w:r>
     </w:p>
     <w:p>
       <w:pPr>
-        <w:rPr>
-          <w:rFonts w:asciiTheme="majorBidi" w:hAnsiTheme="majorBidi" w:cstheme="majorBidi"/>
-          <w:sz w:val="24"/>
-          <w:szCs w:val="24"/>
-        </w:rPr>
-      </w:pPr>
-      <w:r>
-        <w:rPr>
-          <w:rFonts w:ascii="Times New Roman" w:eastAsia="Times New Roman" w:hAnsi="Times New Roman" w:cs="Times New Roman"/>
-          <w:sz w:val="24"/>
-          <w:szCs w:val="24"/>
-        </w:rPr>
-        <w:t xml:space="preserve">Within the Colorado River Basin, </w:t>
-      </w:r>
-      <w:r>
-        <w:rPr>
-          <w:rFonts w:ascii="Times New Roman" w:eastAsia="Times New Roman" w:hAnsi="Times New Roman" w:cs="Times New Roman"/>
-          <w:sz w:val="24"/>
-          <w:szCs w:val="24"/>
-        </w:rPr>
-        <w:t xml:space="preserve">the </w:t>
-      </w:r>
-      <w:r>
-        <w:rPr>
-          <w:rFonts w:ascii="Times New Roman" w:eastAsia="Times New Roman" w:hAnsi="Times New Roman" w:cs="Times New Roman"/>
-          <w:sz w:val="24"/>
-          <w:szCs w:val="24"/>
-        </w:rPr>
-        <w:t>voluntary Lake Mead water conservation program</w:t>
-      </w:r>
-      <w:r>
-        <w:rPr>
-          <w:rFonts w:ascii="Times New Roman" w:eastAsia="Times New Roman" w:hAnsi="Times New Roman" w:cs="Times New Roman"/>
-          <w:sz w:val="24"/>
-          <w:szCs w:val="24"/>
-        </w:rPr>
-        <w:t>s</w:t>
-      </w:r>
-      <w:r>
-        <w:rPr>
-          <w:rFonts w:ascii="Times New Roman" w:eastAsia="Times New Roman" w:hAnsi="Times New Roman" w:cs="Times New Roman"/>
-          <w:sz w:val="24"/>
-          <w:szCs w:val="24"/>
-        </w:rPr>
-        <w:t xml:space="preserve"> offer users more autonomy to manage their different and sometimes conflicting risks of water shortages. In one sentence—</w:t>
-      </w:r>
-      <w:r>
-        <w:rPr>
-          <w:rFonts w:ascii="Times New Roman" w:eastAsia="Times New Roman" w:hAnsi="Times New Roman" w:cs="Times New Roman"/>
-          <w:sz w:val="24"/>
-          <w:szCs w:val="24"/>
-        </w:rPr>
-        <w:t>Arizona, California, Nevada</w:t>
-      </w:r>
-      <w:r>
-        <w:rPr>
-          <w:rFonts w:ascii="Times New Roman" w:eastAsia="Times New Roman" w:hAnsi="Times New Roman" w:cs="Times New Roman"/>
-          <w:sz w:val="24"/>
-          <w:szCs w:val="24"/>
-        </w:rPr>
-        <w:t>, and Mexico</w:t>
-      </w:r>
-      <w:r>
-        <w:rPr>
-          <w:rFonts w:ascii="Times New Roman" w:eastAsia="Times New Roman" w:hAnsi="Times New Roman" w:cs="Times New Roman"/>
-          <w:sz w:val="24"/>
-          <w:szCs w:val="24"/>
-        </w:rPr>
-        <w:t xml:space="preserve"> </w:t>
-      </w:r>
-      <w:r>
-        <w:rPr>
-          <w:rFonts w:ascii="Times New Roman" w:eastAsia="Times New Roman" w:hAnsi="Times New Roman" w:cs="Times New Roman"/>
-          <w:sz w:val="24"/>
-          <w:szCs w:val="24"/>
-        </w:rPr>
-        <w:t xml:space="preserve">can </w:t>
-      </w:r>
-      <w:r>
-        <w:rPr>
-          <w:rFonts w:ascii="Times New Roman" w:eastAsia="Times New Roman" w:hAnsi="Times New Roman" w:cs="Times New Roman"/>
-          <w:sz w:val="24"/>
-          <w:szCs w:val="24"/>
-        </w:rPr>
-        <w:t xml:space="preserve">voluntarily reduce use from their legal entitlements, keep the conserved water in Lake Mead, and withdraw conserved </w:t>
-      </w:r>
-      <w:r>
-        <w:rPr>
-          <w:rFonts w:ascii="Times New Roman" w:eastAsia="Times New Roman" w:hAnsi="Times New Roman" w:cs="Times New Roman"/>
-          <w:sz w:val="24"/>
-          <w:szCs w:val="24"/>
-        </w:rPr>
-        <w:lastRenderedPageBreak/>
-        <w:t>water at a future point in time subject to some constraints.</w:t>
-      </w:r>
-      <w:r>
-        <w:rPr>
-          <w:rFonts w:asciiTheme="majorBidi" w:hAnsiTheme="majorBidi" w:cstheme="majorBidi"/>
-          <w:sz w:val="24"/>
-          <w:szCs w:val="24"/>
-        </w:rPr>
-        <w:t xml:space="preserve"> Since </w:t>
-      </w:r>
-      <w:r>
-        <w:rPr>
-          <w:rFonts w:asciiTheme="majorBidi" w:hAnsiTheme="majorBidi" w:cstheme="majorBidi"/>
-          <w:sz w:val="24"/>
-          <w:szCs w:val="24"/>
-        </w:rPr>
-        <w:t xml:space="preserve">the program inception in </w:t>
-      </w:r>
-      <w:r>
-        <w:rPr>
-          <w:rFonts w:asciiTheme="majorBidi" w:hAnsiTheme="majorBidi" w:cstheme="majorBidi"/>
-          <w:sz w:val="24"/>
-          <w:szCs w:val="24"/>
-        </w:rPr>
-        <w:t>2007, Lower Basin users have conserved 4.</w:t>
-      </w:r>
-      <w:r>
-        <w:rPr>
-          <w:rFonts w:asciiTheme="majorBidi" w:hAnsiTheme="majorBidi" w:cstheme="majorBidi"/>
-          <w:sz w:val="24"/>
-          <w:szCs w:val="24"/>
-        </w:rPr>
-        <w:t>4</w:t>
-      </w:r>
-      <w:r>
-        <w:rPr>
-          <w:rFonts w:asciiTheme="majorBidi" w:hAnsiTheme="majorBidi" w:cstheme="majorBidi"/>
-          <w:sz w:val="24"/>
-          <w:szCs w:val="24"/>
-        </w:rPr>
-        <w:t xml:space="preserve"> million acre-feet of water with 3.</w:t>
-      </w:r>
-      <w:r>
-        <w:rPr>
-          <w:rFonts w:asciiTheme="majorBidi" w:hAnsiTheme="majorBidi" w:cstheme="majorBidi"/>
-          <w:sz w:val="24"/>
-          <w:szCs w:val="24"/>
-        </w:rPr>
-        <w:t>6</w:t>
-      </w:r>
-      <w:r>
-        <w:rPr>
-          <w:rFonts w:asciiTheme="majorBidi" w:hAnsiTheme="majorBidi" w:cstheme="majorBidi"/>
-          <w:sz w:val="24"/>
-          <w:szCs w:val="24"/>
-        </w:rPr>
-        <w:t xml:space="preserve"> million acre-feet </w:t>
-      </w:r>
-      <w:r>
-        <w:rPr>
-          <w:rFonts w:asciiTheme="majorBidi" w:hAnsiTheme="majorBidi" w:cstheme="majorBidi"/>
-          <w:sz w:val="24"/>
-          <w:szCs w:val="24"/>
-        </w:rPr>
-        <w:t>presently</w:t>
-      </w:r>
-      <w:r>
-        <w:rPr>
-          <w:rFonts w:asciiTheme="majorBidi" w:hAnsiTheme="majorBidi" w:cstheme="majorBidi"/>
-          <w:sz w:val="24"/>
-          <w:szCs w:val="24"/>
-        </w:rPr>
-        <w:t xml:space="preserve"> remaining in Lake Mead. </w:t>
-      </w:r>
-      <w:r>
-        <w:rPr>
-          <w:rFonts w:asciiTheme="majorBidi" w:hAnsiTheme="majorBidi" w:cstheme="majorBidi"/>
-          <w:sz w:val="24"/>
-          <w:szCs w:val="24"/>
-        </w:rPr>
-        <w:t>These efforts kept Lake Mead storage above the protection volume</w:t>
-      </w:r>
-      <w:r>
-        <w:rPr>
-          <w:rFonts w:asciiTheme="majorBidi" w:hAnsiTheme="majorBidi" w:cstheme="majorBidi"/>
-          <w:sz w:val="24"/>
-          <w:szCs w:val="24"/>
-        </w:rPr>
-        <w:t xml:space="preserve"> through </w:t>
-      </w:r>
-      <w:r>
-        <w:rPr>
-          <w:rFonts w:asciiTheme="majorBidi" w:hAnsiTheme="majorBidi" w:cstheme="majorBidi"/>
-          <w:sz w:val="24"/>
-          <w:szCs w:val="24"/>
-        </w:rPr>
-        <w:t xml:space="preserve">the recent </w:t>
-      </w:r>
-      <w:r>
-        <w:rPr>
-          <w:rFonts w:asciiTheme="majorBidi" w:hAnsiTheme="majorBidi" w:cstheme="majorBidi"/>
-          <w:sz w:val="24"/>
-          <w:szCs w:val="24"/>
-        </w:rPr>
-        <w:t xml:space="preserve">(and ongoing) </w:t>
-      </w:r>
-      <w:r>
-        <w:rPr>
-          <w:rFonts w:asciiTheme="majorBidi" w:hAnsiTheme="majorBidi" w:cstheme="majorBidi"/>
-          <w:sz w:val="24"/>
-          <w:szCs w:val="24"/>
-        </w:rPr>
-        <w:t>critically dry period</w:t>
-      </w:r>
-      <w:r>
-        <w:rPr>
-          <w:rFonts w:asciiTheme="majorBidi" w:hAnsiTheme="majorBidi" w:cstheme="majorBidi"/>
-          <w:sz w:val="24"/>
-          <w:szCs w:val="24"/>
-        </w:rPr>
-        <w:t xml:space="preserve">. </w:t>
-      </w:r>
-      <w:r>
-        <w:rPr>
-          <w:rFonts w:asciiTheme="majorBidi" w:hAnsiTheme="majorBidi" w:cstheme="majorBidi"/>
-          <w:sz w:val="24"/>
-          <w:szCs w:val="24"/>
-        </w:rPr>
-        <w:t xml:space="preserve">The program works on the assumption that the annual </w:t>
-      </w:r>
-      <w:r>
-        <w:rPr>
-          <w:rFonts w:asciiTheme="majorBidi" w:hAnsiTheme="majorBidi" w:cstheme="majorBidi"/>
-          <w:sz w:val="24"/>
-          <w:szCs w:val="24"/>
-        </w:rPr>
-        <w:t xml:space="preserve">physically </w:t>
-      </w:r>
-      <w:r>
-        <w:rPr>
-          <w:rFonts w:asciiTheme="majorBidi" w:hAnsiTheme="majorBidi" w:cstheme="majorBidi"/>
-          <w:sz w:val="24"/>
-          <w:szCs w:val="24"/>
-        </w:rPr>
-        <w:t>available water</w:t>
-      </w:r>
-      <w:r>
-        <w:rPr>
-          <w:rFonts w:asciiTheme="majorBidi" w:hAnsiTheme="majorBidi" w:cstheme="majorBidi"/>
-          <w:sz w:val="24"/>
-          <w:szCs w:val="24"/>
-        </w:rPr>
-        <w:t>―</w:t>
-      </w:r>
-      <w:r>
-        <w:rPr>
-          <w:rFonts w:asciiTheme="majorBidi" w:hAnsiTheme="majorBidi" w:cstheme="majorBidi"/>
-          <w:sz w:val="24"/>
-          <w:szCs w:val="24"/>
-        </w:rPr>
-        <w:t xml:space="preserve">reservoir inflow minus </w:t>
-      </w:r>
-      <w:r>
-        <w:rPr>
-          <w:rFonts w:asciiTheme="majorBidi" w:hAnsiTheme="majorBidi" w:cstheme="majorBidi"/>
-          <w:sz w:val="24"/>
-          <w:szCs w:val="24"/>
-        </w:rPr>
-        <w:t>e</w:t>
-      </w:r>
-      <w:r>
-        <w:rPr>
-          <w:rFonts w:asciiTheme="majorBidi" w:hAnsiTheme="majorBidi" w:cstheme="majorBidi"/>
-          <w:sz w:val="24"/>
-          <w:szCs w:val="24"/>
-        </w:rPr>
-        <w:t>vaporation</w:t>
-      </w:r>
-      <w:r>
-        <w:rPr>
-          <w:rFonts w:asciiTheme="majorBidi" w:hAnsiTheme="majorBidi" w:cstheme="majorBidi"/>
-          <w:sz w:val="24"/>
-          <w:szCs w:val="24"/>
-        </w:rPr>
-        <w:t>―</w:t>
-      </w:r>
-      <w:r>
-        <w:rPr>
-          <w:rFonts w:asciiTheme="majorBidi" w:hAnsiTheme="majorBidi" w:cstheme="majorBidi"/>
-          <w:sz w:val="24"/>
-          <w:szCs w:val="24"/>
-        </w:rPr>
-        <w:t xml:space="preserve">exceeds </w:t>
-      </w:r>
-      <w:r>
-        <w:rPr>
-          <w:rFonts w:asciiTheme="majorBidi" w:hAnsiTheme="majorBidi" w:cstheme="majorBidi"/>
-          <w:sz w:val="24"/>
-          <w:szCs w:val="24"/>
-        </w:rPr>
-        <w:t>legal</w:t>
-      </w:r>
-      <w:r>
-        <w:rPr>
-          <w:rFonts w:asciiTheme="majorBidi" w:hAnsiTheme="majorBidi" w:cstheme="majorBidi"/>
-          <w:sz w:val="24"/>
-          <w:szCs w:val="24"/>
-        </w:rPr>
-        <w:t xml:space="preserve"> </w:t>
-      </w:r>
-      <w:r>
-        <w:rPr>
-          <w:rFonts w:asciiTheme="majorBidi" w:hAnsiTheme="majorBidi" w:cstheme="majorBidi"/>
-          <w:sz w:val="24"/>
-          <w:szCs w:val="24"/>
-        </w:rPr>
-        <w:t>entitlements</w:t>
-      </w:r>
-      <w:r>
-        <w:rPr>
-          <w:rFonts w:asciiTheme="majorBidi" w:hAnsiTheme="majorBidi" w:cstheme="majorBidi"/>
-          <w:sz w:val="24"/>
-          <w:szCs w:val="24"/>
-        </w:rPr>
-        <w:t>. This assumption is challenged as the Colorado River Basin becomes more arid.</w:t>
-      </w:r>
-      <w:r>
-        <w:rPr>
-          <w:rFonts w:asciiTheme="majorBidi" w:hAnsiTheme="majorBidi" w:cstheme="majorBidi"/>
-          <w:sz w:val="24"/>
-          <w:szCs w:val="24"/>
-        </w:rPr>
-        <w:t xml:space="preserve"> As reservoir storage draws down, t</w:t>
-      </w:r>
-      <w:r>
-        <w:rPr>
-          <w:rFonts w:asciiTheme="majorBidi" w:hAnsiTheme="majorBidi" w:cstheme="majorBidi"/>
-          <w:sz w:val="24"/>
-          <w:szCs w:val="24"/>
-        </w:rPr>
-        <w:t>here is also a challenge to m</w:t>
-      </w:r>
-      <w:r>
-        <w:rPr>
-          <w:rFonts w:asciiTheme="majorBidi" w:hAnsiTheme="majorBidi" w:cstheme="majorBidi"/>
-          <w:sz w:val="24"/>
-          <w:szCs w:val="24"/>
-        </w:rPr>
-        <w:t>otivate voluntary water conservation</w:t>
-      </w:r>
-      <w:r>
-        <w:rPr>
-          <w:rFonts w:asciiTheme="majorBidi" w:hAnsiTheme="majorBidi" w:cstheme="majorBidi"/>
-          <w:sz w:val="24"/>
-          <w:szCs w:val="24"/>
-        </w:rPr>
-        <w:t xml:space="preserve"> </w:t>
-      </w:r>
-      <w:r>
-        <w:rPr>
-          <w:rFonts w:asciiTheme="majorBidi" w:hAnsiTheme="majorBidi" w:cstheme="majorBidi"/>
-          <w:sz w:val="24"/>
-          <w:szCs w:val="24"/>
-        </w:rPr>
-        <w:t xml:space="preserve">because </w:t>
-      </w:r>
-      <w:r>
-        <w:rPr>
-          <w:rFonts w:asciiTheme="majorBidi" w:hAnsiTheme="majorBidi" w:cstheme="majorBidi"/>
-          <w:sz w:val="24"/>
-          <w:szCs w:val="24"/>
-        </w:rPr>
-        <w:t>users</w:t>
-      </w:r>
-      <w:r>
-        <w:rPr>
-          <w:rFonts w:asciiTheme="majorBidi" w:hAnsiTheme="majorBidi" w:cstheme="majorBidi"/>
-          <w:sz w:val="24"/>
-          <w:szCs w:val="24"/>
-        </w:rPr>
-        <w:t xml:space="preserve"> face increasing difficulty to access and debit their </w:t>
-      </w:r>
-      <w:r>
-        <w:rPr>
-          <w:rFonts w:asciiTheme="majorBidi" w:hAnsiTheme="majorBidi" w:cstheme="majorBidi"/>
-          <w:sz w:val="24"/>
-          <w:szCs w:val="24"/>
-        </w:rPr>
-        <w:t>conserved water</w:t>
-      </w:r>
-      <w:r>
-        <w:rPr>
-          <w:rFonts w:asciiTheme="majorBidi" w:hAnsiTheme="majorBidi" w:cstheme="majorBidi"/>
-          <w:sz w:val="24"/>
-          <w:szCs w:val="24"/>
-        </w:rPr>
-        <w:t>.</w:t>
-      </w:r>
-      <w:r>
-        <w:rPr>
-          <w:rFonts w:asciiTheme="majorBidi" w:hAnsiTheme="majorBidi" w:cstheme="majorBidi"/>
-          <w:sz w:val="24"/>
-          <w:szCs w:val="24"/>
-        </w:rPr>
-        <w:t xml:space="preserve"> </w:t>
-      </w:r>
-      <w:r>
-        <w:rPr>
-          <w:rFonts w:asciiTheme="majorBidi" w:hAnsiTheme="majorBidi" w:cstheme="majorBidi"/>
-          <w:sz w:val="24"/>
-          <w:szCs w:val="24"/>
-        </w:rPr>
-        <w:t xml:space="preserve">We describe two novel program improvements </w:t>
-      </w:r>
-      <w:r>
-        <w:rPr>
-          <w:rFonts w:asciiTheme="majorBidi" w:hAnsiTheme="majorBidi" w:cstheme="majorBidi"/>
-          <w:sz w:val="24"/>
-          <w:szCs w:val="24"/>
-        </w:rPr>
-        <w:t>that</w:t>
-      </w:r>
-      <w:r>
-        <w:rPr>
-          <w:rFonts w:asciiTheme="majorBidi" w:hAnsiTheme="majorBidi" w:cstheme="majorBidi"/>
-          <w:sz w:val="24"/>
-          <w:szCs w:val="24"/>
-        </w:rPr>
-        <w:t xml:space="preserve"> switch the </w:t>
-      </w:r>
-      <w:r>
-        <w:rPr>
-          <w:rFonts w:asciiTheme="majorBidi" w:hAnsiTheme="majorBidi" w:cstheme="majorBidi"/>
-          <w:sz w:val="24"/>
-          <w:szCs w:val="24"/>
-        </w:rPr>
-        <w:t xml:space="preserve">conservation </w:t>
-      </w:r>
-      <w:r>
-        <w:rPr>
-          <w:rFonts w:asciiTheme="majorBidi" w:hAnsiTheme="majorBidi" w:cstheme="majorBidi"/>
-          <w:sz w:val="24"/>
-          <w:szCs w:val="24"/>
-        </w:rPr>
-        <w:t xml:space="preserve">accounting from reductions from historical entitlements to reductions from the annual </w:t>
-      </w:r>
-      <w:r>
-        <w:rPr>
-          <w:rFonts w:asciiTheme="majorBidi" w:hAnsiTheme="majorBidi" w:cstheme="majorBidi"/>
-          <w:sz w:val="24"/>
-          <w:szCs w:val="24"/>
-        </w:rPr>
-        <w:t xml:space="preserve">physically </w:t>
-      </w:r>
-      <w:r>
-        <w:rPr>
-          <w:rFonts w:asciiTheme="majorBidi" w:hAnsiTheme="majorBidi" w:cstheme="majorBidi"/>
-          <w:sz w:val="24"/>
-          <w:szCs w:val="24"/>
-        </w:rPr>
-        <w:t>available water</w:t>
-      </w:r>
-      <w:r>
-        <w:rPr>
-          <w:rFonts w:asciiTheme="majorBidi" w:hAnsiTheme="majorBidi" w:cstheme="majorBidi"/>
-          <w:sz w:val="24"/>
-          <w:szCs w:val="24"/>
-        </w:rPr>
-        <w:t xml:space="preserve">. One strategy </w:t>
-      </w:r>
-      <w:r>
-        <w:rPr>
-          <w:rFonts w:asciiTheme="majorBidi" w:hAnsiTheme="majorBidi" w:cstheme="majorBidi"/>
-          <w:sz w:val="24"/>
-          <w:szCs w:val="24"/>
-        </w:rPr>
-        <w:t>proportionally reduces credits. A second strategy converts to water accounting. Both strategies have additional benefits such as ______________ . [[Final Sentence]].</w:t>
+        <w:pStyle w:val="Heading1"/>
+      </w:pPr>
+      <w:r>
+        <w:t>Conclusions</w:t>
       </w:r>
     </w:p>
     <w:p>
       <w:pPr>
-        <w:pStyle w:val="Heading1"/>
-      </w:pPr>
-      <w:r>
-        <w:t>Data Availability</w:t>
+        <w:rPr>
+          <w:rFonts w:asciiTheme="majorBidi" w:hAnsiTheme="majorBidi" w:cstheme="majorBidi"/>
+          <w:sz w:val="24"/>
+          <w:szCs w:val="24"/>
+        </w:rPr>
+      </w:pPr>
+      <w:r>
+        <w:rPr>
+          <w:rFonts w:ascii="Times New Roman" w:eastAsia="Times New Roman" w:hAnsi="Times New Roman" w:cs="Times New Roman"/>
+          <w:sz w:val="24"/>
+          <w:szCs w:val="24"/>
+        </w:rPr>
+        <w:t xml:space="preserve">Within the Colorado River Basin, </w:t>
+      </w:r>
+      <w:r>
+        <w:rPr>
+          <w:rFonts w:ascii="Times New Roman" w:eastAsia="Times New Roman" w:hAnsi="Times New Roman" w:cs="Times New Roman"/>
+          <w:sz w:val="24"/>
+          <w:szCs w:val="24"/>
+        </w:rPr>
+        <w:t xml:space="preserve">the </w:t>
+      </w:r>
+      <w:r>
+        <w:rPr>
+          <w:rFonts w:ascii="Times New Roman" w:eastAsia="Times New Roman" w:hAnsi="Times New Roman" w:cs="Times New Roman"/>
+          <w:sz w:val="24"/>
+          <w:szCs w:val="24"/>
+        </w:rPr>
+        <w:t>voluntary Lake Mead water conservation program</w:t>
+      </w:r>
+      <w:r>
+        <w:rPr>
+          <w:rFonts w:ascii="Times New Roman" w:eastAsia="Times New Roman" w:hAnsi="Times New Roman" w:cs="Times New Roman"/>
+          <w:sz w:val="24"/>
+          <w:szCs w:val="24"/>
+        </w:rPr>
+        <w:t>s</w:t>
+      </w:r>
+      <w:r>
+        <w:rPr>
+          <w:rFonts w:ascii="Times New Roman" w:eastAsia="Times New Roman" w:hAnsi="Times New Roman" w:cs="Times New Roman"/>
+          <w:sz w:val="24"/>
+          <w:szCs w:val="24"/>
+        </w:rPr>
+        <w:t xml:space="preserve"> offer users more autonomy to manage their different and sometimes conflicting risks of water shortages. In one sentence—</w:t>
+      </w:r>
+      <w:r>
+        <w:rPr>
+          <w:rFonts w:ascii="Times New Roman" w:eastAsia="Times New Roman" w:hAnsi="Times New Roman" w:cs="Times New Roman"/>
+          <w:sz w:val="24"/>
+          <w:szCs w:val="24"/>
+        </w:rPr>
+        <w:t>Arizona, California, Nevada</w:t>
+      </w:r>
+      <w:r>
+        <w:rPr>
+          <w:rFonts w:ascii="Times New Roman" w:eastAsia="Times New Roman" w:hAnsi="Times New Roman" w:cs="Times New Roman"/>
+          <w:sz w:val="24"/>
+          <w:szCs w:val="24"/>
+        </w:rPr>
+        <w:t>, and Mexico</w:t>
+      </w:r>
+      <w:r>
+        <w:rPr>
+          <w:rFonts w:ascii="Times New Roman" w:eastAsia="Times New Roman" w:hAnsi="Times New Roman" w:cs="Times New Roman"/>
+          <w:sz w:val="24"/>
+          <w:szCs w:val="24"/>
+        </w:rPr>
+        <w:t xml:space="preserve"> </w:t>
+      </w:r>
+      <w:r>
+        <w:rPr>
+          <w:rFonts w:ascii="Times New Roman" w:eastAsia="Times New Roman" w:hAnsi="Times New Roman" w:cs="Times New Roman"/>
+          <w:sz w:val="24"/>
+          <w:szCs w:val="24"/>
+        </w:rPr>
+        <w:t xml:space="preserve">can </w:t>
+      </w:r>
+      <w:r>
+        <w:rPr>
+          <w:rFonts w:ascii="Times New Roman" w:eastAsia="Times New Roman" w:hAnsi="Times New Roman" w:cs="Times New Roman"/>
+          <w:sz w:val="24"/>
+          <w:szCs w:val="24"/>
+        </w:rPr>
+        <w:t>voluntarily reduce use from their legal entitlements, keep the conserved water in Lake Mead, and withdraw conserved water at a future point in time subject to some constraints.</w:t>
+      </w:r>
+      <w:r>
+        <w:rPr>
+          <w:rFonts w:asciiTheme="majorBidi" w:hAnsiTheme="majorBidi" w:cstheme="majorBidi"/>
+          <w:sz w:val="24"/>
+          <w:szCs w:val="24"/>
+        </w:rPr>
+        <w:t xml:space="preserve"> Since </w:t>
+      </w:r>
+      <w:r>
+        <w:rPr>
+          <w:rFonts w:asciiTheme="majorBidi" w:hAnsiTheme="majorBidi" w:cstheme="majorBidi"/>
+          <w:sz w:val="24"/>
+          <w:szCs w:val="24"/>
+        </w:rPr>
+        <w:t xml:space="preserve">the program inception in </w:t>
+      </w:r>
+      <w:r>
+        <w:rPr>
+          <w:rFonts w:asciiTheme="majorBidi" w:hAnsiTheme="majorBidi" w:cstheme="majorBidi"/>
+          <w:sz w:val="24"/>
+          <w:szCs w:val="24"/>
+        </w:rPr>
+        <w:t>2007, Lower Basin users have conserved 4.</w:t>
+      </w:r>
+      <w:r>
+        <w:rPr>
+          <w:rFonts w:asciiTheme="majorBidi" w:hAnsiTheme="majorBidi" w:cstheme="majorBidi"/>
+          <w:sz w:val="24"/>
+          <w:szCs w:val="24"/>
+        </w:rPr>
+        <w:t>4</w:t>
+      </w:r>
+      <w:r>
+        <w:rPr>
+          <w:rFonts w:asciiTheme="majorBidi" w:hAnsiTheme="majorBidi" w:cstheme="majorBidi"/>
+          <w:sz w:val="24"/>
+          <w:szCs w:val="24"/>
+        </w:rPr>
+        <w:t xml:space="preserve"> million acre-feet of water with 3.</w:t>
+      </w:r>
+      <w:r>
+        <w:rPr>
+          <w:rFonts w:asciiTheme="majorBidi" w:hAnsiTheme="majorBidi" w:cstheme="majorBidi"/>
+          <w:sz w:val="24"/>
+          <w:szCs w:val="24"/>
+        </w:rPr>
+        <w:t>6</w:t>
+      </w:r>
+      <w:r>
+        <w:rPr>
+          <w:rFonts w:asciiTheme="majorBidi" w:hAnsiTheme="majorBidi" w:cstheme="majorBidi"/>
+          <w:sz w:val="24"/>
+          <w:szCs w:val="24"/>
+        </w:rPr>
+        <w:t xml:space="preserve"> million acre-feet </w:t>
+      </w:r>
+      <w:r>
+        <w:rPr>
+          <w:rFonts w:asciiTheme="majorBidi" w:hAnsiTheme="majorBidi" w:cstheme="majorBidi"/>
+          <w:sz w:val="24"/>
+          <w:szCs w:val="24"/>
+        </w:rPr>
+        <w:t>presently</w:t>
+      </w:r>
+      <w:r>
+        <w:rPr>
+          <w:rFonts w:asciiTheme="majorBidi" w:hAnsiTheme="majorBidi" w:cstheme="majorBidi"/>
+          <w:sz w:val="24"/>
+          <w:szCs w:val="24"/>
+        </w:rPr>
+        <w:t xml:space="preserve"> remaining in Lake Mead. </w:t>
+      </w:r>
+      <w:r>
+        <w:rPr>
+          <w:rFonts w:asciiTheme="majorBidi" w:hAnsiTheme="majorBidi" w:cstheme="majorBidi"/>
+          <w:sz w:val="24"/>
+          <w:szCs w:val="24"/>
+        </w:rPr>
+        <w:t>These efforts kept Lake Mead storage above the protection volume</w:t>
+      </w:r>
+      <w:r>
+        <w:rPr>
+          <w:rFonts w:asciiTheme="majorBidi" w:hAnsiTheme="majorBidi" w:cstheme="majorBidi"/>
+          <w:sz w:val="24"/>
+          <w:szCs w:val="24"/>
+        </w:rPr>
+        <w:t xml:space="preserve"> through </w:t>
+      </w:r>
+      <w:r>
+        <w:rPr>
+          <w:rFonts w:asciiTheme="majorBidi" w:hAnsiTheme="majorBidi" w:cstheme="majorBidi"/>
+          <w:sz w:val="24"/>
+          <w:szCs w:val="24"/>
+        </w:rPr>
+        <w:t xml:space="preserve">the recent </w:t>
+      </w:r>
+      <w:r>
+        <w:rPr>
+          <w:rFonts w:asciiTheme="majorBidi" w:hAnsiTheme="majorBidi" w:cstheme="majorBidi"/>
+          <w:sz w:val="24"/>
+          <w:szCs w:val="24"/>
+        </w:rPr>
+        <w:t xml:space="preserve">(and ongoing) </w:t>
+      </w:r>
+      <w:r>
+        <w:rPr>
+          <w:rFonts w:asciiTheme="majorBidi" w:hAnsiTheme="majorBidi" w:cstheme="majorBidi"/>
+          <w:sz w:val="24"/>
+          <w:szCs w:val="24"/>
+        </w:rPr>
+        <w:t>critically dry period</w:t>
+      </w:r>
+      <w:r>
+        <w:rPr>
+          <w:rFonts w:asciiTheme="majorBidi" w:hAnsiTheme="majorBidi" w:cstheme="majorBidi"/>
+          <w:sz w:val="24"/>
+          <w:szCs w:val="24"/>
+        </w:rPr>
+        <w:t xml:space="preserve">. </w:t>
+      </w:r>
+      <w:r>
+        <w:rPr>
+          <w:rFonts w:asciiTheme="majorBidi" w:hAnsiTheme="majorBidi" w:cstheme="majorBidi"/>
+          <w:sz w:val="24"/>
+          <w:szCs w:val="24"/>
+        </w:rPr>
+        <w:t xml:space="preserve">The program works on the assumption that the annual </w:t>
+      </w:r>
+      <w:r>
+        <w:rPr>
+          <w:rFonts w:asciiTheme="majorBidi" w:hAnsiTheme="majorBidi" w:cstheme="majorBidi"/>
+          <w:sz w:val="24"/>
+          <w:szCs w:val="24"/>
+        </w:rPr>
+        <w:t xml:space="preserve">physically </w:t>
+      </w:r>
+      <w:r>
+        <w:rPr>
+          <w:rFonts w:asciiTheme="majorBidi" w:hAnsiTheme="majorBidi" w:cstheme="majorBidi"/>
+          <w:sz w:val="24"/>
+          <w:szCs w:val="24"/>
+        </w:rPr>
+        <w:t>available water</w:t>
+      </w:r>
+      <w:r>
+        <w:rPr>
+          <w:rFonts w:asciiTheme="majorBidi" w:hAnsiTheme="majorBidi" w:cstheme="majorBidi"/>
+          <w:sz w:val="24"/>
+          <w:szCs w:val="24"/>
+        </w:rPr>
+        <w:t>―</w:t>
+      </w:r>
+      <w:r>
+        <w:rPr>
+          <w:rFonts w:asciiTheme="majorBidi" w:hAnsiTheme="majorBidi" w:cstheme="majorBidi"/>
+          <w:sz w:val="24"/>
+          <w:szCs w:val="24"/>
+        </w:rPr>
+        <w:t xml:space="preserve">reservoir inflow minus </w:t>
+      </w:r>
+      <w:r>
+        <w:rPr>
+          <w:rFonts w:asciiTheme="majorBidi" w:hAnsiTheme="majorBidi" w:cstheme="majorBidi"/>
+          <w:sz w:val="24"/>
+          <w:szCs w:val="24"/>
+        </w:rPr>
+        <w:t>e</w:t>
+      </w:r>
+      <w:r>
+        <w:rPr>
+          <w:rFonts w:asciiTheme="majorBidi" w:hAnsiTheme="majorBidi" w:cstheme="majorBidi"/>
+          <w:sz w:val="24"/>
+          <w:szCs w:val="24"/>
+        </w:rPr>
+        <w:t>vaporation</w:t>
+      </w:r>
+      <w:r>
+        <w:rPr>
+          <w:rFonts w:asciiTheme="majorBidi" w:hAnsiTheme="majorBidi" w:cstheme="majorBidi"/>
+          <w:sz w:val="24"/>
+          <w:szCs w:val="24"/>
+        </w:rPr>
+        <w:t>―</w:t>
+      </w:r>
+      <w:r>
+        <w:rPr>
+          <w:rFonts w:asciiTheme="majorBidi" w:hAnsiTheme="majorBidi" w:cstheme="majorBidi"/>
+          <w:sz w:val="24"/>
+          <w:szCs w:val="24"/>
+        </w:rPr>
+        <w:t xml:space="preserve">exceeds </w:t>
+      </w:r>
+      <w:r>
+        <w:rPr>
+          <w:rFonts w:asciiTheme="majorBidi" w:hAnsiTheme="majorBidi" w:cstheme="majorBidi"/>
+          <w:sz w:val="24"/>
+          <w:szCs w:val="24"/>
+        </w:rPr>
+        <w:t>legal</w:t>
+      </w:r>
+      <w:r>
+        <w:rPr>
+          <w:rFonts w:asciiTheme="majorBidi" w:hAnsiTheme="majorBidi" w:cstheme="majorBidi"/>
+          <w:sz w:val="24"/>
+          <w:szCs w:val="24"/>
+        </w:rPr>
+        <w:t xml:space="preserve"> </w:t>
+      </w:r>
+      <w:r>
+        <w:rPr>
+          <w:rFonts w:asciiTheme="majorBidi" w:hAnsiTheme="majorBidi" w:cstheme="majorBidi"/>
+          <w:sz w:val="24"/>
+          <w:szCs w:val="24"/>
+        </w:rPr>
+        <w:t>entitlements</w:t>
+      </w:r>
+      <w:r>
+        <w:rPr>
+          <w:rFonts w:asciiTheme="majorBidi" w:hAnsiTheme="majorBidi" w:cstheme="majorBidi"/>
+          <w:sz w:val="24"/>
+          <w:szCs w:val="24"/>
+        </w:rPr>
+        <w:t>. This assumption is challenged as the Colorado River Basin becomes more arid.</w:t>
+      </w:r>
+      <w:r>
+        <w:rPr>
+          <w:rFonts w:asciiTheme="majorBidi" w:hAnsiTheme="majorBidi" w:cstheme="majorBidi"/>
+          <w:sz w:val="24"/>
+          <w:szCs w:val="24"/>
+        </w:rPr>
+        <w:t xml:space="preserve"> As reservoir storage draws down, t</w:t>
+      </w:r>
+      <w:r>
+        <w:rPr>
+          <w:rFonts w:asciiTheme="majorBidi" w:hAnsiTheme="majorBidi" w:cstheme="majorBidi"/>
+          <w:sz w:val="24"/>
+          <w:szCs w:val="24"/>
+        </w:rPr>
+        <w:t>here is also a challenge to m</w:t>
+      </w:r>
+      <w:r>
+        <w:rPr>
+          <w:rFonts w:asciiTheme="majorBidi" w:hAnsiTheme="majorBidi" w:cstheme="majorBidi"/>
+          <w:sz w:val="24"/>
+          <w:szCs w:val="24"/>
+        </w:rPr>
+        <w:t>otivate voluntary water conservation</w:t>
+      </w:r>
+      <w:r>
+        <w:rPr>
+          <w:rFonts w:asciiTheme="majorBidi" w:hAnsiTheme="majorBidi" w:cstheme="majorBidi"/>
+          <w:sz w:val="24"/>
+          <w:szCs w:val="24"/>
+        </w:rPr>
+        <w:t xml:space="preserve"> </w:t>
+      </w:r>
+      <w:r>
+        <w:rPr>
+          <w:rFonts w:asciiTheme="majorBidi" w:hAnsiTheme="majorBidi" w:cstheme="majorBidi"/>
+          <w:sz w:val="24"/>
+          <w:szCs w:val="24"/>
+        </w:rPr>
+        <w:t xml:space="preserve">because </w:t>
+      </w:r>
+      <w:r>
+        <w:rPr>
+          <w:rFonts w:asciiTheme="majorBidi" w:hAnsiTheme="majorBidi" w:cstheme="majorBidi"/>
+          <w:sz w:val="24"/>
+          <w:szCs w:val="24"/>
+        </w:rPr>
+        <w:t>users</w:t>
+      </w:r>
+      <w:r>
+        <w:rPr>
+          <w:rFonts w:asciiTheme="majorBidi" w:hAnsiTheme="majorBidi" w:cstheme="majorBidi"/>
+          <w:sz w:val="24"/>
+          <w:szCs w:val="24"/>
+        </w:rPr>
+        <w:t xml:space="preserve"> face increasing difficulty to access and debit their </w:t>
+      </w:r>
+      <w:r>
+        <w:rPr>
+          <w:rFonts w:asciiTheme="majorBidi" w:hAnsiTheme="majorBidi" w:cstheme="majorBidi"/>
+          <w:sz w:val="24"/>
+          <w:szCs w:val="24"/>
+        </w:rPr>
+        <w:t>conserved water</w:t>
+      </w:r>
+      <w:r>
+        <w:rPr>
+          <w:rFonts w:asciiTheme="majorBidi" w:hAnsiTheme="majorBidi" w:cstheme="majorBidi"/>
+          <w:sz w:val="24"/>
+          <w:szCs w:val="24"/>
+        </w:rPr>
+        <w:t>.</w:t>
+      </w:r>
+      <w:r>
+        <w:rPr>
+          <w:rFonts w:asciiTheme="majorBidi" w:hAnsiTheme="majorBidi" w:cstheme="majorBidi"/>
+          <w:sz w:val="24"/>
+          <w:szCs w:val="24"/>
+        </w:rPr>
+        <w:t xml:space="preserve"> </w:t>
+      </w:r>
+      <w:r>
+        <w:rPr>
+          <w:rFonts w:asciiTheme="majorBidi" w:hAnsiTheme="majorBidi" w:cstheme="majorBidi"/>
+          <w:sz w:val="24"/>
+          <w:szCs w:val="24"/>
+        </w:rPr>
+        <w:t xml:space="preserve">We describe two novel program improvements </w:t>
+      </w:r>
+      <w:r>
+        <w:rPr>
+          <w:rFonts w:asciiTheme="majorBidi" w:hAnsiTheme="majorBidi" w:cstheme="majorBidi"/>
+          <w:sz w:val="24"/>
+          <w:szCs w:val="24"/>
+        </w:rPr>
+        <w:t>that</w:t>
+      </w:r>
+      <w:r>
+        <w:rPr>
+          <w:rFonts w:asciiTheme="majorBidi" w:hAnsiTheme="majorBidi" w:cstheme="majorBidi"/>
+          <w:sz w:val="24"/>
+          <w:szCs w:val="24"/>
+        </w:rPr>
+        <w:t xml:space="preserve"> switch the </w:t>
+      </w:r>
+      <w:r>
+        <w:rPr>
+          <w:rFonts w:asciiTheme="majorBidi" w:hAnsiTheme="majorBidi" w:cstheme="majorBidi"/>
+          <w:sz w:val="24"/>
+          <w:szCs w:val="24"/>
+        </w:rPr>
+        <w:t xml:space="preserve">conservation </w:t>
+      </w:r>
+      <w:r>
+        <w:rPr>
+          <w:rFonts w:asciiTheme="majorBidi" w:hAnsiTheme="majorBidi" w:cstheme="majorBidi"/>
+          <w:sz w:val="24"/>
+          <w:szCs w:val="24"/>
+        </w:rPr>
+        <w:t xml:space="preserve">accounting from reductions from historical entitlements to reductions from the annual </w:t>
+      </w:r>
+      <w:r>
+        <w:rPr>
+          <w:rFonts w:asciiTheme="majorBidi" w:hAnsiTheme="majorBidi" w:cstheme="majorBidi"/>
+          <w:sz w:val="24"/>
+          <w:szCs w:val="24"/>
+        </w:rPr>
+        <w:t xml:space="preserve">physically </w:t>
+      </w:r>
+      <w:r>
+        <w:rPr>
+          <w:rFonts w:asciiTheme="majorBidi" w:hAnsiTheme="majorBidi" w:cstheme="majorBidi"/>
+          <w:sz w:val="24"/>
+          <w:szCs w:val="24"/>
+        </w:rPr>
+        <w:t>available water</w:t>
+      </w:r>
+      <w:r>
+        <w:rPr>
+          <w:rFonts w:asciiTheme="majorBidi" w:hAnsiTheme="majorBidi" w:cstheme="majorBidi"/>
+          <w:sz w:val="24"/>
+          <w:szCs w:val="24"/>
+        </w:rPr>
+        <w:t xml:space="preserve">. One strategy </w:t>
+      </w:r>
+      <w:r>
+        <w:rPr>
+          <w:rFonts w:asciiTheme="majorBidi" w:hAnsiTheme="majorBidi" w:cstheme="majorBidi"/>
+          <w:sz w:val="24"/>
+          <w:szCs w:val="24"/>
+        </w:rPr>
+        <w:t>proportionally reduces credits. A second strategy converts to water accounting. Both strategies have additional benefits such as ______________ . [[Final Sentence]].</w:t>
       </w:r>
     </w:p>
     <w:p>
       <w:pPr>
+        <w:pStyle w:val="Heading1"/>
+      </w:pPr>
+      <w:r>
+        <w:t>Data Availability</w:t>
+      </w:r>
+    </w:p>
+    <w:p>
+      <w:pPr>
         <w:rPr>
           <w:rFonts w:asciiTheme="majorBidi" w:hAnsiTheme="majorBidi" w:cstheme="majorBidi"/>
           <w:sz w:val="24"/>
@@ -17195,7 +17663,7 @@
         </w:rPr>
         <w:t xml:space="preserve">The data, models, and code used to generate tables and figures in this manuscript are available for download at </w:t>
       </w:r>
-      <w:hyperlink r:id="rId18" w:history="1">
+      <w:hyperlink r:id="rId19" w:history="1">
         <w:r>
           <w:rPr>
             <w:rStyle w:val="Hyperlink"/>
@@ -17217,36 +17685,237 @@
     </w:p>
     <w:p>
       <w:pPr>
-        <w:rPr>
-          <w:rFonts w:asciiTheme="majorBidi" w:hAnsiTheme="majorBidi" w:cstheme="majorBidi"/>
-          <w:sz w:val="24"/>
-          <w:szCs w:val="24"/>
-        </w:rPr>
-      </w:pPr>
+        <w:pStyle w:val="Heading1"/>
+      </w:pPr>
+      <w:r>
+        <w:t>Appendix A. Estimate Share</w:t>
+      </w:r>
+      <w:r>
+        <w:t>s</w:t>
+      </w:r>
+      <w:r>
+        <w:t xml:space="preserve"> of </w:t>
+      </w:r>
+      <w:r>
+        <w:t xml:space="preserve">Annual Lake Mead </w:t>
+      </w:r>
+      <w:r>
+        <w:t>Inflow</w:t>
+      </w:r>
+      <w:r>
+        <w:t xml:space="preserve"> from Prior Agreed Apportionment of Shortages</w:t>
+      </w:r>
+      <w:r>
+        <w:t>.</w:t>
+      </w:r>
     </w:p>
     <w:p>
       <w:pPr>
-        <w:pStyle w:val="Heading1"/>
-      </w:pPr>
-      <w:r>
-        <w:t>Appendix A. Estimate Share</w:t>
-      </w:r>
-      <w:r>
-        <w:t>s</w:t>
-      </w:r>
-      <w:r>
-        <w:t xml:space="preserve"> of </w:t>
-      </w:r>
-      <w:r>
-        <w:t xml:space="preserve">Annual Lake Mead </w:t>
-      </w:r>
-      <w:r>
-        <w:t>Inflow</w:t>
-      </w:r>
-      <w:r>
-        <w:t xml:space="preserve"> from Prior Agreed Apportionment of Shortages</w:t>
-      </w:r>
-      <w:r>
+        <w:rPr>
+          <w:rFonts w:asciiTheme="majorBidi" w:hAnsiTheme="majorBidi" w:cstheme="majorBidi"/>
+          <w:sz w:val="24"/>
+          <w:szCs w:val="24"/>
+        </w:rPr>
+      </w:pPr>
+      <w:r>
+        <w:rPr>
+          <w:rFonts w:asciiTheme="majorBidi" w:hAnsiTheme="majorBidi" w:cstheme="majorBidi"/>
+          <w:sz w:val="24"/>
+          <w:szCs w:val="24"/>
+        </w:rPr>
+        <w:t xml:space="preserve">This appendix </w:t>
+      </w:r>
+      <w:r>
+        <w:rPr>
+          <w:rFonts w:asciiTheme="majorBidi" w:hAnsiTheme="majorBidi" w:cstheme="majorBidi"/>
+          <w:sz w:val="24"/>
+          <w:szCs w:val="24"/>
+        </w:rPr>
+        <w:t>demonstrates a method to estimate</w:t>
+      </w:r>
+      <w:r>
+        <w:rPr>
+          <w:rFonts w:asciiTheme="majorBidi" w:hAnsiTheme="majorBidi" w:cstheme="majorBidi"/>
+          <w:sz w:val="24"/>
+          <w:szCs w:val="24"/>
+        </w:rPr>
+        <w:t xml:space="preserve"> Mexico’s and</w:t>
+      </w:r>
+      <w:r>
+        <w:rPr>
+          <w:rFonts w:asciiTheme="majorBidi" w:hAnsiTheme="majorBidi" w:cstheme="majorBidi"/>
+          <w:sz w:val="24"/>
+          <w:szCs w:val="24"/>
+        </w:rPr>
+        <w:t xml:space="preserve"> each Lower Basin </w:t>
+      </w:r>
+      <w:r>
+        <w:rPr>
+          <w:rFonts w:asciiTheme="majorBidi" w:hAnsiTheme="majorBidi" w:cstheme="majorBidi"/>
+          <w:sz w:val="24"/>
+          <w:szCs w:val="24"/>
+        </w:rPr>
+        <w:t>state</w:t>
+      </w:r>
+      <w:r>
+        <w:rPr>
+          <w:rFonts w:asciiTheme="majorBidi" w:hAnsiTheme="majorBidi" w:cstheme="majorBidi"/>
+          <w:sz w:val="24"/>
+          <w:szCs w:val="24"/>
+        </w:rPr>
+        <w:t xml:space="preserve">’s share of </w:t>
+      </w:r>
+      <w:r>
+        <w:rPr>
+          <w:rFonts w:asciiTheme="majorBidi" w:hAnsiTheme="majorBidi" w:cstheme="majorBidi"/>
+          <w:sz w:val="24"/>
+          <w:szCs w:val="24"/>
+        </w:rPr>
+        <w:t xml:space="preserve">the annual </w:t>
+      </w:r>
+      <w:r>
+        <w:rPr>
+          <w:rFonts w:asciiTheme="majorBidi" w:hAnsiTheme="majorBidi" w:cstheme="majorBidi"/>
+          <w:sz w:val="24"/>
+          <w:szCs w:val="24"/>
+        </w:rPr>
+        <w:t xml:space="preserve">Lake Mead </w:t>
+      </w:r>
+      <w:r>
+        <w:rPr>
+          <w:rFonts w:asciiTheme="majorBidi" w:hAnsiTheme="majorBidi" w:cstheme="majorBidi"/>
+          <w:sz w:val="24"/>
+          <w:szCs w:val="24"/>
+        </w:rPr>
+        <w:t>inflow</w:t>
+      </w:r>
+      <w:r>
+        <w:rPr>
+          <w:rFonts w:asciiTheme="majorBidi" w:hAnsiTheme="majorBidi" w:cstheme="majorBidi"/>
+          <w:sz w:val="24"/>
+          <w:szCs w:val="24"/>
+        </w:rPr>
+        <w:t xml:space="preserve"> from prior agreed upon apportionment of shortages</w:t>
+      </w:r>
+      <w:r>
+        <w:rPr>
+          <w:rFonts w:asciiTheme="majorBidi" w:hAnsiTheme="majorBidi" w:cstheme="majorBidi"/>
+          <w:sz w:val="24"/>
+          <w:szCs w:val="24"/>
+        </w:rPr>
+        <w:t xml:space="preserve">. </w:t>
+      </w:r>
+      <w:r>
+        <w:rPr>
+          <w:rFonts w:asciiTheme="majorBidi" w:hAnsiTheme="majorBidi" w:cstheme="majorBidi"/>
+          <w:sz w:val="24"/>
+          <w:szCs w:val="24"/>
+        </w:rPr>
+        <w:t xml:space="preserve">A </w:t>
+      </w:r>
+      <w:r>
+        <w:rPr>
+          <w:rFonts w:asciiTheme="majorBidi" w:hAnsiTheme="majorBidi" w:cstheme="majorBidi"/>
+          <w:sz w:val="24"/>
+          <w:szCs w:val="24"/>
+        </w:rPr>
+        <w:t xml:space="preserve">user’s </w:t>
+      </w:r>
+      <w:r>
+        <w:rPr>
+          <w:rFonts w:asciiTheme="majorBidi" w:hAnsiTheme="majorBidi" w:cstheme="majorBidi"/>
+          <w:sz w:val="24"/>
+          <w:szCs w:val="24"/>
+        </w:rPr>
+        <w:t>legal entitlement</w:t>
+      </w:r>
+      <w:r>
+        <w:rPr>
+          <w:rFonts w:asciiTheme="majorBidi" w:hAnsiTheme="majorBidi" w:cstheme="majorBidi"/>
+          <w:sz w:val="24"/>
+          <w:szCs w:val="24"/>
+        </w:rPr>
+        <w:t xml:space="preserve"> minus the</w:t>
+      </w:r>
+      <w:r>
+        <w:rPr>
+          <w:rFonts w:asciiTheme="majorBidi" w:hAnsiTheme="majorBidi" w:cstheme="majorBidi"/>
+          <w:sz w:val="24"/>
+          <w:szCs w:val="24"/>
+        </w:rPr>
+        <w:t>ir</w:t>
+      </w:r>
+      <w:r>
+        <w:rPr>
+          <w:rFonts w:asciiTheme="majorBidi" w:hAnsiTheme="majorBidi" w:cstheme="majorBidi"/>
+          <w:sz w:val="24"/>
+          <w:szCs w:val="24"/>
+        </w:rPr>
+        <w:t xml:space="preserve"> prior agreed-on water shortage volume</w:t>
+      </w:r>
+      <w:r>
+        <w:rPr>
+          <w:rFonts w:asciiTheme="majorBidi" w:hAnsiTheme="majorBidi" w:cstheme="majorBidi"/>
+          <w:sz w:val="24"/>
+          <w:szCs w:val="24"/>
+        </w:rPr>
+        <w:t xml:space="preserve"> </w:t>
+      </w:r>
+      <w:r>
+        <w:rPr>
+          <w:rFonts w:asciiTheme="majorBidi" w:hAnsiTheme="majorBidi" w:cstheme="majorBidi"/>
+          <w:sz w:val="24"/>
+          <w:szCs w:val="24"/>
+        </w:rPr>
+        <w:fldChar w:fldCharType="begin"/>
+      </w:r>
+      <w:r>
+        <w:rPr>
+          <w:rFonts w:asciiTheme="majorBidi" w:hAnsiTheme="majorBidi" w:cstheme="majorBidi"/>
+          <w:sz w:val="24"/>
+          <w:szCs w:val="24"/>
+        </w:rPr>
+        <w:instrText xml:space="preserve"> ADDIN EN.CITE &lt;EndNote&gt;&lt;Cite&gt;&lt;Author&gt;Buschatzke&lt;/Author&gt;&lt;Year&gt;2024&lt;/Year&gt;&lt;RecNum&gt;3016&lt;/RecNum&gt;&lt;Suffix&gt;`; Table A1&lt;/Suffix&gt;&lt;DisplayText&gt;(Buschatzke et al., 2024; Table A1)&lt;/DisplayText&gt;&lt;record&gt;&lt;rec-number&gt;3016&lt;/rec-number&gt;&lt;foreign-keys&gt;&lt;key app="EN" db-id="xxt5ta9pd995dwesap0pdzzp2weaz0w9werf" timestamp="1723671806"&gt;3016&lt;/key&gt;&lt;/foreign-keys&gt;&lt;ref-type name="Web Page"&gt;12&lt;/ref-type&gt;&lt;contributors&gt;&lt;authors&gt;&lt;author&gt;Thomas Buschatzke&lt;/author&gt;&lt;author&gt;J.B. Hamby&lt;/author&gt;&lt;author&gt;John Entsminger&lt;/author&gt;&lt;/authors&gt;&lt;/contributors&gt;&lt;titles&gt;&lt;title&gt;Lower Basin Alternative for the Post-2026 Coordinated Operation of the Colorado River Basin&lt;/title&gt;&lt;/titles&gt;&lt;volume&gt;2024&lt;/volume&gt;&lt;number&gt;August 14&lt;/number&gt;&lt;dates&gt;&lt;year&gt;2024&lt;/year&gt;&lt;/dates&gt;&lt;urls&gt;&lt;related-urls&gt;&lt;url&gt;https://www.snwa.com/assets/pdf/lower-basin-alternative-letter-march2024.pdf&lt;/url&gt;&lt;/related-urls&gt;&lt;/urls&gt;&lt;/record&gt;&lt;/Cite&gt;&lt;/EndNote&gt;</w:instrText>
+      </w:r>
+      <w:r>
+        <w:rPr>
+          <w:rFonts w:asciiTheme="majorBidi" w:hAnsiTheme="majorBidi" w:cstheme="majorBidi"/>
+          <w:sz w:val="24"/>
+          <w:szCs w:val="24"/>
+        </w:rPr>
+        <w:fldChar w:fldCharType="separate"/>
+      </w:r>
+      <w:r>
+        <w:rPr>
+          <w:rFonts w:asciiTheme="majorBidi" w:hAnsiTheme="majorBidi" w:cstheme="majorBidi"/>
+          <w:noProof/>
+          <w:sz w:val="24"/>
+          <w:szCs w:val="24"/>
+        </w:rPr>
+        <w:t>(Buschatzke et al., 2024; Table A1)</w:t>
+      </w:r>
+      <w:r>
+        <w:rPr>
+          <w:rFonts w:asciiTheme="majorBidi" w:hAnsiTheme="majorBidi" w:cstheme="majorBidi"/>
+          <w:sz w:val="24"/>
+          <w:szCs w:val="24"/>
+        </w:rPr>
+        <w:fldChar w:fldCharType="end"/>
+      </w:r>
+      <w:r>
+        <w:rPr>
+          <w:rFonts w:asciiTheme="majorBidi" w:hAnsiTheme="majorBidi" w:cstheme="majorBidi"/>
+          <w:sz w:val="24"/>
+          <w:szCs w:val="24"/>
+        </w:rPr>
+        <w:t xml:space="preserve"> becomes the share of reservoir inflow (Table A2)</w:t>
+      </w:r>
+      <w:r>
+        <w:rPr>
+          <w:rFonts w:asciiTheme="majorBidi" w:hAnsiTheme="majorBidi" w:cstheme="majorBidi"/>
+          <w:sz w:val="24"/>
+          <w:szCs w:val="24"/>
+        </w:rPr>
         <w:t>.</w:t>
       </w:r>
     </w:p>
@@ -17254,216 +17923,6 @@
       <w:pPr>
         <w:rPr>
           <w:rFonts w:asciiTheme="majorBidi" w:hAnsiTheme="majorBidi" w:cstheme="majorBidi"/>
-          <w:sz w:val="24"/>
-          <w:szCs w:val="24"/>
-        </w:rPr>
-      </w:pPr>
-      <w:r>
-        <w:rPr>
-          <w:rFonts w:asciiTheme="majorBidi" w:hAnsiTheme="majorBidi" w:cstheme="majorBidi"/>
-          <w:sz w:val="24"/>
-          <w:szCs w:val="24"/>
-        </w:rPr>
-        <w:t xml:space="preserve">This appendix </w:t>
-      </w:r>
-      <w:r>
-        <w:rPr>
-          <w:rFonts w:asciiTheme="majorBidi" w:hAnsiTheme="majorBidi" w:cstheme="majorBidi"/>
-          <w:sz w:val="24"/>
-          <w:szCs w:val="24"/>
-        </w:rPr>
-        <w:t>demonstrates a method to estimate</w:t>
-      </w:r>
-      <w:r>
-        <w:rPr>
-          <w:rFonts w:asciiTheme="majorBidi" w:hAnsiTheme="majorBidi" w:cstheme="majorBidi"/>
-          <w:sz w:val="24"/>
-          <w:szCs w:val="24"/>
-        </w:rPr>
-        <w:t xml:space="preserve"> Mexico’s and</w:t>
-      </w:r>
-      <w:r>
-        <w:rPr>
-          <w:rFonts w:asciiTheme="majorBidi" w:hAnsiTheme="majorBidi" w:cstheme="majorBidi"/>
-          <w:sz w:val="24"/>
-          <w:szCs w:val="24"/>
-        </w:rPr>
-        <w:t xml:space="preserve"> each Lower Basin </w:t>
-      </w:r>
-      <w:r>
-        <w:rPr>
-          <w:rFonts w:asciiTheme="majorBidi" w:hAnsiTheme="majorBidi" w:cstheme="majorBidi"/>
-          <w:sz w:val="24"/>
-          <w:szCs w:val="24"/>
-        </w:rPr>
-        <w:t>state</w:t>
-      </w:r>
-      <w:r>
-        <w:rPr>
-          <w:rFonts w:asciiTheme="majorBidi" w:hAnsiTheme="majorBidi" w:cstheme="majorBidi"/>
-          <w:sz w:val="24"/>
-          <w:szCs w:val="24"/>
-        </w:rPr>
-        <w:t xml:space="preserve">’s share of </w:t>
-      </w:r>
-      <w:r>
-        <w:rPr>
-          <w:rFonts w:asciiTheme="majorBidi" w:hAnsiTheme="majorBidi" w:cstheme="majorBidi"/>
-          <w:sz w:val="24"/>
-          <w:szCs w:val="24"/>
-        </w:rPr>
-        <w:t xml:space="preserve">the annual </w:t>
-      </w:r>
-      <w:r>
-        <w:rPr>
-          <w:rFonts w:asciiTheme="majorBidi" w:hAnsiTheme="majorBidi" w:cstheme="majorBidi"/>
-          <w:sz w:val="24"/>
-          <w:szCs w:val="24"/>
-        </w:rPr>
-        <w:t xml:space="preserve">Lake Mead </w:t>
-      </w:r>
-      <w:r>
-        <w:rPr>
-          <w:rFonts w:asciiTheme="majorBidi" w:hAnsiTheme="majorBidi" w:cstheme="majorBidi"/>
-          <w:sz w:val="24"/>
-          <w:szCs w:val="24"/>
-        </w:rPr>
-        <w:t>inflow</w:t>
-      </w:r>
-      <w:r>
-        <w:rPr>
-          <w:rFonts w:asciiTheme="majorBidi" w:hAnsiTheme="majorBidi" w:cstheme="majorBidi"/>
-          <w:sz w:val="24"/>
-          <w:szCs w:val="24"/>
-        </w:rPr>
-        <w:t xml:space="preserve"> from prior agreed upon apportionment of shortages</w:t>
-      </w:r>
-      <w:r>
-        <w:rPr>
-          <w:rFonts w:asciiTheme="majorBidi" w:hAnsiTheme="majorBidi" w:cstheme="majorBidi"/>
-          <w:sz w:val="24"/>
-          <w:szCs w:val="24"/>
-        </w:rPr>
-        <w:t xml:space="preserve">. </w:t>
-      </w:r>
-      <w:r>
-        <w:rPr>
-          <w:rFonts w:asciiTheme="majorBidi" w:hAnsiTheme="majorBidi" w:cstheme="majorBidi"/>
-          <w:sz w:val="24"/>
-          <w:szCs w:val="24"/>
-        </w:rPr>
-        <w:t xml:space="preserve">A </w:t>
-      </w:r>
-      <w:r>
-        <w:rPr>
-          <w:rFonts w:asciiTheme="majorBidi" w:hAnsiTheme="majorBidi" w:cstheme="majorBidi"/>
-          <w:sz w:val="24"/>
-          <w:szCs w:val="24"/>
-        </w:rPr>
-        <w:t xml:space="preserve">user’s </w:t>
-      </w:r>
-      <w:r>
-        <w:rPr>
-          <w:rFonts w:asciiTheme="majorBidi" w:hAnsiTheme="majorBidi" w:cstheme="majorBidi"/>
-          <w:sz w:val="24"/>
-          <w:szCs w:val="24"/>
-        </w:rPr>
-        <w:t>legal entitlement</w:t>
-      </w:r>
-      <w:r>
-        <w:rPr>
-          <w:rFonts w:asciiTheme="majorBidi" w:hAnsiTheme="majorBidi" w:cstheme="majorBidi"/>
-          <w:sz w:val="24"/>
-          <w:szCs w:val="24"/>
-        </w:rPr>
-        <w:t xml:space="preserve"> minus the</w:t>
-      </w:r>
-      <w:r>
-        <w:rPr>
-          <w:rFonts w:asciiTheme="majorBidi" w:hAnsiTheme="majorBidi" w:cstheme="majorBidi"/>
-          <w:sz w:val="24"/>
-          <w:szCs w:val="24"/>
-        </w:rPr>
-        <w:t>ir</w:t>
-      </w:r>
-      <w:r>
-        <w:rPr>
-          <w:rFonts w:asciiTheme="majorBidi" w:hAnsiTheme="majorBidi" w:cstheme="majorBidi"/>
-          <w:sz w:val="24"/>
-          <w:szCs w:val="24"/>
-        </w:rPr>
-        <w:t xml:space="preserve"> prior agreed-on water shortage volume</w:t>
-      </w:r>
-      <w:r>
-        <w:rPr>
-          <w:rFonts w:asciiTheme="majorBidi" w:hAnsiTheme="majorBidi" w:cstheme="majorBidi"/>
-          <w:sz w:val="24"/>
-          <w:szCs w:val="24"/>
-        </w:rPr>
-        <w:t xml:space="preserve"> </w:t>
-      </w:r>
-      <w:r>
-        <w:rPr>
-          <w:rFonts w:asciiTheme="majorBidi" w:hAnsiTheme="majorBidi" w:cstheme="majorBidi"/>
-          <w:sz w:val="24"/>
-          <w:szCs w:val="24"/>
-        </w:rPr>
-        <w:fldChar w:fldCharType="begin"/>
-      </w:r>
-      <w:r>
-        <w:rPr>
-          <w:rFonts w:asciiTheme="majorBidi" w:hAnsiTheme="majorBidi" w:cstheme="majorBidi"/>
-          <w:sz w:val="24"/>
-          <w:szCs w:val="24"/>
-        </w:rPr>
-        <w:instrText xml:space="preserve"> ADDIN EN.CITE &lt;EndNote&gt;&lt;Cite&gt;&lt;Author&gt;Buschatzke&lt;/Author&gt;&lt;Year&gt;2024&lt;/Year&gt;&lt;RecNum&gt;3016&lt;/RecNum&gt;&lt;Suffix&gt;`; Table A1&lt;/Suffix&gt;&lt;DisplayText&gt;(Buschatzke et al., 2024; Table A1)&lt;/DisplayText&gt;&lt;record&gt;&lt;rec-number&gt;3016&lt;/rec-number&gt;&lt;foreign-keys&gt;&lt;key app="EN" db-id="xxt5ta9pd995dwesap0pdzzp2weaz0w9werf" timestamp="1723671806"&gt;3016&lt;/key&gt;&lt;/foreign-keys&gt;&lt;ref-type name="Web Page"&gt;12&lt;/ref-type&gt;&lt;contributors&gt;&lt;authors&gt;&lt;author&gt;Thomas Buschatzke&lt;/author&gt;&lt;author&gt;J.B. Hamby&lt;/author&gt;&lt;author&gt;John Entsminger&lt;/author&gt;&lt;/authors&gt;&lt;/contributors&gt;&lt;titles&gt;&lt;title&gt;Lower Basin Alternative for the Post-2026 Coordinated Operation of the Colorado River Basin&lt;/title&gt;&lt;/titles&gt;&lt;volume&gt;2024&lt;/volume&gt;&lt;number&gt;August 14&lt;/number&gt;&lt;dates&gt;&lt;year&gt;2024&lt;/year&gt;&lt;/dates&gt;&lt;urls&gt;&lt;related-urls&gt;&lt;url&gt;https://www.snwa.com/assets/pdf/lower-basin-alternative-letter-march2024.pdf&lt;/url&gt;&lt;/related-urls&gt;&lt;/urls&gt;&lt;/record&gt;&lt;/Cite&gt;&lt;/EndNote&gt;</w:instrText>
-      </w:r>
-      <w:r>
-        <w:rPr>
-          <w:rFonts w:asciiTheme="majorBidi" w:hAnsiTheme="majorBidi" w:cstheme="majorBidi"/>
-          <w:sz w:val="24"/>
-          <w:szCs w:val="24"/>
-        </w:rPr>
-        <w:fldChar w:fldCharType="separate"/>
-      </w:r>
-      <w:r>
-        <w:rPr>
-          <w:rFonts w:asciiTheme="majorBidi" w:hAnsiTheme="majorBidi" w:cstheme="majorBidi"/>
-          <w:noProof/>
-          <w:sz w:val="24"/>
-          <w:szCs w:val="24"/>
-        </w:rPr>
-        <w:t>(Buschatzke et al., 2024; Table A1)</w:t>
-      </w:r>
-      <w:r>
-        <w:rPr>
-          <w:rFonts w:asciiTheme="majorBidi" w:hAnsiTheme="majorBidi" w:cstheme="majorBidi"/>
-          <w:sz w:val="24"/>
-          <w:szCs w:val="24"/>
-        </w:rPr>
-        <w:fldChar w:fldCharType="end"/>
-      </w:r>
-      <w:r>
-        <w:rPr>
-          <w:rFonts w:asciiTheme="majorBidi" w:hAnsiTheme="majorBidi" w:cstheme="majorBidi"/>
-          <w:sz w:val="24"/>
-          <w:szCs w:val="24"/>
-        </w:rPr>
-        <w:t xml:space="preserve"> becomes the share of reservoir inflow (Table A2)</w:t>
-      </w:r>
-      <w:r>
-        <w:rPr>
-          <w:rFonts w:asciiTheme="majorBidi" w:hAnsiTheme="majorBidi" w:cstheme="majorBidi"/>
-          <w:sz w:val="24"/>
-          <w:szCs w:val="24"/>
-        </w:rPr>
-        <w:t>.</w:t>
-      </w:r>
-    </w:p>
-    <w:p>
-      <w:pPr>
-        <w:rPr>
-          <w:rFonts w:asciiTheme="majorBidi" w:hAnsiTheme="majorBidi" w:cstheme="majorBidi"/>
           <w:b/>
           <w:bCs/>
           <w:sz w:val="24"/>
@@ -17478,6 +17937,7 @@
           <w:sz w:val="24"/>
           <w:szCs w:val="24"/>
         </w:rPr>
+        <w:lastRenderedPageBreak/>
         <w:t xml:space="preserve">Table A1. </w:t>
       </w:r>
       <w:r>
@@ -17612,7 +18072,7 @@
                     </pic:cNvPicPr>
                   </pic:nvPicPr>
                   <pic:blipFill>
-                    <a:blip r:embed="rId19">
+                    <a:blip r:embed="rId20">
                       <a:extLst>
                         <a:ext uri="{28A0092B-C50C-407E-A947-70E740481C1C}">
                           <a14:useLocalDpi xmlns:a14="http://schemas.microsoft.com/office/drawing/2010/main" val="0"/>
@@ -17673,7 +18133,6 @@
           <w:sz w:val="24"/>
           <w:szCs w:val="24"/>
         </w:rPr>
-        <w:lastRenderedPageBreak/>
         <w:t xml:space="preserve">Table A2. Share of </w:t>
       </w:r>
       <w:r>
@@ -17749,7 +18208,7 @@
                     </pic:cNvPicPr>
                   </pic:nvPicPr>
                   <pic:blipFill>
-                    <a:blip r:embed="rId20">
+                    <a:blip r:embed="rId21">
                       <a:extLst>
                         <a:ext uri="{28A0092B-C50C-407E-A947-70E740481C1C}">
                           <a14:useLocalDpi xmlns:a14="http://schemas.microsoft.com/office/drawing/2010/main" val="0"/>
@@ -18429,6 +18888,7 @@
           <w:sz w:val="24"/>
           <w:szCs w:val="24"/>
         </w:rPr>
+        <w:lastRenderedPageBreak/>
         <w:t xml:space="preserve">Mexico [F] = 1.5 </w:t>
       </w:r>
       <w:r>
@@ -18738,7 +19198,6 @@
         <w:pStyle w:val="Heading1"/>
       </w:pPr>
       <w:r>
-        <w:lastRenderedPageBreak/>
         <w:t>References</w:t>
       </w:r>
     </w:p>
@@ -18784,7 +19243,7 @@
       <w:r>
         <w:t xml:space="preserve">, 4(2), e1274. </w:t>
       </w:r>
-      <w:hyperlink r:id="rId21" w:history="1">
+      <w:hyperlink r:id="rId22" w:history="1">
         <w:r>
           <w:rPr>
             <w:rStyle w:val="Hyperlink"/>
@@ -18814,7 +19273,7 @@
       <w:r>
         <w:t xml:space="preserve">, November 8, 2021. </w:t>
       </w:r>
-      <w:hyperlink r:id="rId22" w:history="1">
+      <w:hyperlink r:id="rId23" w:history="1">
         <w:r>
           <w:rPr>
             <w:rStyle w:val="Hyperlink"/>
@@ -18835,7 +19294,7 @@
       <w:r>
         <w:t xml:space="preserve">Buschatzke, T., Hamby, J. B., and Entsminger, J. (2024). "Lower Basin Alternative for the Post-2026 Coordinated Operation of the Colorado River Basin." </w:t>
       </w:r>
-      <w:hyperlink r:id="rId23" w:history="1">
+      <w:hyperlink r:id="rId24" w:history="1">
         <w:r>
           <w:rPr>
             <w:rStyle w:val="Hyperlink"/>
@@ -18856,7 +19315,7 @@
       <w:r>
         <w:t xml:space="preserve">City of Phoenix. (2024). "Additional concepts for consideration - City of Phoenix." </w:t>
       </w:r>
-      <w:hyperlink r:id="rId24" w:history="1">
+      <w:hyperlink r:id="rId25" w:history="1">
         <w:r>
           <w:rPr>
             <w:rStyle w:val="Hyperlink"/>
@@ -18905,7 +19364,7 @@
       <w:r>
         <w:t xml:space="preserve">, 84(2), 242-261. </w:t>
       </w:r>
-      <w:hyperlink r:id="rId25" w:history="1">
+      <w:hyperlink r:id="rId26" w:history="1">
         <w:r>
           <w:rPr>
             <w:rStyle w:val="Hyperlink"/>
@@ -18935,7 +19394,7 @@
       <w:r>
         <w:t xml:space="preserve">, 90(4), 713-737. </w:t>
       </w:r>
-      <w:hyperlink r:id="rId26" w:history="1">
+      <w:hyperlink r:id="rId27" w:history="1">
         <w:r>
           <w:rPr>
             <w:rStyle w:val="Hyperlink"/>
@@ -18965,7 +19424,7 @@
       <w:r>
         <w:t xml:space="preserve">, 372(6545), 885-885. </w:t>
       </w:r>
-      <w:hyperlink r:id="rId27" w:history="1">
+      <w:hyperlink r:id="rId28" w:history="1">
         <w:r>
           <w:rPr>
             <w:rStyle w:val="Hyperlink"/>
@@ -19001,7 +19460,7 @@
         <w:spacing w:after="0"/>
         <w:ind w:left="720" w:hanging="720"/>
       </w:pPr>
-      <w:hyperlink r:id="rId28" w:history="1">
+      <w:hyperlink r:id="rId29" w:history="1">
         <w:r>
           <w:rPr>
             <w:rStyle w:val="Hyperlink"/>
@@ -19020,7 +19479,11 @@
         <w:ind w:left="720" w:hanging="720"/>
       </w:pPr>
       <w:r>
-        <w:t xml:space="preserve">Hecht, J. S., Vogel, R. M., McManamay, R. A., Kroll, C. N., and Reed, J. M. (2020). "Decision Trees for Incorporating Hypothesis Tests of Hydrologic Alteration into Hydropower&amp;#x2013;Ecosystem Tradeoffs." </w:t>
+        <w:t xml:space="preserve">Hecht, J. S., Vogel, R. M., McManamay, R. A., Kroll, C. N., and Reed, J. M. (2020). "Decision Trees for Incorporating Hypothesis Tests of Hydrologic Alteration into Hydropower&amp;#x2013;Ecosystem </w:t>
+      </w:r>
+      <w:r>
+        <w:lastRenderedPageBreak/>
+        <w:t xml:space="preserve">Tradeoffs." </w:t>
       </w:r>
       <w:r>
         <w:rPr>
@@ -19031,7 +19494,7 @@
       <w:r>
         <w:t xml:space="preserve">, 146(5), 04020017. </w:t>
       </w:r>
-      <w:hyperlink r:id="rId29" w:history="1">
+      <w:hyperlink r:id="rId30" w:history="1">
         <w:r>
           <w:rPr>
             <w:rStyle w:val="Hyperlink"/>
@@ -19061,7 +19524,7 @@
       <w:r>
         <w:t xml:space="preserve">. </w:t>
       </w:r>
-      <w:hyperlink r:id="rId30" w:history="1">
+      <w:hyperlink r:id="rId31" w:history="1">
         <w:r>
           <w:rPr>
             <w:rStyle w:val="Hyperlink"/>
@@ -19101,7 +19564,7 @@
       <w:r>
         <w:t xml:space="preserve">IBWC. (2021). "Minutes between the United States and Mexican Sections of the IBWC." United States Section, </w:t>
       </w:r>
-      <w:hyperlink r:id="rId31" w:history="1">
+      <w:hyperlink r:id="rId32" w:history="1">
         <w:r>
           <w:rPr>
             <w:rStyle w:val="Hyperlink"/>
@@ -19131,7 +19594,7 @@
       <w:r>
         <w:t xml:space="preserve">, 372(6540), 418-421. </w:t>
       </w:r>
-      <w:hyperlink r:id="rId32" w:history="1">
+      <w:hyperlink r:id="rId33" w:history="1">
         <w:r>
           <w:rPr>
             <w:rStyle w:val="Hyperlink"/>
@@ -19169,11 +19632,7 @@
         <w:ind w:left="720" w:hanging="720"/>
       </w:pPr>
       <w:r>
-        <w:t xml:space="preserve">Meehan, K., Jepson, W., Harris, L. M., Wutich, A., Beresford, M., Fencl, A., London, J., Pierce, G., Radonic, L., Wells, C., Wilson, N. J., Adams, E. A., Arsenault, R., Brewis, A., Harrington, V., Lambrinidou, Y., McGregor, D., Patrick, R., Pauli, B., Pearson, A. L., Shah, S., Splichalova, D., Workman, C., and </w:t>
-      </w:r>
-      <w:r>
-        <w:lastRenderedPageBreak/>
-        <w:t xml:space="preserve">Young, S. (2020). "Exposing the myths of household water insecurity in the global north: A critical review." </w:t>
+        <w:t xml:space="preserve">Meehan, K., Jepson, W., Harris, L. M., Wutich, A., Beresford, M., Fencl, A., London, J., Pierce, G., Radonic, L., Wells, C., Wilson, N. J., Adams, E. A., Arsenault, R., Brewis, A., Harrington, V., Lambrinidou, Y., McGregor, D., Patrick, R., Pauli, B., Pearson, A. L., Shah, S., Splichalova, D., Workman, C., and Young, S. (2020). "Exposing the myths of household water insecurity in the global north: A critical review." </w:t>
       </w:r>
       <w:r>
         <w:rPr>
@@ -19184,7 +19643,7 @@
       <w:r>
         <w:t xml:space="preserve">, 7(6), e1486. </w:t>
       </w:r>
-      <w:hyperlink r:id="rId33" w:history="1">
+      <w:hyperlink r:id="rId34" w:history="1">
         <w:r>
           <w:rPr>
             <w:rStyle w:val="Hyperlink"/>
@@ -19213,36 +19672,6 @@
       </w:r>
       <w:r>
         <w:t>, Joseph Henry Press, Washington, D.C.</w:t>
-      </w:r>
-    </w:p>
-    <w:p>
-      <w:pPr>
-        <w:pStyle w:val="EndNoteBibliography"/>
-        <w:spacing w:after="0"/>
-        <w:ind w:left="720" w:hanging="720"/>
-      </w:pPr>
-      <w:r>
-        <w:t xml:space="preserve">Myers, A., Rosenberg, D., Akbar, H., and Porse, E. (2025). "Immersive Model for Lake Mead Based on the Principle of Divide Reservoir Inflow." </w:t>
-      </w:r>
-      <w:r>
-        <w:rPr>
-          <w:i/>
-        </w:rPr>
-        <w:t>Hydroshare</w:t>
-      </w:r>
-      <w:r>
-        <w:t xml:space="preserve">. </w:t>
-      </w:r>
-      <w:hyperlink r:id="rId34" w:history="1">
-        <w:r>
-          <w:rPr>
-            <w:rStyle w:val="Hyperlink"/>
-          </w:rPr>
-          <w:t>http://www.hydroshare.org/resource/23bf9eb290ce4c6a8290c214e6b04da4</w:t>
-        </w:r>
-      </w:hyperlink>
-      <w:r>
-        <w:t>.</w:t>
       </w:r>
     </w:p>
     <w:p>
@@ -19319,19 +19748,7 @@
           <w:rPr>
             <w:rStyle w:val="Hyperlink"/>
           </w:rPr>
-          <w:t>https://heinonline.org/HOL/Page?handle=hein.journals/ucollr88&amp;id=</w:t>
-        </w:r>
-        <w:r>
-          <w:rPr>
-            <w:rStyle w:val="Hyperlink"/>
-          </w:rPr>
-          <w:t>5</w:t>
-        </w:r>
-        <w:r>
-          <w:rPr>
-            <w:rStyle w:val="Hyperlink"/>
-          </w:rPr>
-          <w:t>11&amp;collection=journals&amp;index</w:t>
+          <w:t>https://heinonline.org/HOL/Page?handle=hein.journals/ucollr88&amp;id=511&amp;collection=journals&amp;index</w:t>
         </w:r>
       </w:hyperlink>
       <w:r>
@@ -19456,7 +19873,11 @@
         <w:ind w:left="720" w:hanging="720"/>
       </w:pPr>
       <w:r>
-        <w:t xml:space="preserve">Salehabadi, H., Tarboton, D. G., Wheeler, K. G., Smith, R., and Baker, S. (2024). "Quantifying and Classifying Streamflow Ensembles Using a Broad Range of Metrics for an Evidence-Based Analysis: Colorado River Case Study." </w:t>
+        <w:t xml:space="preserve">Salehabadi, H., Tarboton, D. G., Wheeler, K. G., Smith, R., and Baker, S. (2024). "Quantifying and Classifying Streamflow Ensembles Using a Broad Range of Metrics for an Evidence-Based </w:t>
+      </w:r>
+      <w:r>
+        <w:lastRenderedPageBreak/>
+        <w:t xml:space="preserve">Analysis: Colorado River Case Study." </w:t>
       </w:r>
       <w:r>
         <w:rPr>
@@ -19576,7 +19997,6 @@
         <w:ind w:left="720" w:hanging="720"/>
       </w:pPr>
       <w:r>
-        <w:lastRenderedPageBreak/>
         <w:t xml:space="preserve">UCRC. (2018). "Colorado River System Conservation Pilot Program in the Upper Colorado River Basin." </w:t>
       </w:r>
       <w:r>
@@ -19850,6 +20270,7 @@
           <w:sz w:val="24"/>
           <w:szCs w:val="24"/>
         </w:rPr>
+        <w:lastRenderedPageBreak/>
         <w:fldChar w:fldCharType="end"/>
       </w:r>
     </w:p>
@@ -19951,40 +20372,6 @@
       </w:r>
     </w:p>
   </w:comment>
-  <w:comment w:id="14" w:author="Erik Christian Porse" w:date="2026-05-27T18:13:00Z" w:initials="EP">
-    <w:p>
-      <w:r>
-        <w:rPr>
-          <w:rStyle w:val="CommentReference"/>
-        </w:rPr>
-        <w:annotationRef/>
-      </w:r>
-      <w:r>
-        <w:rPr>
-          <w:sz w:val="20"/>
-          <w:szCs w:val="20"/>
-        </w:rPr>
-        <w:t xml:space="preserve">Suggest to frame these as innovations to the current policy and programs. </w:t>
-      </w:r>
-    </w:p>
-  </w:comment>
-  <w:comment w:id="15" w:author="Erik Christian Porse" w:date="2026-05-27T18:15:00Z" w:initials="EP">
-    <w:p>
-      <w:r>
-        <w:rPr>
-          <w:rStyle w:val="CommentReference"/>
-        </w:rPr>
-        <w:annotationRef/>
-      </w:r>
-      <w:r>
-        <w:rPr>
-          <w:sz w:val="20"/>
-          <w:szCs w:val="20"/>
-        </w:rPr>
-        <w:t xml:space="preserve">This list is a bit overwhelming. Could this be converted into a table with an example of how it benefits? </w:t>
-      </w:r>
-    </w:p>
-  </w:comment>
 </w:comments>
 </file>
 
@@ -19995,8 +20382,6 @@
   <w15:commentEx w15:paraId="3C4EF3BA" w15:done="0"/>
   <w15:commentEx w15:paraId="14A03515" w15:done="0"/>
   <w15:commentEx w15:paraId="1373997E" w15:done="0"/>
-  <w15:commentEx w15:paraId="091788BF" w15:done="0"/>
-  <w15:commentEx w15:paraId="04FECE45" w15:paraIdParent="091788BF" w15:done="0"/>
 </w15:commentsEx>
 </file>
 
@@ -20007,8 +20392,6 @@
   <w16cex:commentExtensible w16cex:durableId="0B3FF86F" w16cex:dateUtc="2026-05-28T00:53:00Z"/>
   <w16cex:commentExtensible w16cex:durableId="0769A5C1" w16cex:dateUtc="2026-05-27T22:54:00Z"/>
   <w16cex:commentExtensible w16cex:durableId="47362715" w16cex:dateUtc="2026-05-28T00:58:00Z"/>
-  <w16cex:commentExtensible w16cex:durableId="55B147C9" w16cex:dateUtc="2026-05-28T01:13:00Z"/>
-  <w16cex:commentExtensible w16cex:durableId="416F9609" w16cex:dateUtc="2026-05-28T01:15:00Z"/>
 </w16cex:commentsExtensible>
 </file>
 
@@ -20019,8 +20402,6 @@
   <w16cid:commentId w16cid:paraId="3C4EF3BA" w16cid:durableId="0B3FF86F"/>
   <w16cid:commentId w16cid:paraId="14A03515" w16cid:durableId="0769A5C1"/>
   <w16cid:commentId w16cid:paraId="1373997E" w16cid:durableId="47362715"/>
-  <w16cid:commentId w16cid:paraId="091788BF" w16cid:durableId="55B147C9"/>
-  <w16cid:commentId w16cid:paraId="04FECE45" w16cid:durableId="416F9609"/>
 </w16cid:commentsIds>
 </file>
 
@@ -24206,4 +24587,16 @@
     </a:ext>
   </a:extLst>
 </a:theme>
+</file>
+
+<file path=customXml/item1.xml><?xml version="1.0" encoding="utf-8"?>
+<b:Sources xmlns:b="http://schemas.openxmlformats.org/officeDocument/2006/bibliography" xmlns="http://schemas.openxmlformats.org/officeDocument/2006/bibliography" SelectedStyle="\APASixthEditionOfficeOnline.xsl" StyleName="APA" Version="6"/>
+</file>
+
+<file path=customXml/itemProps1.xml><?xml version="1.0" encoding="utf-8"?>
+<ds:datastoreItem xmlns:ds="http://schemas.openxmlformats.org/officeDocument/2006/customXml" ds:itemID="{7AFC1DB5-AFCB-4FC4-9BCF-8FBA98599B80}">
+  <ds:schemaRefs>
+    <ds:schemaRef ds:uri="http://schemas.openxmlformats.org/officeDocument/2006/bibliography"/>
+  </ds:schemaRefs>
+</ds:datastoreItem>
 </file>
</xml_diff>

<commit_message>
Add Anabelle results to Lake Mead Conservation analysis
</commit_message>
<xml_diff>
--- a/LakeMeadWaterConservationProgramAnalysis/LakeMeadWaterConservationProgramSuccessChallengesSuggestions_v3.docx
+++ b/LakeMeadWaterConservationProgramAnalysis/LakeMeadWaterConservationProgramSuccessChallengesSuggestions_v3.docx
@@ -376,23 +376,7 @@
           <w:sz w:val="24"/>
           <w:szCs w:val="24"/>
         </w:rPr>
-        <w:t>Phd student</w:t>
-      </w:r>
-      <w:r>
-        <w:rPr>
-          <w:rFonts w:asciiTheme="majorBidi" w:hAnsiTheme="majorBidi" w:cstheme="majorBidi"/>
-          <w:sz w:val="24"/>
-          <w:szCs w:val="24"/>
-        </w:rPr>
-        <w:t>, Department of Civil and Environmental Engineering and Utah Water Research Lab, Utah State University</w:t>
-      </w:r>
-      <w:r>
-        <w:rPr>
-          <w:rFonts w:asciiTheme="majorBidi" w:hAnsiTheme="majorBidi" w:cstheme="majorBidi"/>
-          <w:sz w:val="24"/>
-          <w:szCs w:val="24"/>
-        </w:rPr>
-        <w:t>, Logan, Utah</w:t>
+        <w:t>Phd student, Department of Civil and Environmental Engineering and Utah Water Research Lab, Utah State University, Logan, Utah</w:t>
       </w:r>
       <w:r>
         <w:rPr>
@@ -408,15 +392,7 @@
           <w:sz w:val="24"/>
           <w:szCs w:val="24"/>
         </w:rPr>
-        <w:t>.</w:t>
-      </w:r>
-      <w:r>
-        <w:rPr>
-          <w:rFonts w:asciiTheme="majorBidi" w:hAnsiTheme="majorBidi" w:cstheme="majorBidi"/>
-          <w:sz w:val="24"/>
-          <w:szCs w:val="24"/>
-        </w:rPr>
-        <w:t xml:space="preserve"> Email: </w:t>
+        <w:t xml:space="preserve">. Email: </w:t>
       </w:r>
       <w:hyperlink r:id="rId10" w:history="1">
         <w:r>
@@ -469,15 +445,7 @@
           <w:sz w:val="24"/>
           <w:szCs w:val="24"/>
         </w:rPr>
-        <w:t>A.M.ASCE.</w:t>
-      </w:r>
-      <w:r>
-        <w:rPr>
-          <w:rFonts w:asciiTheme="majorBidi" w:hAnsiTheme="majorBidi" w:cstheme="majorBidi"/>
-          <w:sz w:val="24"/>
-          <w:szCs w:val="24"/>
-        </w:rPr>
-        <w:t xml:space="preserve"> </w:t>
+        <w:t xml:space="preserve">A.M.ASCE. </w:t>
       </w:r>
       <w:r>
         <w:rPr>
@@ -504,15 +472,7 @@
           <w:sz w:val="24"/>
           <w:szCs w:val="24"/>
         </w:rPr>
-        <w:t>.</w:t>
-      </w:r>
-      <w:r>
-        <w:rPr>
-          <w:rFonts w:asciiTheme="majorBidi" w:hAnsiTheme="majorBidi" w:cstheme="majorBidi"/>
-          <w:sz w:val="24"/>
-          <w:szCs w:val="24"/>
-        </w:rPr>
-        <w:t xml:space="preserve"> </w:t>
+        <w:t xml:space="preserve">. </w:t>
       </w:r>
     </w:p>
     <w:p>
@@ -10241,7 +10201,7 @@
         </w:rPr>
         <w:lastRenderedPageBreak/>
         <w:drawing>
-          <wp:inline distT="0" distB="0" distL="0" distR="0" wp14:anchorId="1DF02D15" wp14:editId="080A10E4">
+          <wp:inline distT="0" distB="0" distL="0" distR="0" wp14:anchorId="1DF02D15" wp14:editId="59ED5480">
             <wp:extent cx="5845696" cy="3329343"/>
             <wp:effectExtent l="0" t="0" r="0" b="0"/>
             <wp:docPr id="708746801" name="Picture 2"/>
@@ -10796,15 +10756,7 @@
             <w:sz w:val="24"/>
             <w:szCs w:val="24"/>
           </w:rPr>
-          <m:t>=max</m:t>
-        </m:r>
-        <m:r>
-          <w:rPr>
-            <w:rFonts w:ascii="Cambria Math" w:hAnsi="Cambria Math" w:cstheme="majorBidi"/>
-            <w:sz w:val="24"/>
-            <w:szCs w:val="24"/>
-          </w:rPr>
-          <m:t>imum</m:t>
+          <m:t>=maximum</m:t>
         </m:r>
         <m:d>
           <m:dPr>
@@ -14240,382 +14192,205 @@
     </w:p>
     <w:p>
       <w:pPr>
-        <w:rPr>
-          <w:rFonts w:asciiTheme="majorBidi" w:hAnsiTheme="majorBidi" w:cstheme="majorBidi"/>
-          <w:sz w:val="24"/>
-          <w:szCs w:val="24"/>
-        </w:rPr>
-      </w:pPr>
-      <w:r>
-        <w:rPr>
-          <w:rFonts w:asciiTheme="majorBidi" w:hAnsiTheme="majorBidi" w:cstheme="majorBidi"/>
+        <w:pStyle w:val="NoSpacing"/>
+      </w:pPr>
+      <w:r>
+        <w:rPr>
           <w:b/>
           <w:bCs/>
-          <w:sz w:val="24"/>
-          <w:szCs w:val="24"/>
         </w:rPr>
         <w:t>Water Accounting</w:t>
       </w:r>
       <w:r>
         <w:rPr>
-          <w:rFonts w:asciiTheme="majorBidi" w:hAnsiTheme="majorBidi" w:cstheme="majorBidi"/>
           <w:b/>
           <w:bCs/>
-          <w:sz w:val="24"/>
-          <w:szCs w:val="24"/>
         </w:rPr>
         <w:t>.</w:t>
       </w:r>
       <w:r>
         <w:rPr>
-          <w:rFonts w:asciiTheme="majorBidi" w:hAnsiTheme="majorBidi" w:cstheme="majorBidi"/>
           <w:b/>
           <w:bCs/>
-          <w:sz w:val="24"/>
-          <w:szCs w:val="24"/>
         </w:rPr>
         <w:t xml:space="preserve"> </w:t>
       </w:r>
       <w:r>
-        <w:rPr>
-          <w:rFonts w:asciiTheme="majorBidi" w:hAnsiTheme="majorBidi" w:cstheme="majorBidi"/>
-          <w:sz w:val="24"/>
-          <w:szCs w:val="24"/>
-        </w:rPr>
-        <w:t xml:space="preserve">In this framework, </w:t>
-      </w:r>
-      <w:r>
-        <w:rPr>
-          <w:rFonts w:asciiTheme="majorBidi" w:hAnsiTheme="majorBidi" w:cstheme="majorBidi"/>
-          <w:sz w:val="24"/>
-          <w:szCs w:val="24"/>
-        </w:rPr>
-        <w:t>USBR set</w:t>
-      </w:r>
-      <w:r>
-        <w:rPr>
-          <w:rFonts w:asciiTheme="majorBidi" w:hAnsiTheme="majorBidi" w:cstheme="majorBidi"/>
-          <w:sz w:val="24"/>
-          <w:szCs w:val="24"/>
-        </w:rPr>
-        <w:t>s</w:t>
-      </w:r>
-      <w:r>
-        <w:rPr>
-          <w:rFonts w:asciiTheme="majorBidi" w:hAnsiTheme="majorBidi" w:cstheme="majorBidi"/>
-          <w:sz w:val="24"/>
-          <w:szCs w:val="24"/>
-        </w:rPr>
-        <w:t xml:space="preserve"> the protection volume </w:t>
-      </w:r>
-      <w:r>
-        <w:rPr>
-          <w:rFonts w:asciiTheme="majorBidi" w:hAnsiTheme="majorBidi" w:cstheme="majorBidi"/>
-          <w:sz w:val="24"/>
-          <w:szCs w:val="24"/>
-        </w:rPr>
-        <w:t xml:space="preserve">in Lake Mead </w:t>
-      </w:r>
-      <w:r>
-        <w:rPr>
-          <w:rFonts w:asciiTheme="majorBidi" w:hAnsiTheme="majorBidi" w:cstheme="majorBidi"/>
-          <w:sz w:val="24"/>
-          <w:szCs w:val="24"/>
-        </w:rPr>
-        <w:t>in the year the new water accounting framework starts</w:t>
-      </w:r>
-      <w:r>
-        <w:rPr>
-          <w:rFonts w:asciiTheme="majorBidi" w:hAnsiTheme="majorBidi" w:cstheme="majorBidi"/>
-          <w:sz w:val="24"/>
-          <w:szCs w:val="24"/>
-        </w:rPr>
+        <w:t xml:space="preserve">In this </w:t>
+      </w:r>
+      <w:r>
+        <w:t>framework</w:t>
+      </w:r>
+      <w:r>
+        <w:t>,</w:t>
+      </w:r>
+      <w:r>
+        <w:t xml:space="preserve"> </w:t>
+      </w:r>
+      <w:r>
+        <w:t>the Lake Mead elevation and corresponding storage volume are defined for a protection</w:t>
+      </w:r>
+      <w:r>
+        <w:t xml:space="preserve"> </w:t>
+      </w:r>
+      <w:r>
+        <w:t>account—to be managed by Reclamation</w:t>
+      </w:r>
+      <w:r>
         <w:t xml:space="preserve"> (</w:t>
       </w:r>
       <w:r>
         <w:rPr>
-          <w:rFonts w:asciiTheme="majorBidi" w:hAnsiTheme="majorBidi" w:cstheme="majorBidi"/>
           <w:i/>
           <w:iCs/>
-          <w:sz w:val="24"/>
-          <w:szCs w:val="24"/>
         </w:rPr>
         <w:t>PV</w:t>
       </w:r>
       <w:r>
         <w:rPr>
-          <w:rFonts w:asciiTheme="majorBidi" w:hAnsiTheme="majorBidi" w:cstheme="majorBidi"/>
           <w:i/>
           <w:iCs/>
-          <w:sz w:val="24"/>
-          <w:szCs w:val="24"/>
           <w:vertAlign w:val="subscript"/>
         </w:rPr>
         <w:t>0</w:t>
       </w:r>
       <w:r>
-        <w:rPr>
-          <w:rFonts w:asciiTheme="majorBidi" w:hAnsiTheme="majorBidi" w:cstheme="majorBidi"/>
-          <w:sz w:val="24"/>
-          <w:szCs w:val="24"/>
-        </w:rPr>
-        <w:t xml:space="preserve"> [million acre-feet</w:t>
-      </w:r>
-      <w:r>
-        <w:rPr>
-          <w:rFonts w:asciiTheme="majorBidi" w:hAnsiTheme="majorBidi" w:cstheme="majorBidi"/>
-          <w:sz w:val="24"/>
-          <w:szCs w:val="24"/>
-        </w:rPr>
-        <w:t>])</w:t>
-      </w:r>
-      <w:r>
-        <w:rPr>
-          <w:rFonts w:asciiTheme="majorBidi" w:hAnsiTheme="majorBidi" w:cstheme="majorBidi"/>
-          <w:sz w:val="24"/>
-          <w:szCs w:val="24"/>
-        </w:rPr>
-        <w:t xml:space="preserve">. This volume defines </w:t>
-      </w:r>
-      <w:r>
-        <w:rPr>
-          <w:rFonts w:asciiTheme="majorBidi" w:hAnsiTheme="majorBidi" w:cstheme="majorBidi"/>
-          <w:sz w:val="24"/>
-          <w:szCs w:val="24"/>
-        </w:rPr>
-        <w:t xml:space="preserve">a </w:t>
-      </w:r>
-      <w:r>
-        <w:rPr>
-          <w:rFonts w:asciiTheme="majorBidi" w:hAnsiTheme="majorBidi" w:cstheme="majorBidi"/>
-          <w:sz w:val="24"/>
-          <w:szCs w:val="24"/>
-        </w:rPr>
-        <w:t>USBR</w:t>
-      </w:r>
-      <w:r>
-        <w:rPr>
-          <w:rFonts w:asciiTheme="majorBidi" w:hAnsiTheme="majorBidi" w:cstheme="majorBidi"/>
-          <w:sz w:val="24"/>
-          <w:szCs w:val="24"/>
-        </w:rPr>
-        <w:t xml:space="preserve"> water account balance. Then i</w:t>
-      </w:r>
-      <w:r>
-        <w:rPr>
-          <w:rFonts w:asciiTheme="majorBidi" w:hAnsiTheme="majorBidi" w:cstheme="majorBidi"/>
-          <w:sz w:val="24"/>
-          <w:szCs w:val="24"/>
-        </w:rPr>
-        <w:t xml:space="preserve">n each </w:t>
-      </w:r>
-      <w:r>
-        <w:rPr>
-          <w:rFonts w:asciiTheme="majorBidi" w:hAnsiTheme="majorBidi" w:cstheme="majorBidi"/>
-          <w:sz w:val="24"/>
-          <w:szCs w:val="24"/>
-        </w:rPr>
-        <w:t>year</w:t>
-      </w:r>
-      <w:r>
-        <w:rPr>
-          <w:rFonts w:asciiTheme="majorBidi" w:hAnsiTheme="majorBidi" w:cstheme="majorBidi"/>
-          <w:sz w:val="24"/>
-          <w:szCs w:val="24"/>
-        </w:rPr>
+        <w:t xml:space="preserve"> [million acre-feet])</w:t>
+      </w:r>
+      <w:r>
+        <w:t xml:space="preserve">. </w:t>
+      </w:r>
+      <w:r>
+        <w:t>In e</w:t>
+      </w:r>
+      <w:r>
+        <w:t>ach year</w:t>
+      </w:r>
+      <w:r>
         <w:t xml:space="preserve"> </w:t>
       </w:r>
       <w:r>
         <w:rPr>
-          <w:rFonts w:asciiTheme="majorBidi" w:hAnsiTheme="majorBidi" w:cstheme="majorBidi"/>
           <w:i/>
           <w:iCs/>
-          <w:sz w:val="24"/>
-          <w:szCs w:val="24"/>
         </w:rPr>
         <w:t>t</w:t>
       </w:r>
       <w:r>
-        <w:rPr>
-          <w:rFonts w:asciiTheme="majorBidi" w:hAnsiTheme="majorBidi" w:cstheme="majorBidi"/>
-          <w:sz w:val="24"/>
-          <w:szCs w:val="24"/>
-        </w:rPr>
-        <w:t xml:space="preserve">, </w:t>
-      </w:r>
-      <w:r>
-        <w:rPr>
-          <w:rFonts w:asciiTheme="majorBidi" w:hAnsiTheme="majorBidi" w:cstheme="majorBidi"/>
-          <w:sz w:val="24"/>
-          <w:szCs w:val="24"/>
-        </w:rPr>
-        <w:t xml:space="preserve">the </w:t>
-      </w:r>
-      <w:r>
-        <w:rPr>
-          <w:rFonts w:asciiTheme="majorBidi" w:hAnsiTheme="majorBidi" w:cstheme="majorBidi"/>
-          <w:sz w:val="24"/>
-          <w:szCs w:val="24"/>
-        </w:rPr>
-        <w:t>USBR</w:t>
-      </w:r>
-      <w:r>
-        <w:rPr>
-          <w:rFonts w:asciiTheme="majorBidi" w:hAnsiTheme="majorBidi" w:cstheme="majorBidi"/>
-          <w:sz w:val="24"/>
-          <w:szCs w:val="24"/>
-        </w:rPr>
-        <w:t xml:space="preserve"> water account takes a</w:t>
-      </w:r>
-      <w:r>
-        <w:rPr>
-          <w:rFonts w:asciiTheme="majorBidi" w:hAnsiTheme="majorBidi" w:cstheme="majorBidi"/>
-          <w:sz w:val="24"/>
-          <w:szCs w:val="24"/>
-        </w:rPr>
-        <w:t xml:space="preserve"> first</w:t>
-      </w:r>
-      <w:r>
-        <w:rPr>
-          <w:rFonts w:asciiTheme="majorBidi" w:hAnsiTheme="majorBidi" w:cstheme="majorBidi"/>
-          <w:sz w:val="24"/>
-          <w:szCs w:val="24"/>
-        </w:rPr>
-        <w:t xml:space="preserve"> share of the Lake Mead </w:t>
-      </w:r>
-      <w:r>
-        <w:rPr>
-          <w:rFonts w:asciiTheme="majorBidi" w:hAnsiTheme="majorBidi" w:cstheme="majorBidi"/>
-          <w:sz w:val="24"/>
-          <w:szCs w:val="24"/>
-        </w:rPr>
-        <w:t>inflow (</w:t>
-      </w:r>
-      <w:r>
-        <w:rPr>
-          <w:rFonts w:asciiTheme="majorBidi" w:hAnsiTheme="majorBidi" w:cstheme="majorBidi"/>
+        <w:t>, the protection account is allocated a</w:t>
+      </w:r>
+      <w:r>
+        <w:t xml:space="preserve"> </w:t>
+      </w:r>
+      <w:r>
+        <w:t>first share of the Lake Mead inflow to offset the annual Lake Mead</w:t>
+      </w:r>
+      <w:r>
+        <w:t xml:space="preserve"> </w:t>
+      </w:r>
+      <w:r>
+        <w:t>evaporation</w:t>
+      </w:r>
+      <w:r>
+        <w:t xml:space="preserve"> (Eq. 6)</w:t>
+      </w:r>
+      <w:r>
+        <w:t>.</w:t>
+      </w:r>
+      <w:r>
+        <w:t xml:space="preserve"> </w:t>
+      </w:r>
+      <w:r>
+        <w:t>The remaining reservoir inflow is divided among the water users. Each user</w:t>
+      </w:r>
+      <w:r>
+        <w:t xml:space="preserve"> </w:t>
+      </w:r>
+      <w:r>
+        <w:rPr>
           <w:i/>
           <w:iCs/>
-          <w:sz w:val="24"/>
-          <w:szCs w:val="24"/>
-        </w:rPr>
-        <w:t>USBR Share of Inflow</w:t>
-      </w:r>
-      <w:r>
-        <w:rPr>
-          <w:rFonts w:asciiTheme="majorBidi" w:hAnsiTheme="majorBidi" w:cstheme="majorBidi"/>
+        </w:rPr>
+        <w:t xml:space="preserve">i </w:t>
+      </w:r>
+      <w:r>
+        <w:t>can consume water within their account balance</w:t>
+      </w:r>
+      <w:r>
+        <w:t xml:space="preserve"> (</w:t>
+      </w:r>
+      <w:r>
+        <w:rPr>
           <w:i/>
           <w:iCs/>
-          <w:sz w:val="24"/>
-          <w:szCs w:val="24"/>
+        </w:rPr>
+        <w:t>B</w:t>
+      </w:r>
+      <w:r>
+        <w:rPr>
+          <w:i/>
+          <w:iCs/>
           <w:vertAlign w:val="subscript"/>
         </w:rPr>
+        <w:t>i,t</w:t>
+      </w:r>
+      <w:r>
+        <w:t xml:space="preserve"> </w:t>
+      </w:r>
+      <w:r>
+        <w:t>[million acre-feet]; Eq 7).</w:t>
+      </w:r>
+      <w:r>
+        <w:t xml:space="preserve"> Users carry over any positive end-of-year account balances to the next year.</w:t>
+      </w:r>
+      <w:r>
+        <w:t xml:space="preserve"> </w:t>
+      </w:r>
+      <w:r>
+        <w:t xml:space="preserve"> The </w:t>
+      </w:r>
+      <w:r>
+        <w:t xml:space="preserve">Lake Mead storage volume in year </w:t>
+      </w:r>
+      <w:r>
+        <w:rPr>
+          <w:i/>
+          <w:iCs/>
+        </w:rPr>
+        <w:t xml:space="preserve">t </w:t>
+      </w:r>
+      <w:r>
+        <w:t>(</w:t>
+      </w:r>
+      <w:r>
+        <w:rPr>
+          <w:i/>
+          <w:iCs/>
+        </w:rPr>
+        <w:t>V</w:t>
+      </w:r>
+      <w:r>
+        <w:rPr>
+          <w:i/>
+          <w:iCs/>
+          <w:vertAlign w:val="subscript"/>
+        </w:rPr>
         <w:t>t</w:t>
       </w:r>
       <w:r>
-        <w:rPr>
-          <w:rFonts w:asciiTheme="majorBidi" w:hAnsiTheme="majorBidi" w:cstheme="majorBidi"/>
-          <w:sz w:val="24"/>
-          <w:szCs w:val="24"/>
-          <w:vertAlign w:val="subscript"/>
-        </w:rPr>
         <w:t xml:space="preserve"> </w:t>
       </w:r>
       <w:r>
-        <w:rPr>
-          <w:rFonts w:asciiTheme="majorBidi" w:hAnsiTheme="majorBidi" w:cstheme="majorBidi"/>
-          <w:sz w:val="24"/>
-          <w:szCs w:val="24"/>
-        </w:rPr>
-        <w:t>[million acre-feet per year])</w:t>
-      </w:r>
-      <w:r>
-        <w:rPr>
-          <w:rFonts w:asciiTheme="majorBidi" w:hAnsiTheme="majorBidi" w:cstheme="majorBidi"/>
-          <w:sz w:val="24"/>
-          <w:szCs w:val="24"/>
-        </w:rPr>
-        <w:t xml:space="preserve"> equal to the annual reservoir evaporation</w:t>
-      </w:r>
-      <w:r>
-        <w:rPr>
-          <w:rFonts w:asciiTheme="majorBidi" w:hAnsiTheme="majorBidi" w:cstheme="majorBidi"/>
-          <w:sz w:val="24"/>
-          <w:szCs w:val="24"/>
-        </w:rPr>
-        <w:t xml:space="preserve">. This action </w:t>
-      </w:r>
-      <w:r>
-        <w:rPr>
-          <w:rFonts w:asciiTheme="majorBidi" w:hAnsiTheme="majorBidi" w:cstheme="majorBidi"/>
-          <w:sz w:val="24"/>
-          <w:szCs w:val="24"/>
-        </w:rPr>
-        <w:t>sustain</w:t>
-      </w:r>
-      <w:r>
-        <w:rPr>
-          <w:rFonts w:asciiTheme="majorBidi" w:hAnsiTheme="majorBidi" w:cstheme="majorBidi"/>
-          <w:sz w:val="24"/>
-          <w:szCs w:val="24"/>
-        </w:rPr>
-        <w:t>s</w:t>
-      </w:r>
-      <w:r>
-        <w:rPr>
-          <w:rFonts w:asciiTheme="majorBidi" w:hAnsiTheme="majorBidi" w:cstheme="majorBidi"/>
-          <w:sz w:val="24"/>
-          <w:szCs w:val="24"/>
-        </w:rPr>
-        <w:t xml:space="preserve"> the</w:t>
-      </w:r>
-      <w:r>
-        <w:rPr>
-          <w:rFonts w:asciiTheme="majorBidi" w:hAnsiTheme="majorBidi" w:cstheme="majorBidi"/>
-          <w:sz w:val="24"/>
-          <w:szCs w:val="24"/>
-        </w:rPr>
-        <w:t xml:space="preserve"> protection</w:t>
-      </w:r>
-      <w:r>
-        <w:rPr>
-          <w:rFonts w:asciiTheme="majorBidi" w:hAnsiTheme="majorBidi" w:cstheme="majorBidi"/>
-          <w:sz w:val="24"/>
-          <w:szCs w:val="24"/>
-        </w:rPr>
+        <w:t>[million acre-feet]</w:t>
+      </w:r>
+      <w:r>
+        <w:t xml:space="preserve">) </w:t>
+      </w:r>
+      <w:r>
+        <w:t>is the sum of the Lake Mead protection account and the other user’s water account balances (Eq 8).</w:t>
+      </w:r>
+      <w:r>
         <w:t xml:space="preserve"> </w:t>
-      </w:r>
-      <w:r>
-        <w:rPr>
-          <w:rFonts w:asciiTheme="majorBidi" w:hAnsiTheme="majorBidi" w:cstheme="majorBidi"/>
-          <w:sz w:val="24"/>
-          <w:szCs w:val="24"/>
-        </w:rPr>
-        <w:t>account balance</w:t>
-      </w:r>
-      <w:r>
-        <w:rPr>
-          <w:rFonts w:asciiTheme="majorBidi" w:hAnsiTheme="majorBidi" w:cstheme="majorBidi"/>
-          <w:sz w:val="24"/>
-          <w:szCs w:val="24"/>
-        </w:rPr>
-        <w:t xml:space="preserve"> over time</w:t>
-      </w:r>
-      <w:r>
-        <w:rPr>
-          <w:rFonts w:asciiTheme="majorBidi" w:hAnsiTheme="majorBidi" w:cstheme="majorBidi"/>
-          <w:sz w:val="24"/>
-          <w:szCs w:val="24"/>
-        </w:rPr>
-        <w:t xml:space="preserve"> (Eq 6)</w:t>
-      </w:r>
-      <w:r>
-        <w:rPr>
-          <w:rFonts w:asciiTheme="majorBidi" w:hAnsiTheme="majorBidi" w:cstheme="majorBidi"/>
-          <w:sz w:val="24"/>
-          <w:szCs w:val="24"/>
-        </w:rPr>
-        <w:t xml:space="preserve">. </w:t>
       </w:r>
     </w:p>
     <w:p>
@@ -14772,6 +14547,14 @@
             </m:r>
           </m:sub>
         </m:sSub>
+        <m:r>
+          <w:rPr>
+            <w:rFonts w:ascii="Cambria Math" w:hAnsi="Cambria Math" w:cstheme="majorBidi"/>
+            <w:sz w:val="24"/>
+            <w:szCs w:val="24"/>
+          </w:rPr>
+          <m:t xml:space="preserve">, </m:t>
+        </m:r>
       </m:oMath>
       <w:r>
         <w:rPr>
@@ -14779,390 +14562,25 @@
           <w:sz w:val="24"/>
           <w:szCs w:val="24"/>
         </w:rPr>
-        <w:t xml:space="preserve">  [Eq. </w:t>
-      </w:r>
+        <w:t xml:space="preserve"> </w:t>
+      </w:r>
+      <m:oMath>
+        <m:r>
+          <w:rPr>
+            <w:rFonts w:ascii="Cambria Math" w:hAnsi="Cambria Math" w:cstheme="majorBidi"/>
+            <w:sz w:val="24"/>
+            <w:szCs w:val="24"/>
+          </w:rPr>
+          <m:t>∀t</m:t>
+        </m:r>
+      </m:oMath>
       <w:r>
         <w:rPr>
           <w:rFonts w:asciiTheme="majorBidi" w:eastAsiaTheme="minorEastAsia" w:hAnsiTheme="majorBidi" w:cstheme="majorBidi"/>
           <w:sz w:val="24"/>
           <w:szCs w:val="24"/>
         </w:rPr>
-        <w:t>6</w:t>
-      </w:r>
-      <w:r>
-        <w:rPr>
-          <w:rFonts w:asciiTheme="majorBidi" w:eastAsiaTheme="minorEastAsia" w:hAnsiTheme="majorBidi" w:cstheme="majorBidi"/>
-          <w:sz w:val="24"/>
-          <w:szCs w:val="24"/>
-        </w:rPr>
-        <w:t>]</w:t>
-      </w:r>
-    </w:p>
-    <w:p>
-      <w:pPr>
-        <w:rPr>
-          <w:rFonts w:asciiTheme="majorBidi" w:hAnsiTheme="majorBidi" w:cstheme="majorBidi"/>
-          <w:sz w:val="24"/>
-          <w:szCs w:val="24"/>
-        </w:rPr>
-      </w:pPr>
-      <w:r>
-        <w:rPr>
-          <w:rFonts w:asciiTheme="majorBidi" w:hAnsiTheme="majorBidi" w:cstheme="majorBidi"/>
-          <w:sz w:val="24"/>
-          <w:szCs w:val="24"/>
-        </w:rPr>
-        <w:t>The annual Lake Mead inflow is typically known at the beginning of the year because the annual Lake Powell release—that is set in Fall of each year—</w:t>
-      </w:r>
-      <w:r>
-        <w:rPr>
-          <w:rFonts w:asciiTheme="majorBidi" w:hAnsiTheme="majorBidi" w:cstheme="majorBidi"/>
-          <w:sz w:val="24"/>
-          <w:szCs w:val="24"/>
-        </w:rPr>
-        <w:t xml:space="preserve">often is 85 to 91% of Mead inflow </w:t>
-      </w:r>
-      <w:r>
-        <w:rPr>
-          <w:rFonts w:asciiTheme="majorBidi" w:hAnsiTheme="majorBidi" w:cstheme="majorBidi"/>
-          <w:sz w:val="24"/>
-          <w:szCs w:val="24"/>
-        </w:rPr>
-        <w:fldChar w:fldCharType="begin"/>
-      </w:r>
-      <w:r>
-        <w:rPr>
-          <w:rFonts w:asciiTheme="majorBidi" w:hAnsiTheme="majorBidi" w:cstheme="majorBidi"/>
-          <w:sz w:val="24"/>
-          <w:szCs w:val="24"/>
-        </w:rPr>
-        <w:instrText xml:space="preserve"> ADDIN EN.CITE &lt;EndNote&gt;&lt;Cite&gt;&lt;Author&gt;Rosenberg&lt;/Author&gt;&lt;Year&gt;2022&lt;/Year&gt;&lt;RecNum&gt;2903&lt;/RecNum&gt;&lt;DisplayText&gt;(Rosenberg, 2022; Wang and Schmidt, 2020)&lt;/DisplayText&gt;&lt;record&gt;&lt;rec-number&gt;2903&lt;/rec-number&gt;&lt;foreign-keys&gt;&lt;key app="EN" db-id="xxt5ta9pd995dwesap0pdzzp2weaz0w9werf" timestamp="1663608602"&gt;2903&lt;/key&gt;&lt;/foreign-keys&gt;&lt;ref-type name="Journal Article"&gt;17&lt;/ref-type&gt;&lt;contributors&gt;&lt;authors&gt;&lt;author&gt;David E. Rosenberg&lt;/author&gt;&lt;/authors&gt;&lt;/contributors&gt;&lt;titles&gt;&lt;title&gt;Adapt Lake Mead Releases to Inflow to Give Managers More Flexibility to Slow Reservoir Drawdown&lt;/title&gt;&lt;secondary-title&gt;Journal of Water Resources Planning and Management&lt;/secondary-title&gt;&lt;/titles&gt;&lt;periodical&gt;&lt;full-title&gt;Journal of Water Resources Planning and Management&lt;/full-title&gt;&lt;/periodical&gt;&lt;pages&gt;02522006&lt;/pages&gt;&lt;volume&gt;148&lt;/volume&gt;&lt;number&gt;10&lt;/number&gt;&lt;dates&gt;&lt;year&gt;2022&lt;/year&gt;&lt;/dates&gt;&lt;urls&gt;&lt;related-urls&gt;&lt;url&gt;https://ascelibrary.org/doi/abs/10.1061/%28ASCE%29WR.1943-5452.0001592. Free version: https://digitalcommons.usu.edu/water_pubs/170/.&lt;/url&gt;&lt;/related-urls&gt;&lt;/urls&gt;&lt;electronic-resource-num&gt;https://doi.org/10.1061/(ASCE)WR.1943-5452.0001592&lt;/electronic-resource-num&gt;&lt;/record&gt;&lt;/Cite&gt;&lt;Cite&gt;&lt;Author&gt;Wang&lt;/Author&gt;&lt;Year&gt;2020&lt;/Year&gt;&lt;RecNum&gt;2782&lt;/RecNum&gt;&lt;record&gt;&lt;rec-number&gt;2782&lt;/rec-number&gt;&lt;foreign-keys&gt;&lt;key app="EN" db-id="xxt5ta9pd995dwesap0pdzzp2weaz0w9werf" timestamp="1620768668"&gt;2782&lt;/key&gt;&lt;/foreign-keys&gt;&lt;ref-type name="Report"&gt;27&lt;/ref-type&gt;&lt;contributors&gt;&lt;authors&gt;&lt;author&gt;Jian Wang&lt;/author&gt;&lt;author&gt;John C. Schmidt&lt;/author&gt;&lt;/authors&gt;&lt;/contributors&gt;&lt;titles&gt;&lt;title&gt;Stream flow and Losses of the Colorado River in the Southern Colorado Plateau&lt;/title&gt;&lt;/titles&gt;&lt;pages&gt;30&lt;/pages&gt;&lt;number&gt;White Paper #5&lt;/number&gt;&lt;dates&gt;&lt;year&gt;2020&lt;/year&gt;&lt;pub-dates&gt;&lt;date&gt;Febuary 10&lt;/date&gt;&lt;/pub-dates&gt;&lt;/dates&gt;&lt;pub-location&gt;Logan, Utah&lt;/pub-location&gt;&lt;publisher&gt;Center for Colorado River Studies, Utah State University&lt;/publisher&gt;&lt;urls&gt;&lt;related-urls&gt;&lt;url&gt;https://qcnr.usu.edu//coloradoriver/files/news/White-Paper-7.pdf&lt;/url&gt;&lt;/related-urls&gt;&lt;/urls&gt;&lt;/record&gt;&lt;/Cite&gt;&lt;/EndNote&gt;</w:instrText>
-      </w:r>
-      <w:r>
-        <w:rPr>
-          <w:rFonts w:asciiTheme="majorBidi" w:hAnsiTheme="majorBidi" w:cstheme="majorBidi"/>
-          <w:sz w:val="24"/>
-          <w:szCs w:val="24"/>
-        </w:rPr>
-        <w:fldChar w:fldCharType="separate"/>
-      </w:r>
-      <w:r>
-        <w:rPr>
-          <w:rFonts w:asciiTheme="majorBidi" w:hAnsiTheme="majorBidi" w:cstheme="majorBidi"/>
-          <w:noProof/>
-          <w:sz w:val="24"/>
-          <w:szCs w:val="24"/>
-        </w:rPr>
-        <w:t>(Rosenberg, 2022; Wang and Schmidt, 2020)</w:t>
-      </w:r>
-      <w:r>
-        <w:rPr>
-          <w:rFonts w:asciiTheme="majorBidi" w:hAnsiTheme="majorBidi" w:cstheme="majorBidi"/>
-          <w:sz w:val="24"/>
-          <w:szCs w:val="24"/>
-        </w:rPr>
-        <w:fldChar w:fldCharType="end"/>
-      </w:r>
-      <w:r>
-        <w:rPr>
-          <w:rFonts w:asciiTheme="majorBidi" w:hAnsiTheme="majorBidi" w:cstheme="majorBidi"/>
-          <w:sz w:val="24"/>
-          <w:szCs w:val="24"/>
-        </w:rPr>
-        <w:t xml:space="preserve">. </w:t>
-      </w:r>
-      <w:r>
-        <w:rPr>
-          <w:rFonts w:asciiTheme="majorBidi" w:hAnsiTheme="majorBidi" w:cstheme="majorBidi"/>
-          <w:sz w:val="24"/>
-          <w:szCs w:val="24"/>
-        </w:rPr>
-        <w:t>The other</w:t>
-      </w:r>
-      <w:r>
-        <w:rPr>
-          <w:rFonts w:asciiTheme="majorBidi" w:hAnsiTheme="majorBidi" w:cstheme="majorBidi"/>
-          <w:sz w:val="24"/>
-          <w:szCs w:val="24"/>
-        </w:rPr>
-        <w:t xml:space="preserve"> users</w:t>
-      </w:r>
-      <w:r>
-        <w:rPr>
-          <w:rFonts w:asciiTheme="majorBidi" w:hAnsiTheme="majorBidi" w:cstheme="majorBidi"/>
-          <w:sz w:val="24"/>
-          <w:szCs w:val="24"/>
-        </w:rPr>
-        <w:t xml:space="preserve"> then</w:t>
-      </w:r>
-      <w:r>
-        <w:rPr>
-          <w:rFonts w:asciiTheme="majorBidi" w:hAnsiTheme="majorBidi" w:cstheme="majorBidi"/>
-          <w:sz w:val="24"/>
-          <w:szCs w:val="24"/>
-        </w:rPr>
-        <w:t xml:space="preserve"> divide</w:t>
-      </w:r>
-      <w:r>
-        <w:rPr>
-          <w:rFonts w:asciiTheme="majorBidi" w:hAnsiTheme="majorBidi" w:cstheme="majorBidi"/>
-          <w:sz w:val="24"/>
-          <w:szCs w:val="24"/>
-        </w:rPr>
-        <w:t xml:space="preserve"> </w:t>
-      </w:r>
-      <w:r>
-        <w:rPr>
-          <w:rFonts w:asciiTheme="majorBidi" w:hAnsiTheme="majorBidi" w:cstheme="majorBidi"/>
-          <w:sz w:val="24"/>
-          <w:szCs w:val="24"/>
-        </w:rPr>
-        <w:t>the remaining</w:t>
-      </w:r>
-      <w:r>
-        <w:rPr>
-          <w:rFonts w:asciiTheme="majorBidi" w:hAnsiTheme="majorBidi" w:cstheme="majorBidi"/>
-          <w:sz w:val="24"/>
-          <w:szCs w:val="24"/>
-        </w:rPr>
-        <w:t xml:space="preserve"> </w:t>
-      </w:r>
-      <w:r>
-        <w:rPr>
-          <w:rFonts w:asciiTheme="majorBidi" w:hAnsiTheme="majorBidi" w:cstheme="majorBidi"/>
-          <w:sz w:val="24"/>
-          <w:szCs w:val="24"/>
-        </w:rPr>
-        <w:t>reservoir inflow</w:t>
-      </w:r>
-      <w:r>
-        <w:rPr>
-          <w:rFonts w:asciiTheme="majorBidi" w:hAnsiTheme="majorBidi" w:cstheme="majorBidi"/>
-          <w:sz w:val="24"/>
-          <w:szCs w:val="24"/>
-        </w:rPr>
-        <w:t xml:space="preserve"> (</w:t>
-      </w:r>
-      <w:r>
-        <w:rPr>
-          <w:rFonts w:asciiTheme="majorBidi" w:hAnsiTheme="majorBidi" w:cstheme="majorBidi"/>
-          <w:i/>
-          <w:iCs/>
-          <w:sz w:val="24"/>
-          <w:szCs w:val="24"/>
-        </w:rPr>
-        <w:t>Share of Inflow</w:t>
-      </w:r>
-      <w:r>
-        <w:rPr>
-          <w:rFonts w:asciiTheme="majorBidi" w:hAnsiTheme="majorBidi" w:cstheme="majorBidi"/>
-          <w:i/>
-          <w:iCs/>
-          <w:sz w:val="24"/>
-          <w:szCs w:val="24"/>
-          <w:vertAlign w:val="subscript"/>
-        </w:rPr>
-        <w:t>i</w:t>
-      </w:r>
-      <w:r>
-        <w:rPr>
-          <w:rFonts w:asciiTheme="majorBidi" w:hAnsiTheme="majorBidi" w:cstheme="majorBidi"/>
-          <w:i/>
-          <w:iCs/>
-          <w:sz w:val="24"/>
-          <w:szCs w:val="24"/>
-        </w:rPr>
-        <w:t xml:space="preserve"> </w:t>
-      </w:r>
-      <w:r>
-        <w:rPr>
-          <w:rFonts w:asciiTheme="majorBidi" w:hAnsiTheme="majorBidi" w:cstheme="majorBidi"/>
-          <w:sz w:val="24"/>
-          <w:szCs w:val="24"/>
-        </w:rPr>
-        <w:t>[million acre-feet per year])</w:t>
-      </w:r>
-      <w:r>
-        <w:rPr>
-          <w:rFonts w:asciiTheme="majorBidi" w:hAnsiTheme="majorBidi" w:cstheme="majorBidi"/>
-          <w:sz w:val="24"/>
-          <w:szCs w:val="24"/>
-        </w:rPr>
-        <w:t xml:space="preserve">. </w:t>
-      </w:r>
-      <w:r>
-        <w:rPr>
-          <w:rFonts w:asciiTheme="majorBidi" w:hAnsiTheme="majorBidi" w:cstheme="majorBidi"/>
-          <w:sz w:val="24"/>
-          <w:szCs w:val="24"/>
-        </w:rPr>
-        <w:t>Each user</w:t>
-      </w:r>
-      <w:r>
-        <w:rPr>
-          <w:rFonts w:asciiTheme="majorBidi" w:hAnsiTheme="majorBidi" w:cstheme="majorBidi"/>
-          <w:sz w:val="24"/>
-          <w:szCs w:val="24"/>
-        </w:rPr>
-        <w:t xml:space="preserve"> </w:t>
-      </w:r>
-      <w:r>
-        <w:rPr>
-          <w:rFonts w:asciiTheme="majorBidi" w:hAnsiTheme="majorBidi" w:cstheme="majorBidi"/>
-          <w:i/>
-          <w:iCs/>
-          <w:sz w:val="24"/>
-          <w:szCs w:val="24"/>
-        </w:rPr>
-        <w:t xml:space="preserve">i </w:t>
-      </w:r>
-      <w:r>
-        <w:rPr>
-          <w:rFonts w:asciiTheme="majorBidi" w:hAnsiTheme="majorBidi" w:cstheme="majorBidi"/>
-          <w:sz w:val="24"/>
-          <w:szCs w:val="24"/>
-        </w:rPr>
-        <w:t>consume</w:t>
-      </w:r>
-      <w:r>
-        <w:rPr>
-          <w:rFonts w:asciiTheme="majorBidi" w:hAnsiTheme="majorBidi" w:cstheme="majorBidi"/>
-          <w:sz w:val="24"/>
-          <w:szCs w:val="24"/>
-        </w:rPr>
-        <w:t>s</w:t>
-      </w:r>
-      <w:r>
-        <w:rPr>
-          <w:rFonts w:asciiTheme="majorBidi" w:hAnsiTheme="majorBidi" w:cstheme="majorBidi"/>
-          <w:sz w:val="24"/>
-          <w:szCs w:val="24"/>
-        </w:rPr>
-        <w:t xml:space="preserve"> within their water account balance</w:t>
-      </w:r>
-      <w:r>
-        <w:rPr>
-          <w:rFonts w:asciiTheme="majorBidi" w:hAnsiTheme="majorBidi" w:cstheme="majorBidi"/>
-          <w:sz w:val="24"/>
-          <w:szCs w:val="24"/>
-        </w:rPr>
-        <w:t xml:space="preserve"> in each time period </w:t>
-      </w:r>
-      <w:r>
-        <w:rPr>
-          <w:rFonts w:asciiTheme="majorBidi" w:hAnsiTheme="majorBidi" w:cstheme="majorBidi"/>
-          <w:i/>
-          <w:iCs/>
-          <w:sz w:val="24"/>
-          <w:szCs w:val="24"/>
-        </w:rPr>
-        <w:t>t</w:t>
-      </w:r>
-      <w:r>
-        <w:rPr>
-          <w:rFonts w:asciiTheme="majorBidi" w:hAnsiTheme="majorBidi" w:cstheme="majorBidi"/>
-          <w:sz w:val="24"/>
-          <w:szCs w:val="24"/>
-        </w:rPr>
-        <w:t xml:space="preserve"> (</w:t>
-      </w:r>
-      <w:r>
-        <w:rPr>
-          <w:rFonts w:asciiTheme="majorBidi" w:hAnsiTheme="majorBidi" w:cstheme="majorBidi"/>
-          <w:i/>
-          <w:iCs/>
-          <w:sz w:val="24"/>
-          <w:szCs w:val="24"/>
-        </w:rPr>
-        <w:t>B</w:t>
-      </w:r>
-      <w:r>
-        <w:rPr>
-          <w:rFonts w:asciiTheme="majorBidi" w:hAnsiTheme="majorBidi" w:cstheme="majorBidi"/>
-          <w:i/>
-          <w:iCs/>
-          <w:sz w:val="24"/>
-          <w:szCs w:val="24"/>
-          <w:vertAlign w:val="subscript"/>
-        </w:rPr>
-        <w:t>i</w:t>
-      </w:r>
-      <w:r>
-        <w:rPr>
-          <w:rFonts w:asciiTheme="majorBidi" w:hAnsiTheme="majorBidi" w:cstheme="majorBidi"/>
-          <w:i/>
-          <w:iCs/>
-          <w:sz w:val="24"/>
-          <w:szCs w:val="24"/>
-          <w:vertAlign w:val="subscript"/>
-        </w:rPr>
-        <w:t>,t</w:t>
-      </w:r>
-      <w:r>
-        <w:rPr>
-          <w:rFonts w:asciiTheme="majorBidi" w:hAnsiTheme="majorBidi" w:cstheme="majorBidi"/>
-          <w:i/>
-          <w:iCs/>
-          <w:sz w:val="24"/>
-          <w:szCs w:val="24"/>
-        </w:rPr>
-        <w:t xml:space="preserve"> </w:t>
-      </w:r>
-      <w:r>
-        <w:rPr>
-          <w:rFonts w:asciiTheme="majorBidi" w:hAnsiTheme="majorBidi" w:cstheme="majorBidi"/>
-          <w:sz w:val="24"/>
-          <w:szCs w:val="24"/>
-        </w:rPr>
-        <w:t>[million acre-feet])</w:t>
-      </w:r>
-      <w:r>
-        <w:rPr>
-          <w:rFonts w:asciiTheme="majorBidi" w:hAnsiTheme="majorBidi" w:cstheme="majorBidi"/>
-          <w:sz w:val="24"/>
-          <w:szCs w:val="24"/>
-        </w:rPr>
-        <w:t>;</w:t>
-      </w:r>
-      <w:r>
-        <w:rPr>
-          <w:rFonts w:asciiTheme="majorBidi" w:hAnsiTheme="majorBidi" w:cstheme="majorBidi"/>
-          <w:sz w:val="24"/>
-          <w:szCs w:val="24"/>
-        </w:rPr>
-        <w:t xml:space="preserve"> </w:t>
-      </w:r>
-      <w:r>
-        <w:rPr>
-          <w:rFonts w:asciiTheme="majorBidi" w:hAnsiTheme="majorBidi" w:cstheme="majorBidi"/>
-          <w:sz w:val="24"/>
-          <w:szCs w:val="24"/>
-        </w:rPr>
-        <w:t>Eq</w:t>
-      </w:r>
-      <w:r>
-        <w:rPr>
-          <w:rFonts w:asciiTheme="majorBidi" w:hAnsiTheme="majorBidi" w:cstheme="majorBidi"/>
-          <w:sz w:val="24"/>
-          <w:szCs w:val="24"/>
-        </w:rPr>
-        <w:t>.</w:t>
-      </w:r>
-      <w:r>
-        <w:rPr>
-          <w:rFonts w:asciiTheme="majorBidi" w:hAnsiTheme="majorBidi" w:cstheme="majorBidi"/>
-          <w:sz w:val="24"/>
-          <w:szCs w:val="24"/>
-        </w:rPr>
-        <w:t xml:space="preserve"> 7). </w:t>
-      </w:r>
-      <w:r>
-        <w:rPr>
-          <w:rFonts w:asciiTheme="majorBidi" w:hAnsiTheme="majorBidi" w:cstheme="majorBidi"/>
-          <w:sz w:val="24"/>
-          <w:szCs w:val="24"/>
-        </w:rPr>
-        <w:t xml:space="preserve"> </w:t>
+        <w:t xml:space="preserve"> [Eq. 6]</w:t>
       </w:r>
     </w:p>
     <w:p>
@@ -15342,192 +14760,7 @@
           <w:sz w:val="24"/>
           <w:szCs w:val="24"/>
         </w:rPr>
-        <w:t xml:space="preserve">  [Eq. </w:t>
-      </w:r>
-      <w:r>
-        <w:rPr>
-          <w:rFonts w:asciiTheme="majorBidi" w:eastAsiaTheme="minorEastAsia" w:hAnsiTheme="majorBidi" w:cstheme="majorBidi"/>
-          <w:sz w:val="24"/>
-          <w:szCs w:val="24"/>
-        </w:rPr>
-        <w:t>7</w:t>
-      </w:r>
-      <w:r>
-        <w:rPr>
-          <w:rFonts w:asciiTheme="majorBidi" w:eastAsiaTheme="minorEastAsia" w:hAnsiTheme="majorBidi" w:cstheme="majorBidi"/>
-          <w:sz w:val="24"/>
-          <w:szCs w:val="24"/>
-        </w:rPr>
-        <w:t>]</w:t>
-      </w:r>
-    </w:p>
-    <w:p>
-      <w:pPr>
-        <w:rPr>
-          <w:rFonts w:asciiTheme="majorBidi" w:hAnsiTheme="majorBidi" w:cstheme="majorBidi"/>
-          <w:sz w:val="24"/>
-          <w:szCs w:val="24"/>
-        </w:rPr>
-      </w:pPr>
-      <w:r>
-        <w:rPr>
-          <w:rFonts w:asciiTheme="majorBidi" w:hAnsiTheme="majorBidi" w:cstheme="majorBidi"/>
-          <w:sz w:val="24"/>
-          <w:szCs w:val="24"/>
-        </w:rPr>
-        <w:t xml:space="preserve">Such that all </w:t>
-      </w:r>
-      <w:r>
-        <w:rPr>
-          <w:rFonts w:asciiTheme="majorBidi" w:hAnsiTheme="majorBidi" w:cstheme="majorBidi"/>
-          <w:sz w:val="24"/>
-          <w:szCs w:val="24"/>
-        </w:rPr>
-        <w:t xml:space="preserve">water </w:t>
-      </w:r>
-      <w:r>
-        <w:rPr>
-          <w:rFonts w:asciiTheme="majorBidi" w:hAnsiTheme="majorBidi" w:cstheme="majorBidi"/>
-          <w:sz w:val="24"/>
-          <w:szCs w:val="24"/>
-        </w:rPr>
-        <w:t xml:space="preserve">account balances </w:t>
-      </w:r>
-      <w:r>
-        <w:rPr>
-          <w:rFonts w:asciiTheme="majorBidi" w:hAnsiTheme="majorBidi" w:cstheme="majorBidi"/>
-          <w:i/>
-          <w:iCs/>
-          <w:sz w:val="24"/>
-          <w:szCs w:val="24"/>
-        </w:rPr>
-        <w:t xml:space="preserve">i </w:t>
-      </w:r>
-      <w:r>
-        <w:rPr>
-          <w:rFonts w:asciiTheme="majorBidi" w:hAnsiTheme="majorBidi" w:cstheme="majorBidi"/>
-          <w:sz w:val="24"/>
-          <w:szCs w:val="24"/>
-        </w:rPr>
-        <w:t xml:space="preserve">in all time periods </w:t>
-      </w:r>
-      <w:r>
-        <w:rPr>
-          <w:rFonts w:asciiTheme="majorBidi" w:hAnsiTheme="majorBidi" w:cstheme="majorBidi"/>
-          <w:i/>
-          <w:iCs/>
-          <w:sz w:val="24"/>
-          <w:szCs w:val="24"/>
-        </w:rPr>
-        <w:t xml:space="preserve">t </w:t>
-      </w:r>
-      <w:r>
-        <w:rPr>
-          <w:rFonts w:asciiTheme="majorBidi" w:hAnsiTheme="majorBidi" w:cstheme="majorBidi"/>
-          <w:sz w:val="24"/>
-          <w:szCs w:val="24"/>
-        </w:rPr>
-        <w:t>must be 0 or positive (</w:t>
-      </w:r>
-      <m:oMath>
-        <m:sSub>
-          <m:sSubPr>
-            <m:ctrlPr>
-              <w:rPr>
-                <w:rFonts w:ascii="Cambria Math" w:hAnsi="Cambria Math" w:cstheme="majorBidi"/>
-                <w:i/>
-                <w:sz w:val="24"/>
-                <w:szCs w:val="24"/>
-              </w:rPr>
-            </m:ctrlPr>
-          </m:sSubPr>
-          <m:e>
-            <m:r>
-              <w:rPr>
-                <w:rFonts w:ascii="Cambria Math" w:hAnsi="Cambria Math" w:cstheme="majorBidi"/>
-                <w:sz w:val="24"/>
-                <w:szCs w:val="24"/>
-              </w:rPr>
-              <m:t>B</m:t>
-            </m:r>
-          </m:e>
-          <m:sub>
-            <m:r>
-              <w:rPr>
-                <w:rFonts w:ascii="Cambria Math" w:hAnsi="Cambria Math" w:cstheme="majorBidi"/>
-                <w:sz w:val="24"/>
-                <w:szCs w:val="24"/>
-              </w:rPr>
-              <m:t>i,t</m:t>
-            </m:r>
-          </m:sub>
-        </m:sSub>
-        <m:r>
-          <w:rPr>
-            <w:rFonts w:ascii="Cambria Math" w:hAnsi="Cambria Math" w:cstheme="majorBidi"/>
-            <w:sz w:val="24"/>
-            <w:szCs w:val="24"/>
-          </w:rPr>
-          <m:t>≥0</m:t>
-        </m:r>
-      </m:oMath>
-      <w:r>
-        <w:rPr>
-          <w:rFonts w:asciiTheme="majorBidi" w:eastAsiaTheme="minorEastAsia" w:hAnsiTheme="majorBidi" w:cstheme="majorBidi"/>
-          <w:sz w:val="24"/>
-          <w:szCs w:val="24"/>
-        </w:rPr>
-        <w:t xml:space="preserve">). </w:t>
-      </w:r>
-      <w:r>
-        <w:rPr>
-          <w:rFonts w:asciiTheme="majorBidi" w:hAnsiTheme="majorBidi" w:cstheme="majorBidi"/>
-          <w:sz w:val="24"/>
-          <w:szCs w:val="24"/>
-        </w:rPr>
-        <w:t>Users carry over any positive end-of-year account balances to the next year.</w:t>
-      </w:r>
-      <w:r>
-        <w:rPr>
-          <w:rFonts w:asciiTheme="majorBidi" w:hAnsiTheme="majorBidi" w:cstheme="majorBidi"/>
-          <w:sz w:val="24"/>
-          <w:szCs w:val="24"/>
-        </w:rPr>
-        <w:t xml:space="preserve"> Within the water accounting framework, the Lake Mead storage volume in year </w:t>
-      </w:r>
-      <w:r>
-        <w:rPr>
-          <w:rFonts w:asciiTheme="majorBidi" w:hAnsiTheme="majorBidi" w:cstheme="majorBidi"/>
-          <w:i/>
-          <w:iCs/>
-          <w:sz w:val="24"/>
-          <w:szCs w:val="24"/>
-        </w:rPr>
-        <w:t xml:space="preserve">t </w:t>
-      </w:r>
-      <w:r>
-        <w:rPr>
-          <w:rFonts w:asciiTheme="majorBidi" w:hAnsiTheme="majorBidi" w:cstheme="majorBidi"/>
-          <w:sz w:val="24"/>
-          <w:szCs w:val="24"/>
-        </w:rPr>
-        <w:t xml:space="preserve">is the sum of the USBR protection volume plus all other users’ </w:t>
-      </w:r>
-      <w:r>
-        <w:rPr>
-          <w:rFonts w:asciiTheme="majorBidi" w:hAnsiTheme="majorBidi" w:cstheme="majorBidi"/>
-          <w:sz w:val="24"/>
-          <w:szCs w:val="24"/>
-        </w:rPr>
-        <w:t xml:space="preserve">water </w:t>
-      </w:r>
-      <w:r>
-        <w:rPr>
-          <w:rFonts w:asciiTheme="majorBidi" w:hAnsiTheme="majorBidi" w:cstheme="majorBidi"/>
-          <w:sz w:val="24"/>
-          <w:szCs w:val="24"/>
-        </w:rPr>
-        <w:t>account balances [Eq. 8].</w:t>
+        <w:t xml:space="preserve">  [Eq. 7]</w:t>
       </w:r>
     </w:p>
     <w:p>
@@ -15701,15 +14934,112 @@
     <w:p>
       <w:pPr>
         <w:pStyle w:val="NoSpacing"/>
+      </w:pPr>
+      <w:r>
+        <w:t>Because each user must maintain a zero or positive</w:t>
+      </w:r>
+      <w:r>
+        <w:t xml:space="preserve"> </w:t>
+      </w:r>
+      <w:r>
+        <w:t>account balance</w:t>
+      </w:r>
+      <w:r>
+        <w:t xml:space="preserve"> (</w:t>
+      </w:r>
+      <m:oMath>
+        <m:sSub>
+          <m:sSubPr>
+            <m:ctrlPr>
+              <w:rPr>
+                <w:rFonts w:ascii="Cambria Math" w:hAnsi="Cambria Math"/>
+                <w:i/>
+              </w:rPr>
+            </m:ctrlPr>
+          </m:sSubPr>
+          <m:e>
+            <m:r>
+              <w:rPr>
+                <w:rFonts w:ascii="Cambria Math" w:hAnsi="Cambria Math"/>
+              </w:rPr>
+              <m:t>B</m:t>
+            </m:r>
+          </m:e>
+          <m:sub>
+            <m:r>
+              <w:rPr>
+                <w:rFonts w:ascii="Cambria Math" w:hAnsi="Cambria Math"/>
+              </w:rPr>
+              <m:t>i,t</m:t>
+            </m:r>
+          </m:sub>
+        </m:sSub>
+        <m:r>
+          <w:rPr>
+            <w:rFonts w:ascii="Cambria Math" w:hAnsi="Cambria Math"/>
+          </w:rPr>
+          <m:t>≥0</m:t>
+        </m:r>
+      </m:oMath>
+      <w:r>
         <w:rPr>
           <w:rFonts w:eastAsiaTheme="minorEastAsia"/>
         </w:rPr>
-      </w:pPr>
-      <w:r>
-        <w:t>In water accounting, all users</w:t>
-      </w:r>
-      <w:r>
-        <w:t xml:space="preserve"> can withdraw some up to </w:t>
+        <w:t>)</w:t>
+      </w:r>
+      <w:r>
+        <w:t>, the protection account prevents further draw down to critical levels,</w:t>
+      </w:r>
+      <w:r>
+        <w:t xml:space="preserve"> </w:t>
+      </w:r>
+      <w:r>
+        <w:t>even with extreme low reservoir</w:t>
+      </w:r>
+      <w:r>
+        <w:t xml:space="preserve"> </w:t>
+      </w:r>
+      <w:r>
+        <w:t>storage and inflow.</w:t>
+      </w:r>
+      <w:r>
+        <w:t xml:space="preserve"> </w:t>
+      </w:r>
+      <w:r>
+        <w:t>The annual Lake Mead inflow is typically known at the beginning of the year because the annual Lake Powell release—that is set in Fall of each year—</w:t>
+      </w:r>
+      <w:r>
+        <w:t xml:space="preserve">is </w:t>
+      </w:r>
+      <w:r>
+        <w:t xml:space="preserve">often 85 to 91% of Mead inflow </w:t>
+      </w:r>
+      <w:r>
+        <w:fldChar w:fldCharType="begin"/>
+      </w:r>
+      <w:r>
+        <w:instrText xml:space="preserve"> ADDIN EN.CITE &lt;EndNote&gt;&lt;Cite&gt;&lt;Author&gt;Rosenberg&lt;/Author&gt;&lt;Year&gt;2022&lt;/Year&gt;&lt;RecNum&gt;2903&lt;/RecNum&gt;&lt;DisplayText&gt;(Rosenberg, 2022; Wang and Schmidt, 2020)&lt;/DisplayText&gt;&lt;record&gt;&lt;rec-number&gt;2903&lt;/rec-number&gt;&lt;foreign-keys&gt;&lt;key app="EN" db-id="xxt5ta9pd995dwesap0pdzzp2weaz0w9werf" timestamp="1663608602"&gt;2903&lt;/key&gt;&lt;/foreign-keys&gt;&lt;ref-type name="Journal Article"&gt;17&lt;/ref-type&gt;&lt;contributors&gt;&lt;authors&gt;&lt;author&gt;David E. Rosenberg&lt;/author&gt;&lt;/authors&gt;&lt;/contributors&gt;&lt;titles&gt;&lt;title&gt;Adapt Lake Mead Releases to Inflow to Give Managers More Flexibility to Slow Reservoir Drawdown&lt;/title&gt;&lt;secondary-title&gt;Journal of Water Resources Planning and Management&lt;/secondary-title&gt;&lt;/titles&gt;&lt;periodical&gt;&lt;full-title&gt;Journal of Water Resources Planning and Management&lt;/full-title&gt;&lt;/periodical&gt;&lt;pages&gt;02522006&lt;/pages&gt;&lt;volume&gt;148&lt;/volume&gt;&lt;number&gt;10&lt;/number&gt;&lt;dates&gt;&lt;year&gt;2022&lt;/year&gt;&lt;/dates&gt;&lt;urls&gt;&lt;related-urls&gt;&lt;url&gt;https://ascelibrary.org/doi/abs/10.1061/%28ASCE%29WR.1943-5452.0001592. Free version: https://digitalcommons.usu.edu/water_pubs/170/.&lt;/url&gt;&lt;/related-urls&gt;&lt;/urls&gt;&lt;electronic-resource-num&gt;https://doi.org/10.1061/(ASCE)WR.1943-5452.0001592&lt;/electronic-resource-num&gt;&lt;/record&gt;&lt;/Cite&gt;&lt;Cite&gt;&lt;Author&gt;Wang&lt;/Author&gt;&lt;Year&gt;2020&lt;/Year&gt;&lt;RecNum&gt;2782&lt;/RecNum&gt;&lt;record&gt;&lt;rec-number&gt;2782&lt;/rec-number&gt;&lt;foreign-keys&gt;&lt;key app="EN" db-id="xxt5ta9pd995dwesap0pdzzp2weaz0w9werf" timestamp="1620768668"&gt;2782&lt;/key&gt;&lt;/foreign-keys&gt;&lt;ref-type name="Report"&gt;27&lt;/ref-type&gt;&lt;contributors&gt;&lt;authors&gt;&lt;author&gt;Jian Wang&lt;/author&gt;&lt;author&gt;John C. Schmidt&lt;/author&gt;&lt;/authors&gt;&lt;/contributors&gt;&lt;titles&gt;&lt;title&gt;Stream flow and Losses of the Colorado River in the Southern Colorado Plateau&lt;/title&gt;&lt;/titles&gt;&lt;pages&gt;30&lt;/pages&gt;&lt;number&gt;White Paper #5&lt;/number&gt;&lt;dates&gt;&lt;year&gt;2020&lt;/year&gt;&lt;pub-dates&gt;&lt;date&gt;Febuary 10&lt;/date&gt;&lt;/pub-dates&gt;&lt;/dates&gt;&lt;pub-location&gt;Logan, Utah&lt;/pub-location&gt;&lt;publisher&gt;Center for Colorado River Studies, Utah State University&lt;/publisher&gt;&lt;urls&gt;&lt;related-urls&gt;&lt;url&gt;https://qcnr.usu.edu//coloradoriver/files/news/White-Paper-7.pdf&lt;/url&gt;&lt;/related-urls&gt;&lt;/urls&gt;&lt;/record&gt;&lt;/Cite&gt;&lt;/EndNote&gt;</w:instrText>
+      </w:r>
+      <w:r>
+        <w:fldChar w:fldCharType="separate"/>
+      </w:r>
+      <w:r>
+        <w:rPr>
+          <w:noProof/>
+        </w:rPr>
+        <w:t>(Rosenberg, 2022; Wang and Schmidt, 2020)</w:t>
+      </w:r>
+      <w:r>
+        <w:fldChar w:fldCharType="end"/>
+      </w:r>
+      <w:r>
+        <w:t>.</w:t>
+      </w:r>
+      <w:r>
+        <w:t xml:space="preserve"> With water accounting, each user can </w:t>
+      </w:r>
+      <w:r>
+        <w:t xml:space="preserve">an withdraw some up to </w:t>
       </w:r>
       <w:r>
         <w:rPr>
@@ -15742,16 +15072,19 @@
         <w:t>Lake Mead storage volume.</w:t>
       </w:r>
       <w:r>
-        <w:t xml:space="preserve"> This ability gives users more autonomy to adapt their consumption and conservation activities as system conditions change. Additionally, </w:t>
-      </w:r>
-      <w:r>
-        <w:t xml:space="preserve">the </w:t>
-      </w:r>
-      <w:r>
-        <w:t xml:space="preserve">USBR </w:t>
-      </w:r>
-      <w:r>
-        <w:t xml:space="preserve">protection volume prevents further draw down to critical elevations. Thus, there is no </w:t>
+        <w:t xml:space="preserve"> This ability gives users more autonomy to adapt their consumption and conservation activities as system conditions change. </w:t>
+      </w:r>
+      <w:r>
+        <w:t>Water accounts can be created for any users or uses</w:t>
+      </w:r>
+      <w:r>
+        <w:t xml:space="preserve"> such as Tribal Nations or endangered species conservation programs. </w:t>
+      </w:r>
+      <w:r>
+        <w:t xml:space="preserve">Additionally, </w:t>
+      </w:r>
+      <w:r>
+        <w:t xml:space="preserve">there is no </w:t>
       </w:r>
       <w:r>
         <w:t xml:space="preserve">elevation trigger that </w:t>
@@ -15789,7 +15122,7 @@
         <w:pStyle w:val="Heading1"/>
       </w:pPr>
       <w:r>
-        <w:t>Discussion</w:t>
+        <w:t>Illustration of Water Accounting</w:t>
       </w:r>
     </w:p>
     <w:p>
@@ -15806,39 +15139,7 @@
           <w:sz w:val="24"/>
           <w:szCs w:val="24"/>
         </w:rPr>
-        <w:t xml:space="preserve">We report numerous Lake Mead water conservation program successes, including that the program has conserved more water than any other Colorado River Basin conservation program to date. </w:t>
-      </w:r>
-      <w:r>
-        <w:rPr>
-          <w:rFonts w:asciiTheme="majorBidi" w:hAnsiTheme="majorBidi" w:cstheme="majorBidi"/>
-          <w:sz w:val="24"/>
-          <w:szCs w:val="24"/>
-        </w:rPr>
-        <w:t>Presently, some now 3.6 million acre-feet of c</w:t>
-      </w:r>
-      <w:r>
-        <w:rPr>
-          <w:rFonts w:asciiTheme="majorBidi" w:hAnsiTheme="majorBidi" w:cstheme="majorBidi"/>
-          <w:sz w:val="24"/>
-          <w:szCs w:val="24"/>
-        </w:rPr>
-        <w:t>onserved water remain</w:t>
-      </w:r>
-      <w:r>
-        <w:rPr>
-          <w:rFonts w:asciiTheme="majorBidi" w:hAnsiTheme="majorBidi" w:cstheme="majorBidi"/>
-          <w:sz w:val="24"/>
-          <w:szCs w:val="24"/>
-        </w:rPr>
-        <w:t>s</w:t>
-      </w:r>
-      <w:r>
-        <w:rPr>
-          <w:rFonts w:asciiTheme="majorBidi" w:hAnsiTheme="majorBidi" w:cstheme="majorBidi"/>
-          <w:sz w:val="24"/>
-          <w:szCs w:val="24"/>
-        </w:rPr>
-        <w:t xml:space="preserve"> in Lake Mead—quadruple the volume of ~ 700,000 acre-feet reported through 2015 </w:t>
+        <w:t xml:space="preserve">Like </w:t>
       </w:r>
       <w:r>
         <w:rPr>
@@ -15854,7 +15155,7 @@
           <w:sz w:val="24"/>
           <w:szCs w:val="24"/>
         </w:rPr>
-        <w:instrText xml:space="preserve"> ADDIN EN.CITE &lt;EndNote&gt;&lt;Cite&gt;&lt;Author&gt;Robison&lt;/Author&gt;&lt;Year&gt;2017&lt;/Year&gt;&lt;RecNum&gt;3108&lt;/RecNum&gt;&lt;DisplayText&gt;(Robison, 2017)&lt;/DisplayText&gt;&lt;record&gt;&lt;rec-number&gt;3108&lt;/rec-number&gt;&lt;foreign-keys&gt;&lt;key app="EN" db-id="xxt5ta9pd995dwesap0pdzzp2weaz0w9werf" timestamp="1776460861"&gt;3108&lt;/key&gt;&lt;/foreign-keys&gt;&lt;ref-type name="Journal Article"&gt;17&lt;/ref-type&gt;&lt;contributors&gt;&lt;authors&gt;&lt;author&gt;Jason Anthony Robison&lt;/author&gt;&lt;/authors&gt;&lt;/contributors&gt;&lt;titles&gt;&lt;title&gt;The Colorado River Revisited&lt;/title&gt;&lt;secondary-title&gt;University of Colorado Law Review&lt;/secondary-title&gt;&lt;/titles&gt;&lt;periodical&gt;&lt;full-title&gt;University of Colorado Law Review&lt;/full-title&gt;&lt;/periodical&gt;&lt;volume&gt;88&lt;/volume&gt;&lt;number&gt;3&lt;/number&gt;&lt;dates&gt;&lt;year&gt;2017&lt;/year&gt;&lt;/dates&gt;&lt;urls&gt;&lt;related-urls&gt;&lt;url&gt;https://heinonline.org/HOL/Page?handle=hein.journals/ucollr88&amp;amp;id=511&amp;amp;collection=journals&amp;amp;index=&lt;/url&gt;&lt;/related-urls&gt;&lt;/urls&gt;&lt;/record&gt;&lt;/Cite&gt;&lt;/EndNote&gt;</w:instrText>
+        <w:instrText xml:space="preserve"> ADDIN EN.CITE &lt;EndNote&gt;&lt;Cite AuthorYear="1"&gt;&lt;Author&gt;Huizar&lt;/Author&gt;&lt;Year&gt;2023&lt;/Year&gt;&lt;RecNum&gt;3110&lt;/RecNum&gt;&lt;DisplayText&gt;Huizar et al. (2023)&lt;/DisplayText&gt;&lt;record&gt;&lt;rec-number&gt;3110&lt;/rec-number&gt;&lt;foreign-keys&gt;&lt;key app="EN" db-id="xxt5ta9pd995dwesap0pdzzp2weaz0w9werf" timestamp="1776715189"&gt;3110&lt;/key&gt;&lt;/foreign-keys&gt;&lt;ref-type name="Journal Article"&gt;17&lt;/ref-type&gt;&lt;contributors&gt;&lt;authors&gt;&lt;author&gt;Luis Huizar&lt;/author&gt;&lt;author&gt;Sarai Díaz&lt;/author&gt;&lt;author&gt;Kevin Lansey&lt;/author&gt;&lt;author&gt;Robert Arnold&lt;/author&gt;&lt;/authors&gt;&lt;/contributors&gt;&lt;titles&gt;&lt;title&gt;Water Supply in the Lower Colorado River Basin: Effectiveness of the 2019 Drought Contingency Plan&lt;/title&gt;&lt;secondary-title&gt;Journal of Environmental Engineering&lt;/secondary-title&gt;&lt;/titles&gt;&lt;periodical&gt;&lt;full-title&gt;Journal of Environmental Engineering&lt;/full-title&gt;&lt;/periodical&gt;&lt;pages&gt;04023058&lt;/pages&gt;&lt;volume&gt;149&lt;/volume&gt;&lt;number&gt;10&lt;/number&gt;&lt;dates&gt;&lt;year&gt;2023&lt;/year&gt;&lt;/dates&gt;&lt;urls&gt;&lt;related-urls&gt;&lt;url&gt;https://ascelibrary.org/doi/abs/10.1061/JOEEDU.EEENG-7324&lt;/url&gt;&lt;/related-urls&gt;&lt;/urls&gt;&lt;electronic-resource-num&gt;doi:10.1061/JOEEDU.EEENG-7324&lt;/electronic-resource-num&gt;&lt;/record&gt;&lt;/Cite&gt;&lt;/EndNote&gt;</w:instrText>
       </w:r>
       <w:r>
         <w:rPr>
@@ -15871,7 +15172,7 @@
           <w:sz w:val="24"/>
           <w:szCs w:val="24"/>
         </w:rPr>
-        <w:t>(Robison, 2017)</w:t>
+        <w:t>Huizar et al. (2023)</w:t>
       </w:r>
       <w:r>
         <w:rPr>
@@ -15887,31 +15188,88 @@
           <w:sz w:val="24"/>
           <w:szCs w:val="24"/>
         </w:rPr>
-        <w:t>.</w:t>
-      </w:r>
-      <w:r>
-        <w:rPr>
-          <w:rFonts w:asciiTheme="majorBidi" w:hAnsiTheme="majorBidi" w:cstheme="majorBidi"/>
-          <w:sz w:val="24"/>
-          <w:szCs w:val="24"/>
-        </w:rPr>
-        <w:t xml:space="preserve"> Since 2022, conservation efforts by California, Arizona, Nevada, and Mexico have kept Lake Mead above </w:t>
-      </w:r>
-      <w:r>
-        <w:rPr>
-          <w:rFonts w:asciiTheme="majorBidi" w:hAnsiTheme="majorBidi" w:cstheme="majorBidi"/>
-          <w:sz w:val="24"/>
-          <w:szCs w:val="24"/>
-        </w:rPr>
-        <w:t>its</w:t>
-      </w:r>
-      <w:r>
-        <w:rPr>
-          <w:rFonts w:asciiTheme="majorBidi" w:hAnsiTheme="majorBidi" w:cstheme="majorBidi"/>
-          <w:sz w:val="24"/>
-          <w:szCs w:val="24"/>
-        </w:rPr>
-        <w:t xml:space="preserve"> protection elevation of 1,020 feet set in the 2019 Lower Drought Contingency Plan.</w:t>
+        <w:t xml:space="preserve">, it </w:t>
+      </w:r>
+      <w:r>
+        <w:rPr>
+          <w:rFonts w:asciiTheme="majorBidi" w:hAnsiTheme="majorBidi" w:cstheme="majorBidi"/>
+          <w:sz w:val="24"/>
+          <w:szCs w:val="24"/>
+        </w:rPr>
+        <w:t>is</w:t>
+      </w:r>
+      <w:r>
+        <w:rPr>
+          <w:rFonts w:asciiTheme="majorBidi" w:hAnsiTheme="majorBidi" w:cstheme="majorBidi"/>
+          <w:sz w:val="24"/>
+          <w:szCs w:val="24"/>
+        </w:rPr>
+        <w:t xml:space="preserve"> difficult to predict and model </w:t>
+      </w:r>
+      <w:r>
+        <w:rPr>
+          <w:rFonts w:asciiTheme="majorBidi" w:hAnsiTheme="majorBidi" w:cstheme="majorBidi"/>
+          <w:sz w:val="24"/>
+          <w:szCs w:val="24"/>
+        </w:rPr>
+        <w:t>user</w:t>
+      </w:r>
+      <w:r>
+        <w:rPr>
+          <w:rFonts w:asciiTheme="majorBidi" w:hAnsiTheme="majorBidi" w:cstheme="majorBidi"/>
+          <w:sz w:val="24"/>
+          <w:szCs w:val="24"/>
+        </w:rPr>
+        <w:t xml:space="preserve">’s water consumption and conservation choices, and corresponding Lake Mead storage volumes. Prediction is difficult because with more autonomy, users can adapt their choices year-to-year for a variety of reasons that are not readily coded into </w:t>
+      </w:r>
+      <w:r>
+        <w:rPr>
+          <w:rFonts w:asciiTheme="majorBidi" w:hAnsiTheme="majorBidi" w:cstheme="majorBidi"/>
+          <w:sz w:val="24"/>
+          <w:szCs w:val="24"/>
+        </w:rPr>
+        <w:t xml:space="preserve">simulation models and </w:t>
+      </w:r>
+      <w:r>
+        <w:rPr>
+          <w:rFonts w:asciiTheme="majorBidi" w:hAnsiTheme="majorBidi" w:cstheme="majorBidi"/>
+          <w:sz w:val="24"/>
+          <w:szCs w:val="24"/>
+        </w:rPr>
+        <w:t xml:space="preserve">rules. </w:t>
+      </w:r>
+      <w:r>
+        <w:rPr>
+          <w:rFonts w:asciiTheme="majorBidi" w:hAnsiTheme="majorBidi" w:cstheme="majorBidi"/>
+          <w:sz w:val="24"/>
+          <w:szCs w:val="24"/>
+        </w:rPr>
+        <w:t xml:space="preserve">Here, we instead use collaborator choices in recent immersive, online, collaborative modeling sessions to illustrate a few possibilities of water accounting. </w:t>
+      </w:r>
+      <w:r>
+        <w:rPr>
+          <w:rFonts w:asciiTheme="majorBidi" w:hAnsiTheme="majorBidi" w:cstheme="majorBidi"/>
+          <w:sz w:val="24"/>
+          <w:szCs w:val="24"/>
+        </w:rPr>
+        <w:t xml:space="preserve">Within a session, collaborators immersed in and personified a Lake Mead user. The user roles were Reclamation (protection volume), California, Arizona, Nevada, Mexico, and Tribal Nations of the Lower Basin. Each year, we revealed the Lake Mead inflow. The model apportioned the inflow among the user accounts. Then, each collaborator </w:t>
+      </w:r>
+      <w:r>
+        <w:rPr>
+          <w:rFonts w:asciiTheme="majorBidi" w:hAnsiTheme="majorBidi" w:cstheme="majorBidi"/>
+          <w:sz w:val="24"/>
+          <w:szCs w:val="24"/>
+        </w:rPr>
+        <w:lastRenderedPageBreak/>
+        <w:t>consumed, conserved, or traded within their account balance.</w:t>
+      </w:r>
+      <w:r>
+        <w:rPr>
+          <w:rFonts w:asciiTheme="majorBidi" w:hAnsiTheme="majorBidi" w:cstheme="majorBidi"/>
+          <w:sz w:val="24"/>
+          <w:szCs w:val="24"/>
+        </w:rPr>
+        <w:t xml:space="preserve"> Collaborators carried over account balances to the next year, which also kept Lake Mead storage above the protection volume.</w:t>
       </w:r>
     </w:p>
     <w:p>
@@ -15928,243 +15286,31 @@
           <w:sz w:val="24"/>
           <w:szCs w:val="24"/>
         </w:rPr>
-        <w:t>To expand program participation and increase operational flexibility, p</w:t>
-      </w:r>
-      <w:r>
-        <w:rPr>
-          <w:rFonts w:asciiTheme="majorBidi" w:hAnsiTheme="majorBidi" w:cstheme="majorBidi"/>
-          <w:sz w:val="24"/>
-          <w:szCs w:val="24"/>
-        </w:rPr>
-        <w:t xml:space="preserve">rior researchers </w:t>
-      </w:r>
-      <w:r>
-        <w:rPr>
-          <w:rFonts w:asciiTheme="majorBidi" w:hAnsiTheme="majorBidi" w:cstheme="majorBidi"/>
-          <w:sz w:val="24"/>
-          <w:szCs w:val="24"/>
-        </w:rPr>
-        <w:t xml:space="preserve">suggested to raise caps on water conservation account balances </w:t>
-      </w:r>
-      <w:r>
-        <w:rPr>
-          <w:rFonts w:asciiTheme="majorBidi" w:hAnsiTheme="majorBidi" w:cstheme="majorBidi"/>
-          <w:sz w:val="24"/>
-          <w:szCs w:val="24"/>
-        </w:rPr>
-        <w:fldChar w:fldCharType="begin"/>
-      </w:r>
-      <w:r>
-        <w:rPr>
-          <w:rFonts w:asciiTheme="majorBidi" w:hAnsiTheme="majorBidi" w:cstheme="majorBidi"/>
-          <w:sz w:val="24"/>
-          <w:szCs w:val="24"/>
-        </w:rPr>
-        <w:instrText xml:space="preserve"> ADDIN EN.CITE &lt;EndNote&gt;&lt;Cite&gt;&lt;Author&gt;Robison&lt;/Author&gt;&lt;Year&gt;2017&lt;/Year&gt;&lt;RecNum&gt;3108&lt;/RecNum&gt;&lt;DisplayText&gt;(Fleck and Udall, 2021; Robison, 2017)&lt;/DisplayText&gt;&lt;record&gt;&lt;rec-number&gt;3108&lt;/rec-number&gt;&lt;foreign-keys&gt;&lt;key app="EN" db-id="xxt5ta9pd995dwesap0pdzzp2weaz0w9werf" timestamp="1776460861"&gt;3108&lt;/key&gt;&lt;/foreign-keys&gt;&lt;ref-type name="Journal Article"&gt;17&lt;/ref-type&gt;&lt;contributors&gt;&lt;authors&gt;&lt;author&gt;Jason Anthony Robison&lt;/author&gt;&lt;/authors&gt;&lt;/contributors&gt;&lt;titles&gt;&lt;title&gt;The Colorado River Revisited&lt;/title&gt;&lt;secondary-title&gt;University of Colorado Law Review&lt;/secondary-title&gt;&lt;/titles&gt;&lt;periodical&gt;&lt;full-title&gt;University of Colorado Law Review&lt;/full-title&gt;&lt;/periodical&gt;&lt;volume&gt;88&lt;/volume&gt;&lt;number&gt;3&lt;/number&gt;&lt;dates&gt;&lt;year&gt;2017&lt;/year&gt;&lt;/dates&gt;&lt;urls&gt;&lt;related-urls&gt;&lt;url&gt;https://heinonline.org/HOL/Page?handle=hein.journals/ucollr88&amp;amp;id=511&amp;amp;collection=journals&amp;amp;index=&lt;/url&gt;&lt;/related-urls&gt;&lt;/urls&gt;&lt;/record&gt;&lt;/Cite&gt;&lt;Cite&gt;&lt;Author&gt;Fleck&lt;/Author&gt;&lt;Year&gt;2021&lt;/Year&gt;&lt;RecNum&gt;2801&lt;/RecNum&gt;&lt;record&gt;&lt;rec-number&gt;2801&lt;/rec-number&gt;&lt;foreign-keys&gt;&lt;key app="EN" db-id="xxt5ta9pd995dwesap0pdzzp2weaz0w9werf" timestamp="1624662415"&gt;2801&lt;/key&gt;&lt;/foreign-keys&gt;&lt;ref-type name="Journal Article"&gt;17&lt;/ref-type&gt;&lt;contributors&gt;&lt;authors&gt;&lt;author&gt;Fleck, John&lt;/author&gt;&lt;author&gt;Udall, Brad&lt;/author&gt;&lt;/authors&gt;&lt;/contributors&gt;&lt;titles&gt;&lt;title&gt;Managing Colorado River risk&lt;/title&gt;&lt;secondary-title&gt;Science&lt;/secondary-title&gt;&lt;/titles&gt;&lt;periodical&gt;&lt;full-title&gt;Science&lt;/full-title&gt;&lt;/periodical&gt;&lt;pages&gt;885-885&lt;/pages&gt;&lt;volume&gt;372&lt;/volume&gt;&lt;number&gt;6545&lt;/number&gt;&lt;dates&gt;&lt;year&gt;2021&lt;/year&gt;&lt;/dates&gt;&lt;urls&gt;&lt;related-urls&gt;&lt;url&gt;https://science.sciencemag.org/content/sci/372/6545/885.full.pdf&lt;/url&gt;&lt;/related-urls&gt;&lt;/urls&gt;&lt;electronic-resource-num&gt;https://doi.org/10.1126/science.abj5498&lt;/electronic-resource-num&gt;&lt;/record&gt;&lt;/Cite&gt;&lt;/EndNote&gt;</w:instrText>
-      </w:r>
-      <w:r>
-        <w:rPr>
-          <w:rFonts w:asciiTheme="majorBidi" w:hAnsiTheme="majorBidi" w:cstheme="majorBidi"/>
-          <w:sz w:val="24"/>
-          <w:szCs w:val="24"/>
-        </w:rPr>
-        <w:fldChar w:fldCharType="separate"/>
-      </w:r>
-      <w:r>
-        <w:rPr>
-          <w:rFonts w:asciiTheme="majorBidi" w:hAnsiTheme="majorBidi" w:cstheme="majorBidi"/>
-          <w:noProof/>
-          <w:sz w:val="24"/>
-          <w:szCs w:val="24"/>
-        </w:rPr>
-        <w:t>(Fleck and Udall, 2021; Robison, 2017)</w:t>
-      </w:r>
-      <w:r>
-        <w:rPr>
-          <w:rFonts w:asciiTheme="majorBidi" w:hAnsiTheme="majorBidi" w:cstheme="majorBidi"/>
-          <w:sz w:val="24"/>
-          <w:szCs w:val="24"/>
-        </w:rPr>
-        <w:fldChar w:fldCharType="end"/>
-      </w:r>
-      <w:r>
-        <w:rPr>
-          <w:rFonts w:asciiTheme="majorBidi" w:hAnsiTheme="majorBidi" w:cstheme="majorBidi"/>
-          <w:sz w:val="24"/>
-          <w:szCs w:val="24"/>
-        </w:rPr>
-        <w:t xml:space="preserve">. </w:t>
-      </w:r>
-      <w:r>
-        <w:rPr>
-          <w:rFonts w:asciiTheme="majorBidi" w:hAnsiTheme="majorBidi" w:cstheme="majorBidi"/>
-          <w:sz w:val="24"/>
-          <w:szCs w:val="24"/>
-        </w:rPr>
-        <w:lastRenderedPageBreak/>
-        <w:t xml:space="preserve">These suggestions </w:t>
-      </w:r>
-      <w:r>
-        <w:rPr>
-          <w:rFonts w:asciiTheme="majorBidi" w:hAnsiTheme="majorBidi" w:cstheme="majorBidi"/>
-          <w:sz w:val="24"/>
-          <w:szCs w:val="24"/>
-        </w:rPr>
-        <w:t>were implemented</w:t>
-      </w:r>
-      <w:r>
-        <w:rPr>
-          <w:rFonts w:asciiTheme="majorBidi" w:hAnsiTheme="majorBidi" w:cstheme="majorBidi"/>
-          <w:sz w:val="24"/>
-          <w:szCs w:val="24"/>
-        </w:rPr>
-        <w:t xml:space="preserve"> in </w:t>
-      </w:r>
-      <w:r>
-        <w:rPr>
-          <w:rFonts w:asciiTheme="majorBidi" w:hAnsiTheme="majorBidi" w:cstheme="majorBidi"/>
-          <w:sz w:val="24"/>
-          <w:szCs w:val="24"/>
-        </w:rPr>
-        <w:t xml:space="preserve">2020 </w:t>
-      </w:r>
-      <w:r>
-        <w:rPr>
-          <w:rFonts w:asciiTheme="majorBidi" w:hAnsiTheme="majorBidi" w:cstheme="majorBidi"/>
-          <w:sz w:val="24"/>
-          <w:szCs w:val="24"/>
-        </w:rPr>
-        <w:t xml:space="preserve">when </w:t>
-      </w:r>
-      <w:r>
-        <w:rPr>
-          <w:rFonts w:asciiTheme="majorBidi" w:hAnsiTheme="majorBidi" w:cstheme="majorBidi"/>
-          <w:sz w:val="24"/>
-          <w:szCs w:val="24"/>
-        </w:rPr>
-        <w:t>total account</w:t>
-      </w:r>
-      <w:r>
-        <w:rPr>
-          <w:rFonts w:asciiTheme="majorBidi" w:hAnsiTheme="majorBidi" w:cstheme="majorBidi"/>
-          <w:sz w:val="24"/>
-          <w:szCs w:val="24"/>
-        </w:rPr>
-        <w:t xml:space="preserve"> balances exceeded the 2.7 million acre-feet maximum balance defined in the 2019 Drought Contingency Plan</w:t>
-      </w:r>
-      <w:r>
-        <w:rPr>
-          <w:rFonts w:asciiTheme="majorBidi" w:hAnsiTheme="majorBidi" w:cstheme="majorBidi"/>
-          <w:sz w:val="24"/>
-          <w:szCs w:val="24"/>
-        </w:rPr>
-        <w:t xml:space="preserve"> </w:t>
-      </w:r>
-      <w:r>
-        <w:rPr>
-          <w:rFonts w:asciiTheme="majorBidi" w:hAnsiTheme="majorBidi" w:cstheme="majorBidi"/>
-          <w:sz w:val="24"/>
-          <w:szCs w:val="24"/>
-        </w:rPr>
-        <w:fldChar w:fldCharType="begin"/>
-      </w:r>
-      <w:r>
-        <w:rPr>
-          <w:rFonts w:asciiTheme="majorBidi" w:hAnsiTheme="majorBidi" w:cstheme="majorBidi"/>
-          <w:sz w:val="24"/>
-          <w:szCs w:val="24"/>
-        </w:rPr>
-        <w:instrText xml:space="preserve"> ADDIN EN.CITE &lt;EndNote&gt;&lt;Cite&gt;&lt;Author&gt;USBR&lt;/Author&gt;&lt;Year&gt;2019&lt;/Year&gt;&lt;RecNum&gt;2578&lt;/RecNum&gt;&lt;DisplayText&gt;(USBR, 2019)&lt;/DisplayText&gt;&lt;record&gt;&lt;rec-number&gt;2578&lt;/rec-number&gt;&lt;foreign-keys&gt;&lt;key app="EN" db-id="xxt5ta9pd995dwesap0pdzzp2weaz0w9werf" timestamp="1554700022"&gt;2578&lt;/key&gt;&lt;/foreign-keys&gt;&lt;ref-type name="Report"&gt;27&lt;/ref-type&gt;&lt;contributors&gt;&lt;authors&gt;&lt;author&gt;USBR&lt;/author&gt;&lt;/authors&gt;&lt;/contributors&gt;&lt;titles&gt;&lt;title&gt;Agreement Concerning Colorado River Drought Contingency Management and Operations&lt;/title&gt;&lt;/titles&gt;&lt;pages&gt;56&lt;/pages&gt;&lt;dates&gt;&lt;year&gt;2019&lt;/year&gt;&lt;pub-dates&gt;&lt;date&gt;May 20&lt;/date&gt;&lt;/pub-dates&gt;&lt;/dates&gt;&lt;pub-location&gt;Washington, DC&lt;/pub-location&gt;&lt;publisher&gt;U.S. Bureau of Reclamation&lt;/publisher&gt;&lt;urls&gt;&lt;related-urls&gt;&lt;url&gt;https://www.usbr.gov/ColoradoRiverBasin/dcp/index.html&lt;/url&gt;&lt;/related-urls&gt;&lt;/urls&gt;&lt;/record&gt;&lt;/Cite&gt;&lt;/EndNote&gt;</w:instrText>
-      </w:r>
-      <w:r>
-        <w:rPr>
-          <w:rFonts w:asciiTheme="majorBidi" w:hAnsiTheme="majorBidi" w:cstheme="majorBidi"/>
-          <w:sz w:val="24"/>
-          <w:szCs w:val="24"/>
-        </w:rPr>
-        <w:fldChar w:fldCharType="separate"/>
-      </w:r>
-      <w:r>
-        <w:rPr>
-          <w:rFonts w:asciiTheme="majorBidi" w:hAnsiTheme="majorBidi" w:cstheme="majorBidi"/>
-          <w:noProof/>
-          <w:sz w:val="24"/>
-          <w:szCs w:val="24"/>
-        </w:rPr>
-        <w:t>(USBR, 2019)</w:t>
-      </w:r>
-      <w:r>
-        <w:rPr>
-          <w:rFonts w:asciiTheme="majorBidi" w:hAnsiTheme="majorBidi" w:cstheme="majorBidi"/>
-          <w:sz w:val="24"/>
-          <w:szCs w:val="24"/>
-        </w:rPr>
-        <w:fldChar w:fldCharType="end"/>
-      </w:r>
-      <w:r>
-        <w:rPr>
-          <w:rFonts w:asciiTheme="majorBidi" w:hAnsiTheme="majorBidi" w:cstheme="majorBidi"/>
-          <w:sz w:val="24"/>
-          <w:szCs w:val="24"/>
-        </w:rPr>
-        <w:t>.</w:t>
-      </w:r>
-      <w:r>
-        <w:rPr>
-          <w:rFonts w:asciiTheme="majorBidi" w:hAnsiTheme="majorBidi" w:cstheme="majorBidi"/>
-          <w:sz w:val="24"/>
-          <w:szCs w:val="24"/>
-        </w:rPr>
-        <w:t xml:space="preserve"> A second suggestion would allow movement of voluntarily conserved water from Lake Mead upstream to Lake Powell </w:t>
-      </w:r>
-      <w:r>
-        <w:rPr>
-          <w:rFonts w:asciiTheme="majorBidi" w:hAnsiTheme="majorBidi" w:cstheme="majorBidi"/>
-          <w:sz w:val="24"/>
-          <w:szCs w:val="24"/>
-        </w:rPr>
-        <w:fldChar w:fldCharType="begin"/>
-      </w:r>
-      <w:r>
-        <w:rPr>
-          <w:rFonts w:asciiTheme="majorBidi" w:hAnsiTheme="majorBidi" w:cstheme="majorBidi"/>
-          <w:sz w:val="24"/>
-          <w:szCs w:val="24"/>
-        </w:rPr>
-        <w:instrText xml:space="preserve"> ADDIN EN.CITE &lt;EndNote&gt;&lt;Cite&gt;&lt;Author&gt;USBR&lt;/Author&gt;&lt;Year&gt;2026&lt;/Year&gt;&lt;RecNum&gt;3107&lt;/RecNum&gt;&lt;DisplayText&gt;(USBR, 2026b)&lt;/DisplayText&gt;&lt;record&gt;&lt;rec-number&gt;3107&lt;/rec-number&gt;&lt;foreign-keys&gt;&lt;key app="EN" db-id="xxt5ta9pd995dwesap0pdzzp2weaz0w9werf" timestamp="1772056442"&gt;3107&lt;/key&gt;&lt;/foreign-keys&gt;&lt;ref-type name="Report"&gt;27&lt;/ref-type&gt;&lt;contributors&gt;&lt;authors&gt;&lt;author&gt;USBR&lt;/author&gt;&lt;/authors&gt;&lt;/contributors&gt;&lt;titles&gt;&lt;title&gt;Post-2026 Operational Guidelines and Strategies for Lake Powell and Lake Mead – Draft Environmental Impact Statement&lt;/title&gt;&lt;/titles&gt;&lt;dates&gt;&lt;year&gt;2026&lt;/year&gt;&lt;/dates&gt;&lt;publisher&gt;U.S. Bureau of Reclamation&lt;/publisher&gt;&lt;urls&gt;&lt;related-urls&gt;&lt;url&gt;https://www.usbr.gov/ColoradoRiverBasin/post2026/draft-eis/&lt;/url&gt;&lt;/related-urls&gt;&lt;/urls&gt;&lt;/record&gt;&lt;/Cite&gt;&lt;/EndNote&gt;</w:instrText>
-      </w:r>
-      <w:r>
-        <w:rPr>
-          <w:rFonts w:asciiTheme="majorBidi" w:hAnsiTheme="majorBidi" w:cstheme="majorBidi"/>
-          <w:sz w:val="24"/>
-          <w:szCs w:val="24"/>
-        </w:rPr>
-        <w:fldChar w:fldCharType="separate"/>
-      </w:r>
-      <w:r>
-        <w:rPr>
-          <w:rFonts w:asciiTheme="majorBidi" w:hAnsiTheme="majorBidi" w:cstheme="majorBidi"/>
-          <w:noProof/>
-          <w:sz w:val="24"/>
-          <w:szCs w:val="24"/>
-        </w:rPr>
-        <w:t>(USBR, 2026b)</w:t>
-      </w:r>
-      <w:r>
-        <w:rPr>
-          <w:rFonts w:asciiTheme="majorBidi" w:hAnsiTheme="majorBidi" w:cstheme="majorBidi"/>
-          <w:sz w:val="24"/>
-          <w:szCs w:val="24"/>
-        </w:rPr>
-        <w:fldChar w:fldCharType="end"/>
-      </w:r>
-      <w:r>
-        <w:rPr>
-          <w:rFonts w:asciiTheme="majorBidi" w:hAnsiTheme="majorBidi" w:cstheme="majorBidi"/>
-          <w:sz w:val="24"/>
-          <w:szCs w:val="24"/>
-        </w:rPr>
-        <w:t>.</w:t>
+        <w:t xml:space="preserve">Figure 6 shows results from one session where the person who immersed in the Reclamation role choose a protection volume of 6.3 million acre-feet (1,030 feet). </w:t>
+      </w:r>
+      <w:r>
+        <w:rPr>
+          <w:rFonts w:asciiTheme="majorBidi" w:hAnsiTheme="majorBidi" w:cstheme="majorBidi"/>
+          <w:sz w:val="24"/>
+          <w:szCs w:val="24"/>
+        </w:rPr>
+        <w:t>T</w:t>
+      </w:r>
+      <w:r>
+        <w:rPr>
+          <w:rFonts w:asciiTheme="majorBidi" w:hAnsiTheme="majorBidi" w:cstheme="majorBidi"/>
+          <w:sz w:val="24"/>
+          <w:szCs w:val="24"/>
+        </w:rPr>
+        <w:t xml:space="preserve">he remaining collaborators </w:t>
+      </w:r>
+      <w:r>
+        <w:rPr>
+          <w:rFonts w:asciiTheme="majorBidi" w:hAnsiTheme="majorBidi" w:cstheme="majorBidi"/>
+          <w:sz w:val="24"/>
+          <w:szCs w:val="24"/>
+        </w:rPr>
+        <w:t>reserved 1.4 to 2.0 million acre-feet in their accounts, keeping Lake Mead storage above the protection elevation even with inflows of 3.8, 6.3, and 4.0 million acre-feet—inflows lower than observed to date.</w:t>
       </w:r>
     </w:p>
     <w:p>
@@ -16177,377 +15323,1017 @@
       </w:pPr>
       <w:r>
         <w:rPr>
-          <w:rFonts w:asciiTheme="majorBidi" w:hAnsiTheme="majorBidi" w:cstheme="majorBidi"/>
-          <w:sz w:val="24"/>
-          <w:szCs w:val="24"/>
-        </w:rPr>
-        <w:t xml:space="preserve">Other proposals placed additional constraints on the program </w:t>
-      </w:r>
-      <w:r>
-        <w:rPr>
-          <w:rFonts w:asciiTheme="majorBidi" w:hAnsiTheme="majorBidi" w:cstheme="majorBidi"/>
-          <w:sz w:val="24"/>
-          <w:szCs w:val="24"/>
-        </w:rPr>
-        <w:t>that we believe will</w:t>
-      </w:r>
-      <w:r>
-        <w:rPr>
-          <w:rFonts w:asciiTheme="majorBidi" w:hAnsiTheme="majorBidi" w:cstheme="majorBidi"/>
-          <w:sz w:val="24"/>
-          <w:szCs w:val="24"/>
-        </w:rPr>
-        <w:t xml:space="preserve"> limit </w:t>
-      </w:r>
-      <w:r>
-        <w:rPr>
-          <w:rFonts w:asciiTheme="majorBidi" w:hAnsiTheme="majorBidi" w:cstheme="majorBidi"/>
-          <w:sz w:val="24"/>
-          <w:szCs w:val="24"/>
-        </w:rPr>
-        <w:t>participation and user autonomy.</w:t>
-      </w:r>
-      <w:r>
-        <w:rPr>
-          <w:rFonts w:asciiTheme="majorBidi" w:hAnsiTheme="majorBidi" w:cstheme="majorBidi"/>
-          <w:sz w:val="24"/>
-          <w:szCs w:val="24"/>
-        </w:rPr>
-        <w:t xml:space="preserve"> </w:t>
-      </w:r>
-      <w:r>
-        <w:rPr>
-          <w:rFonts w:asciiTheme="majorBidi" w:hAnsiTheme="majorBidi" w:cstheme="majorBidi"/>
-          <w:sz w:val="24"/>
-          <w:szCs w:val="24"/>
-        </w:rPr>
-        <w:t xml:space="preserve">For example, </w:t>
-      </w:r>
-      <w:r>
-        <w:rPr>
-          <w:rFonts w:asciiTheme="majorBidi" w:hAnsiTheme="majorBidi" w:cstheme="majorBidi"/>
-          <w:sz w:val="24"/>
-          <w:szCs w:val="24"/>
-        </w:rPr>
-        <w:fldChar w:fldCharType="begin"/>
-      </w:r>
-      <w:r>
-        <w:rPr>
-          <w:rFonts w:asciiTheme="majorBidi" w:hAnsiTheme="majorBidi" w:cstheme="majorBidi"/>
-          <w:sz w:val="24"/>
-          <w:szCs w:val="24"/>
-        </w:rPr>
-        <w:instrText xml:space="preserve"> ADDIN EN.CITE &lt;EndNote&gt;&lt;Cite AuthorYear="1"&gt;&lt;Author&gt;Colby&lt;/Author&gt;&lt;Year&gt;2025&lt;/Year&gt;&lt;RecNum&gt;3109&lt;/RecNum&gt;&lt;DisplayText&gt;Colby et al. (2025)&lt;/DisplayText&gt;&lt;record&gt;&lt;rec-number&gt;3109&lt;/rec-number&gt;&lt;foreign-keys&gt;&lt;key app="EN" db-id="xxt5ta9pd995dwesap0pdzzp2weaz0w9werf" timestamp="1776466532"&gt;3109&lt;/key&gt;&lt;/foreign-keys&gt;&lt;ref-type name="Journal Article"&gt;17&lt;/ref-type&gt;&lt;contributors&gt;&lt;authors&gt;&lt;author&gt;Colby, Bonnie&lt;/author&gt;&lt;author&gt;Hansen, Kristiana&lt;/author&gt;&lt;author&gt;Sorensen, Kathryn&lt;/author&gt;&lt;/authors&gt;&lt;/contributors&gt;&lt;titles&gt;&lt;title&gt;Policy Nook — Policy Note: Tough Tradeoffs in the Colorado River Basin&lt;/title&gt;&lt;secondary-title&gt;Water Economics and Policy&lt;/secondary-title&gt;&lt;/titles&gt;&lt;periodical&gt;&lt;full-title&gt;Water Economics and Policy&lt;/full-title&gt;&lt;/periodical&gt;&lt;pages&gt;2471002&lt;/pages&gt;&lt;volume&gt;11&lt;/volume&gt;&lt;number&gt;04&lt;/number&gt;&lt;keywords&gt;&lt;keyword&gt;Colorado River Basin,water shortage,water conservation,water equity,tribal water&lt;/keyword&gt;&lt;/keywords&gt;&lt;dates&gt;&lt;year&gt;2025&lt;/year&gt;&lt;/dates&gt;&lt;urls&gt;&lt;related-urls&gt;&lt;url&gt;https://www.worldscientific.com/doi/abs/10.1142/S2382624X24710024&lt;/url&gt;&lt;/related-urls&gt;&lt;/urls&gt;&lt;electronic-resource-num&gt;10.1142/s2382624x24710024&lt;/electronic-resource-num&gt;&lt;/record&gt;&lt;/Cite&gt;&lt;/EndNote&gt;</w:instrText>
-      </w:r>
-      <w:r>
-        <w:rPr>
-          <w:rFonts w:asciiTheme="majorBidi" w:hAnsiTheme="majorBidi" w:cstheme="majorBidi"/>
-          <w:sz w:val="24"/>
-          <w:szCs w:val="24"/>
-        </w:rPr>
-        <w:fldChar w:fldCharType="separate"/>
-      </w:r>
-      <w:r>
-        <w:rPr>
-          <w:rFonts w:asciiTheme="majorBidi" w:hAnsiTheme="majorBidi" w:cstheme="majorBidi"/>
           <w:noProof/>
-          <w:sz w:val="24"/>
-          <w:szCs w:val="24"/>
-        </w:rPr>
-        <w:t>Colby et al. (2025)</w:t>
-      </w:r>
-      <w:r>
-        <w:rPr>
-          <w:rFonts w:asciiTheme="majorBidi" w:hAnsiTheme="majorBidi" w:cstheme="majorBidi"/>
-          <w:sz w:val="24"/>
-          <w:szCs w:val="24"/>
-        </w:rPr>
-        <w:fldChar w:fldCharType="end"/>
-      </w:r>
-      <w:r>
-        <w:rPr>
-          <w:rFonts w:asciiTheme="majorBidi" w:hAnsiTheme="majorBidi" w:cstheme="majorBidi"/>
-          <w:sz w:val="24"/>
-          <w:szCs w:val="24"/>
-        </w:rPr>
-        <w:t xml:space="preserve"> suggested to assign up to 50% of conserved water to remain in Lake Mead as system water. </w:t>
-      </w:r>
-      <w:r>
-        <w:rPr>
-          <w:rFonts w:asciiTheme="majorBidi" w:hAnsiTheme="majorBidi" w:cstheme="majorBidi"/>
-          <w:sz w:val="24"/>
-          <w:szCs w:val="24"/>
-        </w:rPr>
-        <w:t>This suggestion mean</w:t>
-      </w:r>
-      <w:r>
-        <w:rPr>
-          <w:rFonts w:asciiTheme="majorBidi" w:hAnsiTheme="majorBidi" w:cstheme="majorBidi"/>
-          <w:sz w:val="24"/>
-          <w:szCs w:val="24"/>
-        </w:rPr>
-        <w:t>s</w:t>
-      </w:r>
-      <w:r>
-        <w:rPr>
-          <w:rFonts w:asciiTheme="majorBidi" w:hAnsiTheme="majorBidi" w:cstheme="majorBidi"/>
-          <w:sz w:val="24"/>
-          <w:szCs w:val="24"/>
-        </w:rPr>
-        <w:t xml:space="preserve"> that for every 1 million acre-feet </w:t>
-      </w:r>
-      <w:r>
-        <w:rPr>
-          <w:rFonts w:asciiTheme="majorBidi" w:hAnsiTheme="majorBidi" w:cstheme="majorBidi"/>
-          <w:sz w:val="24"/>
-          <w:szCs w:val="24"/>
-        </w:rPr>
-        <w:t xml:space="preserve">of </w:t>
-      </w:r>
-      <w:r>
-        <w:rPr>
-          <w:rFonts w:asciiTheme="majorBidi" w:hAnsiTheme="majorBidi" w:cstheme="majorBidi"/>
-          <w:sz w:val="24"/>
-          <w:szCs w:val="24"/>
-        </w:rPr>
-        <w:t xml:space="preserve">conserved </w:t>
-      </w:r>
-      <w:r>
-        <w:rPr>
-          <w:rFonts w:asciiTheme="majorBidi" w:hAnsiTheme="majorBidi" w:cstheme="majorBidi"/>
-          <w:sz w:val="24"/>
-          <w:szCs w:val="24"/>
-        </w:rPr>
-        <w:t xml:space="preserve">water </w:t>
-      </w:r>
-      <w:r>
-        <w:rPr>
-          <w:rFonts w:asciiTheme="majorBidi" w:hAnsiTheme="majorBidi" w:cstheme="majorBidi"/>
-          <w:sz w:val="24"/>
-          <w:szCs w:val="24"/>
-        </w:rPr>
-        <w:t>left in Lake Mead, users c</w:t>
-      </w:r>
-      <w:r>
-        <w:rPr>
-          <w:rFonts w:asciiTheme="majorBidi" w:hAnsiTheme="majorBidi" w:cstheme="majorBidi"/>
-          <w:sz w:val="24"/>
-          <w:szCs w:val="24"/>
-        </w:rPr>
-        <w:t>an</w:t>
-      </w:r>
-      <w:r>
-        <w:rPr>
-          <w:rFonts w:asciiTheme="majorBidi" w:hAnsiTheme="majorBidi" w:cstheme="majorBidi"/>
-          <w:sz w:val="24"/>
-          <w:szCs w:val="24"/>
-        </w:rPr>
-        <w:t xml:space="preserve"> only withdraw 500,000 acre-feet. </w:t>
-      </w:r>
-      <w:r>
-        <w:rPr>
-          <w:rFonts w:asciiTheme="majorBidi" w:hAnsiTheme="majorBidi" w:cstheme="majorBidi"/>
-          <w:sz w:val="24"/>
-          <w:szCs w:val="24"/>
-        </w:rPr>
-        <w:t xml:space="preserve">Reclamation proposed to </w:t>
-      </w:r>
-      <w:r>
-        <w:rPr>
-          <w:rFonts w:asciiTheme="majorBidi" w:hAnsiTheme="majorBidi" w:cstheme="majorBidi"/>
-          <w:sz w:val="24"/>
-          <w:szCs w:val="24"/>
-        </w:rPr>
-        <w:t>tie</w:t>
-      </w:r>
-      <w:r>
-        <w:rPr>
-          <w:rFonts w:asciiTheme="majorBidi" w:hAnsiTheme="majorBidi" w:cstheme="majorBidi"/>
-          <w:sz w:val="24"/>
-          <w:szCs w:val="24"/>
-        </w:rPr>
-        <w:t xml:space="preserve"> mandatory shortages to the anticipated Lake Mead level if there was no voluntary</w:t>
-      </w:r>
-      <w:r>
-        <w:rPr>
-          <w:rFonts w:asciiTheme="majorBidi" w:hAnsiTheme="majorBidi" w:cstheme="majorBidi"/>
-          <w:sz w:val="24"/>
-          <w:szCs w:val="24"/>
-        </w:rPr>
-        <w:t xml:space="preserve"> water conservation</w:t>
-      </w:r>
-      <w:r>
-        <w:rPr>
-          <w:rFonts w:asciiTheme="majorBidi" w:hAnsiTheme="majorBidi" w:cstheme="majorBidi"/>
-          <w:sz w:val="24"/>
-          <w:szCs w:val="24"/>
-        </w:rPr>
-        <w:t xml:space="preserve"> activity</w:t>
-      </w:r>
-      <w:r>
-        <w:rPr>
-          <w:rFonts w:asciiTheme="majorBidi" w:hAnsiTheme="majorBidi" w:cstheme="majorBidi"/>
-          <w:sz w:val="24"/>
-          <w:szCs w:val="24"/>
-        </w:rPr>
-        <w:t xml:space="preserve"> </w:t>
-      </w:r>
-      <w:r>
-        <w:rPr>
-          <w:rFonts w:asciiTheme="majorBidi" w:hAnsiTheme="majorBidi" w:cstheme="majorBidi"/>
-          <w:sz w:val="24"/>
-          <w:szCs w:val="24"/>
-        </w:rPr>
-        <w:fldChar w:fldCharType="begin"/>
-      </w:r>
-      <w:r>
-        <w:rPr>
-          <w:rFonts w:asciiTheme="majorBidi" w:hAnsiTheme="majorBidi" w:cstheme="majorBidi"/>
-          <w:sz w:val="24"/>
-          <w:szCs w:val="24"/>
-        </w:rPr>
-        <w:instrText xml:space="preserve"> ADDIN EN.CITE &lt;EndNote&gt;&lt;Cite&gt;&lt;Author&gt;USBR&lt;/Author&gt;&lt;Year&gt;2026&lt;/Year&gt;&lt;RecNum&gt;3107&lt;/RecNum&gt;&lt;DisplayText&gt;(USBR, 2026b)&lt;/DisplayText&gt;&lt;record&gt;&lt;rec-number&gt;3107&lt;/rec-number&gt;&lt;foreign-keys&gt;&lt;key app="EN" db-id="xxt5ta9pd995dwesap0pdzzp2weaz0w9werf" timestamp="1772056442"&gt;3107&lt;/key&gt;&lt;/foreign-keys&gt;&lt;ref-type name="Report"&gt;27&lt;/ref-type&gt;&lt;contributors&gt;&lt;authors&gt;&lt;author&gt;USBR&lt;/author&gt;&lt;/authors&gt;&lt;/contributors&gt;&lt;titles&gt;&lt;title&gt;Post-2026 Operational Guidelines and Strategies for Lake Powell and Lake Mead – Draft Environmental Impact Statement&lt;/title&gt;&lt;/titles&gt;&lt;dates&gt;&lt;year&gt;2026&lt;/year&gt;&lt;/dates&gt;&lt;publisher&gt;U.S. Bureau of Reclamation&lt;/publisher&gt;&lt;urls&gt;&lt;related-urls&gt;&lt;url&gt;https://www.usbr.gov/ColoradoRiverBasin/post2026/draft-eis/&lt;/url&gt;&lt;/related-urls&gt;&lt;/urls&gt;&lt;/record&gt;&lt;/Cite&gt;&lt;/EndNote&gt;</w:instrText>
-      </w:r>
-      <w:r>
-        <w:rPr>
-          <w:rFonts w:asciiTheme="majorBidi" w:hAnsiTheme="majorBidi" w:cstheme="majorBidi"/>
-          <w:sz w:val="24"/>
-          <w:szCs w:val="24"/>
-        </w:rPr>
-        <w:fldChar w:fldCharType="separate"/>
-      </w:r>
-      <w:r>
-        <w:rPr>
-          <w:rFonts w:asciiTheme="majorBidi" w:hAnsiTheme="majorBidi" w:cstheme="majorBidi"/>
-          <w:noProof/>
-          <w:sz w:val="24"/>
-          <w:szCs w:val="24"/>
-        </w:rPr>
-        <w:t>(USBR, 2026b)</w:t>
-      </w:r>
-      <w:r>
-        <w:rPr>
-          <w:rFonts w:asciiTheme="majorBidi" w:hAnsiTheme="majorBidi" w:cstheme="majorBidi"/>
-          <w:sz w:val="24"/>
-          <w:szCs w:val="24"/>
-        </w:rPr>
-        <w:fldChar w:fldCharType="end"/>
-      </w:r>
-      <w:r>
-        <w:rPr>
-          <w:rFonts w:asciiTheme="majorBidi" w:hAnsiTheme="majorBidi" w:cstheme="majorBidi"/>
-          <w:sz w:val="24"/>
-          <w:szCs w:val="24"/>
-        </w:rPr>
-        <w:t xml:space="preserve">. </w:t>
-      </w:r>
-      <w:r>
-        <w:rPr>
-          <w:rFonts w:asciiTheme="majorBidi" w:hAnsiTheme="majorBidi" w:cstheme="majorBidi"/>
-          <w:sz w:val="24"/>
-          <w:szCs w:val="24"/>
-        </w:rPr>
-        <w:t xml:space="preserve">They also proposed to exclude mandatory reductions from the calculation of voluntary credits. </w:t>
-      </w:r>
-      <w:r>
-        <w:rPr>
-          <w:rFonts w:asciiTheme="majorBidi" w:hAnsiTheme="majorBidi" w:cstheme="majorBidi"/>
-          <w:sz w:val="24"/>
-          <w:szCs w:val="24"/>
-        </w:rPr>
-        <w:t>Larger shortages that trigger at higher reservoir levels will help Lake Mead. But there is also a downside. S</w:t>
-      </w:r>
-      <w:r>
-        <w:rPr>
-          <w:rFonts w:asciiTheme="majorBidi" w:hAnsiTheme="majorBidi" w:cstheme="majorBidi"/>
-          <w:sz w:val="24"/>
-          <w:szCs w:val="24"/>
-        </w:rPr>
-        <w:t xml:space="preserve">hortages </w:t>
-      </w:r>
-      <w:r>
-        <w:rPr>
-          <w:rFonts w:asciiTheme="majorBidi" w:hAnsiTheme="majorBidi" w:cstheme="majorBidi"/>
-          <w:sz w:val="24"/>
-          <w:szCs w:val="24"/>
-        </w:rPr>
-        <w:t>will</w:t>
-      </w:r>
-      <w:r>
-        <w:rPr>
-          <w:rFonts w:asciiTheme="majorBidi" w:hAnsiTheme="majorBidi" w:cstheme="majorBidi"/>
-          <w:sz w:val="24"/>
-          <w:szCs w:val="24"/>
-        </w:rPr>
-        <w:t xml:space="preserve"> vary </w:t>
-      </w:r>
-      <w:r>
-        <w:rPr>
-          <w:rFonts w:asciiTheme="majorBidi" w:hAnsiTheme="majorBidi" w:cstheme="majorBidi"/>
-          <w:sz w:val="24"/>
-          <w:szCs w:val="24"/>
-        </w:rPr>
-        <w:t>year-to-yea</w:t>
-      </w:r>
-      <w:r>
-        <w:rPr>
-          <w:rFonts w:asciiTheme="majorBidi" w:hAnsiTheme="majorBidi" w:cstheme="majorBidi"/>
-          <w:sz w:val="24"/>
-          <w:szCs w:val="24"/>
-        </w:rPr>
-        <w:t>r in response to volatile Colorado River flow and Lake Mead or system storage</w:t>
-      </w:r>
-      <w:r>
-        <w:rPr>
-          <w:rFonts w:asciiTheme="majorBidi" w:hAnsiTheme="majorBidi" w:cstheme="majorBidi"/>
-          <w:sz w:val="24"/>
-          <w:szCs w:val="24"/>
-        </w:rPr>
-        <w:t>.</w:t>
-      </w:r>
-      <w:r>
-        <w:rPr>
-          <w:rFonts w:asciiTheme="majorBidi" w:hAnsiTheme="majorBidi" w:cstheme="majorBidi"/>
-          <w:sz w:val="24"/>
-          <w:szCs w:val="24"/>
-        </w:rPr>
-        <w:t xml:space="preserve"> Swings in shortage</w:t>
-      </w:r>
-      <w:r>
-        <w:rPr>
-          <w:rFonts w:asciiTheme="majorBidi" w:hAnsiTheme="majorBidi" w:cstheme="majorBidi"/>
-          <w:sz w:val="24"/>
-          <w:szCs w:val="24"/>
-        </w:rPr>
-        <w:t xml:space="preserve">s limit user’s autonomy and </w:t>
-      </w:r>
-      <w:r>
-        <w:rPr>
-          <w:rFonts w:asciiTheme="majorBidi" w:hAnsiTheme="majorBidi" w:cstheme="majorBidi"/>
-          <w:sz w:val="24"/>
-          <w:szCs w:val="24"/>
-        </w:rPr>
-        <w:t xml:space="preserve">make it difficult for user’s to plan </w:t>
-      </w:r>
-      <w:r>
-        <w:rPr>
-          <w:rFonts w:asciiTheme="majorBidi" w:hAnsiTheme="majorBidi" w:cstheme="majorBidi"/>
-          <w:sz w:val="24"/>
-          <w:szCs w:val="24"/>
-        </w:rPr>
-        <w:t>future</w:t>
-      </w:r>
-      <w:r>
-        <w:rPr>
-          <w:rFonts w:asciiTheme="majorBidi" w:hAnsiTheme="majorBidi" w:cstheme="majorBidi"/>
-          <w:sz w:val="24"/>
-          <w:szCs w:val="24"/>
-        </w:rPr>
-        <w:t xml:space="preserve"> water use. </w:t>
+        </w:rPr>
+        <w:drawing>
+          <wp:inline distT="0" distB="0" distL="0" distR="0" wp14:anchorId="19C76C33" wp14:editId="3792FAAF">
+            <wp:extent cx="4569672" cy="2702257"/>
+            <wp:effectExtent l="0" t="0" r="2540" b="3175"/>
+            <wp:docPr id="2050808461" name="drawing" descr="A graph with a line and a red line&#10;&#10;AI-generated content may be incorrect."/>
+            <wp:cNvGraphicFramePr>
+              <a:graphicFrameLocks xmlns:a="http://schemas.openxmlformats.org/drawingml/2006/main" noChangeAspect="1"/>
+            </wp:cNvGraphicFramePr>
+            <a:graphic xmlns:a="http://schemas.openxmlformats.org/drawingml/2006/main">
+              <a:graphicData uri="http://schemas.openxmlformats.org/drawingml/2006/picture">
+                <pic:pic xmlns:pic="http://schemas.openxmlformats.org/drawingml/2006/picture">
+                  <pic:nvPicPr>
+                    <pic:cNvPr id="2050808461" name="drawing" descr="A graph with a line and a red line&#10;&#10;AI-generated content may be incorrect."/>
+                    <pic:cNvPicPr/>
+                  </pic:nvPicPr>
+                  <pic:blipFill>
+                    <a:blip r:embed="rId23" cstate="print">
+                      <a:extLst>
+                        <a:ext uri="{28A0092B-C50C-407E-A947-70E740481C1C}">
+                          <a14:useLocalDpi xmlns:a14="http://schemas.microsoft.com/office/drawing/2010/main" val="0"/>
+                        </a:ext>
+                      </a:extLst>
+                    </a:blip>
+                    <a:stretch>
+                      <a:fillRect/>
+                    </a:stretch>
+                  </pic:blipFill>
+                  <pic:spPr>
+                    <a:xfrm>
+                      <a:off x="0" y="0"/>
+                      <a:ext cx="4632103" cy="2739176"/>
+                    </a:xfrm>
+                    <a:prstGeom prst="rect">
+                      <a:avLst/>
+                    </a:prstGeom>
+                  </pic:spPr>
+                </pic:pic>
+              </a:graphicData>
+            </a:graphic>
+          </wp:inline>
+        </w:drawing>
       </w:r>
     </w:p>
     <w:p>
       <w:pPr>
+        <w:pStyle w:val="NoSpacing"/>
+      </w:pPr>
+      <w:r>
+        <w:rPr>
+          <w:b/>
+          <w:bCs/>
+        </w:rPr>
+        <w:t xml:space="preserve">Figure 6. Collaborator choice for Lake Mead protection elevation (red) during a recent immersive model session. </w:t>
+      </w:r>
+      <w:r>
+        <w:t>The blue line shows the resulting reservoir storage/elevation with inflows of 3.8, 6.3, and 4.0 million acre-feet per year</w:t>
+      </w:r>
+      <w:r>
+        <w:rPr>
+          <w:b/>
+          <w:bCs/>
+        </w:rPr>
+        <w:t>.</w:t>
+      </w:r>
+      <w:r>
+        <w:rPr>
+          <w:b/>
+          <w:bCs/>
+        </w:rPr>
+        <w:t xml:space="preserve"> </w:t>
+      </w:r>
+      <w:r>
+        <w:t>The area between the red and blue lines shows the total volume the other collaborators conserved within their user accounts.</w:t>
+      </w:r>
+    </w:p>
+    <w:p>
+      <w:pPr>
+        <w:pStyle w:val="NoSpacing"/>
+      </w:pPr>
+    </w:p>
+    <w:p>
+      <w:pPr>
+        <w:pStyle w:val="NoSpacing"/>
+      </w:pPr>
+      <w:r>
+        <w:t>Across 7 sessions, c</w:t>
+      </w:r>
+      <w:r>
+        <w:t xml:space="preserve">ollaborators who immersed in and personified the Reclamation role </w:t>
+      </w:r>
+      <w:r>
+        <w:t>chose Lake Mead protection elevations from 970 to 1,030 ft (2.9 to</w:t>
+      </w:r>
+      <w:r>
+        <w:t xml:space="preserve"> </w:t>
+      </w:r>
+      <w:r>
+        <w:t xml:space="preserve">6.3 million acre-ft of active storage; Figure </w:t>
+      </w:r>
+      <w:r>
+        <w:t>7</w:t>
+      </w:r>
+      <w:r>
+        <w:t>). Across these model sessions, years, and</w:t>
+      </w:r>
+      <w:r>
+        <w:t xml:space="preserve"> </w:t>
+      </w:r>
+      <w:r>
+        <w:t>inflows as low as 3.8 million acre-feet per year, Lake Mead storage was maintained at</w:t>
+      </w:r>
+      <w:r>
+        <w:t xml:space="preserve"> </w:t>
+      </w:r>
+      <w:r>
+        <w:t>100 to 280% of the chosen protection volume (blue circles in Figure 2). Lake Mead</w:t>
+      </w:r>
+      <w:r>
+        <w:t xml:space="preserve"> </w:t>
+      </w:r>
+      <w:r>
+        <w:t>storage stayed above the protection volume when collaborators who personified users</w:t>
+      </w:r>
+      <w:r>
+        <w:t xml:space="preserve"> </w:t>
+      </w:r>
+      <w:r>
+        <w:t>conserved some of their available water for use in future years and/or the person who</w:t>
+      </w:r>
+      <w:r>
+        <w:t xml:space="preserve"> </w:t>
+      </w:r>
+      <w:r>
+        <w:t>immersed in the Reclamation role purchased some water from other users to add to the</w:t>
+      </w:r>
+      <w:r>
+        <w:t xml:space="preserve"> </w:t>
+      </w:r>
+      <w:r>
+        <w:t>protection account volume. For example, Federal purchases of settled, unused water from</w:t>
+      </w:r>
+      <w:r>
+        <w:t xml:space="preserve"> </w:t>
+      </w:r>
+      <w:r>
+        <w:t>an account representing the Tribal Nations of the Lower Basin provided income for</w:t>
+      </w:r>
+      <w:r>
+        <w:t xml:space="preserve"> </w:t>
+      </w:r>
+      <w:r>
+        <w:t>Tribes to build expensive potable water supply systems or repair aging infrastructure.</w:t>
+      </w:r>
+      <w:r>
+        <w:t xml:space="preserve"> </w:t>
+      </w:r>
+      <w:r>
+        <w:t>People who role played Reclamation sometimes sold some protection water to bail out</w:t>
+      </w:r>
+      <w:r>
+        <w:t xml:space="preserve"> </w:t>
+      </w:r>
+      <w:r>
+        <w:t>users who had very low account balances (red diamonds in Figure 2).</w:t>
+      </w:r>
+    </w:p>
+    <w:p>
+      <w:pPr>
+        <w:pStyle w:val="NoSpacing"/>
+      </w:pPr>
+      <w:r>
+        <w:rPr>
+          <w:noProof/>
+        </w:rPr>
+        <w:lastRenderedPageBreak/>
+        <w:drawing>
+          <wp:inline distT="0" distB="0" distL="0" distR="0" wp14:anchorId="35AE1158" wp14:editId="3B510AF1">
+            <wp:extent cx="5125925" cy="3022979"/>
+            <wp:effectExtent l="0" t="0" r="0" b="6350"/>
+            <wp:docPr id="95808357" name="drawing" descr="A graph with numbers and dots&#10;&#10;AI-generated content may be incorrect."/>
+            <wp:cNvGraphicFramePr>
+              <a:graphicFrameLocks xmlns:a="http://schemas.openxmlformats.org/drawingml/2006/main" noChangeAspect="1"/>
+            </wp:cNvGraphicFramePr>
+            <a:graphic xmlns:a="http://schemas.openxmlformats.org/drawingml/2006/main">
+              <a:graphicData uri="http://schemas.openxmlformats.org/drawingml/2006/picture">
+                <pic:pic xmlns:pic="http://schemas.openxmlformats.org/drawingml/2006/picture">
+                  <pic:nvPicPr>
+                    <pic:cNvPr id="95808357" name="drawing" descr="A graph with numbers and dots&#10;&#10;AI-generated content may be incorrect."/>
+                    <pic:cNvPicPr/>
+                  </pic:nvPicPr>
+                  <pic:blipFill>
+                    <a:blip r:embed="rId24" cstate="print">
+                      <a:extLst>
+                        <a:ext uri="{28A0092B-C50C-407E-A947-70E740481C1C}">
+                          <a14:useLocalDpi xmlns:a14="http://schemas.microsoft.com/office/drawing/2010/main" val="0"/>
+                        </a:ext>
+                      </a:extLst>
+                    </a:blip>
+                    <a:stretch>
+                      <a:fillRect/>
+                    </a:stretch>
+                  </pic:blipFill>
+                  <pic:spPr>
+                    <a:xfrm>
+                      <a:off x="0" y="0"/>
+                      <a:ext cx="5221341" cy="3079250"/>
+                    </a:xfrm>
+                    <a:prstGeom prst="rect">
+                      <a:avLst/>
+                    </a:prstGeom>
+                  </pic:spPr>
+                </pic:pic>
+              </a:graphicData>
+            </a:graphic>
+          </wp:inline>
+        </w:drawing>
+      </w:r>
+    </w:p>
+    <w:p>
+      <w:pPr>
+        <w:pStyle w:val="NoSpacing"/>
+      </w:pPr>
+      <w:r>
+        <w:rPr>
+          <w:b/>
+          <w:bCs/>
+        </w:rPr>
+        <w:t xml:space="preserve">Figure </w:t>
+      </w:r>
+      <w:r>
+        <w:rPr>
+          <w:b/>
+          <w:bCs/>
+        </w:rPr>
+        <w:t>7</w:t>
+      </w:r>
+      <w:r>
+        <w:rPr>
+          <w:b/>
+          <w:bCs/>
+        </w:rPr>
+        <w:t>. Lake Mead protection elevations chosen in recent immersive modeling sessions (x axis)</w:t>
+      </w:r>
+      <w:r>
+        <w:rPr>
+          <w:b/>
+          <w:bCs/>
+        </w:rPr>
+        <w:t xml:space="preserve"> and r</w:t>
+      </w:r>
+      <w:r>
+        <w:rPr>
+          <w:b/>
+          <w:bCs/>
+        </w:rPr>
+        <w:t>esulting storage was expressed as a fraction of the chosen protection volume (y axis).</w:t>
+      </w:r>
+      <w:r>
+        <w:t xml:space="preserve"> Inflows were 3.8, 6.3, and 4.0 million acre-feet per year.</w:t>
+      </w:r>
+      <w:r>
+        <w:t xml:space="preserve"> </w:t>
+      </w:r>
+      <w:r>
+        <w:t>Blue circles above the purple dashed line of 1.0 showed sessions and years where</w:t>
+      </w:r>
+      <w:r>
+        <w:t xml:space="preserve"> </w:t>
+      </w:r>
+      <w:r>
+        <w:t>collaborators maintained Lake Mead storage at or above the protection elevation. In some</w:t>
+      </w:r>
+      <w:r>
+        <w:t xml:space="preserve"> </w:t>
+      </w:r>
+      <w:r>
+        <w:t>instances, the collaborator immersing in the Reclamation role chose to sell some of the</w:t>
+      </w:r>
+      <w:r>
+        <w:t xml:space="preserve"> </w:t>
+      </w:r>
+      <w:r>
+        <w:t>protection water to bail out users who had low account balances (red diamonds).</w:t>
+      </w:r>
+    </w:p>
+    <w:p>
+      <w:pPr>
+        <w:pStyle w:val="NoSpacing"/>
+      </w:pPr>
+      <w:r>
+        <w:t>These examples illustrate some of many more autonomous and adaptive strategies that water users can adopt within a water accounting framework.</w:t>
+      </w:r>
+    </w:p>
+    <w:p>
+      <w:pPr>
+        <w:pStyle w:val="Heading1"/>
+      </w:pPr>
+      <w:r>
+        <w:t>Discussion</w:t>
+      </w:r>
+    </w:p>
+    <w:p>
+      <w:pPr>
+        <w:rPr>
+          <w:rFonts w:asciiTheme="majorBidi" w:hAnsiTheme="majorBidi" w:cstheme="majorBidi"/>
+          <w:sz w:val="24"/>
+          <w:szCs w:val="24"/>
+        </w:rPr>
+      </w:pPr>
+      <w:r>
+        <w:rPr>
+          <w:rFonts w:asciiTheme="majorBidi" w:hAnsiTheme="majorBidi" w:cstheme="majorBidi"/>
+          <w:sz w:val="24"/>
+          <w:szCs w:val="24"/>
+        </w:rPr>
+        <w:t xml:space="preserve">We report numerous Lake Mead water conservation program successes, including that the program has conserved more water than any other Colorado River Basin conservation program to date. </w:t>
+      </w:r>
+      <w:r>
+        <w:rPr>
+          <w:rFonts w:asciiTheme="majorBidi" w:hAnsiTheme="majorBidi" w:cstheme="majorBidi"/>
+          <w:sz w:val="24"/>
+          <w:szCs w:val="24"/>
+        </w:rPr>
+        <w:t>Presently, some now 3.6 million acre-feet of c</w:t>
+      </w:r>
+      <w:r>
+        <w:rPr>
+          <w:rFonts w:asciiTheme="majorBidi" w:hAnsiTheme="majorBidi" w:cstheme="majorBidi"/>
+          <w:sz w:val="24"/>
+          <w:szCs w:val="24"/>
+        </w:rPr>
+        <w:t>onserved water remain</w:t>
+      </w:r>
+      <w:r>
+        <w:rPr>
+          <w:rFonts w:asciiTheme="majorBidi" w:hAnsiTheme="majorBidi" w:cstheme="majorBidi"/>
+          <w:sz w:val="24"/>
+          <w:szCs w:val="24"/>
+        </w:rPr>
+        <w:t>s</w:t>
+      </w:r>
+      <w:r>
+        <w:rPr>
+          <w:rFonts w:asciiTheme="majorBidi" w:hAnsiTheme="majorBidi" w:cstheme="majorBidi"/>
+          <w:sz w:val="24"/>
+          <w:szCs w:val="24"/>
+        </w:rPr>
+        <w:t xml:space="preserve"> in Lake Mead—quadruple the volume of ~ 700,000 acre-feet reported through 2015 </w:t>
+      </w:r>
+      <w:r>
+        <w:rPr>
+          <w:rFonts w:asciiTheme="majorBidi" w:hAnsiTheme="majorBidi" w:cstheme="majorBidi"/>
+          <w:sz w:val="24"/>
+          <w:szCs w:val="24"/>
+        </w:rPr>
+        <w:fldChar w:fldCharType="begin"/>
+      </w:r>
+      <w:r>
+        <w:rPr>
+          <w:rFonts w:asciiTheme="majorBidi" w:hAnsiTheme="majorBidi" w:cstheme="majorBidi"/>
+          <w:sz w:val="24"/>
+          <w:szCs w:val="24"/>
+        </w:rPr>
+        <w:instrText xml:space="preserve"> ADDIN EN.CITE &lt;EndNote&gt;&lt;Cite&gt;&lt;Author&gt;Robison&lt;/Author&gt;&lt;Year&gt;2017&lt;/Year&gt;&lt;RecNum&gt;3108&lt;/RecNum&gt;&lt;DisplayText&gt;(Robison, 2017)&lt;/DisplayText&gt;&lt;record&gt;&lt;rec-number&gt;3108&lt;/rec-number&gt;&lt;foreign-keys&gt;&lt;key app="EN" db-id="xxt5ta9pd995dwesap0pdzzp2weaz0w9werf" timestamp="1776460861"&gt;3108&lt;/key&gt;&lt;/foreign-keys&gt;&lt;ref-type name="Journal Article"&gt;17&lt;/ref-type&gt;&lt;contributors&gt;&lt;authors&gt;&lt;author&gt;Jason Anthony Robison&lt;/author&gt;&lt;/authors&gt;&lt;/contributors&gt;&lt;titles&gt;&lt;title&gt;The Colorado River Revisited&lt;/title&gt;&lt;secondary-title&gt;University of Colorado Law Review&lt;/secondary-title&gt;&lt;/titles&gt;&lt;periodical&gt;&lt;full-title&gt;University of Colorado Law Review&lt;/full-title&gt;&lt;/periodical&gt;&lt;volume&gt;88&lt;/volume&gt;&lt;number&gt;3&lt;/number&gt;&lt;dates&gt;&lt;year&gt;2017&lt;/year&gt;&lt;/dates&gt;&lt;urls&gt;&lt;related-urls&gt;&lt;url&gt;https://heinonline.org/HOL/Page?handle=hein.journals/ucollr88&amp;amp;id=511&amp;amp;collection=journals&amp;amp;index=&lt;/url&gt;&lt;/related-urls&gt;&lt;/urls&gt;&lt;/record&gt;&lt;/Cite&gt;&lt;/EndNote&gt;</w:instrText>
+      </w:r>
+      <w:r>
+        <w:rPr>
+          <w:rFonts w:asciiTheme="majorBidi" w:hAnsiTheme="majorBidi" w:cstheme="majorBidi"/>
+          <w:sz w:val="24"/>
+          <w:szCs w:val="24"/>
+        </w:rPr>
+        <w:fldChar w:fldCharType="separate"/>
+      </w:r>
+      <w:r>
+        <w:rPr>
+          <w:rFonts w:asciiTheme="majorBidi" w:hAnsiTheme="majorBidi" w:cstheme="majorBidi"/>
+          <w:noProof/>
+          <w:sz w:val="24"/>
+          <w:szCs w:val="24"/>
+        </w:rPr>
+        <w:t>(Robison, 2017)</w:t>
+      </w:r>
+      <w:r>
+        <w:rPr>
+          <w:rFonts w:asciiTheme="majorBidi" w:hAnsiTheme="majorBidi" w:cstheme="majorBidi"/>
+          <w:sz w:val="24"/>
+          <w:szCs w:val="24"/>
+        </w:rPr>
+        <w:fldChar w:fldCharType="end"/>
+      </w:r>
+      <w:r>
+        <w:rPr>
+          <w:rFonts w:asciiTheme="majorBidi" w:hAnsiTheme="majorBidi" w:cstheme="majorBidi"/>
+          <w:sz w:val="24"/>
+          <w:szCs w:val="24"/>
+        </w:rPr>
+        <w:t>.</w:t>
+      </w:r>
+      <w:r>
+        <w:rPr>
+          <w:rFonts w:asciiTheme="majorBidi" w:hAnsiTheme="majorBidi" w:cstheme="majorBidi"/>
+          <w:sz w:val="24"/>
+          <w:szCs w:val="24"/>
+        </w:rPr>
+        <w:t xml:space="preserve"> Since 2022, conservation efforts by California, Arizona, Nevada, and Mexico have kept Lake Mead above </w:t>
+      </w:r>
+      <w:r>
+        <w:rPr>
+          <w:rFonts w:asciiTheme="majorBidi" w:hAnsiTheme="majorBidi" w:cstheme="majorBidi"/>
+          <w:sz w:val="24"/>
+          <w:szCs w:val="24"/>
+        </w:rPr>
+        <w:t>its</w:t>
+      </w:r>
+      <w:r>
+        <w:rPr>
+          <w:rFonts w:asciiTheme="majorBidi" w:hAnsiTheme="majorBidi" w:cstheme="majorBidi"/>
+          <w:sz w:val="24"/>
+          <w:szCs w:val="24"/>
+        </w:rPr>
+        <w:t xml:space="preserve"> protection elevation of 1,020 feet set in the 2019 Lower Drought Contingency Plan.</w:t>
+      </w:r>
+    </w:p>
+    <w:p>
+      <w:pPr>
+        <w:rPr>
+          <w:rFonts w:asciiTheme="majorBidi" w:hAnsiTheme="majorBidi" w:cstheme="majorBidi"/>
+          <w:sz w:val="24"/>
+          <w:szCs w:val="24"/>
+        </w:rPr>
+      </w:pPr>
+      <w:r>
+        <w:rPr>
+          <w:rFonts w:asciiTheme="majorBidi" w:hAnsiTheme="majorBidi" w:cstheme="majorBidi"/>
+          <w:sz w:val="24"/>
+          <w:szCs w:val="24"/>
+        </w:rPr>
+        <w:t>To expand program participation and increase operational flexibility, p</w:t>
+      </w:r>
+      <w:r>
+        <w:rPr>
+          <w:rFonts w:asciiTheme="majorBidi" w:hAnsiTheme="majorBidi" w:cstheme="majorBidi"/>
+          <w:sz w:val="24"/>
+          <w:szCs w:val="24"/>
+        </w:rPr>
+        <w:t xml:space="preserve">rior researchers </w:t>
+      </w:r>
+      <w:r>
+        <w:rPr>
+          <w:rFonts w:asciiTheme="majorBidi" w:hAnsiTheme="majorBidi" w:cstheme="majorBidi"/>
+          <w:sz w:val="24"/>
+          <w:szCs w:val="24"/>
+        </w:rPr>
+        <w:t xml:space="preserve">suggested to raise caps on water conservation account balances </w:t>
+      </w:r>
+      <w:r>
+        <w:rPr>
+          <w:rFonts w:asciiTheme="majorBidi" w:hAnsiTheme="majorBidi" w:cstheme="majorBidi"/>
+          <w:sz w:val="24"/>
+          <w:szCs w:val="24"/>
+        </w:rPr>
+        <w:fldChar w:fldCharType="begin"/>
+      </w:r>
+      <w:r>
+        <w:rPr>
+          <w:rFonts w:asciiTheme="majorBidi" w:hAnsiTheme="majorBidi" w:cstheme="majorBidi"/>
+          <w:sz w:val="24"/>
+          <w:szCs w:val="24"/>
+        </w:rPr>
+        <w:instrText xml:space="preserve"> ADDIN EN.CITE &lt;EndNote&gt;&lt;Cite&gt;&lt;Author&gt;Robison&lt;/Author&gt;&lt;Year&gt;2017&lt;/Year&gt;&lt;RecNum&gt;3108&lt;/RecNum&gt;&lt;DisplayText&gt;(Fleck and Udall, 2021; Robison, 2017)&lt;/DisplayText&gt;&lt;record&gt;&lt;rec-number&gt;3108&lt;/rec-number&gt;&lt;foreign-keys&gt;&lt;key app="EN" db-id="xxt5ta9pd995dwesap0pdzzp2weaz0w9werf" timestamp="1776460861"&gt;3108&lt;/key&gt;&lt;/foreign-keys&gt;&lt;ref-type name="Journal Article"&gt;17&lt;/ref-type&gt;&lt;contributors&gt;&lt;authors&gt;&lt;author&gt;Jason Anthony Robison&lt;/author&gt;&lt;/authors&gt;&lt;/contributors&gt;&lt;titles&gt;&lt;title&gt;The Colorado River Revisited&lt;/title&gt;&lt;secondary-title&gt;University of Colorado Law Review&lt;/secondary-title&gt;&lt;/titles&gt;&lt;periodical&gt;&lt;full-title&gt;University of Colorado Law Review&lt;/full-title&gt;&lt;/periodical&gt;&lt;volume&gt;88&lt;/volume&gt;&lt;number&gt;3&lt;/number&gt;&lt;dates&gt;&lt;year&gt;2017&lt;/year&gt;&lt;/dates&gt;&lt;urls&gt;&lt;related-urls&gt;&lt;url&gt;https://heinonline.org/HOL/Page?handle=hein.journals/ucollr88&amp;amp;id=511&amp;amp;collection=journals&amp;amp;index=&lt;/url&gt;&lt;/related-urls&gt;&lt;/urls&gt;&lt;/record&gt;&lt;/Cite&gt;&lt;Cite&gt;&lt;Author&gt;Fleck&lt;/Author&gt;&lt;Year&gt;2021&lt;/Year&gt;&lt;RecNum&gt;2801&lt;/RecNum&gt;&lt;record&gt;&lt;rec-number&gt;2801&lt;/rec-number&gt;&lt;foreign-keys&gt;&lt;key app="EN" db-id="xxt5ta9pd995dwesap0pdzzp2weaz0w9werf" timestamp="1624662415"&gt;2801&lt;/key&gt;&lt;/foreign-keys&gt;&lt;ref-type name="Journal Article"&gt;17&lt;/ref-type&gt;&lt;contributors&gt;&lt;authors&gt;&lt;author&gt;Fleck, John&lt;/author&gt;&lt;author&gt;Udall, Brad&lt;/author&gt;&lt;/authors&gt;&lt;/contributors&gt;&lt;titles&gt;&lt;title&gt;Managing Colorado River risk&lt;/title&gt;&lt;secondary-title&gt;Science&lt;/secondary-title&gt;&lt;/titles&gt;&lt;periodical&gt;&lt;full-title&gt;Science&lt;/full-title&gt;&lt;/periodical&gt;&lt;pages&gt;885-885&lt;/pages&gt;&lt;volume&gt;372&lt;/volume&gt;&lt;number&gt;6545&lt;/number&gt;&lt;dates&gt;&lt;year&gt;2021&lt;/year&gt;&lt;/dates&gt;&lt;urls&gt;&lt;related-urls&gt;&lt;url&gt;https://science.sciencemag.org/content/sci/372/6545/885.full.pdf&lt;/url&gt;&lt;/related-urls&gt;&lt;/urls&gt;&lt;electronic-resource-num&gt;https://doi.org/10.1126/science.abj5498&lt;/electronic-resource-num&gt;&lt;/record&gt;&lt;/Cite&gt;&lt;/EndNote&gt;</w:instrText>
+      </w:r>
+      <w:r>
+        <w:rPr>
+          <w:rFonts w:asciiTheme="majorBidi" w:hAnsiTheme="majorBidi" w:cstheme="majorBidi"/>
+          <w:sz w:val="24"/>
+          <w:szCs w:val="24"/>
+        </w:rPr>
+        <w:fldChar w:fldCharType="separate"/>
+      </w:r>
+      <w:r>
+        <w:rPr>
+          <w:rFonts w:asciiTheme="majorBidi" w:hAnsiTheme="majorBidi" w:cstheme="majorBidi"/>
+          <w:noProof/>
+          <w:sz w:val="24"/>
+          <w:szCs w:val="24"/>
+        </w:rPr>
+        <w:t>(Fleck and Udall, 2021; Robison, 2017)</w:t>
+      </w:r>
+      <w:r>
+        <w:rPr>
+          <w:rFonts w:asciiTheme="majorBidi" w:hAnsiTheme="majorBidi" w:cstheme="majorBidi"/>
+          <w:sz w:val="24"/>
+          <w:szCs w:val="24"/>
+        </w:rPr>
+        <w:fldChar w:fldCharType="end"/>
+      </w:r>
+      <w:r>
+        <w:rPr>
+          <w:rFonts w:asciiTheme="majorBidi" w:hAnsiTheme="majorBidi" w:cstheme="majorBidi"/>
+          <w:sz w:val="24"/>
+          <w:szCs w:val="24"/>
+        </w:rPr>
+        <w:t xml:space="preserve">. </w:t>
+      </w:r>
+      <w:r>
+        <w:rPr>
+          <w:rFonts w:asciiTheme="majorBidi" w:hAnsiTheme="majorBidi" w:cstheme="majorBidi"/>
+          <w:sz w:val="24"/>
+          <w:szCs w:val="24"/>
+        </w:rPr>
+        <w:t>I</w:t>
+      </w:r>
+      <w:r>
+        <w:rPr>
+          <w:rFonts w:asciiTheme="majorBidi" w:hAnsiTheme="majorBidi" w:cstheme="majorBidi"/>
+          <w:sz w:val="24"/>
+          <w:szCs w:val="24"/>
+        </w:rPr>
+        <w:t xml:space="preserve">n </w:t>
+      </w:r>
+      <w:r>
+        <w:rPr>
+          <w:rFonts w:asciiTheme="majorBidi" w:hAnsiTheme="majorBidi" w:cstheme="majorBidi"/>
+          <w:sz w:val="24"/>
+          <w:szCs w:val="24"/>
+        </w:rPr>
+        <w:t>2020</w:t>
+      </w:r>
+      <w:r>
+        <w:rPr>
+          <w:rFonts w:asciiTheme="majorBidi" w:hAnsiTheme="majorBidi" w:cstheme="majorBidi"/>
+          <w:sz w:val="24"/>
+          <w:szCs w:val="24"/>
+        </w:rPr>
+        <w:t xml:space="preserve">, </w:t>
+      </w:r>
+      <w:r>
+        <w:rPr>
+          <w:rFonts w:asciiTheme="majorBidi" w:hAnsiTheme="majorBidi" w:cstheme="majorBidi"/>
+          <w:sz w:val="24"/>
+          <w:szCs w:val="24"/>
+        </w:rPr>
+        <w:t>total account</w:t>
+      </w:r>
+      <w:r>
+        <w:rPr>
+          <w:rFonts w:asciiTheme="majorBidi" w:hAnsiTheme="majorBidi" w:cstheme="majorBidi"/>
+          <w:sz w:val="24"/>
+          <w:szCs w:val="24"/>
+        </w:rPr>
+        <w:t xml:space="preserve"> balances exceeded the 2.7 million acre-feet maximum balance defined in the 2019 Drought Contingency Plan</w:t>
+      </w:r>
+      <w:r>
+        <w:rPr>
+          <w:rFonts w:asciiTheme="majorBidi" w:hAnsiTheme="majorBidi" w:cstheme="majorBidi"/>
+          <w:sz w:val="24"/>
+          <w:szCs w:val="24"/>
+        </w:rPr>
+        <w:t xml:space="preserve"> </w:t>
+      </w:r>
+      <w:r>
+        <w:rPr>
+          <w:rFonts w:asciiTheme="majorBidi" w:hAnsiTheme="majorBidi" w:cstheme="majorBidi"/>
+          <w:sz w:val="24"/>
+          <w:szCs w:val="24"/>
+        </w:rPr>
+        <w:fldChar w:fldCharType="begin"/>
+      </w:r>
+      <w:r>
+        <w:rPr>
+          <w:rFonts w:asciiTheme="majorBidi" w:hAnsiTheme="majorBidi" w:cstheme="majorBidi"/>
+          <w:sz w:val="24"/>
+          <w:szCs w:val="24"/>
+        </w:rPr>
+        <w:instrText xml:space="preserve"> ADDIN EN.CITE &lt;EndNote&gt;&lt;Cite&gt;&lt;Author&gt;USBR&lt;/Author&gt;&lt;Year&gt;2019&lt;/Year&gt;&lt;RecNum&gt;2578&lt;/RecNum&gt;&lt;DisplayText&gt;(USBR, 2019)&lt;/DisplayText&gt;&lt;record&gt;&lt;rec-number&gt;2578&lt;/rec-number&gt;&lt;foreign-keys&gt;&lt;key app="EN" db-id="xxt5ta9pd995dwesap0pdzzp2weaz0w9werf" timestamp="1554700022"&gt;2578&lt;/key&gt;&lt;/foreign-keys&gt;&lt;ref-type name="Report"&gt;27&lt;/ref-type&gt;&lt;contributors&gt;&lt;authors&gt;&lt;author&gt;USBR&lt;/author&gt;&lt;/authors&gt;&lt;/contributors&gt;&lt;titles&gt;&lt;title&gt;Agreement Concerning Colorado River Drought Contingency Management and Operations&lt;/title&gt;&lt;/titles&gt;&lt;pages&gt;56&lt;/pages&gt;&lt;dates&gt;&lt;year&gt;2019&lt;/year&gt;&lt;pub-dates&gt;&lt;date&gt;May 20&lt;/date&gt;&lt;/pub-dates&gt;&lt;/dates&gt;&lt;pub-location&gt;Washington, DC&lt;/pub-location&gt;&lt;publisher&gt;U.S. Bureau of Reclamation&lt;/publisher&gt;&lt;urls&gt;&lt;related-urls&gt;&lt;url&gt;https://www.usbr.gov/ColoradoRiverBasin/dcp/index.html&lt;/url&gt;&lt;/related-urls&gt;&lt;/urls&gt;&lt;/record&gt;&lt;/Cite&gt;&lt;/EndNote&gt;</w:instrText>
+      </w:r>
+      <w:r>
+        <w:rPr>
+          <w:rFonts w:asciiTheme="majorBidi" w:hAnsiTheme="majorBidi" w:cstheme="majorBidi"/>
+          <w:sz w:val="24"/>
+          <w:szCs w:val="24"/>
+        </w:rPr>
+        <w:fldChar w:fldCharType="separate"/>
+      </w:r>
+      <w:r>
+        <w:rPr>
+          <w:rFonts w:asciiTheme="majorBidi" w:hAnsiTheme="majorBidi" w:cstheme="majorBidi"/>
+          <w:noProof/>
+          <w:sz w:val="24"/>
+          <w:szCs w:val="24"/>
+        </w:rPr>
+        <w:t>(USBR, 2019)</w:t>
+      </w:r>
+      <w:r>
+        <w:rPr>
+          <w:rFonts w:asciiTheme="majorBidi" w:hAnsiTheme="majorBidi" w:cstheme="majorBidi"/>
+          <w:sz w:val="24"/>
+          <w:szCs w:val="24"/>
+        </w:rPr>
+        <w:fldChar w:fldCharType="end"/>
+      </w:r>
+      <w:r>
+        <w:rPr>
+          <w:rFonts w:asciiTheme="majorBidi" w:hAnsiTheme="majorBidi" w:cstheme="majorBidi"/>
+          <w:sz w:val="24"/>
+          <w:szCs w:val="24"/>
+        </w:rPr>
+        <w:t>.</w:t>
+      </w:r>
+      <w:r>
+        <w:rPr>
+          <w:rFonts w:asciiTheme="majorBidi" w:hAnsiTheme="majorBidi" w:cstheme="majorBidi"/>
+          <w:sz w:val="24"/>
+          <w:szCs w:val="24"/>
+        </w:rPr>
+        <w:t xml:space="preserve"> A second suggestion would allow movement of voluntarily conserved water from Lake Mead upstream to Lake Powell </w:t>
+      </w:r>
+      <w:r>
+        <w:rPr>
+          <w:rFonts w:asciiTheme="majorBidi" w:hAnsiTheme="majorBidi" w:cstheme="majorBidi"/>
+          <w:sz w:val="24"/>
+          <w:szCs w:val="24"/>
+        </w:rPr>
+        <w:fldChar w:fldCharType="begin"/>
+      </w:r>
+      <w:r>
+        <w:rPr>
+          <w:rFonts w:asciiTheme="majorBidi" w:hAnsiTheme="majorBidi" w:cstheme="majorBidi"/>
+          <w:sz w:val="24"/>
+          <w:szCs w:val="24"/>
+        </w:rPr>
+        <w:instrText xml:space="preserve"> ADDIN EN.CITE &lt;EndNote&gt;&lt;Cite&gt;&lt;Author&gt;USBR&lt;/Author&gt;&lt;Year&gt;2026&lt;/Year&gt;&lt;RecNum&gt;3107&lt;/RecNum&gt;&lt;DisplayText&gt;(USBR, 2026b)&lt;/DisplayText&gt;&lt;record&gt;&lt;rec-number&gt;3107&lt;/rec-number&gt;&lt;foreign-keys&gt;&lt;key app="EN" db-id="xxt5ta9pd995dwesap0pdzzp2weaz0w9werf" timestamp="1772056442"&gt;3107&lt;/key&gt;&lt;/foreign-keys&gt;&lt;ref-type name="Report"&gt;27&lt;/ref-type&gt;&lt;contributors&gt;&lt;authors&gt;&lt;author&gt;USBR&lt;/author&gt;&lt;/authors&gt;&lt;/contributors&gt;&lt;titles&gt;&lt;title&gt;Post-2026 Operational Guidelines and Strategies for Lake Powell and Lake Mead – Draft Environmental Impact Statement&lt;/title&gt;&lt;/titles&gt;&lt;dates&gt;&lt;year&gt;2026&lt;/year&gt;&lt;/dates&gt;&lt;publisher&gt;U.S. Bureau of Reclamation&lt;/publisher&gt;&lt;urls&gt;&lt;related-urls&gt;&lt;url&gt;https://www.usbr.gov/ColoradoRiverBasin/post2026/draft-eis/&lt;/url&gt;&lt;/related-urls&gt;&lt;/urls&gt;&lt;/record&gt;&lt;/Cite&gt;&lt;/EndNote&gt;</w:instrText>
+      </w:r>
+      <w:r>
+        <w:rPr>
+          <w:rFonts w:asciiTheme="majorBidi" w:hAnsiTheme="majorBidi" w:cstheme="majorBidi"/>
+          <w:sz w:val="24"/>
+          <w:szCs w:val="24"/>
+        </w:rPr>
+        <w:fldChar w:fldCharType="separate"/>
+      </w:r>
+      <w:r>
+        <w:rPr>
+          <w:rFonts w:asciiTheme="majorBidi" w:hAnsiTheme="majorBidi" w:cstheme="majorBidi"/>
+          <w:noProof/>
+          <w:sz w:val="24"/>
+          <w:szCs w:val="24"/>
+        </w:rPr>
+        <w:t>(USBR, 2026b)</w:t>
+      </w:r>
+      <w:r>
+        <w:rPr>
+          <w:rFonts w:asciiTheme="majorBidi" w:hAnsiTheme="majorBidi" w:cstheme="majorBidi"/>
+          <w:sz w:val="24"/>
+          <w:szCs w:val="24"/>
+        </w:rPr>
+        <w:fldChar w:fldCharType="end"/>
+      </w:r>
+      <w:r>
+        <w:rPr>
+          <w:rFonts w:asciiTheme="majorBidi" w:hAnsiTheme="majorBidi" w:cstheme="majorBidi"/>
+          <w:sz w:val="24"/>
+          <w:szCs w:val="24"/>
+        </w:rPr>
+        <w:t>.</w:t>
+      </w:r>
+    </w:p>
+    <w:p>
+      <w:pPr>
+        <w:rPr>
+          <w:rFonts w:asciiTheme="majorBidi" w:hAnsiTheme="majorBidi" w:cstheme="majorBidi"/>
+          <w:sz w:val="24"/>
+          <w:szCs w:val="24"/>
+        </w:rPr>
+      </w:pPr>
+      <w:r>
+        <w:rPr>
+          <w:rFonts w:asciiTheme="majorBidi" w:hAnsiTheme="majorBidi" w:cstheme="majorBidi"/>
+          <w:sz w:val="24"/>
+          <w:szCs w:val="24"/>
+        </w:rPr>
+        <w:t xml:space="preserve">Other proposals placed additional constraints on the program </w:t>
+      </w:r>
+      <w:r>
+        <w:rPr>
+          <w:rFonts w:asciiTheme="majorBidi" w:hAnsiTheme="majorBidi" w:cstheme="majorBidi"/>
+          <w:sz w:val="24"/>
+          <w:szCs w:val="24"/>
+        </w:rPr>
+        <w:t>that we believe will</w:t>
+      </w:r>
+      <w:r>
+        <w:rPr>
+          <w:rFonts w:asciiTheme="majorBidi" w:hAnsiTheme="majorBidi" w:cstheme="majorBidi"/>
+          <w:sz w:val="24"/>
+          <w:szCs w:val="24"/>
+        </w:rPr>
+        <w:t xml:space="preserve"> limit </w:t>
+      </w:r>
+      <w:r>
+        <w:rPr>
+          <w:rFonts w:asciiTheme="majorBidi" w:hAnsiTheme="majorBidi" w:cstheme="majorBidi"/>
+          <w:sz w:val="24"/>
+          <w:szCs w:val="24"/>
+        </w:rPr>
+        <w:t>participation and user autonomy.</w:t>
+      </w:r>
+      <w:r>
+        <w:rPr>
+          <w:rFonts w:asciiTheme="majorBidi" w:hAnsiTheme="majorBidi" w:cstheme="majorBidi"/>
+          <w:sz w:val="24"/>
+          <w:szCs w:val="24"/>
+        </w:rPr>
+        <w:t xml:space="preserve"> </w:t>
+      </w:r>
+      <w:r>
+        <w:rPr>
+          <w:rFonts w:asciiTheme="majorBidi" w:hAnsiTheme="majorBidi" w:cstheme="majorBidi"/>
+          <w:sz w:val="24"/>
+          <w:szCs w:val="24"/>
+        </w:rPr>
+        <w:t xml:space="preserve">For example, </w:t>
+      </w:r>
+      <w:r>
+        <w:rPr>
+          <w:rFonts w:asciiTheme="majorBidi" w:hAnsiTheme="majorBidi" w:cstheme="majorBidi"/>
+          <w:sz w:val="24"/>
+          <w:szCs w:val="24"/>
+        </w:rPr>
+        <w:fldChar w:fldCharType="begin"/>
+      </w:r>
+      <w:r>
+        <w:rPr>
+          <w:rFonts w:asciiTheme="majorBidi" w:hAnsiTheme="majorBidi" w:cstheme="majorBidi"/>
+          <w:sz w:val="24"/>
+          <w:szCs w:val="24"/>
+        </w:rPr>
+        <w:instrText xml:space="preserve"> ADDIN EN.CITE &lt;EndNote&gt;&lt;Cite AuthorYear="1"&gt;&lt;Author&gt;Colby&lt;/Author&gt;&lt;Year&gt;2025&lt;/Year&gt;&lt;RecNum&gt;3109&lt;/RecNum&gt;&lt;DisplayText&gt;Colby et al. (2025)&lt;/DisplayText&gt;&lt;record&gt;&lt;rec-number&gt;3109&lt;/rec-number&gt;&lt;foreign-keys&gt;&lt;key app="EN" db-id="xxt5ta9pd995dwesap0pdzzp2weaz0w9werf" timestamp="1776466532"&gt;3109&lt;/key&gt;&lt;/foreign-keys&gt;&lt;ref-type name="Journal Article"&gt;17&lt;/ref-type&gt;&lt;contributors&gt;&lt;authors&gt;&lt;author&gt;Colby, Bonnie&lt;/author&gt;&lt;author&gt;Hansen, Kristiana&lt;/author&gt;&lt;author&gt;Sorensen, Kathryn&lt;/author&gt;&lt;/authors&gt;&lt;/contributors&gt;&lt;titles&gt;&lt;title&gt;Policy Nook — Policy Note: Tough Tradeoffs in the Colorado River Basin&lt;/title&gt;&lt;secondary-title&gt;Water Economics and Policy&lt;/secondary-title&gt;&lt;/titles&gt;&lt;periodical&gt;&lt;full-title&gt;Water Economics and Policy&lt;/full-title&gt;&lt;/periodical&gt;&lt;pages&gt;2471002&lt;/pages&gt;&lt;volume&gt;11&lt;/volume&gt;&lt;number&gt;04&lt;/number&gt;&lt;keywords&gt;&lt;keyword&gt;Colorado River Basin,water shortage,water conservation,water equity,tribal water&lt;/keyword&gt;&lt;/keywords&gt;&lt;dates&gt;&lt;year&gt;2025&lt;/year&gt;&lt;/dates&gt;&lt;urls&gt;&lt;related-urls&gt;&lt;url&gt;https://www.worldscientific.com/doi/abs/10.1142/S2382624X24710024&lt;/url&gt;&lt;/related-urls&gt;&lt;/urls&gt;&lt;electronic-resource-num&gt;10.1142/s2382624x24710024&lt;/electronic-resource-num&gt;&lt;/record&gt;&lt;/Cite&gt;&lt;/EndNote&gt;</w:instrText>
+      </w:r>
+      <w:r>
+        <w:rPr>
+          <w:rFonts w:asciiTheme="majorBidi" w:hAnsiTheme="majorBidi" w:cstheme="majorBidi"/>
+          <w:sz w:val="24"/>
+          <w:szCs w:val="24"/>
+        </w:rPr>
+        <w:fldChar w:fldCharType="separate"/>
+      </w:r>
+      <w:r>
+        <w:rPr>
+          <w:rFonts w:asciiTheme="majorBidi" w:hAnsiTheme="majorBidi" w:cstheme="majorBidi"/>
+          <w:noProof/>
+          <w:sz w:val="24"/>
+          <w:szCs w:val="24"/>
+        </w:rPr>
+        <w:t>Colby et al. (2025)</w:t>
+      </w:r>
+      <w:r>
+        <w:rPr>
+          <w:rFonts w:asciiTheme="majorBidi" w:hAnsiTheme="majorBidi" w:cstheme="majorBidi"/>
+          <w:sz w:val="24"/>
+          <w:szCs w:val="24"/>
+        </w:rPr>
+        <w:fldChar w:fldCharType="end"/>
+      </w:r>
+      <w:r>
+        <w:rPr>
+          <w:rFonts w:asciiTheme="majorBidi" w:hAnsiTheme="majorBidi" w:cstheme="majorBidi"/>
+          <w:sz w:val="24"/>
+          <w:szCs w:val="24"/>
+        </w:rPr>
+        <w:t xml:space="preserve"> suggested </w:t>
+      </w:r>
+      <w:r>
+        <w:rPr>
+          <w:rFonts w:asciiTheme="majorBidi" w:hAnsiTheme="majorBidi" w:cstheme="majorBidi"/>
+          <w:sz w:val="24"/>
+          <w:szCs w:val="24"/>
+        </w:rPr>
+        <w:t>that</w:t>
+      </w:r>
+      <w:r>
+        <w:rPr>
+          <w:rFonts w:asciiTheme="majorBidi" w:hAnsiTheme="majorBidi" w:cstheme="majorBidi"/>
+          <w:sz w:val="24"/>
+          <w:szCs w:val="24"/>
+        </w:rPr>
+        <w:t xml:space="preserve"> 50% of conserved water remain in Lake Mead as system water.</w:t>
+      </w:r>
+      <w:r>
+        <w:rPr>
+          <w:rFonts w:asciiTheme="majorBidi" w:hAnsiTheme="majorBidi" w:cstheme="majorBidi"/>
+          <w:sz w:val="24"/>
+          <w:szCs w:val="24"/>
+        </w:rPr>
+        <w:t xml:space="preserve"> </w:t>
+      </w:r>
+      <w:r>
+        <w:rPr>
+          <w:rFonts w:asciiTheme="majorBidi" w:hAnsiTheme="majorBidi" w:cstheme="majorBidi"/>
+          <w:sz w:val="24"/>
+          <w:szCs w:val="24"/>
+        </w:rPr>
+        <w:t xml:space="preserve">Reclamation proposed to </w:t>
+      </w:r>
+      <w:r>
+        <w:rPr>
+          <w:rFonts w:asciiTheme="majorBidi" w:hAnsiTheme="majorBidi" w:cstheme="majorBidi"/>
+          <w:sz w:val="24"/>
+          <w:szCs w:val="24"/>
+        </w:rPr>
+        <w:t>tie</w:t>
+      </w:r>
+      <w:r>
+        <w:rPr>
+          <w:rFonts w:asciiTheme="majorBidi" w:hAnsiTheme="majorBidi" w:cstheme="majorBidi"/>
+          <w:sz w:val="24"/>
+          <w:szCs w:val="24"/>
+        </w:rPr>
+        <w:t xml:space="preserve"> mandatory </w:t>
+      </w:r>
+      <w:r>
+        <w:rPr>
+          <w:rFonts w:asciiTheme="majorBidi" w:hAnsiTheme="majorBidi" w:cstheme="majorBidi"/>
+          <w:sz w:val="24"/>
+          <w:szCs w:val="24"/>
+        </w:rPr>
+        <w:lastRenderedPageBreak/>
+        <w:t>shortages to the anticipated Lake Mead level if there was no voluntary</w:t>
+      </w:r>
+      <w:r>
+        <w:rPr>
+          <w:rFonts w:asciiTheme="majorBidi" w:hAnsiTheme="majorBidi" w:cstheme="majorBidi"/>
+          <w:sz w:val="24"/>
+          <w:szCs w:val="24"/>
+        </w:rPr>
+        <w:t xml:space="preserve"> water conservation</w:t>
+      </w:r>
+      <w:r>
+        <w:rPr>
+          <w:rFonts w:asciiTheme="majorBidi" w:hAnsiTheme="majorBidi" w:cstheme="majorBidi"/>
+          <w:sz w:val="24"/>
+          <w:szCs w:val="24"/>
+        </w:rPr>
+        <w:t xml:space="preserve"> activity</w:t>
+      </w:r>
+      <w:r>
+        <w:rPr>
+          <w:rFonts w:asciiTheme="majorBidi" w:hAnsiTheme="majorBidi" w:cstheme="majorBidi"/>
+          <w:sz w:val="24"/>
+          <w:szCs w:val="24"/>
+        </w:rPr>
+        <w:t xml:space="preserve"> </w:t>
+      </w:r>
+      <w:r>
+        <w:rPr>
+          <w:rFonts w:asciiTheme="majorBidi" w:hAnsiTheme="majorBidi" w:cstheme="majorBidi"/>
+          <w:sz w:val="24"/>
+          <w:szCs w:val="24"/>
+        </w:rPr>
+        <w:fldChar w:fldCharType="begin"/>
+      </w:r>
+      <w:r>
+        <w:rPr>
+          <w:rFonts w:asciiTheme="majorBidi" w:hAnsiTheme="majorBidi" w:cstheme="majorBidi"/>
+          <w:sz w:val="24"/>
+          <w:szCs w:val="24"/>
+        </w:rPr>
+        <w:instrText xml:space="preserve"> ADDIN EN.CITE &lt;EndNote&gt;&lt;Cite&gt;&lt;Author&gt;USBR&lt;/Author&gt;&lt;Year&gt;2026&lt;/Year&gt;&lt;RecNum&gt;3107&lt;/RecNum&gt;&lt;DisplayText&gt;(USBR, 2026b)&lt;/DisplayText&gt;&lt;record&gt;&lt;rec-number&gt;3107&lt;/rec-number&gt;&lt;foreign-keys&gt;&lt;key app="EN" db-id="xxt5ta9pd995dwesap0pdzzp2weaz0w9werf" timestamp="1772056442"&gt;3107&lt;/key&gt;&lt;/foreign-keys&gt;&lt;ref-type name="Report"&gt;27&lt;/ref-type&gt;&lt;contributors&gt;&lt;authors&gt;&lt;author&gt;USBR&lt;/author&gt;&lt;/authors&gt;&lt;/contributors&gt;&lt;titles&gt;&lt;title&gt;Post-2026 Operational Guidelines and Strategies for Lake Powell and Lake Mead – Draft Environmental Impact Statement&lt;/title&gt;&lt;/titles&gt;&lt;dates&gt;&lt;year&gt;2026&lt;/year&gt;&lt;/dates&gt;&lt;publisher&gt;U.S. Bureau of Reclamation&lt;/publisher&gt;&lt;urls&gt;&lt;related-urls&gt;&lt;url&gt;https://www.usbr.gov/ColoradoRiverBasin/post2026/draft-eis/&lt;/url&gt;&lt;/related-urls&gt;&lt;/urls&gt;&lt;/record&gt;&lt;/Cite&gt;&lt;/EndNote&gt;</w:instrText>
+      </w:r>
+      <w:r>
+        <w:rPr>
+          <w:rFonts w:asciiTheme="majorBidi" w:hAnsiTheme="majorBidi" w:cstheme="majorBidi"/>
+          <w:sz w:val="24"/>
+          <w:szCs w:val="24"/>
+        </w:rPr>
+        <w:fldChar w:fldCharType="separate"/>
+      </w:r>
+      <w:r>
+        <w:rPr>
+          <w:rFonts w:asciiTheme="majorBidi" w:hAnsiTheme="majorBidi" w:cstheme="majorBidi"/>
+          <w:noProof/>
+          <w:sz w:val="24"/>
+          <w:szCs w:val="24"/>
+        </w:rPr>
+        <w:t>(USBR, 2026b)</w:t>
+      </w:r>
+      <w:r>
+        <w:rPr>
+          <w:rFonts w:asciiTheme="majorBidi" w:hAnsiTheme="majorBidi" w:cstheme="majorBidi"/>
+          <w:sz w:val="24"/>
+          <w:szCs w:val="24"/>
+        </w:rPr>
+        <w:fldChar w:fldCharType="end"/>
+      </w:r>
+      <w:r>
+        <w:rPr>
+          <w:rFonts w:asciiTheme="majorBidi" w:hAnsiTheme="majorBidi" w:cstheme="majorBidi"/>
+          <w:sz w:val="24"/>
+          <w:szCs w:val="24"/>
+        </w:rPr>
+        <w:t xml:space="preserve">. </w:t>
+      </w:r>
+      <w:r>
+        <w:rPr>
+          <w:rFonts w:asciiTheme="majorBidi" w:hAnsiTheme="majorBidi" w:cstheme="majorBidi"/>
+          <w:sz w:val="24"/>
+          <w:szCs w:val="24"/>
+        </w:rPr>
+        <w:t xml:space="preserve">They also proposed to exclude mandatory reductions from the calculation of voluntary credits. </w:t>
+      </w:r>
+      <w:r>
+        <w:rPr>
+          <w:rFonts w:asciiTheme="majorBidi" w:hAnsiTheme="majorBidi" w:cstheme="majorBidi"/>
+          <w:sz w:val="24"/>
+          <w:szCs w:val="24"/>
+        </w:rPr>
+        <w:t>Larger shortages that trigger at higher reservoir levels will help Lake Mead. But there is also a downside. S</w:t>
+      </w:r>
+      <w:r>
+        <w:rPr>
+          <w:rFonts w:asciiTheme="majorBidi" w:hAnsiTheme="majorBidi" w:cstheme="majorBidi"/>
+          <w:sz w:val="24"/>
+          <w:szCs w:val="24"/>
+        </w:rPr>
+        <w:t xml:space="preserve">hortages </w:t>
+      </w:r>
+      <w:r>
+        <w:rPr>
+          <w:rFonts w:asciiTheme="majorBidi" w:hAnsiTheme="majorBidi" w:cstheme="majorBidi"/>
+          <w:sz w:val="24"/>
+          <w:szCs w:val="24"/>
+        </w:rPr>
+        <w:t>will</w:t>
+      </w:r>
+      <w:r>
+        <w:rPr>
+          <w:rFonts w:asciiTheme="majorBidi" w:hAnsiTheme="majorBidi" w:cstheme="majorBidi"/>
+          <w:sz w:val="24"/>
+          <w:szCs w:val="24"/>
+        </w:rPr>
+        <w:t xml:space="preserve"> vary </w:t>
+      </w:r>
+      <w:r>
+        <w:rPr>
+          <w:rFonts w:asciiTheme="majorBidi" w:hAnsiTheme="majorBidi" w:cstheme="majorBidi"/>
+          <w:sz w:val="24"/>
+          <w:szCs w:val="24"/>
+        </w:rPr>
+        <w:t>year-to-yea</w:t>
+      </w:r>
+      <w:r>
+        <w:rPr>
+          <w:rFonts w:asciiTheme="majorBidi" w:hAnsiTheme="majorBidi" w:cstheme="majorBidi"/>
+          <w:sz w:val="24"/>
+          <w:szCs w:val="24"/>
+        </w:rPr>
+        <w:t>r in response to volatile Colorado River flow and Lake Mead or system storage</w:t>
+      </w:r>
+      <w:r>
+        <w:rPr>
+          <w:rFonts w:asciiTheme="majorBidi" w:hAnsiTheme="majorBidi" w:cstheme="majorBidi"/>
+          <w:sz w:val="24"/>
+          <w:szCs w:val="24"/>
+        </w:rPr>
+        <w:t>.</w:t>
+      </w:r>
+      <w:r>
+        <w:rPr>
+          <w:rFonts w:asciiTheme="majorBidi" w:hAnsiTheme="majorBidi" w:cstheme="majorBidi"/>
+          <w:sz w:val="24"/>
+          <w:szCs w:val="24"/>
+        </w:rPr>
+        <w:t xml:space="preserve"> Swings in shortage</w:t>
+      </w:r>
+      <w:r>
+        <w:rPr>
+          <w:rFonts w:asciiTheme="majorBidi" w:hAnsiTheme="majorBidi" w:cstheme="majorBidi"/>
+          <w:sz w:val="24"/>
+          <w:szCs w:val="24"/>
+        </w:rPr>
+        <w:t xml:space="preserve">s limit user’s autonomy and </w:t>
+      </w:r>
+      <w:r>
+        <w:rPr>
+          <w:rFonts w:asciiTheme="majorBidi" w:hAnsiTheme="majorBidi" w:cstheme="majorBidi"/>
+          <w:sz w:val="24"/>
+          <w:szCs w:val="24"/>
+        </w:rPr>
+        <w:t xml:space="preserve">make it difficult for user’s to plan </w:t>
+      </w:r>
+      <w:r>
+        <w:rPr>
+          <w:rFonts w:asciiTheme="majorBidi" w:hAnsiTheme="majorBidi" w:cstheme="majorBidi"/>
+          <w:sz w:val="24"/>
+          <w:szCs w:val="24"/>
+        </w:rPr>
+        <w:t>future</w:t>
+      </w:r>
+      <w:r>
+        <w:rPr>
+          <w:rFonts w:asciiTheme="majorBidi" w:hAnsiTheme="majorBidi" w:cstheme="majorBidi"/>
+          <w:sz w:val="24"/>
+          <w:szCs w:val="24"/>
+        </w:rPr>
+        <w:t xml:space="preserve"> water use. </w:t>
+      </w:r>
+    </w:p>
+    <w:p>
+      <w:pPr>
         <w:rPr>
           <w:rFonts w:asciiTheme="majorBidi" w:hAnsiTheme="majorBidi" w:cstheme="majorBidi"/>
           <w:sz w:val="24"/>
@@ -16608,7 +16394,39 @@
           <w:sz w:val="24"/>
           <w:szCs w:val="24"/>
         </w:rPr>
-        <w:t>their conserved water. Second, credits are awarded as reductions from legal entitlements rather than reductions from the physically available reservoir inflow. This later challenge means Lake Mead can continue to drawdown even as users voluntarily conserve some water. All of these challenges are exacerbated as reservoir inflow declines, a situation that will occur more frequently as the basin becomes more arid</w:t>
+        <w:t xml:space="preserve">their conserved water. Second, credits are awarded as reductions from legal entitlements rather than reductions from the physically available reservoir inflow. This later challenge means Lake Mead can continue to drawdown even as users voluntarily conserve some water. </w:t>
+      </w:r>
+      <w:r>
+        <w:rPr>
+          <w:rFonts w:asciiTheme="majorBidi" w:hAnsiTheme="majorBidi" w:cstheme="majorBidi"/>
+          <w:sz w:val="24"/>
+          <w:szCs w:val="24"/>
+        </w:rPr>
+        <w:t xml:space="preserve">Each </w:t>
+      </w:r>
+      <w:r>
+        <w:rPr>
+          <w:rFonts w:asciiTheme="majorBidi" w:hAnsiTheme="majorBidi" w:cstheme="majorBidi"/>
+          <w:sz w:val="24"/>
+          <w:szCs w:val="24"/>
+        </w:rPr>
+        <w:t>challenge</w:t>
+      </w:r>
+      <w:r>
+        <w:rPr>
+          <w:rFonts w:asciiTheme="majorBidi" w:hAnsiTheme="majorBidi" w:cstheme="majorBidi"/>
+          <w:sz w:val="24"/>
+          <w:szCs w:val="24"/>
+        </w:rPr>
+        <w:t xml:space="preserve"> is</w:t>
+      </w:r>
+      <w:r>
+        <w:rPr>
+          <w:rFonts w:asciiTheme="majorBidi" w:hAnsiTheme="majorBidi" w:cstheme="majorBidi"/>
+          <w:sz w:val="24"/>
+          <w:szCs w:val="24"/>
+        </w:rPr>
+        <w:t xml:space="preserve"> exacerbated as reservoir inflow declines, a situation that will occur more frequently as the basin becomes more arid</w:t>
       </w:r>
       <w:r>
         <w:rPr>
@@ -16826,7 +16644,23 @@
           <w:sz w:val="24"/>
           <w:szCs w:val="24"/>
         </w:rPr>
-        <w:t xml:space="preserve">address the challenge of sustainability head on. Our first proposal constrains total water consumption and credits to be less than the annual reservoir inflow. Our second proposal divides reservoir inflow among </w:t>
+        <w:t xml:space="preserve">address the challenge of sustainability head on. Our first proposal constrains total water consumption and credits to be less than the annual reservoir inflow. Our second proposal </w:t>
+      </w:r>
+      <w:r>
+        <w:rPr>
+          <w:rFonts w:asciiTheme="majorBidi" w:hAnsiTheme="majorBidi" w:cstheme="majorBidi"/>
+          <w:sz w:val="24"/>
+          <w:szCs w:val="24"/>
+        </w:rPr>
+        <w:t>apportions</w:t>
+      </w:r>
+      <w:r>
+        <w:rPr>
+          <w:rFonts w:asciiTheme="majorBidi" w:hAnsiTheme="majorBidi" w:cstheme="majorBidi"/>
+          <w:sz w:val="24"/>
+          <w:szCs w:val="24"/>
+        </w:rPr>
+        <w:t xml:space="preserve"> reservoir inflow among </w:t>
       </w:r>
       <w:r>
         <w:rPr>
@@ -16869,33 +16703,6 @@
           <w:sz w:val="24"/>
           <w:szCs w:val="24"/>
         </w:rPr>
-        <w:t>Water accounts can be created for any users or uses</w:t>
-      </w:r>
-      <w:r>
-        <w:rPr>
-          <w:rFonts w:asciiTheme="majorBidi" w:hAnsiTheme="majorBidi" w:cstheme="majorBidi"/>
-          <w:sz w:val="24"/>
-          <w:szCs w:val="24"/>
-        </w:rPr>
-        <w:t xml:space="preserve"> such as Tribal Nations or endangered species conservation programs.</w:t>
-      </w:r>
-    </w:p>
-    <w:p>
-      <w:pPr>
-        <w:pStyle w:val="ListParagraph"/>
-        <w:numPr>
-          <w:ilvl w:val="0"/>
-          <w:numId w:val="30"/>
-        </w:numPr>
-      </w:pPr>
-      <w:r>
-        <w:rPr>
-          <w:rFonts w:asciiTheme="majorBidi" w:hAnsiTheme="majorBidi" w:cstheme="majorBidi"/>
-          <w:b/>
-          <w:bCs/>
-          <w:sz w:val="24"/>
-          <w:szCs w:val="24"/>
-        </w:rPr>
         <w:t>Current water conservation account balances can be rolled over</w:t>
       </w:r>
       <w:r>
@@ -17012,11 +16819,7 @@
         <w:t xml:space="preserve"> For Reclamation, this is where to set the reservoir protection elevation. Reclamation does not need to consult with the other users. The other water users can more independently adapt their decisions to consume water, conserve water for future use, and trade in response to their account balances, others choices, the discussion of choices, and their perceptions—or fears—of future low flow. There can also be discussion of the (a) volumes, and (b) prices for Reclamation </w:t>
       </w:r>
       <w:r>
-        <w:t xml:space="preserve">and users </w:t>
-      </w:r>
-      <w:r>
-        <w:lastRenderedPageBreak/>
-        <w:t>to purchase water from each other</w:t>
+        <w:t>and users to purchase water from each other</w:t>
       </w:r>
       <w:r>
         <w:t>—purchase volumes and prices that may change from year to year as water becomes more scarce or available.</w:t>
@@ -17090,60 +16893,33 @@
         </w:rPr>
       </w:pPr>
       <w:r>
-        <w:t xml:space="preserve">Without a mandatory water shortage program, </w:t>
-      </w:r>
-      <w:r>
-        <w:t xml:space="preserve">there is </w:t>
-      </w:r>
-      <w:r>
-        <w:t xml:space="preserve">also </w:t>
-      </w:r>
-      <w:del w:id="2" w:author="Erik Christian Porse" w:date="2026-05-27T18:15:00Z" w16du:dateUtc="2026-05-28T01:15:00Z">
-        <w:r>
-          <w:rPr>
-            <w:b/>
-            <w:bCs/>
-          </w:rPr>
-          <w:delText xml:space="preserve">not </w:delText>
-        </w:r>
-      </w:del>
-      <w:ins w:id="3" w:author="Erik Christian Porse" w:date="2026-05-27T18:15:00Z" w16du:dateUtc="2026-05-28T01:15:00Z">
-        <w:r>
-          <w:rPr>
-            <w:b/>
-            <w:bCs/>
-          </w:rPr>
-          <w:t>no</w:t>
-        </w:r>
-        <w:r>
-          <w:rPr>
-            <w:b/>
-            <w:bCs/>
-          </w:rPr>
-          <w:t xml:space="preserve"> </w:t>
-        </w:r>
-      </w:ins>
+        <w:t xml:space="preserve">Water accounting more transparently and flexibly allows use within the </w:t>
+      </w:r>
+      <w:r>
+        <w:t xml:space="preserve">physically </w:t>
+      </w:r>
+      <w:r>
+        <w:t>available water.</w:t>
+      </w:r>
+      <w:r>
+        <w:t xml:space="preserve"> Thus, there is </w:t>
+      </w:r>
       <w:r>
         <w:rPr>
           <w:b/>
           <w:bCs/>
         </w:rPr>
-        <w:t>need for shortage operations contingent on the anticipated reservoir level had users not conserved water</w:t>
-      </w:r>
-      <w:r>
-        <w:t xml:space="preserve"> (operational neutrality)</w:t>
-      </w:r>
-      <w:r>
-        <w:t>.</w:t>
-      </w:r>
-      <w:r>
-        <w:t xml:space="preserve"> Water accounting more transparently and flexibly allows use within the </w:t>
-      </w:r>
-      <w:r>
-        <w:t xml:space="preserve">physically </w:t>
-      </w:r>
-      <w:r>
-        <w:t>available water—reservoir inflow minus the evaporation.</w:t>
+        <w:t>no</w:t>
+      </w:r>
+      <w:r>
+        <w:rPr>
+          <w:b/>
+          <w:bCs/>
+        </w:rPr>
+        <w:t xml:space="preserve"> need for shortage operations contingent on the anticipated reservoir level had users not conserved water</w:t>
+      </w:r>
+      <w:r>
+        <w:t xml:space="preserve"> (operational neutrality).</w:t>
       </w:r>
     </w:p>
     <w:p>
@@ -17206,6 +16982,7 @@
           <w:b/>
           <w:bCs/>
         </w:rPr>
+        <w:lastRenderedPageBreak/>
         <w:t xml:space="preserve">Water accounting can be </w:t>
       </w:r>
       <w:r>
@@ -17272,7 +17049,23 @@
           <w:sz w:val="24"/>
           <w:szCs w:val="24"/>
         </w:rPr>
-        <w:t xml:space="preserve">lso several limitations </w:t>
+        <w:t>lso</w:t>
+      </w:r>
+      <w:r>
+        <w:rPr>
+          <w:rFonts w:asciiTheme="majorBidi" w:hAnsiTheme="majorBidi" w:cstheme="majorBidi"/>
+          <w:sz w:val="24"/>
+          <w:szCs w:val="24"/>
+        </w:rPr>
+        <w:t xml:space="preserve"> l</w:t>
+      </w:r>
+      <w:r>
+        <w:rPr>
+          <w:rFonts w:asciiTheme="majorBidi" w:hAnsiTheme="majorBidi" w:cstheme="majorBidi"/>
+          <w:sz w:val="24"/>
+          <w:szCs w:val="24"/>
+        </w:rPr>
+        <w:t xml:space="preserve">imitations </w:t>
       </w:r>
       <w:r>
         <w:rPr>
@@ -17298,11 +17091,6 @@
           <w:ilvl w:val="0"/>
           <w:numId w:val="31"/>
         </w:numPr>
-        <w:rPr>
-          <w:rFonts w:asciiTheme="majorBidi" w:hAnsiTheme="majorBidi" w:cstheme="majorBidi"/>
-          <w:sz w:val="24"/>
-          <w:szCs w:val="24"/>
-        </w:rPr>
       </w:pPr>
       <w:r>
         <w:rPr>
@@ -17312,15 +17100,41 @@
           <w:sz w:val="24"/>
           <w:szCs w:val="24"/>
         </w:rPr>
-        <w:t xml:space="preserve">Difficult to predict and model users’ choices. </w:t>
-      </w:r>
-      <w:r>
-        <w:rPr>
-          <w:rFonts w:asciiTheme="majorBidi" w:hAnsiTheme="majorBidi" w:cstheme="majorBidi"/>
-          <w:sz w:val="24"/>
-          <w:szCs w:val="24"/>
-        </w:rPr>
-        <w:t xml:space="preserve">Like </w:t>
+        <w:t>Apportionment</w:t>
+      </w:r>
+      <w:r>
+        <w:rPr>
+          <w:rFonts w:asciiTheme="majorBidi" w:hAnsiTheme="majorBidi" w:cstheme="majorBidi"/>
+          <w:b/>
+          <w:bCs/>
+          <w:sz w:val="24"/>
+          <w:szCs w:val="24"/>
+        </w:rPr>
+        <w:t xml:space="preserve"> of Lake Mead inflow</w:t>
+      </w:r>
+      <w:r>
+        <w:rPr>
+          <w:rFonts w:asciiTheme="majorBidi" w:hAnsiTheme="majorBidi" w:cstheme="majorBidi"/>
+          <w:sz w:val="24"/>
+          <w:szCs w:val="24"/>
+        </w:rPr>
+        <w:t xml:space="preserve">. Apportionment </w:t>
+      </w:r>
+      <w:r>
+        <w:rPr>
+          <w:rFonts w:asciiTheme="majorBidi" w:hAnsiTheme="majorBidi" w:cstheme="majorBidi"/>
+          <w:sz w:val="24"/>
+          <w:szCs w:val="24"/>
+        </w:rPr>
+        <w:t xml:space="preserve">of inflow among users </w:t>
+      </w:r>
+      <w:r>
+        <w:rPr>
+          <w:rFonts w:asciiTheme="majorBidi" w:hAnsiTheme="majorBidi" w:cstheme="majorBidi"/>
+          <w:sz w:val="24"/>
+          <w:szCs w:val="24"/>
+        </w:rPr>
+        <w:t xml:space="preserve">can be done by priority, pro rata, a combination, percentage splits of shortages in the Lower Basin Alternative </w:t>
       </w:r>
       <w:r>
         <w:rPr>
@@ -17336,7 +17150,7 @@
           <w:sz w:val="24"/>
           <w:szCs w:val="24"/>
         </w:rPr>
-        <w:instrText xml:space="preserve"> ADDIN EN.CITE &lt;EndNote&gt;&lt;Cite AuthorYear="1"&gt;&lt;Author&gt;Huizar&lt;/Author&gt;&lt;Year&gt;2023&lt;/Year&gt;&lt;RecNum&gt;3110&lt;/RecNum&gt;&lt;DisplayText&gt;Huizar et al. (2023)&lt;/DisplayText&gt;&lt;record&gt;&lt;rec-number&gt;3110&lt;/rec-number&gt;&lt;foreign-keys&gt;&lt;key app="EN" db-id="xxt5ta9pd995dwesap0pdzzp2weaz0w9werf" timestamp="1776715189"&gt;3110&lt;/key&gt;&lt;/foreign-keys&gt;&lt;ref-type name="Journal Article"&gt;17&lt;/ref-type&gt;&lt;contributors&gt;&lt;authors&gt;&lt;author&gt;Luis Huizar&lt;/author&gt;&lt;author&gt;Sarai Díaz&lt;/author&gt;&lt;author&gt;Kevin Lansey&lt;/author&gt;&lt;author&gt;Robert Arnold&lt;/author&gt;&lt;/authors&gt;&lt;/contributors&gt;&lt;titles&gt;&lt;title&gt;Water Supply in the Lower Colorado River Basin: Effectiveness of the 2019 Drought Contingency Plan&lt;/title&gt;&lt;secondary-title&gt;Journal of Environmental Engineering&lt;/secondary-title&gt;&lt;/titles&gt;&lt;periodical&gt;&lt;full-title&gt;Journal of Environmental Engineering&lt;/full-title&gt;&lt;/periodical&gt;&lt;pages&gt;04023058&lt;/pages&gt;&lt;volume&gt;149&lt;/volume&gt;&lt;number&gt;10&lt;/number&gt;&lt;dates&gt;&lt;year&gt;2023&lt;/year&gt;&lt;/dates&gt;&lt;urls&gt;&lt;related-urls&gt;&lt;url&gt;https://ascelibrary.org/doi/abs/10.1061/JOEEDU.EEENG-7324&lt;/url&gt;&lt;/related-urls&gt;&lt;/urls&gt;&lt;electronic-resource-num&gt;doi:10.1061/JOEEDU.EEENG-7324&lt;/electronic-resource-num&gt;&lt;/record&gt;&lt;/Cite&gt;&lt;/EndNote&gt;</w:instrText>
+        <w:instrText xml:space="preserve"> ADDIN EN.CITE &lt;EndNote&gt;&lt;Cite&gt;&lt;Author&gt;Buschatzke&lt;/Author&gt;&lt;Year&gt;2024&lt;/Year&gt;&lt;RecNum&gt;3016&lt;/RecNum&gt;&lt;DisplayText&gt;(Buschatzke et al., 2024)&lt;/DisplayText&gt;&lt;record&gt;&lt;rec-number&gt;3016&lt;/rec-number&gt;&lt;foreign-keys&gt;&lt;key app="EN" db-id="xxt5ta9pd995dwesap0pdzzp2weaz0w9werf" timestamp="1723671806"&gt;3016&lt;/key&gt;&lt;/foreign-keys&gt;&lt;ref-type name="Web Page"&gt;12&lt;/ref-type&gt;&lt;contributors&gt;&lt;authors&gt;&lt;author&gt;Thomas Buschatzke&lt;/author&gt;&lt;author&gt;J.B. Hamby&lt;/author&gt;&lt;author&gt;John Entsminger&lt;/author&gt;&lt;/authors&gt;&lt;/contributors&gt;&lt;titles&gt;&lt;title&gt;Lower Basin Alternative for the Post-2026 Coordinated Operation of the Colorado River Basin&lt;/title&gt;&lt;/titles&gt;&lt;volume&gt;2024&lt;/volume&gt;&lt;number&gt;August 14&lt;/number&gt;&lt;dates&gt;&lt;year&gt;2024&lt;/year&gt;&lt;/dates&gt;&lt;urls&gt;&lt;related-urls&gt;&lt;url&gt;https://www.snwa.com/assets/pdf/lower-basin-alternative-letter-march2024.pdf&lt;/url&gt;&lt;/related-urls&gt;&lt;/urls&gt;&lt;/record&gt;&lt;/Cite&gt;&lt;/EndNote&gt;</w:instrText>
       </w:r>
       <w:r>
         <w:rPr>
@@ -17353,7 +17167,7 @@
           <w:sz w:val="24"/>
           <w:szCs w:val="24"/>
         </w:rPr>
-        <w:t>Huizar et al. (2023)</w:t>
+        <w:t>(Buschatzke et al., 2024)</w:t>
       </w:r>
       <w:r>
         <w:rPr>
@@ -17369,39 +17183,56 @@
           <w:sz w:val="24"/>
           <w:szCs w:val="24"/>
         </w:rPr>
-        <w:t>, it will be difficult to predict and model state’s water consumption and conservation choices, and corresponding Lake Mead storage volume</w:t>
-      </w:r>
-      <w:r>
-        <w:rPr>
-          <w:rFonts w:asciiTheme="majorBidi" w:hAnsiTheme="majorBidi" w:cstheme="majorBidi"/>
-          <w:sz w:val="24"/>
-          <w:szCs w:val="24"/>
-        </w:rPr>
-        <w:t>s</w:t>
-      </w:r>
-      <w:r>
-        <w:rPr>
-          <w:rFonts w:asciiTheme="majorBidi" w:hAnsiTheme="majorBidi" w:cstheme="majorBidi"/>
-          <w:sz w:val="24"/>
-          <w:szCs w:val="24"/>
-        </w:rPr>
-        <w:t xml:space="preserve">. Prediction is difficult because with more autonomy, users can adapt their choices year-to-year for a variety of reasons that are not readily coded into </w:t>
-      </w:r>
-      <w:r>
-        <w:rPr>
-          <w:rFonts w:asciiTheme="majorBidi" w:hAnsiTheme="majorBidi" w:cstheme="majorBidi"/>
-          <w:sz w:val="24"/>
-          <w:szCs w:val="24"/>
-        </w:rPr>
-        <w:t>rules and simulation models</w:t>
-      </w:r>
-      <w:r>
-        <w:rPr>
-          <w:rFonts w:asciiTheme="majorBidi" w:hAnsiTheme="majorBidi" w:cstheme="majorBidi"/>
-          <w:sz w:val="24"/>
-          <w:szCs w:val="24"/>
-        </w:rPr>
-        <w:t xml:space="preserve">. For our proposals, the minimum Lake Mead storage volume will be </w:t>
+        <w:t>, or another method. In the 4</w:t>
+      </w:r>
+      <w:r>
+        <w:rPr>
+          <w:rFonts w:asciiTheme="majorBidi" w:hAnsiTheme="majorBidi" w:cstheme="majorBidi"/>
+          <w:sz w:val="24"/>
+          <w:szCs w:val="24"/>
+          <w:vertAlign w:val="superscript"/>
+        </w:rPr>
+        <w:t>th</w:t>
+      </w:r>
+      <w:r>
+        <w:rPr>
+          <w:rFonts w:asciiTheme="majorBidi" w:hAnsiTheme="majorBidi" w:cstheme="majorBidi"/>
+          <w:sz w:val="24"/>
+          <w:szCs w:val="24"/>
+        </w:rPr>
+        <w:t xml:space="preserve"> method, a user’s share of the reservoir inflow is their historical allocation minus the agreed-on shortage volume (Appendix A). </w:t>
+      </w:r>
+      <w:r>
+        <w:rPr>
+          <w:rFonts w:asciiTheme="majorBidi" w:hAnsiTheme="majorBidi" w:cstheme="majorBidi"/>
+          <w:sz w:val="24"/>
+          <w:szCs w:val="24"/>
+        </w:rPr>
+        <w:t>D</w:t>
+      </w:r>
+      <w:r>
+        <w:rPr>
+          <w:rFonts w:asciiTheme="majorBidi" w:hAnsiTheme="majorBidi" w:cstheme="majorBidi"/>
+          <w:sz w:val="24"/>
+          <w:szCs w:val="24"/>
+        </w:rPr>
+        <w:t>ifficult decisions</w:t>
+      </w:r>
+      <w:r>
+        <w:rPr>
+          <w:rFonts w:asciiTheme="majorBidi" w:hAnsiTheme="majorBidi" w:cstheme="majorBidi"/>
+          <w:sz w:val="24"/>
+          <w:szCs w:val="24"/>
+        </w:rPr>
+        <w:t xml:space="preserve"> about apportionment </w:t>
+      </w:r>
+      <w:r>
+        <w:rPr>
+          <w:rFonts w:asciiTheme="majorBidi" w:hAnsiTheme="majorBidi" w:cstheme="majorBidi"/>
+          <w:sz w:val="24"/>
+          <w:szCs w:val="24"/>
+        </w:rPr>
+        <w:t xml:space="preserve">are ultimately political choices for where, when, how much, and for which purposes to consumptively use Colorado River water. Until users reach agreement, we suggest to allocate reservoir inflow to increase </w:t>
       </w:r>
       <w:r>
         <w:rPr>
@@ -17417,24 +17248,18 @@
           <w:sz w:val="24"/>
           <w:szCs w:val="24"/>
         </w:rPr>
-        <w:t>protection volume selected by Reclamation. In this case, all users release and consume all of their account balances in every year. A higher Lake Mead storage volume w</w:t>
-      </w:r>
-      <w:r>
-        <w:rPr>
-          <w:rFonts w:asciiTheme="majorBidi" w:hAnsiTheme="majorBidi" w:cstheme="majorBidi"/>
-          <w:sz w:val="24"/>
-          <w:szCs w:val="24"/>
-        </w:rPr>
-        <w:t>ill</w:t>
-      </w:r>
-      <w:r>
-        <w:rPr>
-          <w:rFonts w:asciiTheme="majorBidi" w:hAnsiTheme="majorBidi" w:cstheme="majorBidi"/>
-          <w:sz w:val="24"/>
-          <w:szCs w:val="24"/>
-        </w:rPr>
-        <w:t xml:space="preserve"> occur if one or more users consume only part of their water account balance. Again, it will be difficult to predict how much of their account balance users would choose to consume.</w:t>
-      </w:r>
+        <w:t xml:space="preserve">Lake Mead protection account balance. This set up may encourage users to reach agreement so they can access water. </w:t>
+      </w:r>
+    </w:p>
+    <w:p>
+      <w:pPr>
+        <w:pStyle w:val="ListParagraph"/>
+        <w:rPr>
+          <w:rFonts w:asciiTheme="majorBidi" w:hAnsiTheme="majorBidi" w:cstheme="majorBidi"/>
+          <w:sz w:val="24"/>
+          <w:szCs w:val="24"/>
+        </w:rPr>
+      </w:pPr>
     </w:p>
     <w:p>
       <w:pPr>
@@ -17695,144 +17520,12 @@
     <w:p>
       <w:pPr>
         <w:pStyle w:val="ListParagraph"/>
-        <w:numPr>
-          <w:ilvl w:val="0"/>
-          <w:numId w:val="31"/>
-        </w:numPr>
-      </w:pPr>
-      <w:r>
-        <w:rPr>
-          <w:rFonts w:asciiTheme="majorBidi" w:hAnsiTheme="majorBidi" w:cstheme="majorBidi"/>
-          <w:b/>
-          <w:bCs/>
-          <w:sz w:val="24"/>
-          <w:szCs w:val="24"/>
-        </w:rPr>
-        <w:lastRenderedPageBreak/>
-        <w:t>Division of Lake Mead inflow</w:t>
-      </w:r>
-      <w:r>
-        <w:rPr>
-          <w:rFonts w:asciiTheme="majorBidi" w:hAnsiTheme="majorBidi" w:cstheme="majorBidi"/>
-          <w:sz w:val="24"/>
-          <w:szCs w:val="24"/>
-        </w:rPr>
-        <w:t xml:space="preserve">. Water accounting is neutral to if or how the Lower Basin states, Tribal Nations of the Lower Basin, and Mexico apportion the Lake Mead inflow after Reclamation takes the first share to offset reservoir evaporation. Apportionment can be done by priority, pro rata, a combination, percentage splits of shortages in the Lower Basin Alternative </w:t>
-      </w:r>
-      <w:r>
-        <w:rPr>
-          <w:rFonts w:asciiTheme="majorBidi" w:hAnsiTheme="majorBidi" w:cstheme="majorBidi"/>
-          <w:sz w:val="24"/>
-          <w:szCs w:val="24"/>
-        </w:rPr>
-        <w:fldChar w:fldCharType="begin"/>
-      </w:r>
-      <w:r>
-        <w:rPr>
-          <w:rFonts w:asciiTheme="majorBidi" w:hAnsiTheme="majorBidi" w:cstheme="majorBidi"/>
-          <w:sz w:val="24"/>
-          <w:szCs w:val="24"/>
-        </w:rPr>
-        <w:instrText xml:space="preserve"> ADDIN EN.CITE &lt;EndNote&gt;&lt;Cite&gt;&lt;Author&gt;Buschatzke&lt;/Author&gt;&lt;Year&gt;2024&lt;/Year&gt;&lt;RecNum&gt;3016&lt;/RecNum&gt;&lt;DisplayText&gt;(Buschatzke et al., 2024)&lt;/DisplayText&gt;&lt;record&gt;&lt;rec-number&gt;3016&lt;/rec-number&gt;&lt;foreign-keys&gt;&lt;key app="EN" db-id="xxt5ta9pd995dwesap0pdzzp2weaz0w9werf" timestamp="1723671806"&gt;3016&lt;/key&gt;&lt;/foreign-keys&gt;&lt;ref-type name="Web Page"&gt;12&lt;/ref-type&gt;&lt;contributors&gt;&lt;authors&gt;&lt;author&gt;Thomas Buschatzke&lt;/author&gt;&lt;author&gt;J.B. Hamby&lt;/author&gt;&lt;author&gt;John Entsminger&lt;/author&gt;&lt;/authors&gt;&lt;/contributors&gt;&lt;titles&gt;&lt;title&gt;Lower Basin Alternative for the Post-2026 Coordinated Operation of the Colorado River Basin&lt;/title&gt;&lt;/titles&gt;&lt;volume&gt;2024&lt;/volume&gt;&lt;number&gt;August 14&lt;/number&gt;&lt;dates&gt;&lt;year&gt;2024&lt;/year&gt;&lt;/dates&gt;&lt;urls&gt;&lt;related-urls&gt;&lt;url&gt;https://www.snwa.com/assets/pdf/lower-basin-alternative-letter-march2024.pdf&lt;/url&gt;&lt;/related-urls&gt;&lt;/urls&gt;&lt;/record&gt;&lt;/Cite&gt;&lt;/EndNote&gt;</w:instrText>
-      </w:r>
-      <w:r>
-        <w:rPr>
-          <w:rFonts w:asciiTheme="majorBidi" w:hAnsiTheme="majorBidi" w:cstheme="majorBidi"/>
-          <w:sz w:val="24"/>
-          <w:szCs w:val="24"/>
-        </w:rPr>
-        <w:fldChar w:fldCharType="separate"/>
-      </w:r>
-      <w:r>
-        <w:rPr>
-          <w:rFonts w:asciiTheme="majorBidi" w:hAnsiTheme="majorBidi" w:cstheme="majorBidi"/>
-          <w:noProof/>
-          <w:sz w:val="24"/>
-          <w:szCs w:val="24"/>
-        </w:rPr>
-        <w:t>(Buschatzke et al., 2024)</w:t>
-      </w:r>
-      <w:r>
-        <w:rPr>
-          <w:rFonts w:asciiTheme="majorBidi" w:hAnsiTheme="majorBidi" w:cstheme="majorBidi"/>
-          <w:sz w:val="24"/>
-          <w:szCs w:val="24"/>
-        </w:rPr>
-        <w:fldChar w:fldCharType="end"/>
-      </w:r>
-      <w:r>
-        <w:rPr>
-          <w:rFonts w:asciiTheme="majorBidi" w:hAnsiTheme="majorBidi" w:cstheme="majorBidi"/>
-          <w:sz w:val="24"/>
-          <w:szCs w:val="24"/>
-        </w:rPr>
-        <w:t>, or another method. In the 4</w:t>
-      </w:r>
-      <w:r>
-        <w:rPr>
-          <w:rFonts w:asciiTheme="majorBidi" w:hAnsiTheme="majorBidi" w:cstheme="majorBidi"/>
-          <w:sz w:val="24"/>
-          <w:szCs w:val="24"/>
-          <w:vertAlign w:val="superscript"/>
-        </w:rPr>
-        <w:t>th</w:t>
-      </w:r>
-      <w:r>
-        <w:rPr>
-          <w:rFonts w:asciiTheme="majorBidi" w:hAnsiTheme="majorBidi" w:cstheme="majorBidi"/>
-          <w:sz w:val="24"/>
-          <w:szCs w:val="24"/>
-        </w:rPr>
-        <w:t xml:space="preserve"> method, a user’s share of the reservoir inflow is their historical allocation minus the agreed-on shortage volume (Appendix A). </w:t>
-      </w:r>
-      <w:r>
-        <w:rPr>
-          <w:rFonts w:asciiTheme="majorBidi" w:hAnsiTheme="majorBidi" w:cstheme="majorBidi"/>
-          <w:sz w:val="24"/>
-          <w:szCs w:val="24"/>
-        </w:rPr>
-        <w:t>D</w:t>
-      </w:r>
-      <w:r>
-        <w:rPr>
-          <w:rFonts w:asciiTheme="majorBidi" w:hAnsiTheme="majorBidi" w:cstheme="majorBidi"/>
-          <w:sz w:val="24"/>
-          <w:szCs w:val="24"/>
-        </w:rPr>
-        <w:t>ifficult decisions</w:t>
-      </w:r>
-      <w:r>
-        <w:rPr>
-          <w:rFonts w:asciiTheme="majorBidi" w:hAnsiTheme="majorBidi" w:cstheme="majorBidi"/>
-          <w:sz w:val="24"/>
-          <w:szCs w:val="24"/>
-        </w:rPr>
-        <w:t xml:space="preserve"> about apportionment of reservoir inflow</w:t>
-      </w:r>
-      <w:r>
-        <w:rPr>
-          <w:rFonts w:asciiTheme="majorBidi" w:hAnsiTheme="majorBidi" w:cstheme="majorBidi"/>
-          <w:sz w:val="24"/>
-          <w:szCs w:val="24"/>
-        </w:rPr>
-        <w:t xml:space="preserve"> are best for negotiations as they are ultimately political choices for where, when, how much, and for which purposes to consumptively use Colorado River water. Until users reach agreement, we suggest to allocate reservoir inflow to increase </w:t>
-      </w:r>
-      <w:r>
-        <w:rPr>
-          <w:rFonts w:asciiTheme="majorBidi" w:hAnsiTheme="majorBidi" w:cstheme="majorBidi"/>
-          <w:sz w:val="24"/>
-          <w:szCs w:val="24"/>
-        </w:rPr>
-        <w:t xml:space="preserve">the </w:t>
-      </w:r>
-      <w:r>
-        <w:rPr>
-          <w:rFonts w:asciiTheme="majorBidi" w:hAnsiTheme="majorBidi" w:cstheme="majorBidi"/>
-          <w:sz w:val="24"/>
-          <w:szCs w:val="24"/>
-        </w:rPr>
-        <w:t xml:space="preserve">Lake Mead protection account balance. This set up may encourage users to reach agreement so they can access water. </w:t>
-      </w:r>
+        <w:rPr>
+          <w:rFonts w:asciiTheme="majorBidi" w:hAnsiTheme="majorBidi" w:cstheme="majorBidi"/>
+          <w:sz w:val="24"/>
+          <w:szCs w:val="24"/>
+        </w:rPr>
+      </w:pPr>
     </w:p>
     <w:p>
       <w:pPr>
@@ -17892,13 +17585,7 @@
         <w:t xml:space="preserve"> </w:t>
       </w:r>
       <w:r>
-        <w:t xml:space="preserve">voluntarily reduced </w:t>
-      </w:r>
-      <w:r>
-        <w:t xml:space="preserve">their Colorado River </w:t>
-      </w:r>
-      <w:r>
-        <w:t xml:space="preserve">water use from legal entitlements by </w:t>
+        <w:t xml:space="preserve">voluntarily reduced their Colorado River water use from legal entitlements by </w:t>
       </w:r>
       <w:r>
         <w:t>4.</w:t>
@@ -17988,7 +17675,7 @@
         <w:t>entitlements</w:t>
       </w:r>
       <w:r>
-        <w:t xml:space="preserve"> oof 9.0 million acre-feet per year</w:t>
+        <w:t xml:space="preserve"> of 9.0 million acre-feet per year</w:t>
       </w:r>
       <w:r>
         <w:t>. This assumption is challenged as the Colorado River Basin becomes more arid.</w:t>
@@ -18069,16 +17756,32 @@
         <w:t>available water</w:t>
       </w:r>
       <w:r>
-        <w:t xml:space="preserve">. One strategy </w:t>
+        <w:t xml:space="preserve">. One </w:t>
+      </w:r>
+      <w:r>
+        <w:t>suggestion</w:t>
+      </w:r>
+      <w:r>
+        <w:t xml:space="preserve"> </w:t>
       </w:r>
       <w:r>
         <w:t>proportionally reduces credits</w:t>
       </w:r>
       <w:r>
-        <w:t xml:space="preserve"> for conserved water</w:t>
-      </w:r>
-      <w:r>
-        <w:t xml:space="preserve">. A second strategy </w:t>
+        <w:t xml:space="preserve"> for </w:t>
+      </w:r>
+      <w:r>
+        <w:lastRenderedPageBreak/>
+        <w:t>conserved water</w:t>
+      </w:r>
+      <w:r>
+        <w:t xml:space="preserve">. A second </w:t>
+      </w:r>
+      <w:r>
+        <w:t>suggestion</w:t>
+      </w:r>
+      <w:r>
+        <w:t xml:space="preserve"> </w:t>
       </w:r>
       <w:r>
         <w:t>creates a new protection account to be managed by Reclamation and separate water accounts for each user. Each year, Reclamation takes a first share of the physically available water</w:t>
@@ -18135,6 +17838,9 @@
         <w:t xml:space="preserve">utonomy to </w:t>
       </w:r>
       <w:r>
+        <w:t xml:space="preserve">adaptively </w:t>
+      </w:r>
+      <w:r>
         <w:t>m</w:t>
       </w:r>
       <w:r>
@@ -18183,7 +17889,7 @@
         <w:t xml:space="preserve"> </w:t>
       </w:r>
       <w:r>
-        <w:t xml:space="preserve">These strategies can also serve as examples for other </w:t>
+        <w:t xml:space="preserve">These strategies can serve as examples for other </w:t>
       </w:r>
       <w:r>
         <w:t>water</w:t>
@@ -18244,26 +17950,55 @@
           <w:sz w:val="24"/>
           <w:szCs w:val="24"/>
         </w:rPr>
-        <w:t xml:space="preserve">The data, models, and code used to generate tables and figures in this manuscript are available for download at </w:t>
-      </w:r>
-      <w:hyperlink r:id="rId23" w:history="1">
-        <w:r>
-          <w:rPr>
-            <w:rStyle w:val="Hyperlink"/>
-            <w:rFonts w:asciiTheme="majorBidi" w:hAnsiTheme="majorBidi" w:cstheme="majorBidi"/>
-            <w:sz w:val="24"/>
-            <w:szCs w:val="24"/>
-          </w:rPr>
-          <w:t>https://github.com/dzeke/ColoradoRiverCollaborate/tree/main/LakeMeadWaterConservationProgramAnalysis</w:t>
-        </w:r>
-      </w:hyperlink>
-      <w:r>
-        <w:rPr>
-          <w:rFonts w:asciiTheme="majorBidi" w:hAnsiTheme="majorBidi" w:cstheme="majorBidi"/>
-          <w:sz w:val="24"/>
-          <w:szCs w:val="24"/>
-        </w:rPr>
-        <w:t>.</w:t>
+        <w:t xml:space="preserve">The data, models, and code used to generate </w:t>
+      </w:r>
+      <w:r>
+        <w:rPr>
+          <w:rFonts w:asciiTheme="majorBidi" w:hAnsiTheme="majorBidi" w:cstheme="majorBidi"/>
+          <w:sz w:val="24"/>
+          <w:szCs w:val="24"/>
+        </w:rPr>
+        <w:t xml:space="preserve">Figures 1, 2, 3, and 5, and Table 2 </w:t>
+      </w:r>
+      <w:r>
+        <w:rPr>
+          <w:rFonts w:asciiTheme="majorBidi" w:hAnsiTheme="majorBidi" w:cstheme="majorBidi"/>
+          <w:sz w:val="24"/>
+          <w:szCs w:val="24"/>
+        </w:rPr>
+        <w:t xml:space="preserve">are available at </w:t>
+      </w:r>
+      <w:r>
+        <w:rPr>
+          <w:rFonts w:asciiTheme="majorBidi" w:hAnsiTheme="majorBidi" w:cstheme="majorBidi"/>
+          <w:sz w:val="24"/>
+          <w:szCs w:val="24"/>
+        </w:rPr>
+        <w:t>{Rosenberg, 2026 #3121}</w:t>
+      </w:r>
+      <w:r>
+        <w:rPr>
+          <w:rFonts w:asciiTheme="majorBidi" w:hAnsiTheme="majorBidi" w:cstheme="majorBidi"/>
+          <w:sz w:val="24"/>
+          <w:szCs w:val="24"/>
+        </w:rPr>
+        <w:t xml:space="preserve">. The data, models, and code used to generate Figures 6 and 7 are available at </w:t>
+      </w:r>
+      <w:r>
+        <w:rPr>
+          <w:rFonts w:asciiTheme="majorBidi" w:hAnsiTheme="majorBidi" w:cstheme="majorBidi"/>
+          <w:sz w:val="24"/>
+          <w:szCs w:val="24"/>
+        </w:rPr>
+        <w:t>{Myers, 2025 #3103}{Myers, 2025 #3103}</w:t>
+      </w:r>
+      <w:r>
+        <w:rPr>
+          <w:rFonts w:asciiTheme="majorBidi" w:hAnsiTheme="majorBidi" w:cstheme="majorBidi"/>
+          <w:sz w:val="24"/>
+          <w:szCs w:val="24"/>
+        </w:rPr>
+        <w:t>. Note: on final submission, the separate repositories will be combined into one Hydroshare repository with subfolders for each work.</w:t>
       </w:r>
     </w:p>
     <w:p>
@@ -18271,7 +18006,6 @@
         <w:pStyle w:val="Heading1"/>
       </w:pPr>
       <w:r>
-        <w:lastRenderedPageBreak/>
         <w:t>Appendix A. Estimate Share</w:t>
       </w:r>
       <w:r>
@@ -18655,7 +18389,7 @@
                     </pic:cNvPicPr>
                   </pic:nvPicPr>
                   <pic:blipFill>
-                    <a:blip r:embed="rId24">
+                    <a:blip r:embed="rId25">
                       <a:extLst>
                         <a:ext uri="{28A0092B-C50C-407E-A947-70E740481C1C}">
                           <a14:useLocalDpi xmlns:a14="http://schemas.microsoft.com/office/drawing/2010/main" val="0"/>
@@ -18773,6 +18507,7 @@
         <w:rPr>
           <w:noProof/>
         </w:rPr>
+        <w:lastRenderedPageBreak/>
         <w:drawing>
           <wp:inline distT="0" distB="0" distL="0" distR="0" wp14:anchorId="3DFF5439" wp14:editId="46D10C37">
             <wp:extent cx="5943600" cy="1592580"/>
@@ -18791,7 +18526,7 @@
                     </pic:cNvPicPr>
                   </pic:nvPicPr>
                   <pic:blipFill>
-                    <a:blip r:embed="rId25">
+                    <a:blip r:embed="rId26">
                       <a:extLst>
                         <a:ext uri="{28A0092B-C50C-407E-A947-70E740481C1C}">
                           <a14:useLocalDpi xmlns:a14="http://schemas.microsoft.com/office/drawing/2010/main" val="0"/>
@@ -19153,7 +18888,6 @@
           <w:sz w:val="24"/>
           <w:szCs w:val="24"/>
         </w:rPr>
-        <w:lastRenderedPageBreak/>
         <w:t>For example, at 8.6 maf</w:t>
       </w:r>
       <w:r>
@@ -19781,6 +19515,7 @@
         <w:pStyle w:val="Heading1"/>
       </w:pPr>
       <w:r>
+        <w:lastRenderedPageBreak/>
         <w:t>References</w:t>
       </w:r>
     </w:p>
@@ -19826,7 +19561,7 @@
       <w:r>
         <w:t xml:space="preserve">, 4(2), e1274. </w:t>
       </w:r>
-      <w:hyperlink r:id="rId26" w:history="1">
+      <w:hyperlink r:id="rId27" w:history="1">
         <w:r>
           <w:rPr>
             <w:rStyle w:val="Hyperlink"/>
@@ -19856,7 +19591,7 @@
       <w:r>
         <w:t xml:space="preserve">, November 8, 2021. </w:t>
       </w:r>
-      <w:hyperlink r:id="rId27" w:history="1">
+      <w:hyperlink r:id="rId28" w:history="1">
         <w:r>
           <w:rPr>
             <w:rStyle w:val="Hyperlink"/>
@@ -19877,7 +19612,7 @@
       <w:r>
         <w:t xml:space="preserve">Buschatzke, T., Hamby, J. B., and Entsminger, J. (2024). "Lower Basin Alternative for the Post-2026 Coordinated Operation of the Colorado River Basin." </w:t>
       </w:r>
-      <w:hyperlink r:id="rId28" w:history="1">
+      <w:hyperlink r:id="rId29" w:history="1">
         <w:r>
           <w:rPr>
             <w:rStyle w:val="Hyperlink"/>
@@ -19898,7 +19633,7 @@
       <w:r>
         <w:t xml:space="preserve">City of Phoenix. (2024). "Additional concepts for consideration - City of Phoenix." </w:t>
       </w:r>
-      <w:hyperlink r:id="rId29" w:history="1">
+      <w:hyperlink r:id="rId30" w:history="1">
         <w:r>
           <w:rPr>
             <w:rStyle w:val="Hyperlink"/>
@@ -19947,7 +19682,7 @@
       <w:r>
         <w:t xml:space="preserve">, 84(2), 242-261. </w:t>
       </w:r>
-      <w:hyperlink r:id="rId30" w:history="1">
+      <w:hyperlink r:id="rId31" w:history="1">
         <w:r>
           <w:rPr>
             <w:rStyle w:val="Hyperlink"/>
@@ -19977,7 +19712,7 @@
       <w:r>
         <w:t xml:space="preserve">, 90(4), 713-737. </w:t>
       </w:r>
-      <w:hyperlink r:id="rId31" w:history="1">
+      <w:hyperlink r:id="rId32" w:history="1">
         <w:r>
           <w:rPr>
             <w:rStyle w:val="Hyperlink"/>
@@ -19996,7 +19731,6 @@
         <w:ind w:left="720" w:hanging="720"/>
       </w:pPr>
       <w:r>
-        <w:lastRenderedPageBreak/>
         <w:t xml:space="preserve">Fleck, J., and Udall, B. (2021). "Managing Colorado River risk." </w:t>
       </w:r>
       <w:r>
@@ -20008,7 +19742,7 @@
       <w:r>
         <w:t xml:space="preserve">, 372(6545), 885-885. </w:t>
       </w:r>
-      <w:hyperlink r:id="rId32" w:history="1">
+      <w:hyperlink r:id="rId33" w:history="1">
         <w:r>
           <w:rPr>
             <w:rStyle w:val="Hyperlink"/>
@@ -20044,7 +19778,7 @@
         <w:spacing w:after="0"/>
         <w:ind w:left="720" w:hanging="720"/>
       </w:pPr>
-      <w:hyperlink r:id="rId33" w:history="1">
+      <w:hyperlink r:id="rId34" w:history="1">
         <w:r>
           <w:rPr>
             <w:rStyle w:val="Hyperlink"/>
@@ -20074,7 +19808,7 @@
       <w:r>
         <w:t xml:space="preserve">, 146(5), 04020017. </w:t>
       </w:r>
-      <w:hyperlink r:id="rId34" w:history="1">
+      <w:hyperlink r:id="rId35" w:history="1">
         <w:r>
           <w:rPr>
             <w:rStyle w:val="Hyperlink"/>
@@ -20104,7 +19838,7 @@
       <w:r>
         <w:t xml:space="preserve">. </w:t>
       </w:r>
-      <w:hyperlink r:id="rId35" w:history="1">
+      <w:hyperlink r:id="rId36" w:history="1">
         <w:r>
           <w:rPr>
             <w:rStyle w:val="Hyperlink"/>
@@ -20144,7 +19878,7 @@
       <w:r>
         <w:t xml:space="preserve">IBWC. (2021). "Minutes between the United States and Mexican Sections of the IBWC." United States Section, </w:t>
       </w:r>
-      <w:hyperlink r:id="rId36" w:history="1">
+      <w:hyperlink r:id="rId37" w:history="1">
         <w:r>
           <w:rPr>
             <w:rStyle w:val="Hyperlink"/>
@@ -20174,7 +19908,7 @@
       <w:r>
         <w:t xml:space="preserve">, 372(6540), 418-421. </w:t>
       </w:r>
-      <w:hyperlink r:id="rId37" w:history="1">
+      <w:hyperlink r:id="rId38" w:history="1">
         <w:r>
           <w:rPr>
             <w:rStyle w:val="Hyperlink"/>
@@ -20212,7 +19946,11 @@
         <w:ind w:left="720" w:hanging="720"/>
       </w:pPr>
       <w:r>
-        <w:t xml:space="preserve">Meehan, K., Jepson, W., Harris, L. M., Wutich, A., Beresford, M., Fencl, A., London, J., Pierce, G., Radonic, L., Wells, C., Wilson, N. J., Adams, E. A., Arsenault, R., Brewis, A., Harrington, V., Lambrinidou, Y., McGregor, D., Patrick, R., Pauli, B., Pearson, A. L., Shah, S., Splichalova, D., Workman, C., and Young, S. (2020). "Exposing the myths of household water insecurity in the global north: A critical review." </w:t>
+        <w:t xml:space="preserve">Meehan, K., Jepson, W., Harris, L. M., Wutich, A., Beresford, M., Fencl, A., London, J., Pierce, G., Radonic, L., Wells, C., Wilson, N. J., Adams, E. A., Arsenault, R., Brewis, A., Harrington, V., Lambrinidou, Y., McGregor, D., Patrick, R., Pauli, B., Pearson, A. L., Shah, S., Splichalova, D., Workman, C., and </w:t>
+      </w:r>
+      <w:r>
+        <w:lastRenderedPageBreak/>
+        <w:t xml:space="preserve">Young, S. (2020). "Exposing the myths of household water insecurity in the global north: A critical review." </w:t>
       </w:r>
       <w:r>
         <w:rPr>
@@ -20223,7 +19961,7 @@
       <w:r>
         <w:t xml:space="preserve">, 7(6), e1486. </w:t>
       </w:r>
-      <w:hyperlink r:id="rId38" w:history="1">
+      <w:hyperlink r:id="rId39" w:history="1">
         <w:r>
           <w:rPr>
             <w:rStyle w:val="Hyperlink"/>
@@ -20272,7 +20010,7 @@
       <w:r>
         <w:t xml:space="preserve">, 19(3), 1419. </w:t>
       </w:r>
-      <w:hyperlink r:id="rId39" w:history="1">
+      <w:hyperlink r:id="rId40" w:history="1">
         <w:r>
           <w:rPr>
             <w:rStyle w:val="Hyperlink"/>
@@ -20293,7 +20031,7 @@
       <w:r>
         <w:t xml:space="preserve">Pitt, J., Miller, B., Funk, A., Rice, M., Hawes, T., Moran, K., and Porterfield, S. (2024). "Conservation Groups’ Cooperative Conservation Alternative for Post-2026 Colorado River Guidelines Operations and Strategies." Reclamation. </w:t>
       </w:r>
-      <w:hyperlink r:id="rId40" w:history="1">
+      <w:hyperlink r:id="rId41" w:history="1">
         <w:r>
           <w:rPr>
             <w:rStyle w:val="Hyperlink"/>
@@ -20323,7 +20061,7 @@
       <w:r>
         <w:t xml:space="preserve">, 88(3). </w:t>
       </w:r>
-      <w:hyperlink r:id="rId41" w:history="1">
+      <w:hyperlink r:id="rId42" w:history="1">
         <w:r>
           <w:rPr>
             <w:rStyle w:val="Hyperlink"/>
@@ -20353,7 +20091,7 @@
       <w:r>
         <w:t xml:space="preserve">, 148(10), 02522006. </w:t>
       </w:r>
-      <w:hyperlink r:id="rId42" w:history="1">
+      <w:hyperlink r:id="rId43" w:history="1">
         <w:r>
           <w:rPr>
             <w:rStyle w:val="Hyperlink"/>
@@ -20374,7 +20112,7 @@
       <w:r>
         <w:t xml:space="preserve">Rosenberg, D. E. (2023). "Colorado River Basin Water Accounts: Provoke discussion about more adaptive reservoir operations." Hydroshare.org. </w:t>
       </w:r>
-      <w:hyperlink r:id="rId43" w:history="1">
+      <w:hyperlink r:id="rId44" w:history="1">
         <w:r>
           <w:rPr>
             <w:rStyle w:val="Hyperlink"/>
@@ -20393,7 +20131,6 @@
         <w:ind w:left="720" w:hanging="720"/>
       </w:pPr>
       <w:r>
-        <w:lastRenderedPageBreak/>
         <w:t xml:space="preserve">Rosenberg, D. E. (2024). "Lessons from immersive online collaborative modeling to discuss more adaptive reservoir operations." </w:t>
       </w:r>
       <w:r>
@@ -20405,7 +20142,7 @@
       <w:r>
         <w:t xml:space="preserve">, 150(7). </w:t>
       </w:r>
-      <w:hyperlink r:id="rId44" w:history="1">
+      <w:hyperlink r:id="rId45" w:history="1">
         <w:r>
           <w:rPr>
             <w:rStyle w:val="Hyperlink"/>
@@ -20435,7 +20172,7 @@
       <w:r>
         <w:t xml:space="preserve">, 58(6), 1053-1075. </w:t>
       </w:r>
-      <w:hyperlink r:id="rId45" w:history="1">
+      <w:hyperlink r:id="rId46" w:history="1">
         <w:r>
           <w:rPr>
             <w:rStyle w:val="Hyperlink"/>
@@ -20465,7 +20202,7 @@
       <w:r>
         <w:t xml:space="preserve">, 60(7), e2024WR037225. </w:t>
       </w:r>
-      <w:hyperlink r:id="rId46" w:history="1">
+      <w:hyperlink r:id="rId47" w:history="1">
         <w:r>
           <w:rPr>
             <w:rStyle w:val="Hyperlink"/>
@@ -20495,7 +20232,7 @@
       <w:r>
         <w:t xml:space="preserve">, 58(5), 735-745. </w:t>
       </w:r>
-      <w:hyperlink r:id="rId47" w:history="1">
+      <w:hyperlink r:id="rId48" w:history="1">
         <w:r>
           <w:rPr>
             <w:rStyle w:val="Hyperlink"/>
@@ -20525,7 +20262,7 @@
       <w:r>
         <w:t xml:space="preserve">, 22(2), 4-21. </w:t>
       </w:r>
-      <w:hyperlink r:id="rId48" w:history="1">
+      <w:hyperlink r:id="rId49" w:history="1">
         <w:r>
           <w:rPr>
             <w:rStyle w:val="Hyperlink"/>
@@ -20555,7 +20292,7 @@
       <w:r>
         <w:t xml:space="preserve">, 10(2), e565. </w:t>
       </w:r>
-      <w:hyperlink r:id="rId49" w:history="1">
+      <w:hyperlink r:id="rId50" w:history="1">
         <w:r>
           <w:rPr>
             <w:rStyle w:val="Hyperlink"/>
@@ -20585,7 +20322,7 @@
       <w:r>
         <w:t xml:space="preserve">. </w:t>
       </w:r>
-      <w:hyperlink r:id="rId50" w:history="1">
+      <w:hyperlink r:id="rId51" w:history="1">
         <w:r>
           <w:rPr>
             <w:rStyle w:val="Hyperlink"/>
@@ -20604,6 +20341,7 @@
         <w:ind w:left="720" w:hanging="720"/>
       </w:pPr>
       <w:r>
+        <w:lastRenderedPageBreak/>
         <w:t xml:space="preserve">UCRC. (2024). "Colorado River System Conservation Pilot Program in the Upper Colorado River Basin." </w:t>
       </w:r>
       <w:r>
@@ -20615,7 +20353,7 @@
       <w:r>
         <w:t xml:space="preserve">. </w:t>
       </w:r>
-      <w:hyperlink r:id="rId51" w:history="1">
+      <w:hyperlink r:id="rId52" w:history="1">
         <w:r>
           <w:rPr>
             <w:rStyle w:val="Hyperlink"/>
@@ -20645,7 +20383,7 @@
       <w:r>
         <w:t xml:space="preserve">, 53(3), 2404-2418. </w:t>
       </w:r>
-      <w:hyperlink r:id="rId52" w:history="1">
+      <w:hyperlink r:id="rId53" w:history="1">
         <w:r>
           <w:rPr>
             <w:rStyle w:val="Hyperlink"/>
@@ -20666,7 +20404,7 @@
       <w:r>
         <w:t xml:space="preserve">USBR. (2007a). "Colorado River Interim Guidelines for Lower Basin Shortages and Coordinated Operations for Lakes Powell and Mead: Final Environmental Impact Statement." U.S. Bureau of Reclamation, Washington, D.C., </w:t>
       </w:r>
-      <w:hyperlink r:id="rId53" w:history="1">
+      <w:hyperlink r:id="rId54" w:history="1">
         <w:r>
           <w:rPr>
             <w:rStyle w:val="Hyperlink"/>
@@ -20687,7 +20425,7 @@
       <w:r>
         <w:t xml:space="preserve">USBR. (2007b). "Record of Decision: Colorado River Interim Guidelines for Lower Basin Shortages and Coordinated Operations for Lakes Powell and Mead." U.S. Bureau of Reclamation. </w:t>
       </w:r>
-      <w:hyperlink r:id="rId54" w:history="1">
+      <w:hyperlink r:id="rId55" w:history="1">
         <w:r>
           <w:rPr>
             <w:rStyle w:val="Hyperlink"/>
@@ -20708,7 +20446,7 @@
       <w:r>
         <w:t xml:space="preserve">USBR. (2019). "Agreement Concerning Colorado River Drought Contingency Management and Operations." U.S. Bureau of Reclamation, Washington, DC. </w:t>
       </w:r>
-      <w:hyperlink r:id="rId55" w:history="1">
+      <w:hyperlink r:id="rId56" w:history="1">
         <w:r>
           <w:rPr>
             <w:rStyle w:val="Hyperlink"/>
@@ -20729,7 +20467,7 @@
       <w:r>
         <w:t xml:space="preserve">USBR. (2021). "Pilot System Conservation Program." U.S. Bureau of Reclamation, </w:t>
       </w:r>
-      <w:hyperlink r:id="rId56" w:history="1">
+      <w:hyperlink r:id="rId57" w:history="1">
         <w:r>
           <w:rPr>
             <w:rStyle w:val="Hyperlink"/>
@@ -20750,7 +20488,7 @@
       <w:r>
         <w:t xml:space="preserve">USBR. (2026a). "Boulder Canyon Operations Office - Program and Activities: Water Accounting Reports." U.S. Bureau of Reclamation. </w:t>
       </w:r>
-      <w:hyperlink r:id="rId57" w:history="1">
+      <w:hyperlink r:id="rId58" w:history="1">
         <w:r>
           <w:rPr>
             <w:rStyle w:val="Hyperlink"/>
@@ -20769,10 +20507,9 @@
         <w:ind w:left="720" w:hanging="720"/>
       </w:pPr>
       <w:r>
-        <w:lastRenderedPageBreak/>
         <w:t xml:space="preserve">USBR. (2026b). "Post-2026 Operational Guidelines and Strategies for Lake Powell and Lake Mead – Draft Environmental Impact Statement." U.S. Bureau of Reclamation. </w:t>
       </w:r>
-      <w:hyperlink r:id="rId58" w:history="1">
+      <w:hyperlink r:id="rId59" w:history="1">
         <w:r>
           <w:rPr>
             <w:rStyle w:val="Hyperlink"/>
@@ -20802,7 +20539,7 @@
       <w:r>
         <w:t xml:space="preserve">, 147(9), 04021034. </w:t>
       </w:r>
-      <w:hyperlink r:id="rId59" w:history="1">
+      <w:hyperlink r:id="rId60" w:history="1">
         <w:r>
           <w:rPr>
             <w:rStyle w:val="Hyperlink"/>
@@ -20822,7 +20559,7 @@
       <w:r>
         <w:t xml:space="preserve">Wang, J., and Schmidt, J. C. (2020). "Stream flow and Losses of the Colorado River in the Southern Colorado Plateau." Center for Colorado River Studies, Utah State University, Logan, Utah. </w:t>
       </w:r>
-      <w:hyperlink r:id="rId60" w:history="1">
+      <w:hyperlink r:id="rId61" w:history="1">
         <w:r>
           <w:rPr>
             <w:rStyle w:val="Hyperlink"/>
@@ -20852,7 +20589,7 @@
       </w:r>
     </w:p>
     <w:sectPr>
-      <w:headerReference w:type="default" r:id="rId61"/>
+      <w:headerReference w:type="default" r:id="rId62"/>
       <w:pgSz w:w="12240" w:h="15840"/>
       <w:pgMar w:top="1440" w:right="1440" w:bottom="1440" w:left="1440" w:header="720" w:footer="720" w:gutter="0"/>
       <w:lnNumType w:countBy="1" w:restart="continuous"/>
@@ -24450,7 +24187,7 @@
   <w:style w:type="paragraph" w:default="1" w:styleId="Normal">
     <w:name w:val="Normal"/>
     <w:qFormat/>
-    <w:rsid w:val="00F404B6"/>
+    <w:rsid w:val="00340768"/>
   </w:style>
   <w:style w:type="paragraph" w:styleId="Heading1">
     <w:name w:val="heading 1"/>
@@ -24478,6 +24215,7 @@
   <w:style w:type="character" w:default="1" w:styleId="DefaultParagraphFont">
     <w:name w:val="Default Paragraph Font"/>
     <w:uiPriority w:val="1"/>
+    <w:semiHidden/>
     <w:unhideWhenUsed/>
   </w:style>
   <w:style w:type="table" w:default="1" w:styleId="TableNormal">

</xml_diff>

<commit_message>
A few more edits on Lake Mead Water Conservation analysis manuscript
</commit_message>
<xml_diff>
--- a/LakeMeadWaterConservationProgramAnalysis/LakeMeadWaterConservationProgramSuccessChallengesSuggestions_v3.docx
+++ b/LakeMeadWaterConservationProgramAnalysis/LakeMeadWaterConservationProgramSuccessChallengesSuggestions_v3.docx
@@ -236,16 +236,31 @@
         <w:rPr>
           <w:vertAlign w:val="superscript"/>
         </w:rPr>
+        <w:t>1</w:t>
+      </w:r>
+      <w:r>
+        <w:t xml:space="preserve">, </w:t>
+      </w:r>
+      <w:r>
+        <w:t>Anabelle Myers</w:t>
+      </w:r>
+      <w:r>
+        <w:rPr>
+          <w:vertAlign w:val="superscript"/>
+        </w:rPr>
+        <w:t>1</w:t>
+      </w:r>
+      <w:r>
+        <w:t xml:space="preserve">, </w:t>
+      </w:r>
+      <w:r>
+        <w:t>Erik Porse</w:t>
+      </w:r>
+      <w:r>
+        <w:rPr>
+          <w:vertAlign w:val="superscript"/>
+        </w:rPr>
         <w:t>2</w:t>
-      </w:r>
-      <w:r>
-        <w:t>, Erik Porse</w:t>
-      </w:r>
-      <w:r>
-        <w:rPr>
-          <w:vertAlign w:val="superscript"/>
-        </w:rPr>
-        <w:t>3</w:t>
       </w:r>
     </w:p>
     <w:p>
@@ -288,7 +303,23 @@
           <w:sz w:val="24"/>
           <w:szCs w:val="24"/>
         </w:rPr>
-        <w:t>Professor, Department of Civil and Environmental Engineering and Utah Water Research Lab, Utah State University, Logan, Utah,</w:t>
+        <w:t xml:space="preserve">Professor, </w:t>
+      </w:r>
+      <w:r>
+        <w:rPr>
+          <w:rFonts w:asciiTheme="majorBidi" w:hAnsiTheme="majorBidi" w:cstheme="majorBidi"/>
+          <w:sz w:val="24"/>
+          <w:szCs w:val="24"/>
+        </w:rPr>
+        <w:t xml:space="preserve">Phd student, and undergraduate researcher, </w:t>
+      </w:r>
+      <w:r>
+        <w:rPr>
+          <w:rFonts w:asciiTheme="majorBidi" w:hAnsiTheme="majorBidi" w:cstheme="majorBidi"/>
+          <w:sz w:val="24"/>
+          <w:szCs w:val="24"/>
+        </w:rPr>
+        <w:t>Department of Civil and Environmental Engineering and Utah Water Research Lab, Utah State University, Logan, Utah,</w:t>
       </w:r>
       <w:r>
         <w:rPr>
@@ -350,49 +381,7 @@
           <w:sz w:val="24"/>
           <w:szCs w:val="24"/>
         </w:rPr>
-        <w:t xml:space="preserve">. </w:t>
-      </w:r>
-    </w:p>
-    <w:p>
-      <w:pPr>
-        <w:rPr>
-          <w:rFonts w:asciiTheme="majorBidi" w:hAnsiTheme="majorBidi" w:cstheme="majorBidi"/>
-          <w:sz w:val="24"/>
-          <w:szCs w:val="24"/>
-        </w:rPr>
-      </w:pPr>
-      <w:r>
-        <w:rPr>
-          <w:rFonts w:asciiTheme="majorBidi" w:hAnsiTheme="majorBidi" w:cstheme="majorBidi"/>
-          <w:sz w:val="24"/>
-          <w:szCs w:val="24"/>
-          <w:vertAlign w:val="superscript"/>
-        </w:rPr>
-        <w:t>2</w:t>
-      </w:r>
-      <w:r>
-        <w:rPr>
-          <w:rFonts w:asciiTheme="majorBidi" w:hAnsiTheme="majorBidi" w:cstheme="majorBidi"/>
-          <w:sz w:val="24"/>
-          <w:szCs w:val="24"/>
-        </w:rPr>
-        <w:t>Phd student, Department of Civil and Environmental Engineering and Utah Water Research Lab, Utah State University, Logan, Utah</w:t>
-      </w:r>
-      <w:r>
-        <w:rPr>
-          <w:rFonts w:asciiTheme="majorBidi" w:hAnsiTheme="majorBidi" w:cstheme="majorBidi"/>
-          <w:sz w:val="24"/>
-          <w:szCs w:val="24"/>
-        </w:rPr>
-        <w:t>, 84322-8200</w:t>
-      </w:r>
-      <w:r>
-        <w:rPr>
-          <w:rFonts w:asciiTheme="majorBidi" w:hAnsiTheme="majorBidi" w:cstheme="majorBidi"/>
-          <w:sz w:val="24"/>
-          <w:szCs w:val="24"/>
-        </w:rPr>
-        <w:t xml:space="preserve">. Email: </w:t>
+        <w:t xml:space="preserve">, </w:t>
       </w:r>
       <w:hyperlink r:id="rId10" w:history="1">
         <w:r>
@@ -402,7 +391,7 @@
             <w:sz w:val="24"/>
             <w:szCs w:val="24"/>
           </w:rPr>
-          <w:t>brittany.fager@usu.edu</w:t>
+          <w:t>Brittany.fager@usu.edu</w:t>
         </w:r>
       </w:hyperlink>
       <w:r>
@@ -411,7 +400,29 @@
           <w:sz w:val="24"/>
           <w:szCs w:val="24"/>
         </w:rPr>
+        <w:t xml:space="preserve">,  </w:t>
+      </w:r>
+      <w:hyperlink r:id="rId11" w:history="1">
+        <w:r>
+          <w:rPr>
+            <w:rStyle w:val="Hyperlink"/>
+            <w:rFonts w:asciiTheme="majorBidi" w:hAnsiTheme="majorBidi" w:cstheme="majorBidi"/>
+            <w:sz w:val="24"/>
+            <w:szCs w:val="24"/>
+          </w:rPr>
+          <w:t>a02369941@usu.edu</w:t>
+        </w:r>
+      </w:hyperlink>
+      <w:r>
         <w:t xml:space="preserve">. </w:t>
+      </w:r>
+      <w:r>
+        <w:rPr>
+          <w:rFonts w:asciiTheme="majorBidi" w:hAnsiTheme="majorBidi" w:cstheme="majorBidi"/>
+          <w:sz w:val="24"/>
+          <w:szCs w:val="24"/>
+        </w:rPr>
+        <w:t xml:space="preserve"> </w:t>
       </w:r>
     </w:p>
     <w:p>
@@ -429,7 +440,7 @@
           <w:szCs w:val="24"/>
           <w:vertAlign w:val="superscript"/>
         </w:rPr>
-        <w:t>3</w:t>
+        <w:t>2</w:t>
       </w:r>
       <w:r>
         <w:rPr>
@@ -455,7 +466,7 @@
         </w:rPr>
         <w:t xml:space="preserve">Email: </w:t>
       </w:r>
-      <w:hyperlink r:id="rId11" w:history="1">
+      <w:hyperlink r:id="rId12" w:history="1">
         <w:r>
           <w:rPr>
             <w:rStyle w:val="Hyperlink"/>
@@ -488,34 +499,25 @@
       <w:pPr>
         <w:rPr>
           <w:rFonts w:asciiTheme="majorBidi" w:hAnsiTheme="majorBidi" w:cstheme="majorBidi"/>
-          <w:sz w:val="24"/>
-          <w:szCs w:val="24"/>
-        </w:rPr>
-      </w:pPr>
+          <w:b/>
+          <w:bCs/>
+          <w:sz w:val="24"/>
+          <w:szCs w:val="24"/>
+        </w:rPr>
+      </w:pPr>
+      <w:r>
+        <w:rPr>
+          <w:rFonts w:asciiTheme="majorBidi" w:hAnsiTheme="majorBidi" w:cstheme="majorBidi"/>
+          <w:b/>
+          <w:bCs/>
+          <w:sz w:val="24"/>
+          <w:szCs w:val="24"/>
+        </w:rPr>
+        <w:t>Abstract</w:t>
+      </w:r>
     </w:p>
     <w:p>
       <w:pPr>
-        <w:rPr>
-          <w:rFonts w:asciiTheme="majorBidi" w:hAnsiTheme="majorBidi" w:cstheme="majorBidi"/>
-          <w:b/>
-          <w:bCs/>
-          <w:sz w:val="24"/>
-          <w:szCs w:val="24"/>
-        </w:rPr>
-      </w:pPr>
-      <w:r>
-        <w:rPr>
-          <w:rFonts w:asciiTheme="majorBidi" w:hAnsiTheme="majorBidi" w:cstheme="majorBidi"/>
-          <w:b/>
-          <w:bCs/>
-          <w:sz w:val="24"/>
-          <w:szCs w:val="24"/>
-        </w:rPr>
-        <w:t>Abstract</w:t>
-      </w:r>
-    </w:p>
-    <w:p>
-      <w:pPr>
         <w:pStyle w:val="NoSpacing"/>
       </w:pPr>
       <w:r>
@@ -678,7 +680,25 @@
         <w:t>available water</w:t>
       </w:r>
       <w:r>
-        <w:t>. One strategy proportionally reduces credits for conserved water. A second strategy creates a new protection account to be managed by Reclamation and separate water accounts for each user. Each year, Reclamation takes a first share of the physically available water equal to reservoir evaporation to sustain the protected volume. The users then divide the remaining inflow and consume, conserve, and/or trade within their account balances. Both strategies have potential benefits to stabilize and recover Lake Mead storage while increasing u</w:t>
+        <w:t xml:space="preserve">. One </w:t>
+      </w:r>
+      <w:r>
+        <w:t>suggestion</w:t>
+      </w:r>
+      <w:r>
+        <w:t xml:space="preserve"> proportionally reduces credits for conserved water. A second </w:t>
+      </w:r>
+      <w:r>
+        <w:t>suggestion</w:t>
+      </w:r>
+      <w:r>
+        <w:t xml:space="preserve"> creates a new protection account to be managed by Reclamation and separate water accounts for each user. Each year, Reclamation takes a first share of the physically available water equal to reservoir evaporation to sustain the protected volume. The users then divide the remaining inflow and consume, conserve, and/or trade within their account balances. Both </w:t>
+      </w:r>
+      <w:r>
+        <w:t>suggestions</w:t>
+      </w:r>
+      <w:r>
+        <w:t xml:space="preserve"> have potential benefits to stabilize and recover Lake Mead storage while increasing u</w:t>
       </w:r>
       <w:r>
         <w:t>ser</w:t>
@@ -3477,7 +3497,7 @@
         <w:t xml:space="preserve"> </w:t>
       </w:r>
       <w:r>
-        <w:t>strategies</w:t>
+        <w:t>suggestions</w:t>
       </w:r>
       <w:r>
         <w:t xml:space="preserve"> to </w:t>
@@ -3534,7 +3554,7 @@
         <w:t xml:space="preserve">The </w:t>
       </w:r>
       <w:r>
-        <w:t>strategies</w:t>
+        <w:t>suggestions</w:t>
       </w:r>
       <w:r>
         <w:t xml:space="preserve"> switch </w:t>
@@ -3561,7 +3581,16 @@
         <w:t xml:space="preserve">historical entitlements to </w:t>
       </w:r>
       <w:r>
-        <w:t xml:space="preserve">allocations based on </w:t>
+        <w:t xml:space="preserve">water accounting </w:t>
+      </w:r>
+      <w:r>
+        <w:t>based on</w:t>
+      </w:r>
+      <w:r>
+        <w:t xml:space="preserve"> apportionment of</w:t>
+      </w:r>
+      <w:r>
+        <w:t xml:space="preserve"> </w:t>
       </w:r>
       <w:r>
         <w:t xml:space="preserve">physical </w:t>
@@ -3570,22 +3599,94 @@
         <w:t>reservoir inflow</w:t>
       </w:r>
       <w:r>
-        <w:t xml:space="preserve">. These changes can </w:t>
-      </w:r>
-      <w:r>
-        <w:t xml:space="preserve">help </w:t>
-      </w:r>
-      <w:r>
-        <w:t>stabilize</w:t>
-      </w:r>
-      <w:r>
-        <w:t xml:space="preserve"> Lake Mead, recover storage, and reduce conflict </w:t>
-      </w:r>
-      <w:r>
-        <w:t>under</w:t>
-      </w:r>
-      <w:r>
-        <w:t xml:space="preserve"> conditions of low storage and low inflow</w:t>
+        <w:t xml:space="preserve">. </w:t>
+      </w:r>
+      <w:r>
+        <w:t>We</w:t>
+      </w:r>
+      <w:r>
+        <w:t xml:space="preserve"> illustrate some of many more autonomous and adaptive strategies that water users can adopt within a water accounting framework</w:t>
+      </w:r>
+      <w:r>
+        <w:t xml:space="preserve"> (</w:t>
+      </w:r>
+      <w:r>
+        <w:t>Section 6)</w:t>
+      </w:r>
+      <w:r>
+        <w:t>.</w:t>
+      </w:r>
+      <w:r>
+        <w:t xml:space="preserve"> </w:t>
+      </w:r>
+      <w:r>
+        <w:t>The next section discusses our suggestions in the context of prior work and lists additional benefits and limitations of water accounting. This work has</w:t>
+      </w:r>
+      <w:r>
+        <w:t xml:space="preserve"> potential benefits to stabilize and recover Lake Mead storage while increasing u</w:t>
+      </w:r>
+      <w:r>
+        <w:t>ser</w:t>
+      </w:r>
+      <w:r>
+        <w:t>s</w:t>
+      </w:r>
+      <w:r>
+        <w:t xml:space="preserve"> </w:t>
+      </w:r>
+      <w:r>
+        <w:t>a</w:t>
+      </w:r>
+      <w:r>
+        <w:t xml:space="preserve">utonomy to </w:t>
+      </w:r>
+      <w:r>
+        <w:t>m</w:t>
+      </w:r>
+      <w:r>
+        <w:t>anage</w:t>
+      </w:r>
+      <w:r>
+        <w:t xml:space="preserve"> their differing and sometimes conflicting</w:t>
+      </w:r>
+      <w:r>
+        <w:t xml:space="preserve"> </w:t>
+      </w:r>
+      <w:r>
+        <w:t>r</w:t>
+      </w:r>
+      <w:r>
+        <w:t>isk</w:t>
+      </w:r>
+      <w:r>
+        <w:t>s</w:t>
+      </w:r>
+      <w:r>
+        <w:t xml:space="preserve"> </w:t>
+      </w:r>
+      <w:r>
+        <w:t>of</w:t>
+      </w:r>
+      <w:r>
+        <w:t xml:space="preserve"> </w:t>
+      </w:r>
+      <w:r>
+        <w:t>d</w:t>
+      </w:r>
+      <w:r>
+        <w:t>eclining</w:t>
+      </w:r>
+      <w:r>
+        <w:t xml:space="preserve"> and low Colorado River</w:t>
+      </w:r>
+      <w:r>
+        <w:t xml:space="preserve"> </w:t>
+      </w:r>
+      <w:r>
+        <w:t>f</w:t>
+      </w:r>
+      <w:r>
+        <w:t>low</w:t>
       </w:r>
       <w:r>
         <w:t>.</w:t>
@@ -4096,7 +4197,23 @@
                                 <w:sz w:val="20"/>
                                 <w:szCs w:val="20"/>
                               </w:rPr>
-                              <w:t>program debits are prohibited. This trigger elevation has the purpose to prevent reservoir drawdown below the protection elevation. Presently, the trigger</w:t>
+                              <w:t xml:space="preserve">program debits are prohibited. This trigger elevation has the purpose to prevent reservoir drawdown </w:t>
+                            </w:r>
+                            <w:r>
+                              <w:rPr>
+                                <w:rFonts w:asciiTheme="majorBidi" w:hAnsiTheme="majorBidi" w:cstheme="majorBidi"/>
+                                <w:sz w:val="20"/>
+                                <w:szCs w:val="20"/>
+                              </w:rPr>
+                              <w:t>to catastrophic elevations</w:t>
+                            </w:r>
+                            <w:r>
+                              <w:rPr>
+                                <w:rFonts w:asciiTheme="majorBidi" w:hAnsiTheme="majorBidi" w:cstheme="majorBidi"/>
+                                <w:sz w:val="20"/>
+                                <w:szCs w:val="20"/>
+                              </w:rPr>
+                              <w:t>. Presently, the trigger</w:t>
                             </w:r>
                             <w:r>
                               <w:rPr>
@@ -4146,7 +4263,23 @@
                                 <w:sz w:val="20"/>
                                 <w:szCs w:val="20"/>
                               </w:rPr>
-                              <w:t xml:space="preserve">The volume of water a Lower Basin user or Mexico must reduce use below their historical entitlement. This volume is also referred to as a </w:t>
+                              <w:t xml:space="preserve">The volume of water a Lower Basin user or Mexico must reduce use below their </w:t>
+                            </w:r>
+                            <w:r>
+                              <w:rPr>
+                                <w:rFonts w:asciiTheme="majorBidi" w:hAnsiTheme="majorBidi" w:cstheme="majorBidi"/>
+                                <w:sz w:val="20"/>
+                                <w:szCs w:val="20"/>
+                              </w:rPr>
+                              <w:t>legal</w:t>
+                            </w:r>
+                            <w:r>
+                              <w:rPr>
+                                <w:rFonts w:asciiTheme="majorBidi" w:hAnsiTheme="majorBidi" w:cstheme="majorBidi"/>
+                                <w:sz w:val="20"/>
+                                <w:szCs w:val="20"/>
+                              </w:rPr>
+                              <w:t xml:space="preserve"> entitlement. This volume is also referred to as a </w:t>
                             </w:r>
                             <w:r>
                               <w:rPr>
@@ -4640,7 +4773,23 @@
                           <w:sz w:val="20"/>
                           <w:szCs w:val="20"/>
                         </w:rPr>
-                        <w:t>program debits are prohibited. This trigger elevation has the purpose to prevent reservoir drawdown below the protection elevation. Presently, the trigger</w:t>
+                        <w:t xml:space="preserve">program debits are prohibited. This trigger elevation has the purpose to prevent reservoir drawdown </w:t>
+                      </w:r>
+                      <w:r>
+                        <w:rPr>
+                          <w:rFonts w:asciiTheme="majorBidi" w:hAnsiTheme="majorBidi" w:cstheme="majorBidi"/>
+                          <w:sz w:val="20"/>
+                          <w:szCs w:val="20"/>
+                        </w:rPr>
+                        <w:t>to catastrophic elevations</w:t>
+                      </w:r>
+                      <w:r>
+                        <w:rPr>
+                          <w:rFonts w:asciiTheme="majorBidi" w:hAnsiTheme="majorBidi" w:cstheme="majorBidi"/>
+                          <w:sz w:val="20"/>
+                          <w:szCs w:val="20"/>
+                        </w:rPr>
+                        <w:t>. Presently, the trigger</w:t>
                       </w:r>
                       <w:r>
                         <w:rPr>
@@ -4690,7 +4839,23 @@
                           <w:sz w:val="20"/>
                           <w:szCs w:val="20"/>
                         </w:rPr>
-                        <w:t xml:space="preserve">The volume of water a Lower Basin user or Mexico must reduce use below their historical entitlement. This volume is also referred to as a </w:t>
+                        <w:t xml:space="preserve">The volume of water a Lower Basin user or Mexico must reduce use below their </w:t>
+                      </w:r>
+                      <w:r>
+                        <w:rPr>
+                          <w:rFonts w:asciiTheme="majorBidi" w:hAnsiTheme="majorBidi" w:cstheme="majorBidi"/>
+                          <w:sz w:val="20"/>
+                          <w:szCs w:val="20"/>
+                        </w:rPr>
+                        <w:t>legal</w:t>
+                      </w:r>
+                      <w:r>
+                        <w:rPr>
+                          <w:rFonts w:asciiTheme="majorBidi" w:hAnsiTheme="majorBidi" w:cstheme="majorBidi"/>
+                          <w:sz w:val="20"/>
+                          <w:szCs w:val="20"/>
+                        </w:rPr>
+                        <w:t xml:space="preserve"> entitlement. This volume is also referred to as a </w:t>
                       </w:r>
                       <w:r>
                         <w:rPr>
@@ -4807,7 +4972,15 @@
           <w:sz w:val="24"/>
           <w:szCs w:val="24"/>
         </w:rPr>
-        <w:t xml:space="preserve"> above historical allocations</w:t>
+        <w:t xml:space="preserve"> above </w:t>
+      </w:r>
+      <w:r>
+        <w:rPr>
+          <w:rFonts w:asciiTheme="majorBidi" w:hAnsiTheme="majorBidi" w:cstheme="majorBidi"/>
+          <w:sz w:val="24"/>
+          <w:szCs w:val="24"/>
+        </w:rPr>
+        <w:t>legal entitlements</w:t>
       </w:r>
       <w:r>
         <w:rPr>
@@ -7472,7 +7645,7 @@
                     <pic:cNvPicPr/>
                   </pic:nvPicPr>
                   <pic:blipFill>
-                    <a:blip r:embed="rId16"/>
+                    <a:blip r:embed="rId17"/>
                     <a:stretch>
                       <a:fillRect/>
                     </a:stretch>
@@ -7555,7 +7728,7 @@
                     <pic:cNvPicPr/>
                   </pic:nvPicPr>
                   <pic:blipFill>
-                    <a:blip r:embed="rId17"/>
+                    <a:blip r:embed="rId18"/>
                     <a:stretch>
                       <a:fillRect/>
                     </a:stretch>
@@ -8138,7 +8311,7 @@
                     </pic:cNvPicPr>
                   </pic:nvPicPr>
                   <pic:blipFill>
-                    <a:blip r:embed="rId18">
+                    <a:blip r:embed="rId19">
                       <a:extLst>
                         <a:ext uri="{28A0092B-C50C-407E-A947-70E740481C1C}">
                           <a14:useLocalDpi xmlns:a14="http://schemas.microsoft.com/office/drawing/2010/main" val="0"/>
@@ -8446,7 +8619,7 @@
                     <pic:cNvPicPr/>
                   </pic:nvPicPr>
                   <pic:blipFill>
-                    <a:blip r:embed="rId19"/>
+                    <a:blip r:embed="rId20"/>
                     <a:stretch>
                       <a:fillRect/>
                     </a:stretch>
@@ -10201,7 +10374,7 @@
         </w:rPr>
         <w:lastRenderedPageBreak/>
         <w:drawing>
-          <wp:inline distT="0" distB="0" distL="0" distR="0" wp14:anchorId="1DF02D15" wp14:editId="59ED5480">
+          <wp:inline distT="0" distB="0" distL="0" distR="0" wp14:anchorId="1DF02D15" wp14:editId="782FA2DD">
             <wp:extent cx="5845696" cy="3329343"/>
             <wp:effectExtent l="0" t="0" r="0" b="0"/>
             <wp:docPr id="708746801" name="Picture 2"/>
@@ -10218,7 +10391,7 @@
                     </pic:cNvPicPr>
                   </pic:nvPicPr>
                   <pic:blipFill>
-                    <a:blip r:embed="rId20" cstate="print">
+                    <a:blip r:embed="rId21" cstate="print">
                       <a:extLst>
                         <a:ext uri="{28A0092B-C50C-407E-A947-70E740481C1C}">
                           <a14:useLocalDpi xmlns:a14="http://schemas.microsoft.com/office/drawing/2010/main" val="0"/>
@@ -11477,7 +11650,7 @@
                     <pic:cNvPicPr/>
                   </pic:nvPicPr>
                   <pic:blipFill>
-                    <a:blip r:embed="rId21"/>
+                    <a:blip r:embed="rId22"/>
                     <a:stretch>
                       <a:fillRect/>
                     </a:stretch>
@@ -11907,7 +12080,7 @@
                     </pic:cNvPicPr>
                   </pic:nvPicPr>
                   <pic:blipFill>
-                    <a:blip r:embed="rId22">
+                    <a:blip r:embed="rId23">
                       <a:extLst>
                         <a:ext uri="{28A0092B-C50C-407E-A947-70E740481C1C}">
                           <a14:useLocalDpi xmlns:a14="http://schemas.microsoft.com/office/drawing/2010/main" val="0"/>
@@ -15122,7 +15295,13 @@
         <w:pStyle w:val="Heading1"/>
       </w:pPr>
       <w:r>
-        <w:t>Illustration of Water Accounting</w:t>
+        <w:t>Illustration</w:t>
+      </w:r>
+      <w:r>
+        <w:t>s</w:t>
+      </w:r>
+      <w:r>
+        <w:t xml:space="preserve"> of Water Accounting</w:t>
       </w:r>
     </w:p>
     <w:p>
@@ -15252,7 +15431,31 @@
           <w:sz w:val="24"/>
           <w:szCs w:val="24"/>
         </w:rPr>
-        <w:t xml:space="preserve">Within a session, collaborators immersed in and personified a Lake Mead user. The user roles were Reclamation (protection volume), California, Arizona, Nevada, Mexico, and Tribal Nations of the Lower Basin. Each year, we revealed the Lake Mead inflow. The model apportioned the inflow among the user accounts. Then, each collaborator </w:t>
+        <w:t xml:space="preserve">Within a session, collaborators immersed in and personified a Lake Mead user. The user roles were Reclamation (protection volume), California, Arizona, Nevada, Mexico, and Tribal Nations of the Lower Basin. Each year, we </w:t>
+      </w:r>
+      <w:r>
+        <w:rPr>
+          <w:rFonts w:asciiTheme="majorBidi" w:hAnsiTheme="majorBidi" w:cstheme="majorBidi"/>
+          <w:sz w:val="24"/>
+          <w:szCs w:val="24"/>
+        </w:rPr>
+        <w:t xml:space="preserve">choose and </w:t>
+      </w:r>
+      <w:r>
+        <w:rPr>
+          <w:rFonts w:asciiTheme="majorBidi" w:hAnsiTheme="majorBidi" w:cstheme="majorBidi"/>
+          <w:sz w:val="24"/>
+          <w:szCs w:val="24"/>
+        </w:rPr>
+        <w:t>revealed the Lake Mead inflow. The model apportioned the inflow among the user accounts. Then, each collaborator consumed, conserved, or traded within their account balance.</w:t>
+      </w:r>
+      <w:r>
+        <w:rPr>
+          <w:rFonts w:asciiTheme="majorBidi" w:hAnsiTheme="majorBidi" w:cstheme="majorBidi"/>
+          <w:sz w:val="24"/>
+          <w:szCs w:val="24"/>
+        </w:rPr>
+        <w:t xml:space="preserve"> Collaborators carried </w:t>
       </w:r>
       <w:r>
         <w:rPr>
@@ -15261,15 +15464,64 @@
           <w:szCs w:val="24"/>
         </w:rPr>
         <w:lastRenderedPageBreak/>
-        <w:t>consumed, conserved, or traded within their account balance.</w:t>
-      </w:r>
-      <w:r>
-        <w:rPr>
-          <w:rFonts w:asciiTheme="majorBidi" w:hAnsiTheme="majorBidi" w:cstheme="majorBidi"/>
-          <w:sz w:val="24"/>
-          <w:szCs w:val="24"/>
-        </w:rPr>
-        <w:t xml:space="preserve"> Collaborators carried over account balances to the next year, which also kept Lake Mead storage above the protection volume.</w:t>
+        <w:t>over account balances to the next year, which also kept Lake Mead storage above the protection volume.</w:t>
+      </w:r>
+      <w:r>
+        <w:rPr>
+          <w:rFonts w:asciiTheme="majorBidi" w:hAnsiTheme="majorBidi" w:cstheme="majorBidi"/>
+          <w:sz w:val="24"/>
+          <w:szCs w:val="24"/>
+        </w:rPr>
+        <w:t xml:space="preserve"> Each collaborator participated in one session and each session lasted ~ 2 hours. Otherwise, sessions followed the structure of prior immersive modeling work </w:t>
+      </w:r>
+      <w:r>
+        <w:rPr>
+          <w:rFonts w:asciiTheme="majorBidi" w:hAnsiTheme="majorBidi" w:cstheme="majorBidi"/>
+          <w:sz w:val="24"/>
+          <w:szCs w:val="24"/>
+        </w:rPr>
+        <w:fldChar w:fldCharType="begin"/>
+      </w:r>
+      <w:r>
+        <w:rPr>
+          <w:rFonts w:asciiTheme="majorBidi" w:hAnsiTheme="majorBidi" w:cstheme="majorBidi"/>
+          <w:sz w:val="24"/>
+          <w:szCs w:val="24"/>
+        </w:rPr>
+        <w:instrText xml:space="preserve"> ADDIN EN.CITE &lt;EndNote&gt;&lt;Cite&gt;&lt;Author&gt;Rosenberg&lt;/Author&gt;&lt;Year&gt;2024&lt;/Year&gt;&lt;RecNum&gt;2847&lt;/RecNum&gt;&lt;DisplayText&gt;(Rosenberg, 2024)&lt;/DisplayText&gt;&lt;record&gt;&lt;rec-number&gt;2847&lt;/rec-number&gt;&lt;foreign-keys&gt;&lt;key app="EN" db-id="xxt5ta9pd995dwesap0pdzzp2weaz0w9werf" timestamp="1642471467"&gt;2847&lt;/key&gt;&lt;/foreign-keys&gt;&lt;ref-type name="Journal Article"&gt;17&lt;/ref-type&gt;&lt;contributors&gt;&lt;authors&gt;&lt;author&gt;David E. Rosenberg&lt;/author&gt;&lt;/authors&gt;&lt;/contributors&gt;&lt;titles&gt;&lt;title&gt;Lessons from immersive online collaborative modeling to discuss more adaptive reservoir operations&lt;/title&gt;&lt;secondary-title&gt;Journal of Water Resources Planning and Management&lt;/secondary-title&gt;&lt;/titles&gt;&lt;periodical&gt;&lt;full-title&gt;Journal of Water Resources Planning and Management&lt;/full-title&gt;&lt;/periodical&gt;&lt;volume&gt;150&lt;/volume&gt;&lt;number&gt;7&lt;/number&gt;&lt;dates&gt;&lt;year&gt;2024&lt;/year&gt;&lt;/dates&gt;&lt;publisher&gt;American Society of Civil Engineers&lt;/publisher&gt;&lt;urls&gt;&lt;related-urls&gt;&lt;url&gt;https://doi.org/10.4211/hs.e0cbe52ad4524c07bb5b7ff8c373a343&lt;/url&gt;&lt;/related-urls&gt;&lt;/urls&gt;&lt;electronic-resource-num&gt;https://doi.org/10.1061/JWRMD5.WRENG-5893&lt;/electronic-resource-num&gt;&lt;/record&gt;&lt;/Cite&gt;&lt;/EndNote&gt;</w:instrText>
+      </w:r>
+      <w:r>
+        <w:rPr>
+          <w:rFonts w:asciiTheme="majorBidi" w:hAnsiTheme="majorBidi" w:cstheme="majorBidi"/>
+          <w:sz w:val="24"/>
+          <w:szCs w:val="24"/>
+        </w:rPr>
+        <w:fldChar w:fldCharType="separate"/>
+      </w:r>
+      <w:r>
+        <w:rPr>
+          <w:rFonts w:asciiTheme="majorBidi" w:hAnsiTheme="majorBidi" w:cstheme="majorBidi"/>
+          <w:noProof/>
+          <w:sz w:val="24"/>
+          <w:szCs w:val="24"/>
+        </w:rPr>
+        <w:t>(Rosenberg, 2024)</w:t>
+      </w:r>
+      <w:r>
+        <w:rPr>
+          <w:rFonts w:asciiTheme="majorBidi" w:hAnsiTheme="majorBidi" w:cstheme="majorBidi"/>
+          <w:sz w:val="24"/>
+          <w:szCs w:val="24"/>
+        </w:rPr>
+        <w:fldChar w:fldCharType="end"/>
+      </w:r>
+      <w:r>
+        <w:rPr>
+          <w:rFonts w:asciiTheme="majorBidi" w:hAnsiTheme="majorBidi" w:cstheme="majorBidi"/>
+          <w:sz w:val="24"/>
+          <w:szCs w:val="24"/>
+        </w:rPr>
+        <w:t>.</w:t>
       </w:r>
     </w:p>
     <w:p>
@@ -15310,7 +15562,15 @@
           <w:sz w:val="24"/>
           <w:szCs w:val="24"/>
         </w:rPr>
-        <w:t>reserved 1.4 to 2.0 million acre-feet in their accounts, keeping Lake Mead storage above the protection elevation even with inflows of 3.8, 6.3, and 4.0 million acre-feet—inflows lower than observed to date.</w:t>
+        <w:t>reserved 1.4 to 2.0 million acre-feet in their accounts, keeping Lake Mead storage above the protection elevation even with inflows of 3.8, 6.3, and 4.0 million acre-feet—inflows lower than observed</w:t>
+      </w:r>
+      <w:r>
+        <w:rPr>
+          <w:rFonts w:asciiTheme="majorBidi" w:hAnsiTheme="majorBidi" w:cstheme="majorBidi"/>
+          <w:sz w:val="24"/>
+          <w:szCs w:val="24"/>
+        </w:rPr>
+        <w:t>.</w:t>
       </w:r>
     </w:p>
     <w:p>
@@ -15341,7 +15601,7 @@
                     <pic:cNvPicPr/>
                   </pic:nvPicPr>
                   <pic:blipFill>
-                    <a:blip r:embed="rId23" cstate="print">
+                    <a:blip r:embed="rId24" cstate="print">
                       <a:extLst>
                         <a:ext uri="{28A0092B-C50C-407E-A947-70E740481C1C}">
                           <a14:useLocalDpi xmlns:a14="http://schemas.microsoft.com/office/drawing/2010/main" val="0"/>
@@ -15397,7 +15657,19 @@
         <w:t xml:space="preserve"> </w:t>
       </w:r>
       <w:r>
-        <w:t>The area between the red and blue lines shows the total volume the other collaborators conserved within their user accounts.</w:t>
+        <w:t xml:space="preserve">The area between the red and blue lines </w:t>
+      </w:r>
+      <w:r>
+        <w:t>is</w:t>
+      </w:r>
+      <w:r>
+        <w:t xml:space="preserve"> the total volume the other collaborators </w:t>
+      </w:r>
+      <w:r>
+        <w:t>conserved water and account balances</w:t>
+      </w:r>
+      <w:r>
+        <w:t>.</w:t>
       </w:r>
     </w:p>
     <w:p>
@@ -15516,7 +15788,7 @@
                     <pic:cNvPicPr/>
                   </pic:nvPicPr>
                   <pic:blipFill>
-                    <a:blip r:embed="rId24" cstate="print">
+                    <a:blip r:embed="rId25" cstate="print">
                       <a:extLst>
                         <a:ext uri="{28A0092B-C50C-407E-A947-70E740481C1C}">
                           <a14:useLocalDpi xmlns:a14="http://schemas.microsoft.com/office/drawing/2010/main" val="0"/>
@@ -17974,7 +18246,40 @@
           <w:sz w:val="24"/>
           <w:szCs w:val="24"/>
         </w:rPr>
-        <w:t>{Rosenberg, 2026 #3121}</w:t>
+        <w:fldChar w:fldCharType="begin"/>
+      </w:r>
+      <w:r>
+        <w:rPr>
+          <w:rFonts w:asciiTheme="majorBidi" w:hAnsiTheme="majorBidi" w:cstheme="majorBidi"/>
+          <w:sz w:val="24"/>
+          <w:szCs w:val="24"/>
+        </w:rPr>
+        <w:instrText xml:space="preserve"> ADDIN EN.CITE &lt;EndNote&gt;&lt;Cite&gt;&lt;Author&gt;Rosenberg&lt;/Author&gt;&lt;Year&gt;2026&lt;/Year&gt;&lt;RecNum&gt;3121&lt;/RecNum&gt;&lt;DisplayText&gt;(Rosenberg, 2026)&lt;/DisplayText&gt;&lt;record&gt;&lt;rec-number&gt;3121&lt;/rec-number&gt;&lt;foreign-keys&gt;&lt;key app="EN" db-id="xxt5ta9pd995dwesap0pdzzp2weaz0w9werf" timestamp="1783713642"&gt;3121&lt;/key&gt;&lt;/foreign-keys&gt;&lt;ref-type name="Journal Article"&gt;17&lt;/ref-type&gt;&lt;contributors&gt;&lt;authors&gt;&lt;author&gt;Rosenberg, D.&lt;/author&gt;&lt;/authors&gt;&lt;/contributors&gt;&lt;titles&gt;&lt;title&gt;Lake Mead Water Conservation Program Analysis&lt;/title&gt;&lt;secondary-title&gt;Github, Utah State Unviersity&lt;/secondary-title&gt;&lt;/titles&gt;&lt;periodical&gt;&lt;full-title&gt;Github, Utah State Unviersity&lt;/full-title&gt;&lt;/periodical&gt;&lt;dates&gt;&lt;year&gt;2026&lt;/year&gt;&lt;/dates&gt;&lt;urls&gt;&lt;related-urls&gt;&lt;url&gt;https://github.com/dzeke/ColoradoRiverCollaborate/tree/main/LakeMeadWaterConservationProgramAnalysis&lt;/url&gt;&lt;/related-urls&gt;&lt;/urls&gt;&lt;/record&gt;&lt;/Cite&gt;&lt;/EndNote&gt;</w:instrText>
+      </w:r>
+      <w:r>
+        <w:rPr>
+          <w:rFonts w:asciiTheme="majorBidi" w:hAnsiTheme="majorBidi" w:cstheme="majorBidi"/>
+          <w:sz w:val="24"/>
+          <w:szCs w:val="24"/>
+        </w:rPr>
+        <w:fldChar w:fldCharType="separate"/>
+      </w:r>
+      <w:r>
+        <w:rPr>
+          <w:rFonts w:asciiTheme="majorBidi" w:hAnsiTheme="majorBidi" w:cstheme="majorBidi"/>
+          <w:noProof/>
+          <w:sz w:val="24"/>
+          <w:szCs w:val="24"/>
+        </w:rPr>
+        <w:t>(Rosenberg, 2026)</w:t>
+      </w:r>
+      <w:r>
+        <w:rPr>
+          <w:rFonts w:asciiTheme="majorBidi" w:hAnsiTheme="majorBidi" w:cstheme="majorBidi"/>
+          <w:sz w:val="24"/>
+          <w:szCs w:val="24"/>
+        </w:rPr>
+        <w:fldChar w:fldCharType="end"/>
       </w:r>
       <w:r>
         <w:rPr>
@@ -17990,7 +18295,40 @@
           <w:sz w:val="24"/>
           <w:szCs w:val="24"/>
         </w:rPr>
-        <w:t>{Myers, 2025 #3103}{Myers, 2025 #3103}</w:t>
+        <w:fldChar w:fldCharType="begin"/>
+      </w:r>
+      <w:r>
+        <w:rPr>
+          <w:rFonts w:asciiTheme="majorBidi" w:hAnsiTheme="majorBidi" w:cstheme="majorBidi"/>
+          <w:sz w:val="24"/>
+          <w:szCs w:val="24"/>
+        </w:rPr>
+        <w:instrText xml:space="preserve"> ADDIN EN.CITE &lt;EndNote&gt;&lt;Cite&gt;&lt;Author&gt;Myers&lt;/Author&gt;&lt;Year&gt;2025&lt;/Year&gt;&lt;RecNum&gt;3103&lt;/RecNum&gt;&lt;DisplayText&gt;(Myers et al., 2025)&lt;/DisplayText&gt;&lt;record&gt;&lt;rec-number&gt;3103&lt;/rec-number&gt;&lt;foreign-keys&gt;&lt;key app="EN" db-id="xxt5ta9pd995dwesap0pdzzp2weaz0w9werf" timestamp="1762385688"&gt;3103&lt;/key&gt;&lt;/foreign-keys&gt;&lt;ref-type name="Journal Article"&gt;17&lt;/ref-type&gt;&lt;contributors&gt;&lt;authors&gt;&lt;author&gt;Anabelle Myers&lt;/author&gt;&lt;author&gt;David Rosenberg&lt;/author&gt;&lt;author&gt;Hadia Akbar&lt;/author&gt;&lt;author&gt;Erik Porse&lt;/author&gt;&lt;/authors&gt;&lt;/contributors&gt;&lt;titles&gt;&lt;title&gt;Immersive Model for Lake Mead Based on the Principle of Divide Reservoir Inflow&lt;/title&gt;&lt;secondary-title&gt;Hydroshare&lt;/secondary-title&gt;&lt;/titles&gt;&lt;periodical&gt;&lt;full-title&gt;Hydroshare&lt;/full-title&gt;&lt;/periodical&gt;&lt;dates&gt;&lt;year&gt;2025&lt;/year&gt;&lt;/dates&gt;&lt;urls&gt;&lt;/urls&gt;&lt;electronic-resource-num&gt;https://www.hydroshare.org/resource/1fcd5325c0a7400099f1698bc72cecd7/&lt;/electronic-resource-num&gt;&lt;/record&gt;&lt;/Cite&gt;&lt;Cite&gt;&lt;Author&gt;Myers&lt;/Author&gt;&lt;Year&gt;2025&lt;/Year&gt;&lt;RecNum&gt;3103&lt;/RecNum&gt;&lt;record&gt;&lt;rec-number&gt;3103&lt;/rec-number&gt;&lt;foreign-keys&gt;&lt;key app="EN" db-id="xxt5ta9pd995dwesap0pdzzp2weaz0w9werf" timestamp="1762385688"&gt;3103&lt;/key&gt;&lt;/foreign-keys&gt;&lt;ref-type name="Journal Article"&gt;17&lt;/ref-type&gt;&lt;contributors&gt;&lt;authors&gt;&lt;author&gt;Anabelle Myers&lt;/author&gt;&lt;author&gt;David Rosenberg&lt;/author&gt;&lt;author&gt;Hadia Akbar&lt;/author&gt;&lt;author&gt;Erik Porse&lt;/author&gt;&lt;/authors&gt;&lt;/contributors&gt;&lt;titles&gt;&lt;title&gt;Immersive Model for Lake Mead Based on the Principle of Divide Reservoir Inflow&lt;/title&gt;&lt;secondary-title&gt;Hydroshare&lt;/secondary-title&gt;&lt;/titles&gt;&lt;periodical&gt;&lt;full-title&gt;Hydroshare&lt;/full-title&gt;&lt;/periodical&gt;&lt;dates&gt;&lt;year&gt;2025&lt;/year&gt;&lt;/dates&gt;&lt;urls&gt;&lt;/urls&gt;&lt;electronic-resource-num&gt;https://www.hydroshare.org/resource/1fcd5325c0a7400099f1698bc72cecd7/&lt;/electronic-resource-num&gt;&lt;/record&gt;&lt;/Cite&gt;&lt;/EndNote&gt;</w:instrText>
+      </w:r>
+      <w:r>
+        <w:rPr>
+          <w:rFonts w:asciiTheme="majorBidi" w:hAnsiTheme="majorBidi" w:cstheme="majorBidi"/>
+          <w:sz w:val="24"/>
+          <w:szCs w:val="24"/>
+        </w:rPr>
+        <w:fldChar w:fldCharType="separate"/>
+      </w:r>
+      <w:r>
+        <w:rPr>
+          <w:rFonts w:asciiTheme="majorBidi" w:hAnsiTheme="majorBidi" w:cstheme="majorBidi"/>
+          <w:noProof/>
+          <w:sz w:val="24"/>
+          <w:szCs w:val="24"/>
+        </w:rPr>
+        <w:t>(Myers et al., 2025)</w:t>
+      </w:r>
+      <w:r>
+        <w:rPr>
+          <w:rFonts w:asciiTheme="majorBidi" w:hAnsiTheme="majorBidi" w:cstheme="majorBidi"/>
+          <w:sz w:val="24"/>
+          <w:szCs w:val="24"/>
+        </w:rPr>
+        <w:fldChar w:fldCharType="end"/>
       </w:r>
       <w:r>
         <w:rPr>
@@ -18389,7 +18727,7 @@
                     </pic:cNvPicPr>
                   </pic:nvPicPr>
                   <pic:blipFill>
-                    <a:blip r:embed="rId25">
+                    <a:blip r:embed="rId26">
                       <a:extLst>
                         <a:ext uri="{28A0092B-C50C-407E-A947-70E740481C1C}">
                           <a14:useLocalDpi xmlns:a14="http://schemas.microsoft.com/office/drawing/2010/main" val="0"/>
@@ -18526,7 +18864,7 @@
                     </pic:cNvPicPr>
                   </pic:nvPicPr>
                   <pic:blipFill>
-                    <a:blip r:embed="rId26">
+                    <a:blip r:embed="rId27">
                       <a:extLst>
                         <a:ext uri="{28A0092B-C50C-407E-A947-70E740481C1C}">
                           <a14:useLocalDpi xmlns:a14="http://schemas.microsoft.com/office/drawing/2010/main" val="0"/>
@@ -19561,7 +19899,7 @@
       <w:r>
         <w:t xml:space="preserve">, 4(2), e1274. </w:t>
       </w:r>
-      <w:hyperlink r:id="rId27" w:history="1">
+      <w:hyperlink r:id="rId28" w:history="1">
         <w:r>
           <w:rPr>
             <w:rStyle w:val="Hyperlink"/>
@@ -19591,7 +19929,7 @@
       <w:r>
         <w:t xml:space="preserve">, November 8, 2021. </w:t>
       </w:r>
-      <w:hyperlink r:id="rId28" w:history="1">
+      <w:hyperlink r:id="rId29" w:history="1">
         <w:r>
           <w:rPr>
             <w:rStyle w:val="Hyperlink"/>
@@ -19612,7 +19950,7 @@
       <w:r>
         <w:t xml:space="preserve">Buschatzke, T., Hamby, J. B., and Entsminger, J. (2024). "Lower Basin Alternative for the Post-2026 Coordinated Operation of the Colorado River Basin." </w:t>
       </w:r>
-      <w:hyperlink r:id="rId29" w:history="1">
+      <w:hyperlink r:id="rId30" w:history="1">
         <w:r>
           <w:rPr>
             <w:rStyle w:val="Hyperlink"/>
@@ -19633,7 +19971,7 @@
       <w:r>
         <w:t xml:space="preserve">City of Phoenix. (2024). "Additional concepts for consideration - City of Phoenix." </w:t>
       </w:r>
-      <w:hyperlink r:id="rId30" w:history="1">
+      <w:hyperlink r:id="rId31" w:history="1">
         <w:r>
           <w:rPr>
             <w:rStyle w:val="Hyperlink"/>
@@ -19682,7 +20020,7 @@
       <w:r>
         <w:t xml:space="preserve">, 84(2), 242-261. </w:t>
       </w:r>
-      <w:hyperlink r:id="rId31" w:history="1">
+      <w:hyperlink r:id="rId32" w:history="1">
         <w:r>
           <w:rPr>
             <w:rStyle w:val="Hyperlink"/>
@@ -19712,7 +20050,7 @@
       <w:r>
         <w:t xml:space="preserve">, 90(4), 713-737. </w:t>
       </w:r>
-      <w:hyperlink r:id="rId32" w:history="1">
+      <w:hyperlink r:id="rId33" w:history="1">
         <w:r>
           <w:rPr>
             <w:rStyle w:val="Hyperlink"/>
@@ -19742,7 +20080,7 @@
       <w:r>
         <w:t xml:space="preserve">, 372(6545), 885-885. </w:t>
       </w:r>
-      <w:hyperlink r:id="rId33" w:history="1">
+      <w:hyperlink r:id="rId34" w:history="1">
         <w:r>
           <w:rPr>
             <w:rStyle w:val="Hyperlink"/>
@@ -19778,7 +20116,7 @@
         <w:spacing w:after="0"/>
         <w:ind w:left="720" w:hanging="720"/>
       </w:pPr>
-      <w:hyperlink r:id="rId34" w:history="1">
+      <w:hyperlink r:id="rId35" w:history="1">
         <w:r>
           <w:rPr>
             <w:rStyle w:val="Hyperlink"/>
@@ -19808,7 +20146,7 @@
       <w:r>
         <w:t xml:space="preserve">, 146(5), 04020017. </w:t>
       </w:r>
-      <w:hyperlink r:id="rId35" w:history="1">
+      <w:hyperlink r:id="rId36" w:history="1">
         <w:r>
           <w:rPr>
             <w:rStyle w:val="Hyperlink"/>
@@ -19838,7 +20176,7 @@
       <w:r>
         <w:t xml:space="preserve">. </w:t>
       </w:r>
-      <w:hyperlink r:id="rId36" w:history="1">
+      <w:hyperlink r:id="rId37" w:history="1">
         <w:r>
           <w:rPr>
             <w:rStyle w:val="Hyperlink"/>
@@ -19878,7 +20216,7 @@
       <w:r>
         <w:t xml:space="preserve">IBWC. (2021). "Minutes between the United States and Mexican Sections of the IBWC." United States Section, </w:t>
       </w:r>
-      <w:hyperlink r:id="rId37" w:history="1">
+      <w:hyperlink r:id="rId38" w:history="1">
         <w:r>
           <w:rPr>
             <w:rStyle w:val="Hyperlink"/>
@@ -19908,7 +20246,7 @@
       <w:r>
         <w:t xml:space="preserve">, 372(6540), 418-421. </w:t>
       </w:r>
-      <w:hyperlink r:id="rId38" w:history="1">
+      <w:hyperlink r:id="rId39" w:history="1">
         <w:r>
           <w:rPr>
             <w:rStyle w:val="Hyperlink"/>
@@ -19961,7 +20299,7 @@
       <w:r>
         <w:t xml:space="preserve">, 7(6), e1486. </w:t>
       </w:r>
-      <w:hyperlink r:id="rId39" w:history="1">
+      <w:hyperlink r:id="rId40" w:history="1">
         <w:r>
           <w:rPr>
             <w:rStyle w:val="Hyperlink"/>
@@ -19999,6 +20337,36 @@
         <w:ind w:left="720" w:hanging="720"/>
       </w:pPr>
       <w:r>
+        <w:t xml:space="preserve">Myers, A., Rosenberg, D., Akbar, H., and Porse, E. (2025). "Immersive Model for Lake Mead Based on the Principle of Divide Reservoir Inflow." </w:t>
+      </w:r>
+      <w:r>
+        <w:rPr>
+          <w:i/>
+        </w:rPr>
+        <w:t>Hydroshare</w:t>
+      </w:r>
+      <w:r>
+        <w:t xml:space="preserve">. </w:t>
+      </w:r>
+      <w:hyperlink r:id="rId41" w:history="1">
+        <w:r>
+          <w:rPr>
+            <w:rStyle w:val="Hyperlink"/>
+          </w:rPr>
+          <w:t>https://www.hydroshare.org/resource/1fcd5325c0a7400099f1698bc72cecd7/</w:t>
+        </w:r>
+      </w:hyperlink>
+      <w:r>
+        <w:t>.</w:t>
+      </w:r>
+    </w:p>
+    <w:p>
+      <w:pPr>
+        <w:pStyle w:val="EndNoteBibliography"/>
+        <w:spacing w:after="0"/>
+        <w:ind w:left="720" w:hanging="720"/>
+      </w:pPr>
+      <w:r>
         <w:t xml:space="preserve">Pace, C., Fencl, A., Baehner, L., Lukacs, H., Cushing, L. J., and Morello-Frosch, R. (2022). "The Drinking Water Tool: A Community-Driven Data Visualization Tool for Policy Implementation." </w:t>
       </w:r>
       <w:r>
@@ -20010,7 +20378,7 @@
       <w:r>
         <w:t xml:space="preserve">, 19(3), 1419. </w:t>
       </w:r>
-      <w:hyperlink r:id="rId40" w:history="1">
+      <w:hyperlink r:id="rId42" w:history="1">
         <w:r>
           <w:rPr>
             <w:rStyle w:val="Hyperlink"/>
@@ -20031,7 +20399,7 @@
       <w:r>
         <w:t xml:space="preserve">Pitt, J., Miller, B., Funk, A., Rice, M., Hawes, T., Moran, K., and Porterfield, S. (2024). "Conservation Groups’ Cooperative Conservation Alternative for Post-2026 Colorado River Guidelines Operations and Strategies." Reclamation. </w:t>
       </w:r>
-      <w:hyperlink r:id="rId41" w:history="1">
+      <w:hyperlink r:id="rId43" w:history="1">
         <w:r>
           <w:rPr>
             <w:rStyle w:val="Hyperlink"/>
@@ -20061,7 +20429,7 @@
       <w:r>
         <w:t xml:space="preserve">, 88(3). </w:t>
       </w:r>
-      <w:hyperlink r:id="rId42" w:history="1">
+      <w:hyperlink r:id="rId44" w:history="1">
         <w:r>
           <w:rPr>
             <w:rStyle w:val="Hyperlink"/>
@@ -20080,6 +20448,36 @@
         <w:ind w:left="720" w:hanging="720"/>
       </w:pPr>
       <w:r>
+        <w:t xml:space="preserve">Rosenberg, D. (2026). "Lake Mead Water Conservation Program Analysis." </w:t>
+      </w:r>
+      <w:r>
+        <w:rPr>
+          <w:i/>
+        </w:rPr>
+        <w:t>Github, Utah State Unviersity</w:t>
+      </w:r>
+      <w:r>
+        <w:t xml:space="preserve">. </w:t>
+      </w:r>
+      <w:hyperlink r:id="rId45" w:history="1">
+        <w:r>
+          <w:rPr>
+            <w:rStyle w:val="Hyperlink"/>
+          </w:rPr>
+          <w:t>https://github.com/dzeke/ColoradoRiverCollaborate/tree/main/LakeMeadWaterConservationProgramAnalysis</w:t>
+        </w:r>
+      </w:hyperlink>
+      <w:r>
+        <w:t>.</w:t>
+      </w:r>
+    </w:p>
+    <w:p>
+      <w:pPr>
+        <w:pStyle w:val="EndNoteBibliography"/>
+        <w:spacing w:after="0"/>
+        <w:ind w:left="720" w:hanging="720"/>
+      </w:pPr>
+      <w:r>
         <w:t xml:space="preserve">Rosenberg, D. E. (2022). "Adapt Lake Mead Releases to Inflow to Give Managers More Flexibility to Slow Reservoir Drawdown." </w:t>
       </w:r>
       <w:r>
@@ -20091,7 +20489,7 @@
       <w:r>
         <w:t xml:space="preserve">, 148(10), 02522006. </w:t>
       </w:r>
-      <w:hyperlink r:id="rId43" w:history="1">
+      <w:hyperlink r:id="rId46" w:history="1">
         <w:r>
           <w:rPr>
             <w:rStyle w:val="Hyperlink"/>
@@ -20112,7 +20510,7 @@
       <w:r>
         <w:t xml:space="preserve">Rosenberg, D. E. (2023). "Colorado River Basin Water Accounts: Provoke discussion about more adaptive reservoir operations." Hydroshare.org. </w:t>
       </w:r>
-      <w:hyperlink r:id="rId44" w:history="1">
+      <w:hyperlink r:id="rId47" w:history="1">
         <w:r>
           <w:rPr>
             <w:rStyle w:val="Hyperlink"/>
@@ -20142,7 +20540,7 @@
       <w:r>
         <w:t xml:space="preserve">, 150(7). </w:t>
       </w:r>
-      <w:hyperlink r:id="rId45" w:history="1">
+      <w:hyperlink r:id="rId48" w:history="1">
         <w:r>
           <w:rPr>
             <w:rStyle w:val="Hyperlink"/>
@@ -20172,7 +20570,7 @@
       <w:r>
         <w:t xml:space="preserve">, 58(6), 1053-1075. </w:t>
       </w:r>
-      <w:hyperlink r:id="rId46" w:history="1">
+      <w:hyperlink r:id="rId49" w:history="1">
         <w:r>
           <w:rPr>
             <w:rStyle w:val="Hyperlink"/>
@@ -20202,7 +20600,7 @@
       <w:r>
         <w:t xml:space="preserve">, 60(7), e2024WR037225. </w:t>
       </w:r>
-      <w:hyperlink r:id="rId47" w:history="1">
+      <w:hyperlink r:id="rId50" w:history="1">
         <w:r>
           <w:rPr>
             <w:rStyle w:val="Hyperlink"/>
@@ -20232,7 +20630,7 @@
       <w:r>
         <w:t xml:space="preserve">, 58(5), 735-745. </w:t>
       </w:r>
-      <w:hyperlink r:id="rId48" w:history="1">
+      <w:hyperlink r:id="rId51" w:history="1">
         <w:r>
           <w:rPr>
             <w:rStyle w:val="Hyperlink"/>
@@ -20262,7 +20660,7 @@
       <w:r>
         <w:t xml:space="preserve">, 22(2), 4-21. </w:t>
       </w:r>
-      <w:hyperlink r:id="rId49" w:history="1">
+      <w:hyperlink r:id="rId52" w:history="1">
         <w:r>
           <w:rPr>
             <w:rStyle w:val="Hyperlink"/>
@@ -20281,7 +20679,11 @@
         <w:ind w:left="720" w:hanging="720"/>
       </w:pPr>
       <w:r>
-        <w:t xml:space="preserve">Thomas, K., Hardy, R. D., Lazrus, H., Mendez, M., Orlove, B., Rivera-Collazo, I., Roberts, J. T., Rockman, M., Warner, B. P., and Winthrop, R. (2019). "Explaining differential vulnerability to climate change: A social science review." </w:t>
+        <w:t xml:space="preserve">Thomas, K., Hardy, R. D., Lazrus, H., Mendez, M., Orlove, B., Rivera-Collazo, I., Roberts, J. T., Rockman, M., Warner, B. P., and Winthrop, R. (2019). "Explaining differential vulnerability to climate </w:t>
+      </w:r>
+      <w:r>
+        <w:lastRenderedPageBreak/>
+        <w:t xml:space="preserve">change: A social science review." </w:t>
       </w:r>
       <w:r>
         <w:rPr>
@@ -20292,7 +20694,7 @@
       <w:r>
         <w:t xml:space="preserve">, 10(2), e565. </w:t>
       </w:r>
-      <w:hyperlink r:id="rId50" w:history="1">
+      <w:hyperlink r:id="rId53" w:history="1">
         <w:r>
           <w:rPr>
             <w:rStyle w:val="Hyperlink"/>
@@ -20322,7 +20724,7 @@
       <w:r>
         <w:t xml:space="preserve">. </w:t>
       </w:r>
-      <w:hyperlink r:id="rId51" w:history="1">
+      <w:hyperlink r:id="rId54" w:history="1">
         <w:r>
           <w:rPr>
             <w:rStyle w:val="Hyperlink"/>
@@ -20341,7 +20743,6 @@
         <w:ind w:left="720" w:hanging="720"/>
       </w:pPr>
       <w:r>
-        <w:lastRenderedPageBreak/>
         <w:t xml:space="preserve">UCRC. (2024). "Colorado River System Conservation Pilot Program in the Upper Colorado River Basin." </w:t>
       </w:r>
       <w:r>
@@ -20353,7 +20754,7 @@
       <w:r>
         <w:t xml:space="preserve">. </w:t>
       </w:r>
-      <w:hyperlink r:id="rId52" w:history="1">
+      <w:hyperlink r:id="rId55" w:history="1">
         <w:r>
           <w:rPr>
             <w:rStyle w:val="Hyperlink"/>
@@ -20383,7 +20784,7 @@
       <w:r>
         <w:t xml:space="preserve">, 53(3), 2404-2418. </w:t>
       </w:r>
-      <w:hyperlink r:id="rId53" w:history="1">
+      <w:hyperlink r:id="rId56" w:history="1">
         <w:r>
           <w:rPr>
             <w:rStyle w:val="Hyperlink"/>
@@ -20404,7 +20805,7 @@
       <w:r>
         <w:t xml:space="preserve">USBR. (2007a). "Colorado River Interim Guidelines for Lower Basin Shortages and Coordinated Operations for Lakes Powell and Mead: Final Environmental Impact Statement." U.S. Bureau of Reclamation, Washington, D.C., </w:t>
       </w:r>
-      <w:hyperlink r:id="rId54" w:history="1">
+      <w:hyperlink r:id="rId57" w:history="1">
         <w:r>
           <w:rPr>
             <w:rStyle w:val="Hyperlink"/>
@@ -20425,7 +20826,7 @@
       <w:r>
         <w:t xml:space="preserve">USBR. (2007b). "Record of Decision: Colorado River Interim Guidelines for Lower Basin Shortages and Coordinated Operations for Lakes Powell and Mead." U.S. Bureau of Reclamation. </w:t>
       </w:r>
-      <w:hyperlink r:id="rId55" w:history="1">
+      <w:hyperlink r:id="rId58" w:history="1">
         <w:r>
           <w:rPr>
             <w:rStyle w:val="Hyperlink"/>
@@ -20446,7 +20847,7 @@
       <w:r>
         <w:t xml:space="preserve">USBR. (2019). "Agreement Concerning Colorado River Drought Contingency Management and Operations." U.S. Bureau of Reclamation, Washington, DC. </w:t>
       </w:r>
-      <w:hyperlink r:id="rId56" w:history="1">
+      <w:hyperlink r:id="rId59" w:history="1">
         <w:r>
           <w:rPr>
             <w:rStyle w:val="Hyperlink"/>
@@ -20467,7 +20868,7 @@
       <w:r>
         <w:t xml:space="preserve">USBR. (2021). "Pilot System Conservation Program." U.S. Bureau of Reclamation, </w:t>
       </w:r>
-      <w:hyperlink r:id="rId57" w:history="1">
+      <w:hyperlink r:id="rId60" w:history="1">
         <w:r>
           <w:rPr>
             <w:rStyle w:val="Hyperlink"/>
@@ -20488,7 +20889,7 @@
       <w:r>
         <w:t xml:space="preserve">USBR. (2026a). "Boulder Canyon Operations Office - Program and Activities: Water Accounting Reports." U.S. Bureau of Reclamation. </w:t>
       </w:r>
-      <w:hyperlink r:id="rId58" w:history="1">
+      <w:hyperlink r:id="rId61" w:history="1">
         <w:r>
           <w:rPr>
             <w:rStyle w:val="Hyperlink"/>
@@ -20509,7 +20910,7 @@
       <w:r>
         <w:t xml:space="preserve">USBR. (2026b). "Post-2026 Operational Guidelines and Strategies for Lake Powell and Lake Mead – Draft Environmental Impact Statement." U.S. Bureau of Reclamation. </w:t>
       </w:r>
-      <w:hyperlink r:id="rId59" w:history="1">
+      <w:hyperlink r:id="rId62" w:history="1">
         <w:r>
           <w:rPr>
             <w:rStyle w:val="Hyperlink"/>
@@ -20539,7 +20940,7 @@
       <w:r>
         <w:t xml:space="preserve">, 147(9), 04021034. </w:t>
       </w:r>
-      <w:hyperlink r:id="rId60" w:history="1">
+      <w:hyperlink r:id="rId63" w:history="1">
         <w:r>
           <w:rPr>
             <w:rStyle w:val="Hyperlink"/>
@@ -20559,7 +20960,7 @@
       <w:r>
         <w:t xml:space="preserve">Wang, J., and Schmidt, J. C. (2020). "Stream flow and Losses of the Colorado River in the Southern Colorado Plateau." Center for Colorado River Studies, Utah State University, Logan, Utah. </w:t>
       </w:r>
-      <w:hyperlink r:id="rId61" w:history="1">
+      <w:hyperlink r:id="rId64" w:history="1">
         <w:r>
           <w:rPr>
             <w:rStyle w:val="Hyperlink"/>
@@ -20589,7 +20990,7 @@
       </w:r>
     </w:p>
     <w:sectPr>
-      <w:headerReference w:type="default" r:id="rId62"/>
+      <w:headerReference w:type="default" r:id="rId65"/>
       <w:pgSz w:w="12240" w:h="15840"/>
       <w:pgMar w:top="1440" w:right="1440" w:bottom="1440" w:left="1440" w:header="720" w:footer="720" w:gutter="0"/>
       <w:lnNumType w:countBy="1" w:restart="continuous"/>
@@ -24215,7 +24616,6 @@
   <w:style w:type="character" w:default="1" w:styleId="DefaultParagraphFont">
     <w:name w:val="Default Paragraph Font"/>
     <w:uiPriority w:val="1"/>
-    <w:semiHidden/>
     <w:unhideWhenUsed/>
   </w:style>
   <w:style w:type="table" w:default="1" w:styleId="TableNormal">

</xml_diff>